<commit_message>
feat: complete W7 nameplate map and alert presentation
</commit_message>
<xml_diff>
--- a/Museum_Heist_GDD.docx
+++ b/Museum_Heist_GDD.docx
@@ -101,7 +101,7 @@
           </w:tcPr>
           <w:p>
             <w:r>
-              <w:t>Rev 12 · 2026-08-09</w:t>
+              <w:t>Rev 13 · 2026-08-15</w:t>
             </w:r>
           </w:p>
         </w:tc>
@@ -8457,7 +8457,7 @@
         </w:numPr>
       </w:pPr>
       <w:r>
-        <w:t>World View가 완전히 가려진 Full-Screen 화면으로 전환된다. World Audio와 팀 음성은 유지하지만 Alert/Lockdown 상세 정보는 작업 화면에 중복 표시하지 않는다. Alert가 Quiet을 벗어나면 현재 작업을 서버에 한 번 취소 요청하고 화면을 닫아 이동·시점·탈출 판단을 즉시 복원한다.</w:t>
+        <w:t>World View가 완전히 가려진 Full-Screen 화면으로 전환된다. World Audio와 팀 음성은 유지하지만 Alert/Lockdown 상세 정보는 작업 화면에 중복 표시하지 않는다. Suspicious/Searching에서는 현재 작업을 유지한다. Alarmed/Lockdown 진입 시 서버가 작업 Session을 먼저 취소하고 화면을 닫아 이동·시점·탈출 판단을 즉시 복원하며, 위험 단계에서는 신규 작업 진입을 허용하지 않는다.</w:t>
       </w:r>
     </w:p>
     <w:p>
@@ -19624,7 +19624,7 @@
         <w:sz w:val="17"/>
       </w:rPr>
       <w:tab/>
-      <w:t>Rev 12</w:t>
+      <w:t>Rev 13</w:t>
     </w:r>
   </w:p>
 </w:hdr>

</xml_diff>

<commit_message>
Implement Rev14 security and start-count gates
Adds server-authoritative CCTV, laser barrier, and hold-button security actors with shared incident handling that escalates alert state and assigns one nearby guard investigation per incident. Enforces 2–4 player public match starts, rejects in-game joins, snapshots ContractStartPlayerCount for quota/assignment stability, and improves disconnect cleanup by releasing security holds and dropping carried loose loot before logout resolution. Also hard-disables Object Assembly runtime paths for v1, updates contract/result logic to Surface-only behavior, and realigns automation/debug coverage and project status docs with the Rev14 boundaries.
</commit_message>
<xml_diff>
--- a/Museum_Heist_GDD.docx
+++ b/Museum_Heist_GDD.docx
@@ -62,6 +62,7 @@
       </w:tblGrid>
       <w:tr>
         <w:trPr>
+          <w:cantSplit/>
           <w:jc w:val="center"/>
         </w:trPr>
         <w:tc>
@@ -108,6 +109,7 @@
       </w:tr>
       <w:tr>
         <w:trPr>
+          <w:cantSplit/>
           <w:jc w:val="center"/>
         </w:trPr>
         <w:tc>
@@ -160,6 +162,7 @@
       </w:tr>
       <w:tr>
         <w:trPr>
+          <w:cantSplit/>
           <w:jc w:val="center"/>
         </w:trPr>
         <w:tc>
@@ -221,7 +224,6 @@
         <w:pStyle w:val="FrontHeading"/>
       </w:pPr>
       <w:r>
-        <w:lastRenderedPageBreak/>
         <w:t>이 문서의 역할</w:t>
       </w:r>
     </w:p>
@@ -240,7 +242,6 @@
       <w:tr>
         <w:trPr>
           <w:cantSplit/>
-          <w:tblHeader/>
           <w:jc w:val="center"/>
         </w:trPr>
         <w:tc>
@@ -485,6 +486,7 @@
       </w:tblGrid>
       <w:tr>
         <w:trPr>
+          <w:cantSplit/>
           <w:jc w:val="center"/>
         </w:trPr>
         <w:tc>
@@ -549,7 +551,7 @@
       <w:r>
         <w:fldChar w:fldCharType="separate"/>
       </w:r>
-      <w:hyperlink w:anchor="_Toc237977662" w:history="1">
+      <w:hyperlink w:anchor="_Toc238277941" w:history="1">
         <w:r>
           <w:rPr>
             <w:rStyle w:val="aff1"/>
@@ -576,7 +578,7 @@
             <w:noProof/>
             <w:webHidden/>
           </w:rPr>
-          <w:instrText xml:space="preserve"> PAGEREF _Toc237977662 \h </w:instrText>
+          <w:instrText xml:space="preserve"> PAGEREF _Toc238277941 \h </w:instrText>
         </w:r>
         <w:r>
           <w:rPr>
@@ -596,7 +598,7 @@
             <w:noProof/>
             <w:webHidden/>
           </w:rPr>
-          <w:t>6</w:t>
+          <w:t>5</w:t>
         </w:r>
         <w:r>
           <w:rPr>
@@ -625,7 +627,7 @@
           <w14:ligatures w14:val="standardContextual"/>
         </w:rPr>
       </w:pPr>
-      <w:hyperlink w:anchor="_Toc237977663" w:history="1">
+      <w:hyperlink w:anchor="_Toc238277942" w:history="1">
         <w:r>
           <w:rPr>
             <w:rStyle w:val="aff1"/>
@@ -652,7 +654,7 @@
             <w:noProof/>
             <w:webHidden/>
           </w:rPr>
-          <w:instrText xml:space="preserve"> PAGEREF _Toc237977663 \h </w:instrText>
+          <w:instrText xml:space="preserve"> PAGEREF _Toc238277942 \h </w:instrText>
         </w:r>
         <w:r>
           <w:rPr>
@@ -672,7 +674,7 @@
             <w:noProof/>
             <w:webHidden/>
           </w:rPr>
-          <w:t>6</w:t>
+          <w:t>5</w:t>
         </w:r>
         <w:r>
           <w:rPr>
@@ -701,7 +703,7 @@
           <w14:ligatures w14:val="standardContextual"/>
         </w:rPr>
       </w:pPr>
-      <w:hyperlink w:anchor="_Toc237977664" w:history="1">
+      <w:hyperlink w:anchor="_Toc238277943" w:history="1">
         <w:r>
           <w:rPr>
             <w:rStyle w:val="aff1"/>
@@ -728,7 +730,7 @@
             <w:noProof/>
             <w:webHidden/>
           </w:rPr>
-          <w:instrText xml:space="preserve"> PAGEREF _Toc237977664 \h </w:instrText>
+          <w:instrText xml:space="preserve"> PAGEREF _Toc238277943 \h </w:instrText>
         </w:r>
         <w:r>
           <w:rPr>
@@ -748,7 +750,7 @@
             <w:noProof/>
             <w:webHidden/>
           </w:rPr>
-          <w:t>6</w:t>
+          <w:t>5</w:t>
         </w:r>
         <w:r>
           <w:rPr>
@@ -777,7 +779,7 @@
           <w14:ligatures w14:val="standardContextual"/>
         </w:rPr>
       </w:pPr>
-      <w:hyperlink w:anchor="_Toc237977665" w:history="1">
+      <w:hyperlink w:anchor="_Toc238277944" w:history="1">
         <w:r>
           <w:rPr>
             <w:rStyle w:val="aff1"/>
@@ -804,7 +806,7 @@
             <w:noProof/>
             <w:webHidden/>
           </w:rPr>
-          <w:instrText xml:space="preserve"> PAGEREF _Toc237977665 \h </w:instrText>
+          <w:instrText xml:space="preserve"> PAGEREF _Toc238277944 \h </w:instrText>
         </w:r>
         <w:r>
           <w:rPr>
@@ -824,7 +826,7 @@
             <w:noProof/>
             <w:webHidden/>
           </w:rPr>
-          <w:t>6</w:t>
+          <w:t>5</w:t>
         </w:r>
         <w:r>
           <w:rPr>
@@ -853,7 +855,7 @@
           <w14:ligatures w14:val="standardContextual"/>
         </w:rPr>
       </w:pPr>
-      <w:hyperlink w:anchor="_Toc237977666" w:history="1">
+      <w:hyperlink w:anchor="_Toc238277945" w:history="1">
         <w:r>
           <w:rPr>
             <w:rStyle w:val="aff1"/>
@@ -880,7 +882,7 @@
             <w:noProof/>
             <w:webHidden/>
           </w:rPr>
-          <w:instrText xml:space="preserve"> PAGEREF _Toc237977666 \h </w:instrText>
+          <w:instrText xml:space="preserve"> PAGEREF _Toc238277945 \h </w:instrText>
         </w:r>
         <w:r>
           <w:rPr>
@@ -900,7 +902,7 @@
             <w:noProof/>
             <w:webHidden/>
           </w:rPr>
-          <w:t>7</w:t>
+          <w:t>6</w:t>
         </w:r>
         <w:r>
           <w:rPr>
@@ -929,7 +931,7 @@
           <w14:ligatures w14:val="standardContextual"/>
         </w:rPr>
       </w:pPr>
-      <w:hyperlink w:anchor="_Toc237977667" w:history="1">
+      <w:hyperlink w:anchor="_Toc238277946" w:history="1">
         <w:r>
           <w:rPr>
             <w:rStyle w:val="aff1"/>
@@ -956,7 +958,7 @@
             <w:noProof/>
             <w:webHidden/>
           </w:rPr>
-          <w:instrText xml:space="preserve"> PAGEREF _Toc237977667 \h </w:instrText>
+          <w:instrText xml:space="preserve"> PAGEREF _Toc238277946 \h </w:instrText>
         </w:r>
         <w:r>
           <w:rPr>
@@ -976,7 +978,7 @@
             <w:noProof/>
             <w:webHidden/>
           </w:rPr>
-          <w:t>7</w:t>
+          <w:t>6</w:t>
         </w:r>
         <w:r>
           <w:rPr>
@@ -1005,7 +1007,7 @@
           <w14:ligatures w14:val="standardContextual"/>
         </w:rPr>
       </w:pPr>
-      <w:hyperlink w:anchor="_Toc237977668" w:history="1">
+      <w:hyperlink w:anchor="_Toc238277947" w:history="1">
         <w:r>
           <w:rPr>
             <w:rStyle w:val="aff1"/>
@@ -1032,7 +1034,7 @@
             <w:noProof/>
             <w:webHidden/>
           </w:rPr>
-          <w:instrText xml:space="preserve"> PAGEREF _Toc237977668 \h </w:instrText>
+          <w:instrText xml:space="preserve"> PAGEREF _Toc238277947 \h </w:instrText>
         </w:r>
         <w:r>
           <w:rPr>
@@ -1052,7 +1054,7 @@
             <w:noProof/>
             <w:webHidden/>
           </w:rPr>
-          <w:t>7</w:t>
+          <w:t>6</w:t>
         </w:r>
         <w:r>
           <w:rPr>
@@ -1080,7 +1082,7 @@
           <w14:ligatures w14:val="standardContextual"/>
         </w:rPr>
       </w:pPr>
-      <w:hyperlink w:anchor="_Toc237977669" w:history="1">
+      <w:hyperlink w:anchor="_Toc238277948" w:history="1">
         <w:r>
           <w:rPr>
             <w:rStyle w:val="aff1"/>
@@ -1107,7 +1109,7 @@
             <w:noProof/>
             <w:webHidden/>
           </w:rPr>
-          <w:instrText xml:space="preserve"> PAGEREF _Toc237977669 \h </w:instrText>
+          <w:instrText xml:space="preserve"> PAGEREF _Toc238277948 \h </w:instrText>
         </w:r>
         <w:r>
           <w:rPr>
@@ -1127,7 +1129,7 @@
             <w:noProof/>
             <w:webHidden/>
           </w:rPr>
-          <w:t>8</w:t>
+          <w:t>7</w:t>
         </w:r>
         <w:r>
           <w:rPr>
@@ -1156,7 +1158,7 @@
           <w14:ligatures w14:val="standardContextual"/>
         </w:rPr>
       </w:pPr>
-      <w:hyperlink w:anchor="_Toc237977670" w:history="1">
+      <w:hyperlink w:anchor="_Toc238277949" w:history="1">
         <w:r>
           <w:rPr>
             <w:rStyle w:val="aff1"/>
@@ -1183,7 +1185,7 @@
             <w:noProof/>
             <w:webHidden/>
           </w:rPr>
-          <w:instrText xml:space="preserve"> PAGEREF _Toc237977670 \h </w:instrText>
+          <w:instrText xml:space="preserve"> PAGEREF _Toc238277949 \h </w:instrText>
         </w:r>
         <w:r>
           <w:rPr>
@@ -1203,7 +1205,7 @@
             <w:noProof/>
             <w:webHidden/>
           </w:rPr>
-          <w:t>8</w:t>
+          <w:t>7</w:t>
         </w:r>
         <w:r>
           <w:rPr>
@@ -1232,7 +1234,7 @@
           <w14:ligatures w14:val="standardContextual"/>
         </w:rPr>
       </w:pPr>
-      <w:hyperlink w:anchor="_Toc237977671" w:history="1">
+      <w:hyperlink w:anchor="_Toc238277950" w:history="1">
         <w:r>
           <w:rPr>
             <w:rStyle w:val="aff1"/>
@@ -1259,7 +1261,7 @@
             <w:noProof/>
             <w:webHidden/>
           </w:rPr>
-          <w:instrText xml:space="preserve"> PAGEREF _Toc237977671 \h </w:instrText>
+          <w:instrText xml:space="preserve"> PAGEREF _Toc238277950 \h </w:instrText>
         </w:r>
         <w:r>
           <w:rPr>
@@ -1279,7 +1281,7 @@
             <w:noProof/>
             <w:webHidden/>
           </w:rPr>
-          <w:t>8</w:t>
+          <w:t>7</w:t>
         </w:r>
         <w:r>
           <w:rPr>
@@ -1308,7 +1310,7 @@
           <w14:ligatures w14:val="standardContextual"/>
         </w:rPr>
       </w:pPr>
-      <w:hyperlink w:anchor="_Toc237977672" w:history="1">
+      <w:hyperlink w:anchor="_Toc238277951" w:history="1">
         <w:r>
           <w:rPr>
             <w:rStyle w:val="aff1"/>
@@ -1335,7 +1337,7 @@
             <w:noProof/>
             <w:webHidden/>
           </w:rPr>
-          <w:instrText xml:space="preserve"> PAGEREF _Toc237977672 \h </w:instrText>
+          <w:instrText xml:space="preserve"> PAGEREF _Toc238277951 \h </w:instrText>
         </w:r>
         <w:r>
           <w:rPr>
@@ -1355,7 +1357,7 @@
             <w:noProof/>
             <w:webHidden/>
           </w:rPr>
-          <w:t>9</w:t>
+          <w:t>8</w:t>
         </w:r>
         <w:r>
           <w:rPr>
@@ -1384,7 +1386,7 @@
           <w14:ligatures w14:val="standardContextual"/>
         </w:rPr>
       </w:pPr>
-      <w:hyperlink w:anchor="_Toc237977673" w:history="1">
+      <w:hyperlink w:anchor="_Toc238277952" w:history="1">
         <w:r>
           <w:rPr>
             <w:rStyle w:val="aff1"/>
@@ -1411,15 +1413,7 @@
             <w:noProof/>
             <w:webHidden/>
           </w:rPr>
-          <w:instrText xml:space="preserve"> PAGEREF _To</w:instrText>
-        </w:r>
-        <w:r>
-          <w:rPr>
-            <w:noProof/>
-            <w:webHidden/>
-          </w:rPr>
-          <w:lastRenderedPageBreak/>
-          <w:instrText xml:space="preserve">c237977673 \h </w:instrText>
+          <w:instrText xml:space="preserve"> PAGEREF _Toc238277952 \h </w:instrText>
         </w:r>
         <w:r>
           <w:rPr>
@@ -1439,7 +1433,7 @@
             <w:noProof/>
             <w:webHidden/>
           </w:rPr>
-          <w:t>9</w:t>
+          <w:t>8</w:t>
         </w:r>
         <w:r>
           <w:rPr>
@@ -1468,7 +1462,7 @@
           <w14:ligatures w14:val="standardContextual"/>
         </w:rPr>
       </w:pPr>
-      <w:hyperlink w:anchor="_Toc237977674" w:history="1">
+      <w:hyperlink w:anchor="_Toc238277953" w:history="1">
         <w:r>
           <w:rPr>
             <w:rStyle w:val="aff1"/>
@@ -1495,7 +1489,7 @@
             <w:noProof/>
             <w:webHidden/>
           </w:rPr>
-          <w:instrText xml:space="preserve"> PAGEREF _Toc237977674 \h </w:instrText>
+          <w:instrText xml:space="preserve"> PAGEREF _Toc238277953 \h </w:instrText>
         </w:r>
         <w:r>
           <w:rPr>
@@ -1515,7 +1509,7 @@
             <w:noProof/>
             <w:webHidden/>
           </w:rPr>
-          <w:t>9</w:t>
+          <w:t>8</w:t>
         </w:r>
         <w:r>
           <w:rPr>
@@ -1543,7 +1537,7 @@
           <w14:ligatures w14:val="standardContextual"/>
         </w:rPr>
       </w:pPr>
-      <w:hyperlink w:anchor="_Toc237977675" w:history="1">
+      <w:hyperlink w:anchor="_Toc238277954" w:history="1">
         <w:r>
           <w:rPr>
             <w:rStyle w:val="aff1"/>
@@ -1570,7 +1564,7 @@
             <w:noProof/>
             <w:webHidden/>
           </w:rPr>
-          <w:instrText xml:space="preserve"> PAGEREF _Toc237977675 \h </w:instrText>
+          <w:instrText xml:space="preserve"> PAGEREF _Toc238277954 \h </w:instrText>
         </w:r>
         <w:r>
           <w:rPr>
@@ -1590,7 +1584,7 @@
             <w:noProof/>
             <w:webHidden/>
           </w:rPr>
-          <w:t>10</w:t>
+          <w:t>9</w:t>
         </w:r>
         <w:r>
           <w:rPr>
@@ -1619,7 +1613,7 @@
           <w14:ligatures w14:val="standardContextual"/>
         </w:rPr>
       </w:pPr>
-      <w:hyperlink w:anchor="_Toc237977676" w:history="1">
+      <w:hyperlink w:anchor="_Toc238277955" w:history="1">
         <w:r>
           <w:rPr>
             <w:rStyle w:val="aff1"/>
@@ -1646,7 +1640,7 @@
             <w:noProof/>
             <w:webHidden/>
           </w:rPr>
-          <w:instrText xml:space="preserve"> PAGEREF _Toc237977676 \h </w:instrText>
+          <w:instrText xml:space="preserve"> PAGEREF _Toc238277955 \h </w:instrText>
         </w:r>
         <w:r>
           <w:rPr>
@@ -1666,7 +1660,7 @@
             <w:noProof/>
             <w:webHidden/>
           </w:rPr>
-          <w:t>10</w:t>
+          <w:t>9</w:t>
         </w:r>
         <w:r>
           <w:rPr>
@@ -1695,7 +1689,7 @@
           <w14:ligatures w14:val="standardContextual"/>
         </w:rPr>
       </w:pPr>
-      <w:hyperlink w:anchor="_Toc237977677" w:history="1">
+      <w:hyperlink w:anchor="_Toc238277956" w:history="1">
         <w:r>
           <w:rPr>
             <w:rStyle w:val="aff1"/>
@@ -1722,7 +1716,7 @@
             <w:noProof/>
             <w:webHidden/>
           </w:rPr>
-          <w:instrText xml:space="preserve"> PAGEREF _Toc237977677 \h </w:instrText>
+          <w:instrText xml:space="preserve"> PAGEREF _Toc238277956 \h </w:instrText>
         </w:r>
         <w:r>
           <w:rPr>
@@ -1742,7 +1736,7 @@
             <w:noProof/>
             <w:webHidden/>
           </w:rPr>
-          <w:t>10</w:t>
+          <w:t>9</w:t>
         </w:r>
         <w:r>
           <w:rPr>
@@ -1771,7 +1765,7 @@
           <w14:ligatures w14:val="standardContextual"/>
         </w:rPr>
       </w:pPr>
-      <w:hyperlink w:anchor="_Toc237977678" w:history="1">
+      <w:hyperlink w:anchor="_Toc238277957" w:history="1">
         <w:r>
           <w:rPr>
             <w:rStyle w:val="aff1"/>
@@ -1798,7 +1792,7 @@
             <w:noProof/>
             <w:webHidden/>
           </w:rPr>
-          <w:instrText xml:space="preserve"> PAGEREF _Toc237977678 \h </w:instrText>
+          <w:instrText xml:space="preserve"> PAGEREF _Toc238277957 \h </w:instrText>
         </w:r>
         <w:r>
           <w:rPr>
@@ -1818,7 +1812,7 @@
             <w:noProof/>
             <w:webHidden/>
           </w:rPr>
-          <w:t>11</w:t>
+          <w:t>10</w:t>
         </w:r>
         <w:r>
           <w:rPr>
@@ -1847,7 +1841,7 @@
           <w14:ligatures w14:val="standardContextual"/>
         </w:rPr>
       </w:pPr>
-      <w:hyperlink w:anchor="_Toc237977679" w:history="1">
+      <w:hyperlink w:anchor="_Toc238277958" w:history="1">
         <w:r>
           <w:rPr>
             <w:rStyle w:val="aff1"/>
@@ -1874,7 +1868,7 @@
             <w:noProof/>
             <w:webHidden/>
           </w:rPr>
-          <w:instrText xml:space="preserve"> PAGEREF _Toc237977679 \h </w:instrText>
+          <w:instrText xml:space="preserve"> PAGEREF _Toc238277958 \h </w:instrText>
         </w:r>
         <w:r>
           <w:rPr>
@@ -1894,7 +1888,7 @@
             <w:noProof/>
             <w:webHidden/>
           </w:rPr>
-          <w:t>12</w:t>
+          <w:t>11</w:t>
         </w:r>
         <w:r>
           <w:rPr>
@@ -1923,7 +1917,7 @@
           <w14:ligatures w14:val="standardContextual"/>
         </w:rPr>
       </w:pPr>
-      <w:hyperlink w:anchor="_Toc237977680" w:history="1">
+      <w:hyperlink w:anchor="_Toc238277959" w:history="1">
         <w:r>
           <w:rPr>
             <w:rStyle w:val="aff1"/>
@@ -1950,7 +1944,7 @@
             <w:noProof/>
             <w:webHidden/>
           </w:rPr>
-          <w:instrText xml:space="preserve"> PAGEREF _Toc237977680 \h </w:instrText>
+          <w:instrText xml:space="preserve"> PAGEREF _Toc238277959 \h </w:instrText>
         </w:r>
         <w:r>
           <w:rPr>
@@ -1970,7 +1964,7 @@
             <w:noProof/>
             <w:webHidden/>
           </w:rPr>
-          <w:t>12</w:t>
+          <w:t>11</w:t>
         </w:r>
         <w:r>
           <w:rPr>
@@ -1999,7 +1993,7 @@
           <w14:ligatures w14:val="standardContextual"/>
         </w:rPr>
       </w:pPr>
-      <w:hyperlink w:anchor="_Toc237977681" w:history="1">
+      <w:hyperlink w:anchor="_Toc238277960" w:history="1">
         <w:r>
           <w:rPr>
             <w:rStyle w:val="aff1"/>
@@ -2026,7 +2020,7 @@
             <w:noProof/>
             <w:webHidden/>
           </w:rPr>
-          <w:instrText xml:space="preserve"> PAGEREF _Toc237977681 \h </w:instrText>
+          <w:instrText xml:space="preserve"> PAGEREF _Toc238277960 \h </w:instrText>
         </w:r>
         <w:r>
           <w:rPr>
@@ -2046,7 +2040,7 @@
             <w:noProof/>
             <w:webHidden/>
           </w:rPr>
-          <w:t>13</w:t>
+          <w:t>12</w:t>
         </w:r>
         <w:r>
           <w:rPr>
@@ -2074,7 +2068,7 @@
           <w14:ligatures w14:val="standardContextual"/>
         </w:rPr>
       </w:pPr>
-      <w:hyperlink w:anchor="_Toc237977682" w:history="1">
+      <w:hyperlink w:anchor="_Toc238277961" w:history="1">
         <w:r>
           <w:rPr>
             <w:rStyle w:val="aff1"/>
@@ -2101,7 +2095,7 @@
             <w:noProof/>
             <w:webHidden/>
           </w:rPr>
-          <w:instrText xml:space="preserve"> PAGEREF _Toc237977682 \h </w:instrText>
+          <w:instrText xml:space="preserve"> PAGEREF _Toc238277961 \h </w:instrText>
         </w:r>
         <w:r>
           <w:rPr>
@@ -2121,7 +2115,7 @@
             <w:noProof/>
             <w:webHidden/>
           </w:rPr>
-          <w:t>14</w:t>
+          <w:t>13</w:t>
         </w:r>
         <w:r>
           <w:rPr>
@@ -2150,7 +2144,7 @@
           <w14:ligatures w14:val="standardContextual"/>
         </w:rPr>
       </w:pPr>
-      <w:hyperlink w:anchor="_Toc237977683" w:history="1">
+      <w:hyperlink w:anchor="_Toc238277962" w:history="1">
         <w:r>
           <w:rPr>
             <w:rStyle w:val="aff1"/>
@@ -2177,7 +2171,7 @@
             <w:noProof/>
             <w:webHidden/>
           </w:rPr>
-          <w:instrText xml:space="preserve"> PAGEREF _Toc237977683 \h </w:instrText>
+          <w:instrText xml:space="preserve"> PAGEREF _Toc238277962 \h </w:instrText>
         </w:r>
         <w:r>
           <w:rPr>
@@ -2197,7 +2191,7 @@
             <w:noProof/>
             <w:webHidden/>
           </w:rPr>
-          <w:t>14</w:t>
+          <w:t>13</w:t>
         </w:r>
         <w:r>
           <w:rPr>
@@ -2226,7 +2220,7 @@
           <w14:ligatures w14:val="standardContextual"/>
         </w:rPr>
       </w:pPr>
-      <w:hyperlink w:anchor="_Toc237977684" w:history="1">
+      <w:hyperlink w:anchor="_Toc238277963" w:history="1">
         <w:r>
           <w:rPr>
             <w:rStyle w:val="aff1"/>
@@ -2253,7 +2247,7 @@
             <w:noProof/>
             <w:webHidden/>
           </w:rPr>
-          <w:instrText xml:space="preserve"> PAGEREF _Toc237977684 \h </w:instrText>
+          <w:instrText xml:space="preserve"> PAGEREF _Toc238277963 \h </w:instrText>
         </w:r>
         <w:r>
           <w:rPr>
@@ -2273,7 +2267,7 @@
             <w:noProof/>
             <w:webHidden/>
           </w:rPr>
-          <w:t>14</w:t>
+          <w:t>13</w:t>
         </w:r>
         <w:r>
           <w:rPr>
@@ -2302,7 +2296,7 @@
           <w14:ligatures w14:val="standardContextual"/>
         </w:rPr>
       </w:pPr>
-      <w:hyperlink w:anchor="_Toc237977685" w:history="1">
+      <w:hyperlink w:anchor="_Toc238277964" w:history="1">
         <w:r>
           <w:rPr>
             <w:rStyle w:val="aff1"/>
@@ -2329,7 +2323,7 @@
             <w:noProof/>
             <w:webHidden/>
           </w:rPr>
-          <w:instrText xml:space="preserve"> PAGEREF _Toc237977685 \h </w:instrText>
+          <w:instrText xml:space="preserve"> PAGEREF _Toc238277964 \h </w:instrText>
         </w:r>
         <w:r>
           <w:rPr>
@@ -2349,7 +2343,7 @@
             <w:noProof/>
             <w:webHidden/>
           </w:rPr>
-          <w:t>14</w:t>
+          <w:t>13</w:t>
         </w:r>
         <w:r>
           <w:rPr>
@@ -2378,7 +2372,7 @@
           <w14:ligatures w14:val="standardContextual"/>
         </w:rPr>
       </w:pPr>
-      <w:hyperlink w:anchor="_Toc237977686" w:history="1">
+      <w:hyperlink w:anchor="_Toc238277965" w:history="1">
         <w:r>
           <w:rPr>
             <w:rStyle w:val="aff1"/>
@@ -2405,7 +2399,7 @@
             <w:noProof/>
             <w:webHidden/>
           </w:rPr>
-          <w:instrText xml:space="preserve"> PAGEREF _Toc237977686 \h </w:instrText>
+          <w:instrText xml:space="preserve"> PAGEREF _Toc238277965 \h </w:instrText>
         </w:r>
         <w:r>
           <w:rPr>
@@ -2425,7 +2419,7 @@
             <w:noProof/>
             <w:webHidden/>
           </w:rPr>
-          <w:t>15</w:t>
+          <w:t>14</w:t>
         </w:r>
         <w:r>
           <w:rPr>
@@ -2454,7 +2448,7 @@
           <w14:ligatures w14:val="standardContextual"/>
         </w:rPr>
       </w:pPr>
-      <w:hyperlink w:anchor="_Toc237977687" w:history="1">
+      <w:hyperlink w:anchor="_Toc238277966" w:history="1">
         <w:r>
           <w:rPr>
             <w:rStyle w:val="aff1"/>
@@ -2481,7 +2475,7 @@
             <w:noProof/>
             <w:webHidden/>
           </w:rPr>
-          <w:instrText xml:space="preserve"> PAGEREF _Toc237977687 \h </w:instrText>
+          <w:instrText xml:space="preserve"> PAGEREF _Toc238277966 \h </w:instrText>
         </w:r>
         <w:r>
           <w:rPr>
@@ -2501,7 +2495,7 @@
             <w:noProof/>
             <w:webHidden/>
           </w:rPr>
-          <w:t>15</w:t>
+          <w:t>14</w:t>
         </w:r>
         <w:r>
           <w:rPr>
@@ -2530,7 +2524,7 @@
           <w14:ligatures w14:val="standardContextual"/>
         </w:rPr>
       </w:pPr>
-      <w:hyperlink w:anchor="_Toc237977688" w:history="1">
+      <w:hyperlink w:anchor="_Toc238277967" w:history="1">
         <w:r>
           <w:rPr>
             <w:rStyle w:val="aff1"/>
@@ -2557,7 +2551,7 @@
             <w:noProof/>
             <w:webHidden/>
           </w:rPr>
-          <w:instrText xml:space="preserve"> PAGEREF _Toc237977688 \h </w:instrText>
+          <w:instrText xml:space="preserve"> PAGEREF _Toc238277967 \h </w:instrText>
         </w:r>
         <w:r>
           <w:rPr>
@@ -2577,7 +2571,7 @@
             <w:noProof/>
             <w:webHidden/>
           </w:rPr>
-          <w:t>16</w:t>
+          <w:t>15</w:t>
         </w:r>
         <w:r>
           <w:rPr>
@@ -2605,7 +2599,7 @@
           <w14:ligatures w14:val="standardContextual"/>
         </w:rPr>
       </w:pPr>
-      <w:hyperlink w:anchor="_Toc237977689" w:history="1">
+      <w:hyperlink w:anchor="_Toc238277968" w:history="1">
         <w:r>
           <w:rPr>
             <w:rStyle w:val="aff1"/>
@@ -2632,7 +2626,7 @@
             <w:noProof/>
             <w:webHidden/>
           </w:rPr>
-          <w:instrText xml:space="preserve"> PAGEREF _Toc237977689 \h </w:instrText>
+          <w:instrText xml:space="preserve"> PAGEREF _Toc238277968 \h </w:instrText>
         </w:r>
         <w:r>
           <w:rPr>
@@ -2652,7 +2646,7 @@
             <w:noProof/>
             <w:webHidden/>
           </w:rPr>
-          <w:t>17</w:t>
+          <w:t>16</w:t>
         </w:r>
         <w:r>
           <w:rPr>
@@ -2681,7 +2675,7 @@
           <w14:ligatures w14:val="standardContextual"/>
         </w:rPr>
       </w:pPr>
-      <w:hyperlink w:anchor="_Toc237977690" w:history="1">
+      <w:hyperlink w:anchor="_Toc238277969" w:history="1">
         <w:r>
           <w:rPr>
             <w:rStyle w:val="aff1"/>
@@ -2708,7 +2702,7 @@
             <w:noProof/>
             <w:webHidden/>
           </w:rPr>
-          <w:instrText xml:space="preserve"> PAGEREF _Toc237977690 \h </w:instrText>
+          <w:instrText xml:space="preserve"> PAGEREF _Toc238277969 \h </w:instrText>
         </w:r>
         <w:r>
           <w:rPr>
@@ -2728,7 +2722,7 @@
             <w:noProof/>
             <w:webHidden/>
           </w:rPr>
-          <w:t>17</w:t>
+          <w:t>16</w:t>
         </w:r>
         <w:r>
           <w:rPr>
@@ -2757,7 +2751,7 @@
           <w14:ligatures w14:val="standardContextual"/>
         </w:rPr>
       </w:pPr>
-      <w:hyperlink w:anchor="_Toc237977691" w:history="1">
+      <w:hyperlink w:anchor="_Toc238277970" w:history="1">
         <w:r>
           <w:rPr>
             <w:rStyle w:val="aff1"/>
@@ -2784,7 +2778,7 @@
             <w:noProof/>
             <w:webHidden/>
           </w:rPr>
-          <w:instrText xml:space="preserve"> PAGEREF _Toc237977691 \h </w:instrText>
+          <w:instrText xml:space="preserve"> PAGEREF _Toc238277970 \h </w:instrText>
         </w:r>
         <w:r>
           <w:rPr>
@@ -2804,7 +2798,7 @@
             <w:noProof/>
             <w:webHidden/>
           </w:rPr>
-          <w:t>17</w:t>
+          <w:t>16</w:t>
         </w:r>
         <w:r>
           <w:rPr>
@@ -2833,7 +2827,7 @@
           <w14:ligatures w14:val="standardContextual"/>
         </w:rPr>
       </w:pPr>
-      <w:hyperlink w:anchor="_Toc237977692" w:history="1">
+      <w:hyperlink w:anchor="_Toc238277971" w:history="1">
         <w:r>
           <w:rPr>
             <w:rStyle w:val="aff1"/>
@@ -2860,7 +2854,7 @@
             <w:noProof/>
             <w:webHidden/>
           </w:rPr>
-          <w:instrText xml:space="preserve"> PAGEREF _Toc237977692 \h </w:instrText>
+          <w:instrText xml:space="preserve"> PAGEREF _Toc238277971 \h </w:instrText>
         </w:r>
         <w:r>
           <w:rPr>
@@ -2880,7 +2874,7 @@
             <w:noProof/>
             <w:webHidden/>
           </w:rPr>
-          <w:t>17</w:t>
+          <w:t>16</w:t>
         </w:r>
         <w:r>
           <w:rPr>
@@ -2909,7 +2903,7 @@
           <w14:ligatures w14:val="standardContextual"/>
         </w:rPr>
       </w:pPr>
-      <w:hyperlink w:anchor="_Toc237977693" w:history="1">
+      <w:hyperlink w:anchor="_Toc238277972" w:history="1">
         <w:r>
           <w:rPr>
             <w:rStyle w:val="aff1"/>
@@ -2936,7 +2930,7 @@
             <w:noProof/>
             <w:webHidden/>
           </w:rPr>
-          <w:instrText xml:space="preserve"> PAGEREF _Toc237977693 \h </w:instrText>
+          <w:instrText xml:space="preserve"> PAGEREF _Toc238277972 \h </w:instrText>
         </w:r>
         <w:r>
           <w:rPr>
@@ -2956,7 +2950,7 @@
             <w:noProof/>
             <w:webHidden/>
           </w:rPr>
-          <w:t>18</w:t>
+          <w:t>17</w:t>
         </w:r>
         <w:r>
           <w:rPr>
@@ -2985,7 +2979,7 @@
           <w14:ligatures w14:val="standardContextual"/>
         </w:rPr>
       </w:pPr>
-      <w:hyperlink w:anchor="_Toc237977694" w:history="1">
+      <w:hyperlink w:anchor="_Toc238277973" w:history="1">
         <w:r>
           <w:rPr>
             <w:rStyle w:val="aff1"/>
@@ -3012,7 +3006,7 @@
             <w:noProof/>
             <w:webHidden/>
           </w:rPr>
-          <w:instrText xml:space="preserve"> PAGEREF _Toc237977694 \h </w:instrText>
+          <w:instrText xml:space="preserve"> PAGEREF _Toc238277973 \h </w:instrText>
         </w:r>
         <w:r>
           <w:rPr>
@@ -3032,7 +3026,7 @@
             <w:noProof/>
             <w:webHidden/>
           </w:rPr>
-          <w:t>18</w:t>
+          <w:t>17</w:t>
         </w:r>
         <w:r>
           <w:rPr>
@@ -3060,7 +3054,7 @@
           <w14:ligatures w14:val="standardContextual"/>
         </w:rPr>
       </w:pPr>
-      <w:hyperlink w:anchor="_Toc237977695" w:history="1">
+      <w:hyperlink w:anchor="_Toc238277974" w:history="1">
         <w:r>
           <w:rPr>
             <w:rStyle w:val="aff1"/>
@@ -3087,7 +3081,7 @@
             <w:noProof/>
             <w:webHidden/>
           </w:rPr>
-          <w:instrText xml:space="preserve"> PAGEREF _Toc237977695 \h </w:instrText>
+          <w:instrText xml:space="preserve"> PAGEREF _Toc238277974 \h </w:instrText>
         </w:r>
         <w:r>
           <w:rPr>
@@ -3107,7 +3101,7 @@
             <w:noProof/>
             <w:webHidden/>
           </w:rPr>
-          <w:t>19</w:t>
+          <w:t>18</w:t>
         </w:r>
         <w:r>
           <w:rPr>
@@ -3136,7 +3130,7 @@
           <w14:ligatures w14:val="standardContextual"/>
         </w:rPr>
       </w:pPr>
-      <w:hyperlink w:anchor="_Toc237977696" w:history="1">
+      <w:hyperlink w:anchor="_Toc238277975" w:history="1">
         <w:r>
           <w:rPr>
             <w:rStyle w:val="aff1"/>
@@ -3163,7 +3157,7 @@
             <w:noProof/>
             <w:webHidden/>
           </w:rPr>
-          <w:instrText xml:space="preserve"> PAGEREF _Toc237977696 \h </w:instrText>
+          <w:instrText xml:space="preserve"> PAGEREF _Toc238277975 \h </w:instrText>
         </w:r>
         <w:r>
           <w:rPr>
@@ -3183,7 +3177,7 @@
             <w:noProof/>
             <w:webHidden/>
           </w:rPr>
-          <w:t>19</w:t>
+          <w:t>18</w:t>
         </w:r>
         <w:r>
           <w:rPr>
@@ -3212,7 +3206,7 @@
           <w14:ligatures w14:val="standardContextual"/>
         </w:rPr>
       </w:pPr>
-      <w:hyperlink w:anchor="_Toc237977697" w:history="1">
+      <w:hyperlink w:anchor="_Toc238277976" w:history="1">
         <w:r>
           <w:rPr>
             <w:rStyle w:val="aff1"/>
@@ -3239,7 +3233,7 @@
             <w:noProof/>
             <w:webHidden/>
           </w:rPr>
-          <w:instrText xml:space="preserve"> PAGEREF _Toc237977697 \h </w:instrText>
+          <w:instrText xml:space="preserve"> PAGEREF _Toc238277976 \h </w:instrText>
         </w:r>
         <w:r>
           <w:rPr>
@@ -3259,7 +3253,7 @@
             <w:noProof/>
             <w:webHidden/>
           </w:rPr>
-          <w:t>19</w:t>
+          <w:t>18</w:t>
         </w:r>
         <w:r>
           <w:rPr>
@@ -3288,7 +3282,7 @@
           <w14:ligatures w14:val="standardContextual"/>
         </w:rPr>
       </w:pPr>
-      <w:hyperlink w:anchor="_Toc237977698" w:history="1">
+      <w:hyperlink w:anchor="_Toc238277977" w:history="1">
         <w:r>
           <w:rPr>
             <w:rStyle w:val="aff1"/>
@@ -3315,15 +3309,7 @@
             <w:noProof/>
             <w:webHidden/>
           </w:rPr>
-          <w:instrText xml:space="preserve"> PAGEREF _Toc23797769</w:instrText>
-        </w:r>
-        <w:r>
-          <w:rPr>
-            <w:noProof/>
-            <w:webHidden/>
-          </w:rPr>
-          <w:lastRenderedPageBreak/>
-          <w:instrText xml:space="preserve">8 \h </w:instrText>
+          <w:instrText xml:space="preserve"> PAGEREF _Toc238277977 \h </w:instrText>
         </w:r>
         <w:r>
           <w:rPr>
@@ -3343,7 +3329,7 @@
             <w:noProof/>
             <w:webHidden/>
           </w:rPr>
-          <w:t>19</w:t>
+          <w:t>18</w:t>
         </w:r>
         <w:r>
           <w:rPr>
@@ -3372,7 +3358,7 @@
           <w14:ligatures w14:val="standardContextual"/>
         </w:rPr>
       </w:pPr>
-      <w:hyperlink w:anchor="_Toc237977699" w:history="1">
+      <w:hyperlink w:anchor="_Toc238277978" w:history="1">
         <w:r>
           <w:rPr>
             <w:rStyle w:val="aff1"/>
@@ -3399,7 +3385,7 @@
             <w:noProof/>
             <w:webHidden/>
           </w:rPr>
-          <w:instrText xml:space="preserve"> PAGEREF _Toc237977699 \h </w:instrText>
+          <w:instrText xml:space="preserve"> PAGEREF _Toc238277978 \h </w:instrText>
         </w:r>
         <w:r>
           <w:rPr>
@@ -3419,7 +3405,7 @@
             <w:noProof/>
             <w:webHidden/>
           </w:rPr>
-          <w:t>19</w:t>
+          <w:t>18</w:t>
         </w:r>
         <w:r>
           <w:rPr>
@@ -3448,7 +3434,7 @@
           <w14:ligatures w14:val="standardContextual"/>
         </w:rPr>
       </w:pPr>
-      <w:hyperlink w:anchor="_Toc237977700" w:history="1">
+      <w:hyperlink w:anchor="_Toc238277979" w:history="1">
         <w:r>
           <w:rPr>
             <w:rStyle w:val="aff1"/>
@@ -3475,7 +3461,7 @@
             <w:noProof/>
             <w:webHidden/>
           </w:rPr>
-          <w:instrText xml:space="preserve"> PAGEREF _Toc237977700 \h </w:instrText>
+          <w:instrText xml:space="preserve"> PAGEREF _Toc238277979 \h </w:instrText>
         </w:r>
         <w:r>
           <w:rPr>
@@ -3495,7 +3481,7 @@
             <w:noProof/>
             <w:webHidden/>
           </w:rPr>
-          <w:t>20</w:t>
+          <w:t>19</w:t>
         </w:r>
         <w:r>
           <w:rPr>
@@ -3524,7 +3510,7 @@
           <w14:ligatures w14:val="standardContextual"/>
         </w:rPr>
       </w:pPr>
-      <w:hyperlink w:anchor="_Toc237977701" w:history="1">
+      <w:hyperlink w:anchor="_Toc238277980" w:history="1">
         <w:r>
           <w:rPr>
             <w:rStyle w:val="aff1"/>
@@ -3551,7 +3537,7 @@
             <w:noProof/>
             <w:webHidden/>
           </w:rPr>
-          <w:instrText xml:space="preserve"> PAGEREF _Toc237977701 \h </w:instrText>
+          <w:instrText xml:space="preserve"> PAGEREF _Toc238277980 \h </w:instrText>
         </w:r>
         <w:r>
           <w:rPr>
@@ -3571,7 +3557,7 @@
             <w:noProof/>
             <w:webHidden/>
           </w:rPr>
-          <w:t>20</w:t>
+          <w:t>19</w:t>
         </w:r>
         <w:r>
           <w:rPr>
@@ -3600,7 +3586,7 @@
           <w14:ligatures w14:val="standardContextual"/>
         </w:rPr>
       </w:pPr>
-      <w:hyperlink w:anchor="_Toc237977702" w:history="1">
+      <w:hyperlink w:anchor="_Toc238277981" w:history="1">
         <w:r>
           <w:rPr>
             <w:rStyle w:val="aff1"/>
@@ -3627,7 +3613,7 @@
             <w:noProof/>
             <w:webHidden/>
           </w:rPr>
-          <w:instrText xml:space="preserve"> PAGEREF _Toc237977702 \h </w:instrText>
+          <w:instrText xml:space="preserve"> PAGEREF _Toc238277981 \h </w:instrText>
         </w:r>
         <w:r>
           <w:rPr>
@@ -3647,7 +3633,7 @@
             <w:noProof/>
             <w:webHidden/>
           </w:rPr>
-          <w:t>20</w:t>
+          <w:t>19</w:t>
         </w:r>
         <w:r>
           <w:rPr>
@@ -3676,7 +3662,7 @@
           <w14:ligatures w14:val="standardContextual"/>
         </w:rPr>
       </w:pPr>
-      <w:hyperlink w:anchor="_Toc237977703" w:history="1">
+      <w:hyperlink w:anchor="_Toc238277982" w:history="1">
         <w:r>
           <w:rPr>
             <w:rStyle w:val="aff1"/>
@@ -3703,7 +3689,7 @@
             <w:noProof/>
             <w:webHidden/>
           </w:rPr>
-          <w:instrText xml:space="preserve"> PAGEREF _Toc237977703 \h </w:instrText>
+          <w:instrText xml:space="preserve"> PAGEREF _Toc238277982 \h </w:instrText>
         </w:r>
         <w:r>
           <w:rPr>
@@ -3723,7 +3709,7 @@
             <w:noProof/>
             <w:webHidden/>
           </w:rPr>
-          <w:t>21</w:t>
+          <w:t>20</w:t>
         </w:r>
         <w:r>
           <w:rPr>
@@ -3752,7 +3738,7 @@
           <w14:ligatures w14:val="standardContextual"/>
         </w:rPr>
       </w:pPr>
-      <w:hyperlink w:anchor="_Toc237977704" w:history="1">
+      <w:hyperlink w:anchor="_Toc238277983" w:history="1">
         <w:r>
           <w:rPr>
             <w:rStyle w:val="aff1"/>
@@ -3779,7 +3765,7 @@
             <w:noProof/>
             <w:webHidden/>
           </w:rPr>
-          <w:instrText xml:space="preserve"> PAGEREF _Toc237977704 \h </w:instrText>
+          <w:instrText xml:space="preserve"> PAGEREF _Toc238277983 \h </w:instrText>
         </w:r>
         <w:r>
           <w:rPr>
@@ -3799,7 +3785,7 @@
             <w:noProof/>
             <w:webHidden/>
           </w:rPr>
-          <w:t>21</w:t>
+          <w:t>20</w:t>
         </w:r>
         <w:r>
           <w:rPr>
@@ -3827,7 +3813,7 @@
           <w14:ligatures w14:val="standardContextual"/>
         </w:rPr>
       </w:pPr>
-      <w:hyperlink w:anchor="_Toc237977705" w:history="1">
+      <w:hyperlink w:anchor="_Toc238277984" w:history="1">
         <w:r>
           <w:rPr>
             <w:rStyle w:val="aff1"/>
@@ -3854,7 +3840,7 @@
             <w:noProof/>
             <w:webHidden/>
           </w:rPr>
-          <w:instrText xml:space="preserve"> PAGEREF _Toc237977705 \h </w:instrText>
+          <w:instrText xml:space="preserve"> PAGEREF _Toc238277984 \h </w:instrText>
         </w:r>
         <w:r>
           <w:rPr>
@@ -3874,7 +3860,7 @@
             <w:noProof/>
             <w:webHidden/>
           </w:rPr>
-          <w:t>22</w:t>
+          <w:t>21</w:t>
         </w:r>
         <w:r>
           <w:rPr>
@@ -3903,7 +3889,7 @@
           <w14:ligatures w14:val="standardContextual"/>
         </w:rPr>
       </w:pPr>
-      <w:hyperlink w:anchor="_Toc237977706" w:history="1">
+      <w:hyperlink w:anchor="_Toc238277985" w:history="1">
         <w:r>
           <w:rPr>
             <w:rStyle w:val="aff1"/>
@@ -3930,7 +3916,7 @@
             <w:noProof/>
             <w:webHidden/>
           </w:rPr>
-          <w:instrText xml:space="preserve"> PAGEREF _Toc237977706 \h </w:instrText>
+          <w:instrText xml:space="preserve"> PAGEREF _Toc238277985 \h </w:instrText>
         </w:r>
         <w:r>
           <w:rPr>
@@ -3950,7 +3936,7 @@
             <w:noProof/>
             <w:webHidden/>
           </w:rPr>
-          <w:t>22</w:t>
+          <w:t>21</w:t>
         </w:r>
         <w:r>
           <w:rPr>
@@ -3979,7 +3965,7 @@
           <w14:ligatures w14:val="standardContextual"/>
         </w:rPr>
       </w:pPr>
-      <w:hyperlink w:anchor="_Toc237977707" w:history="1">
+      <w:hyperlink w:anchor="_Toc238277986" w:history="1">
         <w:r>
           <w:rPr>
             <w:rStyle w:val="aff1"/>
@@ -4006,7 +3992,7 @@
             <w:noProof/>
             <w:webHidden/>
           </w:rPr>
-          <w:instrText xml:space="preserve"> PAGEREF _Toc237977707 \h </w:instrText>
+          <w:instrText xml:space="preserve"> PAGEREF _Toc238277986 \h </w:instrText>
         </w:r>
         <w:r>
           <w:rPr>
@@ -4026,7 +4012,7 @@
             <w:noProof/>
             <w:webHidden/>
           </w:rPr>
-          <w:t>22</w:t>
+          <w:t>21</w:t>
         </w:r>
         <w:r>
           <w:rPr>
@@ -4055,7 +4041,7 @@
           <w14:ligatures w14:val="standardContextual"/>
         </w:rPr>
       </w:pPr>
-      <w:hyperlink w:anchor="_Toc237977708" w:history="1">
+      <w:hyperlink w:anchor="_Toc238277987" w:history="1">
         <w:r>
           <w:rPr>
             <w:rStyle w:val="aff1"/>
@@ -4082,7 +4068,7 @@
             <w:noProof/>
             <w:webHidden/>
           </w:rPr>
-          <w:instrText xml:space="preserve"> PAGEREF _Toc237977708 \h </w:instrText>
+          <w:instrText xml:space="preserve"> PAGEREF _Toc238277987 \h </w:instrText>
         </w:r>
         <w:r>
           <w:rPr>
@@ -4102,7 +4088,7 @@
             <w:noProof/>
             <w:webHidden/>
           </w:rPr>
-          <w:t>22</w:t>
+          <w:t>21</w:t>
         </w:r>
         <w:r>
           <w:rPr>
@@ -4131,7 +4117,7 @@
           <w14:ligatures w14:val="standardContextual"/>
         </w:rPr>
       </w:pPr>
-      <w:hyperlink w:anchor="_Toc237977709" w:history="1">
+      <w:hyperlink w:anchor="_Toc238277988" w:history="1">
         <w:r>
           <w:rPr>
             <w:rStyle w:val="aff1"/>
@@ -4158,7 +4144,7 @@
             <w:noProof/>
             <w:webHidden/>
           </w:rPr>
-          <w:instrText xml:space="preserve"> PAGEREF _Toc237977709 \h </w:instrText>
+          <w:instrText xml:space="preserve"> PAGEREF _Toc238277988 \h </w:instrText>
         </w:r>
         <w:r>
           <w:rPr>
@@ -4178,7 +4164,7 @@
             <w:noProof/>
             <w:webHidden/>
           </w:rPr>
-          <w:t>23</w:t>
+          <w:t>22</w:t>
         </w:r>
         <w:r>
           <w:rPr>
@@ -4207,7 +4193,7 @@
           <w14:ligatures w14:val="standardContextual"/>
         </w:rPr>
       </w:pPr>
-      <w:hyperlink w:anchor="_Toc237977710" w:history="1">
+      <w:hyperlink w:anchor="_Toc238277989" w:history="1">
         <w:r>
           <w:rPr>
             <w:rStyle w:val="aff1"/>
@@ -4234,7 +4220,7 @@
             <w:noProof/>
             <w:webHidden/>
           </w:rPr>
-          <w:instrText xml:space="preserve"> PAGEREF _Toc237977710 \h </w:instrText>
+          <w:instrText xml:space="preserve"> PAGEREF _Toc238277989 \h </w:instrText>
         </w:r>
         <w:r>
           <w:rPr>
@@ -4254,7 +4240,7 @@
             <w:noProof/>
             <w:webHidden/>
           </w:rPr>
-          <w:t>23</w:t>
+          <w:t>22</w:t>
         </w:r>
         <w:r>
           <w:rPr>
@@ -4283,7 +4269,7 @@
           <w14:ligatures w14:val="standardContextual"/>
         </w:rPr>
       </w:pPr>
-      <w:hyperlink w:anchor="_Toc237977711" w:history="1">
+      <w:hyperlink w:anchor="_Toc238277990" w:history="1">
         <w:r>
           <w:rPr>
             <w:rStyle w:val="aff1"/>
@@ -4310,7 +4296,7 @@
             <w:noProof/>
             <w:webHidden/>
           </w:rPr>
-          <w:instrText xml:space="preserve"> PAGEREF _Toc237977711 \h </w:instrText>
+          <w:instrText xml:space="preserve"> PAGEREF _Toc238277990 \h </w:instrText>
         </w:r>
         <w:r>
           <w:rPr>
@@ -4330,7 +4316,7 @@
             <w:noProof/>
             <w:webHidden/>
           </w:rPr>
-          <w:t>24</w:t>
+          <w:t>23</w:t>
         </w:r>
         <w:r>
           <w:rPr>
@@ -4359,7 +4345,7 @@
           <w14:ligatures w14:val="standardContextual"/>
         </w:rPr>
       </w:pPr>
-      <w:hyperlink w:anchor="_Toc237977712" w:history="1">
+      <w:hyperlink w:anchor="_Toc238277991" w:history="1">
         <w:r>
           <w:rPr>
             <w:rStyle w:val="aff1"/>
@@ -4386,7 +4372,7 @@
             <w:noProof/>
             <w:webHidden/>
           </w:rPr>
-          <w:instrText xml:space="preserve"> PAGEREF _Toc237977712 \h </w:instrText>
+          <w:instrText xml:space="preserve"> PAGEREF _Toc238277991 \h </w:instrText>
         </w:r>
         <w:r>
           <w:rPr>
@@ -4406,7 +4392,7 @@
             <w:noProof/>
             <w:webHidden/>
           </w:rPr>
-          <w:t>24</w:t>
+          <w:t>23</w:t>
         </w:r>
         <w:r>
           <w:rPr>
@@ -4435,7 +4421,7 @@
           <w14:ligatures w14:val="standardContextual"/>
         </w:rPr>
       </w:pPr>
-      <w:hyperlink w:anchor="_Toc237977713" w:history="1">
+      <w:hyperlink w:anchor="_Toc238277992" w:history="1">
         <w:r>
           <w:rPr>
             <w:rStyle w:val="aff1"/>
@@ -4462,7 +4448,7 @@
             <w:noProof/>
             <w:webHidden/>
           </w:rPr>
-          <w:instrText xml:space="preserve"> PAGEREF _Toc237977713 \h </w:instrText>
+          <w:instrText xml:space="preserve"> PAGEREF _Toc238277992 \h </w:instrText>
         </w:r>
         <w:r>
           <w:rPr>
@@ -4482,7 +4468,7 @@
             <w:noProof/>
             <w:webHidden/>
           </w:rPr>
-          <w:t>25</w:t>
+          <w:t>24</w:t>
         </w:r>
         <w:r>
           <w:rPr>
@@ -4510,7 +4496,7 @@
           <w14:ligatures w14:val="standardContextual"/>
         </w:rPr>
       </w:pPr>
-      <w:hyperlink w:anchor="_Toc237977714" w:history="1">
+      <w:hyperlink w:anchor="_Toc238277993" w:history="1">
         <w:r>
           <w:rPr>
             <w:rStyle w:val="aff1"/>
@@ -4537,7 +4523,7 @@
             <w:noProof/>
             <w:webHidden/>
           </w:rPr>
-          <w:instrText xml:space="preserve"> PAGEREF _Toc237977714 \h </w:instrText>
+          <w:instrText xml:space="preserve"> PAGEREF _Toc238277993 \h </w:instrText>
         </w:r>
         <w:r>
           <w:rPr>
@@ -4557,7 +4543,7 @@
             <w:noProof/>
             <w:webHidden/>
           </w:rPr>
-          <w:t>26</w:t>
+          <w:t>25</w:t>
         </w:r>
         <w:r>
           <w:rPr>
@@ -4586,7 +4572,7 @@
           <w14:ligatures w14:val="standardContextual"/>
         </w:rPr>
       </w:pPr>
-      <w:hyperlink w:anchor="_Toc237977715" w:history="1">
+      <w:hyperlink w:anchor="_Toc238277994" w:history="1">
         <w:r>
           <w:rPr>
             <w:rStyle w:val="aff1"/>
@@ -4613,7 +4599,7 @@
             <w:noProof/>
             <w:webHidden/>
           </w:rPr>
-          <w:instrText xml:space="preserve"> PAGEREF _Toc237977715 \h </w:instrText>
+          <w:instrText xml:space="preserve"> PAGEREF _Toc238277994 \h </w:instrText>
         </w:r>
         <w:r>
           <w:rPr>
@@ -4633,7 +4619,7 @@
             <w:noProof/>
             <w:webHidden/>
           </w:rPr>
-          <w:t>26</w:t>
+          <w:t>25</w:t>
         </w:r>
         <w:r>
           <w:rPr>
@@ -4662,7 +4648,7 @@
           <w14:ligatures w14:val="standardContextual"/>
         </w:rPr>
       </w:pPr>
-      <w:hyperlink w:anchor="_Toc237977716" w:history="1">
+      <w:hyperlink w:anchor="_Toc238277995" w:history="1">
         <w:r>
           <w:rPr>
             <w:rStyle w:val="aff1"/>
@@ -4689,7 +4675,7 @@
             <w:noProof/>
             <w:webHidden/>
           </w:rPr>
-          <w:instrText xml:space="preserve"> PAGEREF _Toc237977716 \h </w:instrText>
+          <w:instrText xml:space="preserve"> PAGEREF _Toc238277995 \h </w:instrText>
         </w:r>
         <w:r>
           <w:rPr>
@@ -4709,7 +4695,7 @@
             <w:noProof/>
             <w:webHidden/>
           </w:rPr>
-          <w:t>26</w:t>
+          <w:t>25</w:t>
         </w:r>
         <w:r>
           <w:rPr>
@@ -4738,7 +4724,7 @@
           <w14:ligatures w14:val="standardContextual"/>
         </w:rPr>
       </w:pPr>
-      <w:hyperlink w:anchor="_Toc237977717" w:history="1">
+      <w:hyperlink w:anchor="_Toc238277996" w:history="1">
         <w:r>
           <w:rPr>
             <w:rStyle w:val="aff1"/>
@@ -4765,7 +4751,7 @@
             <w:noProof/>
             <w:webHidden/>
           </w:rPr>
-          <w:instrText xml:space="preserve"> PAGEREF _Toc237977717 \h </w:instrText>
+          <w:instrText xml:space="preserve"> PAGEREF _Toc238277996 \h </w:instrText>
         </w:r>
         <w:r>
           <w:rPr>
@@ -4785,7 +4771,7 @@
             <w:noProof/>
             <w:webHidden/>
           </w:rPr>
-          <w:t>26</w:t>
+          <w:t>25</w:t>
         </w:r>
         <w:r>
           <w:rPr>
@@ -4814,7 +4800,7 @@
           <w14:ligatures w14:val="standardContextual"/>
         </w:rPr>
       </w:pPr>
-      <w:hyperlink w:anchor="_Toc237977718" w:history="1">
+      <w:hyperlink w:anchor="_Toc238277997" w:history="1">
         <w:r>
           <w:rPr>
             <w:rStyle w:val="aff1"/>
@@ -4841,7 +4827,7 @@
             <w:noProof/>
             <w:webHidden/>
           </w:rPr>
-          <w:instrText xml:space="preserve"> PAGEREF _Toc237977718 \h </w:instrText>
+          <w:instrText xml:space="preserve"> PAGEREF _Toc238277997 \h </w:instrText>
         </w:r>
         <w:r>
           <w:rPr>
@@ -4861,7 +4847,7 @@
             <w:noProof/>
             <w:webHidden/>
           </w:rPr>
-          <w:t>27</w:t>
+          <w:t>26</w:t>
         </w:r>
         <w:r>
           <w:rPr>
@@ -4890,7 +4876,7 @@
           <w14:ligatures w14:val="standardContextual"/>
         </w:rPr>
       </w:pPr>
-      <w:hyperlink w:anchor="_Toc237977719" w:history="1">
+      <w:hyperlink w:anchor="_Toc238277998" w:history="1">
         <w:r>
           <w:rPr>
             <w:rStyle w:val="aff1"/>
@@ -4917,7 +4903,7 @@
             <w:noProof/>
             <w:webHidden/>
           </w:rPr>
-          <w:instrText xml:space="preserve"> PAGEREF _Toc237977719 \h </w:instrText>
+          <w:instrText xml:space="preserve"> PAGEREF _Toc238277998 \h </w:instrText>
         </w:r>
         <w:r>
           <w:rPr>
@@ -4937,7 +4923,7 @@
             <w:noProof/>
             <w:webHidden/>
           </w:rPr>
-          <w:t>27</w:t>
+          <w:t>26</w:t>
         </w:r>
         <w:r>
           <w:rPr>
@@ -4966,7 +4952,7 @@
           <w14:ligatures w14:val="standardContextual"/>
         </w:rPr>
       </w:pPr>
-      <w:hyperlink w:anchor="_Toc237977720" w:history="1">
+      <w:hyperlink w:anchor="_Toc238277999" w:history="1">
         <w:r>
           <w:rPr>
             <w:rStyle w:val="aff1"/>
@@ -4993,7 +4979,7 @@
             <w:noProof/>
             <w:webHidden/>
           </w:rPr>
-          <w:instrText xml:space="preserve"> PAGEREF _Toc237977720 \h </w:instrText>
+          <w:instrText xml:space="preserve"> PAGEREF _Toc238277999 \h </w:instrText>
         </w:r>
         <w:r>
           <w:rPr>
@@ -5013,7 +4999,7 @@
             <w:noProof/>
             <w:webHidden/>
           </w:rPr>
-          <w:t>27</w:t>
+          <w:t>26</w:t>
         </w:r>
         <w:r>
           <w:rPr>
@@ -5042,7 +5028,7 @@
           <w14:ligatures w14:val="standardContextual"/>
         </w:rPr>
       </w:pPr>
-      <w:hyperlink w:anchor="_Toc237977721" w:history="1">
+      <w:hyperlink w:anchor="_Toc238278000" w:history="1">
         <w:r>
           <w:rPr>
             <w:rStyle w:val="aff1"/>
@@ -5069,7 +5055,7 @@
             <w:noProof/>
             <w:webHidden/>
           </w:rPr>
-          <w:instrText xml:space="preserve"> PAGEREF _Toc237977721 \h </w:instrText>
+          <w:instrText xml:space="preserve"> PAGEREF _Toc238278000 \h </w:instrText>
         </w:r>
         <w:r>
           <w:rPr>
@@ -5089,7 +5075,7 @@
             <w:noProof/>
             <w:webHidden/>
           </w:rPr>
-          <w:t>28</w:t>
+          <w:t>27</w:t>
         </w:r>
         <w:r>
           <w:rPr>
@@ -5117,7 +5103,7 @@
           <w14:ligatures w14:val="standardContextual"/>
         </w:rPr>
       </w:pPr>
-      <w:hyperlink w:anchor="_Toc237977722" w:history="1">
+      <w:hyperlink w:anchor="_Toc238278001" w:history="1">
         <w:r>
           <w:rPr>
             <w:rStyle w:val="aff1"/>
@@ -5144,7 +5130,7 @@
             <w:noProof/>
             <w:webHidden/>
           </w:rPr>
-          <w:instrText xml:space="preserve"> PAGEREF _Toc237977722 \h </w:instrText>
+          <w:instrText xml:space="preserve"> PAGEREF _Toc238278001 \h </w:instrText>
         </w:r>
         <w:r>
           <w:rPr>
@@ -5164,7 +5150,7 @@
             <w:noProof/>
             <w:webHidden/>
           </w:rPr>
-          <w:t>29</w:t>
+          <w:t>28</w:t>
         </w:r>
         <w:r>
           <w:rPr>
@@ -5192,7 +5178,7 @@
           <w14:ligatures w14:val="standardContextual"/>
         </w:rPr>
       </w:pPr>
-      <w:hyperlink w:anchor="_Toc237977723" w:history="1">
+      <w:hyperlink w:anchor="_Toc238278002" w:history="1">
         <w:r>
           <w:rPr>
             <w:rStyle w:val="aff1"/>
@@ -5219,7 +5205,7 @@
             <w:noProof/>
             <w:webHidden/>
           </w:rPr>
-          <w:instrText xml:space="preserve"> PAGEREF _Toc237977723 \h </w:instrText>
+          <w:instrText xml:space="preserve"> PAGEREF _Toc238278002 \h </w:instrText>
         </w:r>
         <w:r>
           <w:rPr>
@@ -5239,7 +5225,7 @@
             <w:noProof/>
             <w:webHidden/>
           </w:rPr>
-          <w:t>30</w:t>
+          <w:t>29</w:t>
         </w:r>
         <w:r>
           <w:rPr>
@@ -5267,7 +5253,7 @@
           <w14:ligatures w14:val="standardContextual"/>
         </w:rPr>
       </w:pPr>
-      <w:hyperlink w:anchor="_Toc237977724" w:history="1">
+      <w:hyperlink w:anchor="_Toc238278003" w:history="1">
         <w:r>
           <w:rPr>
             <w:rStyle w:val="aff1"/>
@@ -5294,7 +5280,7 @@
             <w:noProof/>
             <w:webHidden/>
           </w:rPr>
-          <w:instrText xml:space="preserve"> PAGEREF _Toc237977724 \h </w:instrText>
+          <w:instrText xml:space="preserve"> PAGEREF _Toc238278003 \h </w:instrText>
         </w:r>
         <w:r>
           <w:rPr>
@@ -5314,7 +5300,7 @@
             <w:noProof/>
             <w:webHidden/>
           </w:rPr>
-          <w:t>31</w:t>
+          <w:t>30</w:t>
         </w:r>
         <w:r>
           <w:rPr>
@@ -5331,19 +5317,6 @@
       </w:pPr>
       <w:r>
         <w:fldChar w:fldCharType="end"/>
-      </w:r>
-    </w:p>
-    <w:p>
-      <w:pPr>
-        <w:pStyle w:val="CaptionCustom"/>
-      </w:pPr>
-      <w:r>
-        <w:t>문서를 연 뒤 Ctrl+A → F9로 목차와 페이지 번호를 갱신하세요.</w:t>
-      </w:r>
-    </w:p>
-    <w:p>
-      <w:r>
-        <w:br w:type="page"/>
       </w:r>
     </w:p>
     <w:p>
@@ -5354,9 +5327,8 @@
           <w:numId w:val="7"/>
         </w:numPr>
       </w:pPr>
-      <w:bookmarkStart w:id="0" w:name="_Toc237977662"/>
-      <w:r>
-        <w:lastRenderedPageBreak/>
+      <w:bookmarkStart w:id="0" w:name="_Toc238277941"/>
+      <w:r>
         <w:t>게임</w:t>
       </w:r>
       <w:r>
@@ -5387,7 +5359,7 @@
           <w:numId w:val="7"/>
         </w:numPr>
       </w:pPr>
-      <w:bookmarkStart w:id="1" w:name="_Toc237977663"/>
+      <w:bookmarkStart w:id="1" w:name="_Toc238277942"/>
       <w:r>
         <w:t>Executive Summary</w:t>
       </w:r>
@@ -5416,6 +5388,7 @@
       </w:tblGrid>
       <w:tr>
         <w:trPr>
+          <w:cantSplit/>
           <w:jc w:val="center"/>
         </w:trPr>
         <w:tc>
@@ -5454,7 +5427,7 @@
           <w:numId w:val="7"/>
         </w:numPr>
       </w:pPr>
-      <w:bookmarkStart w:id="2" w:name="_Toc237977664"/>
+      <w:bookmarkStart w:id="2" w:name="_Toc238277943"/>
       <w:r>
         <w:t>Rev 14 Release Profile</w:t>
       </w:r>
@@ -5706,7 +5679,7 @@
           <w:numId w:val="7"/>
         </w:numPr>
       </w:pPr>
-      <w:bookmarkStart w:id="3" w:name="_Toc237977665"/>
+      <w:bookmarkStart w:id="3" w:name="_Toc238277944"/>
       <w:r>
         <w:t>제품</w:t>
       </w:r>
@@ -5736,7 +5709,6 @@
       <w:tr>
         <w:trPr>
           <w:cantSplit/>
-          <w:tblHeader/>
           <w:jc w:val="center"/>
         </w:trPr>
         <w:tc>
@@ -5955,7 +5927,6 @@
         </w:numPr>
       </w:pPr>
       <w:r>
-        <w:lastRenderedPageBreak/>
         <w:t>W8은 세 맵 Release Shape와 Feature Lock 준비 구간이다.</w:t>
       </w:r>
     </w:p>
@@ -5991,7 +5962,7 @@
           <w:numId w:val="7"/>
         </w:numPr>
       </w:pPr>
-      <w:bookmarkStart w:id="4" w:name="_Toc237977666"/>
+      <w:bookmarkStart w:id="4" w:name="_Toc238277945"/>
       <w:r>
         <w:t>디자인</w:t>
       </w:r>
@@ -6019,7 +5990,6 @@
       <w:tr>
         <w:trPr>
           <w:cantSplit/>
-          <w:tblHeader/>
           <w:jc w:val="center"/>
         </w:trPr>
         <w:tc>
@@ -6307,7 +6277,7 @@
           <w:numId w:val="7"/>
         </w:numPr>
       </w:pPr>
-      <w:bookmarkStart w:id="5" w:name="_Toc237977667"/>
+      <w:bookmarkStart w:id="5" w:name="_Toc238277946"/>
       <w:r>
         <w:t>Target Experience</w:t>
       </w:r>
@@ -6381,7 +6351,7 @@
           <w:numId w:val="7"/>
         </w:numPr>
       </w:pPr>
-      <w:bookmarkStart w:id="6" w:name="_Toc237977668"/>
+      <w:bookmarkStart w:id="6" w:name="_Toc238277947"/>
       <w:r>
         <w:t>명시적</w:t>
       </w:r>
@@ -6408,7 +6378,6 @@
       <w:tr>
         <w:trPr>
           <w:cantSplit/>
-          <w:tblHeader/>
           <w:jc w:val="center"/>
         </w:trPr>
         <w:tc>
@@ -6648,9 +6617,8 @@
           <w:numId w:val="7"/>
         </w:numPr>
       </w:pPr>
-      <w:bookmarkStart w:id="7" w:name="_Toc237977669"/>
-      <w:r>
-        <w:lastRenderedPageBreak/>
+      <w:bookmarkStart w:id="7" w:name="_Toc238277948"/>
+      <w:r>
         <w:t>Contract Run</w:t>
       </w:r>
       <w:r>
@@ -6684,7 +6652,7 @@
           <w:numId w:val="7"/>
         </w:numPr>
       </w:pPr>
-      <w:bookmarkStart w:id="8" w:name="_Toc237977670"/>
+      <w:bookmarkStart w:id="8" w:name="_Toc238277949"/>
       <w:r>
         <w:t>Core Loop</w:t>
       </w:r>
@@ -6706,7 +6674,6 @@
       <w:tr>
         <w:trPr>
           <w:cantSplit/>
-          <w:tblHeader/>
           <w:jc w:val="center"/>
         </w:trPr>
         <w:tc>
@@ -6992,7 +6959,11 @@
           </w:tcPr>
           <w:p>
             <w:r>
-              <w:t>5. 검토·교체·운반</w:t>
+              <w:t>5. 검토·</w:t>
+            </w:r>
+            <w:r>
+              <w:br/>
+              <w:t>교체·운반</w:t>
             </w:r>
           </w:p>
         </w:tc>
@@ -7168,7 +7139,7 @@
           <w:numId w:val="7"/>
         </w:numPr>
       </w:pPr>
-      <w:bookmarkStart w:id="9" w:name="_Toc237977671"/>
+      <w:bookmarkStart w:id="9" w:name="_Toc238277950"/>
       <w:r>
         <w:t xml:space="preserve">Contract </w:t>
       </w:r>
@@ -7205,7 +7176,6 @@
       <w:tr>
         <w:trPr>
           <w:cantSplit/>
-          <w:tblHeader/>
           <w:jc w:val="center"/>
         </w:trPr>
         <w:tc>
@@ -7586,9 +7556,8 @@
           <w:numId w:val="7"/>
         </w:numPr>
       </w:pPr>
-      <w:bookmarkStart w:id="10" w:name="_Toc237977672"/>
-      <w:r>
-        <w:lastRenderedPageBreak/>
+      <w:bookmarkStart w:id="10" w:name="_Toc238277951"/>
+      <w:r>
         <w:t>성공</w:t>
       </w:r>
       <w:r>
@@ -7627,7 +7596,6 @@
       <w:tr>
         <w:trPr>
           <w:cantSplit/>
-          <w:tblHeader/>
           <w:jc w:val="center"/>
         </w:trPr>
         <w:tc>
@@ -7872,7 +7840,7 @@
           <w:numId w:val="7"/>
         </w:numPr>
       </w:pPr>
-      <w:bookmarkStart w:id="11" w:name="_Toc237977673"/>
+      <w:bookmarkStart w:id="11" w:name="_Toc238277952"/>
       <w:r>
         <w:t>Greed Decision</w:t>
       </w:r>
@@ -7899,7 +7867,6 @@
       <w:tr>
         <w:trPr>
           <w:cantSplit/>
-          <w:tblHeader/>
           <w:jc w:val="center"/>
         </w:trPr>
         <w:tc>
@@ -8235,7 +8202,7 @@
           <w:numId w:val="7"/>
         </w:numPr>
       </w:pPr>
-      <w:bookmarkStart w:id="12" w:name="_Toc237977674"/>
+      <w:bookmarkStart w:id="12" w:name="_Toc238277953"/>
       <w:r>
         <w:t>15~25</w:t>
       </w:r>
@@ -8263,7 +8230,6 @@
       <w:tr>
         <w:trPr>
           <w:cantSplit/>
-          <w:tblHeader/>
           <w:jc w:val="center"/>
         </w:trPr>
         <w:tc>
@@ -8599,9 +8565,8 @@
           <w:numId w:val="7"/>
         </w:numPr>
       </w:pPr>
-      <w:bookmarkStart w:id="13" w:name="_Toc237977675"/>
-      <w:r>
-        <w:lastRenderedPageBreak/>
+      <w:bookmarkStart w:id="13" w:name="_Toc238277954"/>
+      <w:r>
         <w:t>위조와</w:t>
       </w:r>
       <w:r>
@@ -8626,7 +8591,7 @@
           <w:numId w:val="7"/>
         </w:numPr>
       </w:pPr>
-      <w:bookmarkStart w:id="14" w:name="_Toc237977676"/>
+      <w:bookmarkStart w:id="14" w:name="_Toc238277955"/>
       <w:r>
         <w:t>Artifact</w:t>
       </w:r>
@@ -8670,7 +8635,6 @@
       <w:tr>
         <w:trPr>
           <w:cantSplit/>
-          <w:tblHeader/>
           <w:jc w:val="center"/>
         </w:trPr>
         <w:tc>
@@ -8909,7 +8873,7 @@
           <w:numId w:val="7"/>
         </w:numPr>
       </w:pPr>
-      <w:bookmarkStart w:id="15" w:name="_Toc237977677"/>
+      <w:bookmarkStart w:id="15" w:name="_Toc238277956"/>
       <w:r>
         <w:t xml:space="preserve">Surface Forgery </w:t>
       </w:r>
@@ -8969,7 +8933,6 @@
         </w:numPr>
       </w:pPr>
       <w:r>
-        <w:lastRenderedPageBreak/>
         <w:t>기본 40초, 최소 20초, 최대 45초 안에 Quality 70 이상으로 Submit한다. Timeout은 현재 Stroke와 Preview를 폐기하고 Replica를 만들지 않으며, Case 근처의 유효한 Guard 한 명만 한 번 InvestigateNoise로 보낸다. Timeout 자체는 Alert를 올리지 않는다.</w:t>
       </w:r>
     </w:p>
@@ -9034,6 +8997,7 @@
       </w:tblGrid>
       <w:tr>
         <w:trPr>
+          <w:cantSplit/>
           <w:jc w:val="center"/>
         </w:trPr>
         <w:tc>
@@ -9087,7 +9051,7 @@
           <w:numId w:val="7"/>
         </w:numPr>
       </w:pPr>
-      <w:bookmarkStart w:id="16" w:name="_Toc237977678"/>
+      <w:bookmarkStart w:id="16" w:name="_Toc238277957"/>
       <w:r>
         <w:t>Object Assembly — Deferred Expansion</w:t>
       </w:r>
@@ -9154,9 +9118,8 @@
           <w:numId w:val="7"/>
         </w:numPr>
       </w:pPr>
-      <w:bookmarkStart w:id="17" w:name="_Toc237977679"/>
-      <w:r>
-        <w:lastRenderedPageBreak/>
+      <w:bookmarkStart w:id="17" w:name="_Toc238277958"/>
+      <w:r>
         <w:t>Quality</w:t>
       </w:r>
       <w:r>
@@ -9184,7 +9147,6 @@
       <w:tr>
         <w:trPr>
           <w:cantSplit/>
-          <w:tblHeader/>
           <w:jc w:val="center"/>
         </w:trPr>
         <w:tc>
@@ -9429,7 +9391,7 @@
           <w:numId w:val="7"/>
         </w:numPr>
       </w:pPr>
-      <w:bookmarkStart w:id="18" w:name="_Toc237977680"/>
+      <w:bookmarkStart w:id="18" w:name="_Toc238277959"/>
       <w:r>
         <w:t>핵심</w:t>
       </w:r>
@@ -9465,7 +9427,6 @@
       <w:tr>
         <w:trPr>
           <w:cantSplit/>
-          <w:tblHeader/>
           <w:jc w:val="center"/>
         </w:trPr>
         <w:tc>
@@ -9922,7 +9883,7 @@
           <w:numId w:val="7"/>
         </w:numPr>
       </w:pPr>
-      <w:bookmarkStart w:id="19" w:name="_Toc237977681"/>
+      <w:bookmarkStart w:id="19" w:name="_Toc238277960"/>
       <w:r>
         <w:t xml:space="preserve">Owner-only Forgery </w:t>
       </w:r>
@@ -9952,6 +9913,7 @@
       </w:tblGrid>
       <w:tr>
         <w:trPr>
+          <w:cantSplit/>
           <w:jc w:val="center"/>
         </w:trPr>
         <w:tc>
@@ -10011,6 +9973,7 @@
       </w:tr>
       <w:tr>
         <w:trPr>
+          <w:cantSplit/>
           <w:jc w:val="center"/>
         </w:trPr>
         <w:tc>
@@ -10090,6 +10053,7 @@
       </w:tr>
       <w:tr>
         <w:trPr>
+          <w:cantSplit/>
           <w:jc w:val="center"/>
         </w:trPr>
         <w:tc>
@@ -10156,9 +10120,8 @@
           <w:numId w:val="7"/>
         </w:numPr>
       </w:pPr>
-      <w:bookmarkStart w:id="20" w:name="_Toc237977682"/>
-      <w:r>
-        <w:lastRenderedPageBreak/>
+      <w:bookmarkStart w:id="20" w:name="_Toc238277961"/>
+      <w:r>
         <w:t>잠입</w:t>
       </w:r>
       <w:r>
@@ -10189,7 +10152,7 @@
           <w:numId w:val="7"/>
         </w:numPr>
       </w:pPr>
-      <w:bookmarkStart w:id="21" w:name="_Toc237977683"/>
+      <w:bookmarkStart w:id="21" w:name="_Toc238277962"/>
       <w:r>
         <w:t xml:space="preserve">First-Person </w:t>
       </w:r>
@@ -10254,7 +10217,7 @@
           <w:numId w:val="7"/>
         </w:numPr>
       </w:pPr>
-      <w:bookmarkStart w:id="22" w:name="_Toc237977684"/>
+      <w:bookmarkStart w:id="22" w:name="_Toc238277963"/>
       <w:r>
         <w:t>Walk, Sprint, Weight, Footstep</w:t>
       </w:r>
@@ -10277,7 +10240,6 @@
       <w:tr>
         <w:trPr>
           <w:cantSplit/>
-          <w:tblHeader/>
           <w:jc w:val="center"/>
         </w:trPr>
         <w:tc>
@@ -10590,7 +10552,7 @@
           <w:numId w:val="7"/>
         </w:numPr>
       </w:pPr>
-      <w:bookmarkStart w:id="23" w:name="_Toc237977685"/>
+      <w:bookmarkStart w:id="23" w:name="_Toc238277964"/>
       <w:r>
         <w:t>Patrol Guard</w:t>
       </w:r>
@@ -10615,6 +10577,7 @@
       </w:tblGrid>
       <w:tr>
         <w:trPr>
+          <w:cantSplit/>
           <w:jc w:val="center"/>
         </w:trPr>
         <w:tc>
@@ -10657,7 +10620,6 @@
       <w:tr>
         <w:trPr>
           <w:cantSplit/>
-          <w:tblHeader/>
           <w:jc w:val="center"/>
         </w:trPr>
         <w:tc>
@@ -10850,7 +10812,6 @@
               <w:pStyle w:val="TableText"/>
             </w:pPr>
             <w:r>
-              <w:lastRenderedPageBreak/>
               <w:t>Searching</w:t>
             </w:r>
           </w:p>
@@ -10994,7 +10955,7 @@
           <w:numId w:val="7"/>
         </w:numPr>
       </w:pPr>
-      <w:bookmarkStart w:id="24" w:name="_Toc237977686"/>
+      <w:bookmarkStart w:id="24" w:name="_Toc238277965"/>
       <w:r>
         <w:t>CCTV</w:t>
       </w:r>
@@ -11431,13 +11392,25 @@
         <w:t>통과는</w:t>
       </w:r>
       <w:r>
-        <w:t xml:space="preserve"> Alert</w:t>
+        <w:t xml:space="preserve"> Suspicious</w:t>
       </w:r>
       <w:r>
         <w:t>와</w:t>
       </w:r>
       <w:r>
-        <w:t xml:space="preserve"> Guard </w:t>
+        <w:t xml:space="preserve"> </w:t>
+      </w:r>
+      <w:r>
+        <w:t>근처</w:t>
+      </w:r>
+      <w:r>
+        <w:t xml:space="preserve"> Guard 1</w:t>
+      </w:r>
+      <w:r>
+        <w:t>회</w:t>
+      </w:r>
+      <w:r>
+        <w:t xml:space="preserve"> </w:t>
       </w:r>
       <w:r>
         <w:t>조사를</w:t>
@@ -11458,12 +11431,30 @@
         <w:t xml:space="preserve"> </w:t>
       </w:r>
       <w:r>
-        <w:t>막지</w:t>
+        <w:t>막거나</w:t>
+      </w:r>
+      <w:r>
+        <w:t xml:space="preserve"> Stun·Damage</w:t>
+      </w:r>
+      <w:r>
+        <w:t>를</w:t>
       </w:r>
       <w:r>
         <w:t xml:space="preserve"> </w:t>
       </w:r>
       <w:r>
+        <w:t>직접</w:t>
+      </w:r>
+      <w:r>
+        <w:t xml:space="preserve"> </w:t>
+      </w:r>
+      <w:r>
+        <w:t>적용하지</w:t>
+      </w:r>
+      <w:r>
+        <w:t xml:space="preserve"> </w:t>
+      </w:r>
+      <w:r>
         <w:t>않는다</w:t>
       </w:r>
       <w:r>
@@ -11485,7 +11476,7 @@
         <w:t>이탈</w:t>
       </w:r>
       <w:r>
-        <w:t>·Stun·Arrest·Escape·Disconnect·Match End</w:t>
+        <w:t>·Stun·Arrest·Escape·Disconnect·Match End·Actor EndPlay</w:t>
       </w:r>
       <w:r>
         <w:t>에는</w:t>
@@ -11520,6 +11511,9 @@
         <w:gridCol w:w="2520"/>
       </w:tblGrid>
       <w:tr>
+        <w:trPr>
+          <w:cantSplit/>
+        </w:trPr>
         <w:tc>
           <w:tcPr>
             <w:tcW w:w="1584" w:type="dxa"/>
@@ -11587,6 +11581,9 @@
         </w:tc>
       </w:tr>
       <w:tr>
+        <w:trPr>
+          <w:cantSplit/>
+        </w:trPr>
         <w:tc>
           <w:tcPr>
             <w:tcW w:w="1584" w:type="dxa"/>
@@ -11681,6 +11678,9 @@
         </w:tc>
       </w:tr>
       <w:tr>
+        <w:trPr>
+          <w:cantSplit/>
+        </w:trPr>
         <w:tc>
           <w:tcPr>
             <w:tcW w:w="1584" w:type="dxa"/>
@@ -11811,6 +11811,9 @@
         </w:tc>
       </w:tr>
       <w:tr>
+        <w:trPr>
+          <w:cantSplit/>
+        </w:trPr>
         <w:tc>
           <w:tcPr>
             <w:tcW w:w="1584" w:type="dxa"/>
@@ -11943,7 +11946,7 @@
           <w:numId w:val="7"/>
         </w:numPr>
       </w:pPr>
-      <w:bookmarkStart w:id="25" w:name="_Toc237977687"/>
+      <w:bookmarkStart w:id="25" w:name="_Toc238277966"/>
       <w:r>
         <w:t>Stun, Arrest, Recovery</w:t>
       </w:r>
@@ -11994,7 +11997,6 @@
         </w:numPr>
       </w:pPr>
       <w:r>
-        <w:lastRenderedPageBreak/>
         <w:t>Dropped Original은 Map/World에서 회수 가능한 팀 사건이 되며, 즉시 실패가 아니다.</w:t>
       </w:r>
     </w:p>
@@ -12018,7 +12020,7 @@
           <w:numId w:val="7"/>
         </w:numPr>
       </w:pPr>
-      <w:bookmarkStart w:id="26" w:name="_Toc237977688"/>
+      <w:bookmarkStart w:id="26" w:name="_Toc238277967"/>
       <w:r>
         <w:t>두</w:t>
       </w:r>
@@ -12055,7 +12057,6 @@
       <w:tr>
         <w:trPr>
           <w:cantSplit/>
-          <w:tblHeader/>
           <w:jc w:val="center"/>
         </w:trPr>
         <w:tc>
@@ -12487,9 +12488,8 @@
           <w:numId w:val="7"/>
         </w:numPr>
       </w:pPr>
-      <w:bookmarkStart w:id="27" w:name="_Toc237977689"/>
-      <w:r>
-        <w:lastRenderedPageBreak/>
+      <w:bookmarkStart w:id="27" w:name="_Toc238277968"/>
+      <w:r>
         <w:t>협동</w:t>
       </w:r>
       <w:r>
@@ -12514,7 +12514,7 @@
           <w:numId w:val="7"/>
         </w:numPr>
       </w:pPr>
-      <w:bookmarkStart w:id="28" w:name="_Toc237977690"/>
+      <w:bookmarkStart w:id="28" w:name="_Toc238277969"/>
       <w:r>
         <w:t>Role Switching</w:t>
       </w:r>
@@ -12541,7 +12541,6 @@
       <w:tr>
         <w:trPr>
           <w:cantSplit/>
-          <w:tblHeader/>
           <w:jc w:val="center"/>
         </w:trPr>
         <w:tc>
@@ -12865,6 +12864,7 @@
       </w:tr>
       <w:tr>
         <w:trPr>
+          <w:cantSplit/>
           <w:jc w:val="center"/>
         </w:trPr>
         <w:tc>
@@ -12942,7 +12942,7 @@
           <w:numId w:val="7"/>
         </w:numPr>
       </w:pPr>
-      <w:bookmarkStart w:id="29" w:name="_Toc237977691"/>
+      <w:bookmarkStart w:id="29" w:name="_Toc238277970"/>
       <w:r>
         <w:t>Inventory, Loose Loot, Coin</w:t>
       </w:r>
@@ -13004,7 +13004,7 @@
           <w:numId w:val="7"/>
         </w:numPr>
       </w:pPr>
-      <w:bookmarkStart w:id="30" w:name="_Toc237977692"/>
+      <w:bookmarkStart w:id="30" w:name="_Toc238277971"/>
       <w:r>
         <w:t>Player Identity</w:t>
       </w:r>
@@ -13032,7 +13032,6 @@
       <w:tr>
         <w:trPr>
           <w:cantSplit/>
-          <w:tblHeader/>
           <w:jc w:val="center"/>
         </w:trPr>
         <w:tc>
@@ -13421,7 +13420,7 @@
           <w:numId w:val="7"/>
         </w:numPr>
       </w:pPr>
-      <w:bookmarkStart w:id="31" w:name="_Toc237977693"/>
+      <w:bookmarkStart w:id="31" w:name="_Toc238277972"/>
       <w:r>
         <w:t xml:space="preserve">Floor Plan Map </w:t>
       </w:r>
@@ -13451,7 +13450,6 @@
       <w:tr>
         <w:trPr>
           <w:cantSplit/>
-          <w:tblHeader/>
           <w:jc w:val="center"/>
         </w:trPr>
         <w:tc>
@@ -13628,7 +13626,7 @@
           <w:numId w:val="7"/>
         </w:numPr>
       </w:pPr>
-      <w:bookmarkStart w:id="32" w:name="_Toc237977694"/>
+      <w:bookmarkStart w:id="32" w:name="_Toc238277973"/>
       <w:r>
         <w:t>Shared Extraction</w:t>
       </w:r>
@@ -13707,9 +13705,8 @@
           <w:numId w:val="7"/>
         </w:numPr>
       </w:pPr>
-      <w:bookmarkStart w:id="33" w:name="_Toc237977695"/>
-      <w:r>
-        <w:lastRenderedPageBreak/>
+      <w:bookmarkStart w:id="33" w:name="_Toc238277974"/>
+      <w:r>
         <w:t xml:space="preserve">UI, </w:t>
       </w:r>
       <w:r>
@@ -13731,7 +13728,7 @@
           <w:numId w:val="7"/>
         </w:numPr>
       </w:pPr>
-      <w:bookmarkStart w:id="34" w:name="_Toc237977696"/>
+      <w:bookmarkStart w:id="34" w:name="_Toc238277975"/>
       <w:r>
         <w:t>HUD Information Architecture</w:t>
       </w:r>
@@ -13753,7 +13750,6 @@
       <w:tr>
         <w:trPr>
           <w:cantSplit/>
-          <w:tblHeader/>
           <w:jc w:val="center"/>
         </w:trPr>
         <w:tc>
@@ -14089,7 +14085,7 @@
           <w:numId w:val="7"/>
         </w:numPr>
       </w:pPr>
-      <w:bookmarkStart w:id="35" w:name="_Toc237977697"/>
+      <w:bookmarkStart w:id="35" w:name="_Toc238277976"/>
       <w:r>
         <w:t xml:space="preserve">Main HUD </w:t>
       </w:r>
@@ -14125,6 +14121,7 @@
       </w:tblGrid>
       <w:tr>
         <w:trPr>
+          <w:cantSplit/>
           <w:jc w:val="center"/>
         </w:trPr>
         <w:tc>
@@ -14235,6 +14232,7 @@
       </w:tr>
       <w:tr>
         <w:trPr>
+          <w:cantSplit/>
           <w:jc w:val="center"/>
         </w:trPr>
         <w:tc>
@@ -14344,6 +14342,7 @@
       </w:tr>
       <w:tr>
         <w:trPr>
+          <w:cantSplit/>
           <w:jc w:val="center"/>
         </w:trPr>
         <w:tc>
@@ -14411,6 +14410,7 @@
       </w:tr>
       <w:tr>
         <w:trPr>
+          <w:cantSplit/>
           <w:jc w:val="center"/>
         </w:trPr>
         <w:tc>
@@ -14506,7 +14506,7 @@
           <w:numId w:val="7"/>
         </w:numPr>
       </w:pPr>
-      <w:bookmarkStart w:id="36" w:name="_Toc237977698"/>
+      <w:bookmarkStart w:id="36" w:name="_Toc238277977"/>
       <w:r>
         <w:t>값</w:t>
       </w:r>
@@ -14573,6 +14573,11 @@
       </w:r>
     </w:p>
     <w:p>
+      <w:r>
+        <w:br w:type="page"/>
+      </w:r>
+    </w:p>
+    <w:p>
       <w:pPr>
         <w:pStyle w:val="21"/>
         <w:numPr>
@@ -14580,7 +14585,7 @@
           <w:numId w:val="7"/>
         </w:numPr>
       </w:pPr>
-      <w:bookmarkStart w:id="37" w:name="_Toc237977699"/>
+      <w:bookmarkStart w:id="37" w:name="_Toc238277978"/>
       <w:r>
         <w:t xml:space="preserve">Input Mode </w:t>
       </w:r>
@@ -14606,7 +14611,6 @@
       <w:tr>
         <w:trPr>
           <w:cantSplit/>
-          <w:tblHeader/>
           <w:jc w:val="center"/>
         </w:trPr>
         <w:tc>
@@ -14736,7 +14740,6 @@
               <w:rPr>
                 <w:sz w:val="16"/>
               </w:rPr>
-              <w:lastRenderedPageBreak/>
               <w:t>Gameplay</w:t>
             </w:r>
           </w:p>
@@ -14747,14 +14750,8 @@
             <w:vAlign w:val="center"/>
           </w:tcPr>
           <w:p>
-            <w:pPr>
-              <w:pStyle w:val="TableText"/>
-            </w:pPr>
-            <w:r>
-              <w:rPr>
-                <w:sz w:val="16"/>
-              </w:rPr>
-              <w:t>Move/Look/Interact/Sprint/Throw</w:t>
+            <w:r>
+              <w:t>Move / Look / Interact / Sprint / Throw</w:t>
             </w:r>
           </w:p>
         </w:tc>
@@ -14964,7 +14961,7 @@
           </w:tcPr>
           <w:p>
             <w:r>
-              <w:t>Draw/Erase/Brush/Submit</w:t>
+              <w:t>Draw / Erase / Brush / Submit</w:t>
             </w:r>
           </w:p>
         </w:tc>
@@ -15117,7 +15114,7 @@
           <w:numId w:val="7"/>
         </w:numPr>
       </w:pPr>
-      <w:bookmarkStart w:id="38" w:name="_Toc237977700"/>
+      <w:bookmarkStart w:id="38" w:name="_Toc238277979"/>
       <w:r>
         <w:t>Floor Plan</w:t>
       </w:r>
@@ -15140,7 +15137,7 @@
           <w:numId w:val="7"/>
         </w:numPr>
       </w:pPr>
-      <w:bookmarkStart w:id="39" w:name="_Toc237977701"/>
+      <w:bookmarkStart w:id="39" w:name="_Toc238277980"/>
       <w:r>
         <w:t xml:space="preserve">Floor Plan Map </w:t>
       </w:r>
@@ -15164,6 +15161,7 @@
       </w:tblGrid>
       <w:tr>
         <w:trPr>
+          <w:cantSplit/>
           <w:jc w:val="center"/>
         </w:trPr>
         <w:tc>
@@ -15247,6 +15245,7 @@
       </w:tr>
       <w:tr>
         <w:trPr>
+          <w:cantSplit/>
           <w:jc w:val="center"/>
         </w:trPr>
         <w:tc>
@@ -15354,6 +15353,7 @@
       </w:tr>
       <w:tr>
         <w:trPr>
+          <w:cantSplit/>
           <w:jc w:val="center"/>
         </w:trPr>
         <w:tc>
@@ -15444,7 +15444,7 @@
           <w:numId w:val="7"/>
         </w:numPr>
       </w:pPr>
-      <w:bookmarkStart w:id="40" w:name="_Toc237977702"/>
+      <w:bookmarkStart w:id="40" w:name="_Toc238277981"/>
       <w:r>
         <w:t xml:space="preserve">Team Result / Replica Recap </w:t>
       </w:r>
@@ -15469,7 +15469,6 @@
       <w:tr>
         <w:trPr>
           <w:cantSplit/>
-          <w:tblHeader/>
           <w:jc w:val="center"/>
         </w:trPr>
         <w:tc>
@@ -15621,7 +15620,6 @@
       <w:tr>
         <w:trPr>
           <w:cantSplit/>
-          <w:tblHeader/>
           <w:jc w:val="center"/>
         </w:trPr>
         <w:tc>
@@ -15810,7 +15808,7 @@
           <w:numId w:val="7"/>
         </w:numPr>
       </w:pPr>
-      <w:bookmarkStart w:id="41" w:name="_Toc237977703"/>
+      <w:bookmarkStart w:id="41" w:name="_Toc238277982"/>
       <w:r>
         <w:t>첫</w:t>
       </w:r>
@@ -15843,7 +15841,6 @@
       <w:tr>
         <w:trPr>
           <w:cantSplit/>
-          <w:tblHeader/>
           <w:jc w:val="center"/>
         </w:trPr>
         <w:tc>
@@ -16079,7 +16076,7 @@
           <w:numId w:val="7"/>
         </w:numPr>
       </w:pPr>
-      <w:bookmarkStart w:id="42" w:name="_Toc237977704"/>
+      <w:bookmarkStart w:id="42" w:name="_Toc238277983"/>
       <w:r>
         <w:t>접근성</w:t>
       </w:r>
@@ -16147,9 +16144,8 @@
           <w:numId w:val="7"/>
         </w:numPr>
       </w:pPr>
-      <w:bookmarkStart w:id="43" w:name="_Toc237977705"/>
-      <w:r>
-        <w:lastRenderedPageBreak/>
+      <w:bookmarkStart w:id="43" w:name="_Toc238277984"/>
+      <w:r>
         <w:t>레벨</w:t>
       </w:r>
       <w:r>
@@ -16180,7 +16176,7 @@
           <w:numId w:val="7"/>
         </w:numPr>
       </w:pPr>
-      <w:bookmarkStart w:id="44" w:name="_Toc237977706"/>
+      <w:bookmarkStart w:id="44" w:name="_Toc238277985"/>
       <w:r>
         <w:t>세</w:t>
       </w:r>
@@ -16278,7 +16274,7 @@
           <w:numId w:val="7"/>
         </w:numPr>
       </w:pPr>
-      <w:bookmarkStart w:id="45" w:name="_Toc237977707"/>
+      <w:bookmarkStart w:id="45" w:name="_Toc238277986"/>
       <w:r>
         <w:t>맵</w:t>
       </w:r>
@@ -16308,7 +16304,6 @@
       <w:tr>
         <w:trPr>
           <w:cantSplit/>
-          <w:tblHeader/>
           <w:jc w:val="center"/>
         </w:trPr>
         <w:tc>
@@ -16734,7 +16729,7 @@
           <w:numId w:val="7"/>
         </w:numPr>
       </w:pPr>
-      <w:bookmarkStart w:id="46" w:name="_Toc237977708"/>
+      <w:bookmarkStart w:id="46" w:name="_Toc238277987"/>
       <w:r>
         <w:t xml:space="preserve">M01 — </w:t>
       </w:r>
@@ -16771,7 +16766,6 @@
       <w:tr>
         <w:trPr>
           <w:cantSplit/>
-          <w:tblHeader/>
           <w:jc w:val="center"/>
         </w:trPr>
         <w:tc>
@@ -16960,6 +16954,7 @@
       </w:tblGrid>
       <w:tr>
         <w:trPr>
+          <w:cantSplit/>
           <w:trHeight w:val="3061"/>
           <w:jc w:val="center"/>
         </w:trPr>
@@ -16985,7 +16980,6 @@
                 <w:color w:val="C55A11"/>
                 <w:sz w:val="18"/>
               </w:rPr>
-              <w:lastRenderedPageBreak/>
               <w:t>IMAGE REFERENCE SLOT</w:t>
             </w:r>
             <w:r>
@@ -17039,7 +17033,7 @@
           <w:numId w:val="7"/>
         </w:numPr>
       </w:pPr>
-      <w:bookmarkStart w:id="47" w:name="_Toc237977709"/>
+      <w:bookmarkStart w:id="47" w:name="_Toc238277988"/>
       <w:r>
         <w:t xml:space="preserve">M02 — </w:t>
       </w:r>
@@ -17076,7 +17070,6 @@
       <w:tr>
         <w:trPr>
           <w:cantSplit/>
-          <w:tblHeader/>
           <w:jc w:val="center"/>
         </w:trPr>
         <w:tc>
@@ -17265,6 +17258,7 @@
       </w:tblGrid>
       <w:tr>
         <w:trPr>
+          <w:cantSplit/>
           <w:trHeight w:val="3061"/>
           <w:jc w:val="center"/>
         </w:trPr>
@@ -17343,7 +17337,7 @@
           <w:numId w:val="7"/>
         </w:numPr>
       </w:pPr>
-      <w:bookmarkStart w:id="48" w:name="_Toc237977710"/>
+      <w:bookmarkStart w:id="48" w:name="_Toc238277989"/>
       <w:r>
         <w:t xml:space="preserve">M03 — </w:t>
       </w:r>
@@ -17380,7 +17374,6 @@
       <w:tr>
         <w:trPr>
           <w:cantSplit/>
-          <w:tblHeader/>
           <w:jc w:val="center"/>
         </w:trPr>
         <w:tc>
@@ -17555,6 +17548,9 @@
       <w:pPr>
         <w:spacing w:after="20"/>
       </w:pPr>
+      <w:r>
+        <w:br w:type="page"/>
+      </w:r>
     </w:p>
     <w:tbl>
       <w:tblPr>
@@ -17569,6 +17565,7 @@
       </w:tblGrid>
       <w:tr>
         <w:trPr>
+          <w:cantSplit/>
           <w:trHeight w:val="3061"/>
           <w:jc w:val="center"/>
         </w:trPr>
@@ -17594,7 +17591,6 @@
                 <w:color w:val="C55A11"/>
                 <w:sz w:val="18"/>
               </w:rPr>
-              <w:lastRenderedPageBreak/>
               <w:t>IMAGE REFERENCE SLOT</w:t>
             </w:r>
             <w:r>
@@ -17648,7 +17644,7 @@
           <w:numId w:val="7"/>
         </w:numPr>
       </w:pPr>
-      <w:bookmarkStart w:id="49" w:name="_Toc237977711"/>
+      <w:bookmarkStart w:id="49" w:name="_Toc238277990"/>
       <w:r>
         <w:t xml:space="preserve">First-Person </w:t>
       </w:r>
@@ -17731,7 +17727,7 @@
           <w:numId w:val="7"/>
         </w:numPr>
       </w:pPr>
-      <w:bookmarkStart w:id="50" w:name="_Toc237977712"/>
+      <w:bookmarkStart w:id="50" w:name="_Toc238277991"/>
       <w:r>
         <w:t>사운드</w:t>
       </w:r>
@@ -17759,7 +17755,6 @@
       <w:tr>
         <w:trPr>
           <w:cantSplit/>
-          <w:tblHeader/>
           <w:jc w:val="center"/>
         </w:trPr>
         <w:tc>
@@ -18122,9 +18117,8 @@
           <w:numId w:val="7"/>
         </w:numPr>
       </w:pPr>
-      <w:bookmarkStart w:id="51" w:name="_Toc237977713"/>
-      <w:r>
-        <w:lastRenderedPageBreak/>
+      <w:bookmarkStart w:id="51" w:name="_Toc238277992"/>
+      <w:r>
         <w:t>세계관과</w:t>
       </w:r>
       <w:r>
@@ -18161,7 +18155,6 @@
       <w:tr>
         <w:trPr>
           <w:cantSplit/>
-          <w:tblHeader/>
           <w:jc w:val="center"/>
         </w:trPr>
         <w:tc>
@@ -18364,9 +18357,8 @@
           <w:numId w:val="7"/>
         </w:numPr>
       </w:pPr>
-      <w:bookmarkStart w:id="52" w:name="_Toc237977714"/>
-      <w:r>
-        <w:lastRenderedPageBreak/>
+      <w:bookmarkStart w:id="52" w:name="_Toc238277993"/>
+      <w:r>
         <w:t>범위</w:t>
       </w:r>
       <w:r>
@@ -18391,7 +18383,7 @@
           <w:numId w:val="7"/>
         </w:numPr>
       </w:pPr>
-      <w:bookmarkStart w:id="53" w:name="_Toc237977715"/>
+      <w:bookmarkStart w:id="53" w:name="_Toc238277994"/>
       <w:r>
         <w:t>v1.0 Required Scope</w:t>
       </w:r>
@@ -18412,7 +18404,6 @@
       <w:tr>
         <w:trPr>
           <w:cantSplit/>
-          <w:tblHeader/>
           <w:jc w:val="center"/>
         </w:trPr>
         <w:tc>
@@ -18754,7 +18745,7 @@
           <w:numId w:val="7"/>
         </w:numPr>
       </w:pPr>
-      <w:bookmarkStart w:id="54" w:name="_Toc237977716"/>
+      <w:bookmarkStart w:id="54" w:name="_Toc238277995"/>
       <w:r>
         <w:t>Deferred Expansion</w:t>
       </w:r>
@@ -18973,7 +18964,7 @@
           <w:numId w:val="7"/>
         </w:numPr>
       </w:pPr>
-      <w:bookmarkStart w:id="55" w:name="_Toc237977717"/>
+      <w:bookmarkStart w:id="55" w:name="_Toc238277996"/>
       <w:r>
         <w:t>Stretch</w:t>
       </w:r>
@@ -19004,7 +18995,6 @@
       <w:tr>
         <w:trPr>
           <w:cantSplit/>
-          <w:tblHeader/>
           <w:jc w:val="center"/>
         </w:trPr>
         <w:tc>
@@ -19345,9 +19335,8 @@
           <w:numId w:val="7"/>
         </w:numPr>
       </w:pPr>
-      <w:bookmarkStart w:id="56" w:name="_Toc237977718"/>
-      <w:r>
-        <w:lastRenderedPageBreak/>
+      <w:bookmarkStart w:id="56" w:name="_Toc238277997"/>
+      <w:r>
         <w:t>Starting Balance Targets</w:t>
       </w:r>
       <w:bookmarkEnd w:id="56"/>
@@ -19368,7 +19357,6 @@
       <w:tr>
         <w:trPr>
           <w:cantSplit/>
-          <w:tblHeader/>
           <w:jc w:val="center"/>
         </w:trPr>
         <w:tc>
@@ -19788,6 +19776,7 @@
       </w:tr>
       <w:tr>
         <w:trPr>
+          <w:cantSplit/>
           <w:jc w:val="center"/>
         </w:trPr>
         <w:tc>
@@ -19823,6 +19812,7 @@
       </w:tr>
       <w:tr>
         <w:trPr>
+          <w:cantSplit/>
           <w:jc w:val="center"/>
         </w:trPr>
         <w:tc>
@@ -19870,7 +19860,7 @@
           <w:numId w:val="7"/>
         </w:numPr>
       </w:pPr>
-      <w:bookmarkStart w:id="57" w:name="_Toc237977719"/>
+      <w:bookmarkStart w:id="57" w:name="_Toc238277998"/>
       <w:r>
         <w:t>Playtest Questions</w:t>
       </w:r>
@@ -19956,7 +19946,7 @@
           <w:numId w:val="7"/>
         </w:numPr>
       </w:pPr>
-      <w:bookmarkStart w:id="58" w:name="_Toc237977720"/>
+      <w:bookmarkStart w:id="58" w:name="_Toc238277999"/>
       <w:r>
         <w:t>Release KPI</w:t>
       </w:r>
@@ -19977,7 +19967,6 @@
       <w:tr>
         <w:trPr>
           <w:cantSplit/>
-          <w:tblHeader/>
           <w:jc w:val="center"/>
         </w:trPr>
         <w:tc>
@@ -20248,9 +20237,8 @@
           <w:numId w:val="7"/>
         </w:numPr>
       </w:pPr>
-      <w:bookmarkStart w:id="59" w:name="_Toc237977721"/>
-      <w:r>
-        <w:lastRenderedPageBreak/>
+      <w:bookmarkStart w:id="59" w:name="_Toc238278000"/>
+      <w:r>
         <w:t>W6~W12 Roadmap</w:t>
       </w:r>
       <w:bookmarkEnd w:id="59"/>
@@ -20271,7 +20259,6 @@
       <w:tr>
         <w:trPr>
           <w:cantSplit/>
-          <w:tblHeader/>
           <w:jc w:val="center"/>
         </w:trPr>
         <w:tc>
@@ -20496,6 +20483,7 @@
       </w:tr>
       <w:tr>
         <w:trPr>
+          <w:cantSplit/>
           <w:jc w:val="center"/>
         </w:trPr>
         <w:tc>
@@ -20531,6 +20519,7 @@
       </w:tr>
       <w:tr>
         <w:trPr>
+          <w:cantSplit/>
           <w:jc w:val="center"/>
         </w:trPr>
         <w:tc>
@@ -20566,6 +20555,7 @@
       </w:tr>
       <w:tr>
         <w:trPr>
+          <w:cantSplit/>
           <w:jc w:val="center"/>
         </w:trPr>
         <w:tc>
@@ -20601,6 +20591,7 @@
       </w:tr>
       <w:tr>
         <w:trPr>
+          <w:cantSplit/>
           <w:jc w:val="center"/>
         </w:trPr>
         <w:tc>
@@ -20649,9 +20640,8 @@
         <w:keepLines/>
         <w:pageBreakBefore w:val="0"/>
       </w:pPr>
-      <w:bookmarkStart w:id="60" w:name="_Toc237977722"/>
-      <w:r>
-        <w:lastRenderedPageBreak/>
+      <w:bookmarkStart w:id="60" w:name="_Toc238278001"/>
+      <w:r>
         <w:t>Appendix A — 용어</w:t>
       </w:r>
       <w:bookmarkEnd w:id="60"/>
@@ -20671,7 +20661,6 @@
       <w:tr>
         <w:trPr>
           <w:cantSplit/>
-          <w:tblHeader/>
           <w:jc w:val="center"/>
         </w:trPr>
         <w:tc>
@@ -20998,6 +20987,7 @@
       </w:tr>
       <w:tr>
         <w:trPr>
+          <w:cantSplit/>
           <w:jc w:val="center"/>
         </w:trPr>
         <w:tc>
@@ -21065,12 +21055,11 @@
         <w:keepLines/>
         <w:pageBreakBefore w:val="0"/>
       </w:pPr>
-      <w:bookmarkStart w:id="61" w:name="_Toc237977723"/>
+      <w:bookmarkStart w:id="61" w:name="_Toc238278002"/>
       <w:r>
         <w:rPr>
           <w:sz w:val="32"/>
         </w:rPr>
-        <w:lastRenderedPageBreak/>
         <w:t>Appendix B — Removed / Excluded / Deferred Expansion / Stretch</w:t>
       </w:r>
       <w:bookmarkEnd w:id="61"/>
@@ -21090,7 +21079,6 @@
       <w:tr>
         <w:trPr>
           <w:cantSplit/>
-          <w:tblHeader/>
           <w:jc w:val="center"/>
         </w:trPr>
         <w:tc>
@@ -21250,6 +21238,7 @@
       </w:tr>
       <w:tr>
         <w:trPr>
+          <w:cantSplit/>
           <w:jc w:val="center"/>
         </w:trPr>
         <w:tc>
@@ -21305,12 +21294,11 @@
         <w:keepLines/>
         <w:pageBreakBefore w:val="0"/>
       </w:pPr>
-      <w:bookmarkStart w:id="62" w:name="_Toc237977724"/>
+      <w:bookmarkStart w:id="62" w:name="_Toc238278003"/>
       <w:r>
         <w:rPr>
           <w:sz w:val="32"/>
         </w:rPr>
-        <w:lastRenderedPageBreak/>
         <w:t>Appendix C — Player Experience Definition of Done</w:t>
       </w:r>
       <w:bookmarkEnd w:id="62"/>

</xml_diff>

<commit_message>
Add voice PTT noise and split title UI
Implements the v1 voice contract by enabling Steam push-to-talk in config, wiring controller-side PTT handling and voice-activity reporting, adding VOIP talker setup with in-game proximity attenuation, and emitting server-authoritative Voice sound pings for guard investigate logic. It also registers a new voice gameplay tag/type, updates guard noise priority ordering, and adds an automation contract test for voice defaults.

Refactors title menu presentation into dedicated Title/SessionJoin/Settings widgets and viewmodels, moves title UI classes under UI/Title, and updates HUD wiring accordingly. Adds generated title button/logo textures, source-art provenance + generation/verification scripts, and updates project status/inbox/manifest/docs to reflect the new UI and voice scope.
</commit_message>
<xml_diff>
--- a/Museum_Heist_GDD.docx
+++ b/Museum_Heist_GDD.docx
@@ -6259,6 +6259,54 @@
             </w:pPr>
             <w:r>
               <w:t>Nameplate·Team Status·Audio·Alert를 필수 Gameplay Readability로 취급한다.</w:t>
+            </w:r>
+          </w:p>
+        </w:tc>
+      </w:tr>
+      <w:tr>
+        <w:trPr>
+          <w:cantSplit/>
+          <w:jc w:val="center"/>
+        </w:trPr>
+        <w:tc>
+          <w:tcPr>
+            <w:tcW w:w="2219" w:type="dxa"/>
+            <w:vAlign w:val="center"/>
+          </w:tcPr>
+          <w:p>
+            <w:pPr>
+              <w:pStyle w:val="TableText"/>
+            </w:pPr>
+            <w:r>
+              <w:t>Diegetic Team Communication</w:t>
+            </w:r>
+          </w:p>
+        </w:tc>
+        <w:tc>
+          <w:tcPr>
+            <w:tcW w:w="3699" w:type="dxa"/>
+            <w:vAlign w:val="center"/>
+          </w:tcPr>
+          <w:p>
+            <w:pPr>
+              <w:pStyle w:val="TableText"/>
+            </w:pPr>
+            <w:r>
+              <w:t>가까운 동료와 대화할수록 협동은 쉬워지지만 경비에게 위치를 노출할 수 있다.</w:t>
+            </w:r>
+          </w:p>
+        </w:tc>
+        <w:tc>
+          <w:tcPr>
+            <w:tcW w:w="3946" w:type="dxa"/>
+            <w:vAlign w:val="center"/>
+          </w:tcPr>
+          <w:p>
+            <w:pPr>
+              <w:pStyle w:val="TableText"/>
+            </w:pPr>
+            <w:r>
+              <w:t>Lobby/Result는 팀 채널, InGame은 V PTT 거리 보이스다. 발화 소음은 조사만 유발하며 필수 진행 Gate가 아니다.</w:t>
             </w:r>
           </w:p>
         </w:tc>
@@ -12713,7 +12761,7 @@
               <w:pStyle w:val="TableText"/>
             </w:pPr>
             <w:r>
-              <w:t>음성 + Nameplate/Alert</w:t>
+              <w:t>거리 기반 음성 + Nameplate/Alert</w:t>
             </w:r>
           </w:p>
         </w:tc>
@@ -12933,6 +12981,32 @@
       <w:pPr>
         <w:spacing w:after="20"/>
       </w:pPr>
+    </w:p>
+    <w:p>
+      <w:pPr/>
+      <w:r>
+        <w:t>플레이어가 특정 동료의 출력을 음소거해도 박물관 경비가 듣는 발화 위험은 사라지지 않는다. PTT 해제 또는 입력 음소거만 Voice SoundPing을 중단한다. 외부 음성 앱으로 우회할 수 있으므로 보이스는 Required Target, Laser, Extraction의 필수 Gate로 사용하지 않는다.</w:t>
+      </w:r>
+    </w:p>
+    <w:p>
+      <w:pPr/>
+      <w:r>
+        <w:t>V를 누른 동안만 송신한다. 0~250cm는 정상 음량, 250~1,500cm는 거리 감쇠, 1,500cm 밖은 들리지 않는다. 실제 발화가 감지되는 동안 서버는 플레이어의 확정 위치에서 800cm Voice SoundPing을 최대 0.8초마다 발생시킨다. 이 소음은 Alert를 직접 올리지 않고 근처 Patrol Guard를 InvestigateNoise로 전환한다.</w:t>
+      </w:r>
+    </w:p>
+    <w:p>
+      <w:pPr/>
+      <w:r>
+        <w:t>팀 보이스는 협동 정보를 전달하는 동시에 잠입 위험을 만든다. Lobby와 Result에서는 거리 제한 없는 팀 채널을 사용하고, InGame에서는 캐릭터 위치를 기준으로 감쇠되는 Push-to-Talk를 사용한다.</w:t>
+      </w:r>
+    </w:p>
+    <w:p>
+      <w:pPr>
+        <w:pStyle w:val="21"/>
+      </w:pPr>
+      <w:r>
+        <w:t>거리 기반 팀 보이스와 발화 위험</w:t>
+      </w:r>
     </w:p>
     <w:p>
       <w:pPr>
@@ -18067,6 +18141,54 @@
           </w:p>
         </w:tc>
       </w:tr>
+      <w:tr>
+        <w:trPr>
+          <w:cantSplit/>
+          <w:jc w:val="center"/>
+        </w:trPr>
+        <w:tc>
+          <w:tcPr>
+            <w:tcW w:w="2055" w:type="dxa"/>
+            <w:vAlign w:val="center"/>
+          </w:tcPr>
+          <w:p>
+            <w:pPr>
+              <w:pStyle w:val="TableText"/>
+            </w:pPr>
+            <w:r>
+              <w:t>Crew Voice</w:t>
+            </w:r>
+          </w:p>
+        </w:tc>
+        <w:tc>
+          <w:tcPr>
+            <w:tcW w:w="3452" w:type="dxa"/>
+            <w:vAlign w:val="center"/>
+          </w:tcPr>
+          <w:p>
+            <w:pPr>
+              <w:pStyle w:val="TableText"/>
+            </w:pPr>
+            <w:r>
+              <w:t>협동 정보와 발화 위험의 공간적 거리</w:t>
+            </w:r>
+          </w:p>
+        </w:tc>
+        <w:tc>
+          <w:tcPr>
+            <w:tcW w:w="4357" w:type="dxa"/>
+            <w:vAlign w:val="center"/>
+          </w:tcPr>
+          <w:p>
+            <w:pPr>
+              <w:pStyle w:val="TableText"/>
+            </w:pPr>
+            <w:r>
+              <w:t>Lobby/Result Team Voice, InGame Proximity PTT, Speaking/Mute 상태</w:t>
+            </w:r>
+          </w:p>
+        </w:tc>
+      </w:tr>
     </w:tbl>
     <w:p>
       <w:pPr>
@@ -18488,7 +18610,7 @@
               <w:pStyle w:val="TableText"/>
             </w:pPr>
             <w:r>
-              <w:t>2~4인 Listen Server, Steam Session, Title/Lobby/Host Start/InGame/End</w:t>
+              <w:t>2~4인 Listen Server, Steam Session, Title/Lobby/Host Start/InGame/End, V PTT 거리 기반 팀 보이스</w:t>
             </w:r>
           </w:p>
         </w:tc>
@@ -19846,6 +19968,42 @@
           </w:p>
         </w:tc>
       </w:tr>
+      <w:tr>
+        <w:trPr>
+          <w:cantSplit/>
+          <w:jc w:val="center"/>
+        </w:trPr>
+        <w:tc>
+          <w:tcPr>
+            <w:tcW w:w="2630" w:type="dxa"/>
+          </w:tcPr>
+          <w:p>
+            <w:r>
+              <w:t>Voice Speech Noise</w:t>
+            </w:r>
+          </w:p>
+        </w:tc>
+        <w:tc>
+          <w:tcPr>
+            <w:tcW w:w="2795" w:type="dxa"/>
+          </w:tcPr>
+          <w:p>
+            <w:r>
+              <w:t>출력 250~1,500cm / Guard 800cm / Refresh 0.8초</w:t>
+            </w:r>
+          </w:p>
+        </w:tc>
+        <w:tc>
+          <w:tcPr>
+            <w:tcW w:w="4439" w:type="dxa"/>
+          </w:tcPr>
+          <w:p>
+            <w:r>
+              <w:t>대화를 협동 수단이자 낮은 우선순위 잠입 비용으로 사용</w:t>
+            </w:r>
+          </w:p>
+        </w:tc>
+      </w:tr>
     </w:tbl>
     <w:p>
       <w:pPr>
@@ -20219,6 +20377,40 @@
             </w:pPr>
             <w:r>
               <w:t>2인·3인·4인 M01/M02/M03 Contract Run이 End/Lobby Return까지 완주</w:t>
+            </w:r>
+          </w:p>
+        </w:tc>
+      </w:tr>
+      <w:tr>
+        <w:trPr>
+          <w:cantSplit/>
+          <w:jc w:val="center"/>
+        </w:trPr>
+        <w:tc>
+          <w:tcPr>
+            <w:tcW w:w="3288" w:type="dxa"/>
+            <w:vAlign w:val="center"/>
+          </w:tcPr>
+          <w:p>
+            <w:pPr>
+              <w:pStyle w:val="TableText"/>
+            </w:pPr>
+            <w:r>
+              <w:t>Voice Readability</w:t>
+            </w:r>
+          </w:p>
+        </w:tc>
+        <w:tc>
+          <w:tcPr>
+            <w:tcW w:w="6576" w:type="dxa"/>
+            <w:vAlign w:val="center"/>
+          </w:tcPr>
+          <w:p>
+            <w:pPr>
+              <w:pStyle w:val="TableText"/>
+            </w:pPr>
+            <w:r>
+              <w:t>2인 이상 Steam Package에서 PTT·거리 감쇠·발화 표시·개별 음소거·Guard 조사 결과를 구분</w:t>
             </w:r>
           </w:p>
         </w:tc>
@@ -21197,7 +21389,7 @@
               <w:pStyle w:val="TableText"/>
             </w:pPr>
             <w:r>
-              <w:t>PvP, Progression, Dedicated Server, Steam Voice, PCG, Security Room, Cinematic, Perspective Toggle, Minimap/Radar, Stamina</w:t>
+              <w:t>PvP, Progression, Dedicated Server, PCG, Security Room, Cinematic, Perspective Toggle, Minimap/Radar, Stamina</w:t>
             </w:r>
           </w:p>
         </w:tc>

</xml_diff>

<commit_message>
Revamp HUD with 0-10 server alert meter
Reworks gameplay/UI around Rev 15 by replacing staged alert escalation with a server-authoritative 0.0–10.0 alert meter (0.5 steps), including new balance thresholds, trigger handling, guard-capture and security-incident meter increases, and immediate lockdown at max meter. Updates contract snapshot data to replicate mission end time and required target display name for HUD mission readability.

Main HUD presentation is rebuilt: mission timer + required target status, 10-slot alert star indicator, transient alert event text, fixed 4-slot team cards (with voice/mic and Steam avatar support), inventory shortcut visual state, and HUD-mode quick slots. Full-screen forgery/object assembly warning/countdown overlays are removed per new rules. Automation/tests and docs are updated to validate meter semantics and the new HUD contract.
</commit_message>
<xml_diff>
--- a/Museum_Heist_GDD.docx
+++ b/Museum_Heist_GDD.docx
@@ -102,7 +102,7 @@
           </w:tcPr>
           <w:p>
             <w:r>
-              <w:t>Rev 14 · 2026-08-18</w:t>
+              <w:t>Rev 15 · 2026-08-23</w:t>
             </w:r>
           </w:p>
         </w:tc>
@@ -201,14 +201,8 @@
             </w:tcMar>
           </w:tcPr>
           <w:p>
-            <w:pPr>
-              <w:pStyle w:val="TableText"/>
-            </w:pPr>
-            <w:r>
-              <w:rPr>
-                <w:sz w:val="19"/>
-              </w:rPr>
-              <w:t>2~4인 협동 · First-Person PvE · Surface Forgery · Patrol/CCTV/Laser · Assembly Deferred</w:t>
+            <w:r>
+              <w:t>2~4인 협동 · First-Person PvE · Surface Forgery · Patrol/CCTV/Laser · 10단계 경계도 · HUD 재정립 · Assembly Deferred</w:t>
             </w:r>
           </w:p>
         </w:tc>
@@ -10651,6 +10645,9 @@
       <w:pPr>
         <w:spacing w:after="20"/>
       </w:pPr>
+      <w:r>
+        <w:t>경계도는 서버가 확정하는 0.0~10.0 수치이며 0.5 단위로만 변한다. 시간 경과만으로 자동 상승하지 않고, 10.0에 도달하면 즉시 Lockdown으로 전환한다. Guard에게 붙잡히면 +1.0, CCTV 완전 발각과 활성 Laser 접촉은 각각 +0.5다.</w:t>
+      </w:r>
     </w:p>
     <w:tbl>
       <w:tblPr>
@@ -10683,16 +10680,8 @@
             <w:vAlign w:val="center"/>
           </w:tcPr>
           <w:p>
-            <w:pPr>
-              <w:pStyle w:val="TableText"/>
-              <w:jc w:val="center"/>
-            </w:pPr>
-            <w:r>
-              <w:rPr>
-                <w:b/>
-                <w:color w:val="17365D"/>
-              </w:rPr>
-              <w:t>단계</w:t>
+            <w:r>
+              <w:t>경계도</w:t>
             </w:r>
           </w:p>
         </w:tc>
@@ -10709,15 +10698,7 @@
             <w:vAlign w:val="center"/>
           </w:tcPr>
           <w:p>
-            <w:pPr>
-              <w:pStyle w:val="TableText"/>
-              <w:jc w:val="center"/>
-            </w:pPr>
-            <w:r>
-              <w:rPr>
-                <w:b/>
-                <w:color w:val="17365D"/>
-              </w:rPr>
+            <w:r>
               <w:t>플레이어가 알아야 할 변화</w:t>
             </w:r>
           </w:p>
@@ -10735,15 +10716,7 @@
             <w:vAlign w:val="center"/>
           </w:tcPr>
           <w:p>
-            <w:pPr>
-              <w:pStyle w:val="TableText"/>
-              <w:jc w:val="center"/>
-            </w:pPr>
-            <w:r>
-              <w:rPr>
-                <w:b/>
-                <w:color w:val="17365D"/>
-              </w:rPr>
+            <w:r>
               <w:t>최소 피드백</w:t>
             </w:r>
           </w:p>
@@ -10760,11 +10733,8 @@
             <w:vAlign w:val="center"/>
           </w:tcPr>
           <w:p>
-            <w:pPr>
-              <w:pStyle w:val="TableText"/>
-            </w:pPr>
-            <w:r>
-              <w:t>Quiet</w:t>
+            <w:r>
+              <w:t>0.0</w:t>
             </w:r>
           </w:p>
         </w:tc>
@@ -10774,9 +10744,6 @@
             <w:vAlign w:val="center"/>
           </w:tcPr>
           <w:p>
-            <w:pPr>
-              <w:pStyle w:val="TableText"/>
-            </w:pPr>
             <w:r>
               <w:t>평상 순찰</w:t>
             </w:r>
@@ -10788,11 +10755,8 @@
             <w:vAlign w:val="center"/>
           </w:tcPr>
           <w:p>
-            <w:pPr>
-              <w:pStyle w:val="TableText"/>
-            </w:pPr>
-            <w:r>
-              <w:t>기본 Ambience</w:t>
+            <w:r>
+              <w:t>빈 별 10개 + 기본 Ambience</w:t>
             </w:r>
           </w:p>
         </w:tc>
@@ -10808,11 +10772,8 @@
             <w:vAlign w:val="center"/>
           </w:tcPr>
           <w:p>
-            <w:pPr>
-              <w:pStyle w:val="TableText"/>
-            </w:pPr>
-            <w:r>
-              <w:t>Suspicious</w:t>
+            <w:r>
+              <w:t>0.5~3.5</w:t>
             </w:r>
           </w:p>
         </w:tc>
@@ -10822,11 +10783,8 @@
             <w:vAlign w:val="center"/>
           </w:tcPr>
           <w:p>
-            <w:pPr>
-              <w:pStyle w:val="TableText"/>
-            </w:pPr>
-            <w:r>
-              <w:t>이상 징후가 확인됨</w:t>
+            <w:r>
+              <w:t>보안 사건이 누적됨</w:t>
             </w:r>
           </w:p>
         </w:tc>
@@ -10836,11 +10794,8 @@
             <w:vAlign w:val="center"/>
           </w:tcPr>
           <w:p>
-            <w:pPr>
-              <w:pStyle w:val="TableText"/>
-            </w:pPr>
-            <w:r>
-              <w:t>HUD 단계 + 무전/Notice</w:t>
+            <w:r>
+              <w:t>반/찬 별 + 짧은 사건 문구</w:t>
             </w:r>
           </w:p>
         </w:tc>
@@ -10856,11 +10811,8 @@
             <w:vAlign w:val="center"/>
           </w:tcPr>
           <w:p>
-            <w:pPr>
-              <w:pStyle w:val="TableText"/>
-            </w:pPr>
-            <w:r>
-              <w:t>Searching</w:t>
+            <w:r>
+              <w:t>4.0~6.5</w:t>
             </w:r>
           </w:p>
         </w:tc>
@@ -10870,9 +10822,6 @@
             <w:vAlign w:val="center"/>
           </w:tcPr>
           <w:p>
-            <w:pPr>
-              <w:pStyle w:val="TableText"/>
-            </w:pPr>
             <w:r>
               <w:t>경비가 적극 수색</w:t>
             </w:r>
@@ -10884,11 +10833,8 @@
             <w:vAlign w:val="center"/>
           </w:tcPr>
           <w:p>
-            <w:pPr>
-              <w:pStyle w:val="TableText"/>
-            </w:pPr>
-            <w:r>
-              <w:t>방향 경고 + 월드 자세 변화</w:t>
+            <w:r>
+              <w:t>단색 별 + 월드 자세 변화</w:t>
             </w:r>
           </w:p>
         </w:tc>
@@ -10904,11 +10850,8 @@
             <w:vAlign w:val="center"/>
           </w:tcPr>
           <w:p>
-            <w:pPr>
-              <w:pStyle w:val="TableText"/>
-            </w:pPr>
-            <w:r>
-              <w:t>Alarmed</w:t>
+            <w:r>
+              <w:t>7.0~9.5</w:t>
             </w:r>
           </w:p>
         </w:tc>
@@ -10918,11 +10861,8 @@
             <w:vAlign w:val="center"/>
           </w:tcPr>
           <w:p>
-            <w:pPr>
-              <w:pStyle w:val="TableText"/>
-            </w:pPr>
-            <w:r>
-              <w:t>탈출 준비가 급해짐</w:t>
+            <w:r>
+              <w:t>탈출 판단이 급해짐</w:t>
             </w:r>
           </w:p>
         </w:tc>
@@ -10932,11 +10872,8 @@
             <w:vAlign w:val="center"/>
           </w:tcPr>
           <w:p>
-            <w:pPr>
-              <w:pStyle w:val="TableText"/>
-            </w:pPr>
-            <w:r>
-              <w:t>강한 UI/Audio, Lockdown 예고</w:t>
+            <w:r>
+              <w:t>강한 UI/Audio</w:t>
             </w:r>
           </w:p>
         </w:tc>
@@ -10952,11 +10889,8 @@
             <w:vAlign w:val="center"/>
           </w:tcPr>
           <w:p>
-            <w:pPr>
-              <w:pStyle w:val="TableText"/>
-            </w:pPr>
-            <w:r>
-              <w:t>Lockdown</w:t>
+            <w:r>
+              <w:t>10.0</w:t>
             </w:r>
           </w:p>
         </w:tc>
@@ -10966,11 +10900,8 @@
             <w:vAlign w:val="center"/>
           </w:tcPr>
           <w:p>
-            <w:pPr>
-              <w:pStyle w:val="TableText"/>
-            </w:pPr>
-            <w:r>
-              <w:t>시간·동선 제한이 현실화</w:t>
+            <w:r>
+              <w:t>즉시 봉쇄</w:t>
             </w:r>
           </w:p>
         </w:tc>
@@ -10980,11 +10911,8 @@
             <w:vAlign w:val="center"/>
           </w:tcPr>
           <w:p>
-            <w:pPr>
-              <w:pStyle w:val="TableText"/>
-            </w:pPr>
-            <w:r>
-              <w:t>Countdown + 환경 경고</w:t>
+            <w:r>
+              <w:t>전역 경고 + Match 종료 판정</w:t>
             </w:r>
           </w:p>
         </w:tc>
@@ -11017,145 +10945,7 @@
     </w:p>
     <w:p>
       <w:r>
-        <w:t>CCTV</w:t>
-      </w:r>
-      <w:r>
-        <w:t>는</w:t>
-      </w:r>
-      <w:r>
-        <w:t xml:space="preserve"> Guard</w:t>
-      </w:r>
-      <w:r>
-        <w:t>와</w:t>
-      </w:r>
-      <w:r>
-        <w:t xml:space="preserve"> </w:t>
-      </w:r>
-      <w:r>
-        <w:t>다른</w:t>
-      </w:r>
-      <w:r>
-        <w:t xml:space="preserve"> </w:t>
-      </w:r>
-      <w:r>
-        <w:t>고정</w:t>
-      </w:r>
-      <w:r>
-        <w:t xml:space="preserve"> World Detection Source</w:t>
-      </w:r>
-      <w:r>
-        <w:t>다</w:t>
-      </w:r>
-      <w:r>
-        <w:t>. 1.2~1.5</w:t>
-      </w:r>
-      <w:r>
-        <w:t>초</w:t>
-      </w:r>
-      <w:r>
-        <w:t xml:space="preserve"> </w:t>
-      </w:r>
-      <w:r>
-        <w:t>동안</w:t>
-      </w:r>
-      <w:r>
-        <w:t xml:space="preserve"> </w:t>
-      </w:r>
-      <w:r>
-        <w:t>거리</w:t>
-      </w:r>
-      <w:r>
-        <w:t>·</w:t>
-      </w:r>
-      <w:r>
-        <w:t>각도</w:t>
-      </w:r>
-      <w:r>
-        <w:t>·</w:t>
-      </w:r>
-      <w:r>
-        <w:t>가림을</w:t>
-      </w:r>
-      <w:r>
-        <w:t xml:space="preserve"> </w:t>
-      </w:r>
-      <w:r>
-        <w:t>모두</w:t>
-      </w:r>
-      <w:r>
-        <w:t xml:space="preserve"> </w:t>
-      </w:r>
-      <w:r>
-        <w:t>만족한</w:t>
-      </w:r>
-      <w:r>
-        <w:t xml:space="preserve"> </w:t>
-      </w:r>
-      <w:r>
-        <w:t>완전</w:t>
-      </w:r>
-      <w:r>
-        <w:t xml:space="preserve"> </w:t>
-      </w:r>
-      <w:r>
-        <w:t>발각만</w:t>
-      </w:r>
-      <w:r>
-        <w:t xml:space="preserve"> Suspicious</w:t>
-      </w:r>
-      <w:r>
-        <w:t>와</w:t>
-      </w:r>
-      <w:r>
-        <w:t xml:space="preserve"> </w:t>
-      </w:r>
-      <w:r>
-        <w:t>근처</w:t>
-      </w:r>
-      <w:r>
-        <w:t xml:space="preserve"> Guard 1</w:t>
-      </w:r>
-      <w:r>
-        <w:t>회</w:t>
-      </w:r>
-      <w:r>
-        <w:t xml:space="preserve"> </w:t>
-      </w:r>
-      <w:r>
-        <w:t>조사로</w:t>
-      </w:r>
-      <w:r>
-        <w:t xml:space="preserve"> </w:t>
-      </w:r>
-      <w:r>
-        <w:t>이어지며</w:t>
-      </w:r>
-      <w:r>
-        <w:t xml:space="preserve">, </w:t>
-      </w:r>
-      <w:r>
-        <w:t>짧은</w:t>
-      </w:r>
-      <w:r>
-        <w:t xml:space="preserve"> </w:t>
-      </w:r>
-      <w:r>
-        <w:t>노출은</w:t>
-      </w:r>
-      <w:r>
-        <w:t xml:space="preserve"> </w:t>
-      </w:r>
-      <w:r>
-        <w:t>경고만</w:t>
-      </w:r>
-      <w:r>
-        <w:t xml:space="preserve"> </w:t>
-      </w:r>
-      <w:r>
-        <w:t>제공한다</w:t>
-      </w:r>
-      <w:r>
-        <w:t>.</w:t>
+        <w:t>CCTV는 Guard와 다른 고정 World Detection Source다. 1.2~1.5초 동안 거리·각도·가림을 모두 만족한 완전 발각만 경계도 +0.5와 근처 Guard 1회 조사로 이어지며, 짧은 노출은 경고만 제공한다.</w:t>
       </w:r>
     </w:p>
     <w:p>
@@ -11398,151 +11188,7 @@
     </w:p>
     <w:p>
       <w:r>
-        <w:t>Laser</w:t>
-      </w:r>
-      <w:r>
-        <w:t>는</w:t>
-      </w:r>
-      <w:r>
-        <w:t xml:space="preserve"> </w:t>
-      </w:r>
-      <w:r>
-        <w:t>물리</w:t>
-      </w:r>
-      <w:r>
-        <w:t xml:space="preserve"> </w:t>
-      </w:r>
-      <w:r>
-        <w:t>장벽이</w:t>
-      </w:r>
-      <w:r>
-        <w:t xml:space="preserve"> </w:t>
-      </w:r>
-      <w:r>
-        <w:t>아니라</w:t>
-      </w:r>
-      <w:r>
-        <w:t xml:space="preserve"> </w:t>
-      </w:r>
-      <w:r>
-        <w:t>경보선이다</w:t>
-      </w:r>
-      <w:r>
-        <w:t xml:space="preserve">. </w:t>
-      </w:r>
-      <w:r>
-        <w:t>활성</w:t>
-      </w:r>
-      <w:r>
-        <w:t xml:space="preserve"> Beam </w:t>
-      </w:r>
-      <w:r>
-        <w:t>통과는</w:t>
-      </w:r>
-      <w:r>
-        <w:t xml:space="preserve"> Suspicious</w:t>
-      </w:r>
-      <w:r>
-        <w:t>와</w:t>
-      </w:r>
-      <w:r>
-        <w:t xml:space="preserve"> </w:t>
-      </w:r>
-      <w:r>
-        <w:t>근처</w:t>
-      </w:r>
-      <w:r>
-        <w:t xml:space="preserve"> Guard 1</w:t>
-      </w:r>
-      <w:r>
-        <w:t>회</w:t>
-      </w:r>
-      <w:r>
-        <w:t xml:space="preserve"> </w:t>
-      </w:r>
-      <w:r>
-        <w:t>조사를</w:t>
-      </w:r>
-      <w:r>
-        <w:t xml:space="preserve"> </w:t>
-      </w:r>
-      <w:r>
-        <w:t>발생시키지만</w:t>
-      </w:r>
-      <w:r>
-        <w:t xml:space="preserve"> </w:t>
-      </w:r>
-      <w:r>
-        <w:t>이동을</w:t>
-      </w:r>
-      <w:r>
-        <w:t xml:space="preserve"> </w:t>
-      </w:r>
-      <w:r>
-        <w:t>막거나</w:t>
-      </w:r>
-      <w:r>
-        <w:t xml:space="preserve"> Stun·Damage</w:t>
-      </w:r>
-      <w:r>
-        <w:t>를</w:t>
-      </w:r>
-      <w:r>
-        <w:t xml:space="preserve"> </w:t>
-      </w:r>
-      <w:r>
-        <w:t>직접</w:t>
-      </w:r>
-      <w:r>
-        <w:t xml:space="preserve"> </w:t>
-      </w:r>
-      <w:r>
-        <w:t>적용하지</w:t>
-      </w:r>
-      <w:r>
-        <w:t xml:space="preserve"> </w:t>
-      </w:r>
-      <w:r>
-        <w:t>않는다</w:t>
-      </w:r>
-      <w:r>
-        <w:t xml:space="preserve">. Hold </w:t>
-      </w:r>
-      <w:r>
-        <w:t>해제</w:t>
-      </w:r>
-      <w:r>
-        <w:t>·</w:t>
-      </w:r>
-      <w:r>
-        <w:t>범위</w:t>
-      </w:r>
-      <w:r>
-        <w:t xml:space="preserve"> </w:t>
-      </w:r>
-      <w:r>
-        <w:t>이탈</w:t>
-      </w:r>
-      <w:r>
-        <w:t>·Stun·Arrest·Escape·Disconnect·Match End·Actor EndPlay</w:t>
-      </w:r>
-      <w:r>
-        <w:t>에는</w:t>
-      </w:r>
-      <w:r>
-        <w:t xml:space="preserve"> </w:t>
-      </w:r>
-      <w:r>
-        <w:t>즉시</w:t>
-      </w:r>
-      <w:r>
-        <w:t xml:space="preserve"> </w:t>
-      </w:r>
-      <w:r>
-        <w:t>복원한다</w:t>
-      </w:r>
-      <w:r>
-        <w:t>.</w:t>
+        <w:t>Laser는 물리 장벽이 아니라 경보선이다. 활성 Beam 통과는 경계도 +0.5와 근처 Guard 1회 조사를 발생시키지만 이동을 막거나 Stun·Damage를 직접 적용하지 않는다. Hold 해제·범위 이탈·Stun·Arrest·Escape·Disconnect·Match End·Actor EndPlay에는 즉시 복원한다.</w:t>
       </w:r>
     </w:p>
     <w:tbl>
@@ -11673,19 +11319,7 @@
           </w:tcPr>
           <w:p>
             <w:r>
-              <w:t>발각</w:t>
-            </w:r>
-            <w:r>
-              <w:t>·</w:t>
-            </w:r>
-            <w:r>
-              <w:t>추격</w:t>
-            </w:r>
-            <w:r>
-              <w:t>·</w:t>
-            </w:r>
-            <w:r>
-              <w:t>수색</w:t>
+              <w:t>붙잡힘 확정 시 경계도 +1.0</w:t>
             </w:r>
           </w:p>
         </w:tc>
@@ -11791,31 +11425,7 @@
           </w:tcPr>
           <w:p>
             <w:r>
-              <w:t>완전</w:t>
-            </w:r>
-            <w:r>
-              <w:t xml:space="preserve"> </w:t>
-            </w:r>
-            <w:r>
-              <w:t>발각</w:t>
-            </w:r>
-            <w:r>
-              <w:t xml:space="preserve"> </w:t>
-            </w:r>
-            <w:r>
-              <w:t>시</w:t>
-            </w:r>
-            <w:r>
-              <w:t xml:space="preserve"> Suspicious + </w:t>
-            </w:r>
-            <w:r>
-              <w:t>근처</w:t>
-            </w:r>
-            <w:r>
-              <w:t xml:space="preserve"> Guard </w:t>
-            </w:r>
-            <w:r>
-              <w:t>조사</w:t>
+              <w:t>완전 발각 시 경계도 +0.5 + 근처 Guard 조사</w:t>
             </w:r>
           </w:p>
         </w:tc>
@@ -11921,25 +11531,7 @@
           </w:tcPr>
           <w:p>
             <w:r>
-              <w:t>활성</w:t>
-            </w:r>
-            <w:r>
-              <w:t xml:space="preserve"> Beam </w:t>
-            </w:r>
-            <w:r>
-              <w:t>통과</w:t>
-            </w:r>
-            <w:r>
-              <w:t xml:space="preserve"> </w:t>
-            </w:r>
-            <w:r>
-              <w:t>시</w:t>
-            </w:r>
-            <w:r>
-              <w:t xml:space="preserve"> Alert + Guard </w:t>
-            </w:r>
-            <w:r>
-              <w:t>조사</w:t>
+              <w:t>활성 Beam 접촉 시 경계도 +0.5 + 근처 Guard 조사</w:t>
             </w:r>
           </w:p>
         </w:tc>
@@ -13839,15 +13431,7 @@
             <w:vAlign w:val="center"/>
           </w:tcPr>
           <w:p>
-            <w:pPr>
-              <w:pStyle w:val="TableText"/>
-              <w:jc w:val="center"/>
-            </w:pPr>
-            <w:r>
-              <w:rPr>
-                <w:b/>
-                <w:color w:val="17365D"/>
-              </w:rPr>
+            <w:r>
               <w:t>우선순위</w:t>
             </w:r>
           </w:p>
@@ -13865,15 +13449,7 @@
             <w:vAlign w:val="center"/>
           </w:tcPr>
           <w:p>
-            <w:pPr>
-              <w:pStyle w:val="TableText"/>
-              <w:jc w:val="center"/>
-            </w:pPr>
-            <w:r>
-              <w:rPr>
-                <w:b/>
-                <w:color w:val="17365D"/>
-              </w:rPr>
+            <w:r>
               <w:t>항상 답해야 할 질문</w:t>
             </w:r>
           </w:p>
@@ -13891,15 +13467,7 @@
             <w:vAlign w:val="center"/>
           </w:tcPr>
           <w:p>
-            <w:pPr>
-              <w:pStyle w:val="TableText"/>
-              <w:jc w:val="center"/>
-            </w:pPr>
-            <w:r>
-              <w:rPr>
-                <w:b/>
-                <w:color w:val="17365D"/>
-              </w:rPr>
+            <w:r>
               <w:t>UI 요소</w:t>
             </w:r>
           </w:p>
@@ -13916,9 +13484,6 @@
             <w:vAlign w:val="center"/>
           </w:tcPr>
           <w:p>
-            <w:pPr>
-              <w:pStyle w:val="TableText"/>
-            </w:pPr>
             <w:r>
               <w:t>1</w:t>
             </w:r>
@@ -13930,11 +13495,8 @@
             <w:vAlign w:val="center"/>
           </w:tcPr>
           <w:p>
-            <w:pPr>
-              <w:pStyle w:val="TableText"/>
-            </w:pPr>
-            <w:r>
-              <w:t>무엇을 반드시 가져와야 하나?</w:t>
+            <w:r>
+              <w:t>무엇을 언제까지 가져와야 하나?</w:t>
             </w:r>
           </w:p>
         </w:tc>
@@ -13944,11 +13506,8 @@
             <w:vAlign w:val="center"/>
           </w:tcPr>
           <w:p>
-            <w:pPr>
-              <w:pStyle w:val="TableText"/>
-            </w:pPr>
-            <w:r>
-              <w:t>Required Target / Target Gallery</w:t>
+            <w:r>
+              <w:t>미션 / MM : SS / 필수 목표 작품명</w:t>
             </w:r>
           </w:p>
         </w:tc>
@@ -13964,9 +13523,6 @@
             <w:vAlign w:val="center"/>
           </w:tcPr>
           <w:p>
-            <w:pPr>
-              <w:pStyle w:val="TableText"/>
-            </w:pPr>
             <w:r>
               <w:t>2</w:t>
             </w:r>
@@ -13978,11 +13534,8 @@
             <w:vAlign w:val="center"/>
           </w:tcPr>
           <w:p>
-            <w:pPr>
-              <w:pStyle w:val="TableText"/>
-            </w:pPr>
-            <w:r>
-              <w:t>얼마나 더 필요하나?</w:t>
+            <w:r>
+              <w:t>지금 얼마나 위험한가?</w:t>
             </w:r>
           </w:p>
         </w:tc>
@@ -13992,11 +13545,8 @@
             <w:vAlign w:val="center"/>
           </w:tcPr>
           <w:p>
-            <w:pPr>
-              <w:pStyle w:val="TableText"/>
-            </w:pPr>
-            <w:r>
-              <w:t>Quota / Secured / Carried</w:t>
+            <w:r>
+              <w:t>10칸 경계도 / 짧은 사건 문구</w:t>
             </w:r>
           </w:p>
         </w:tc>
@@ -14012,9 +13562,6 @@
             <w:vAlign w:val="center"/>
           </w:tcPr>
           <w:p>
-            <w:pPr>
-              <w:pStyle w:val="TableText"/>
-            </w:pPr>
             <w:r>
               <w:t>3</w:t>
             </w:r>
@@ -14026,11 +13573,8 @@
             <w:vAlign w:val="center"/>
           </w:tcPr>
           <w:p>
-            <w:pPr>
-              <w:pStyle w:val="TableText"/>
-            </w:pPr>
-            <w:r>
-              <w:t>지금 얼마나 위험한가?</w:t>
+            <w:r>
+              <w:t>팀원은 어떤 상태인가?</w:t>
             </w:r>
           </w:p>
         </w:tc>
@@ -14040,11 +13584,8 @@
             <w:vAlign w:val="center"/>
           </w:tcPr>
           <w:p>
-            <w:pPr>
-              <w:pStyle w:val="TableText"/>
-            </w:pPr>
-            <w:r>
-              <w:t>Security Level / Detection / Lockdown</w:t>
+            <w:r>
+              <w:t>Steam Profile / Name / Status / Mic</w:t>
             </w:r>
           </w:p>
         </w:tc>
@@ -14060,9 +13601,6 @@
             <w:vAlign w:val="center"/>
           </w:tcPr>
           <w:p>
-            <w:pPr>
-              <w:pStyle w:val="TableText"/>
-            </w:pPr>
             <w:r>
               <w:t>4</w:t>
             </w:r>
@@ -14074,11 +13612,8 @@
             <w:vAlign w:val="center"/>
           </w:tcPr>
           <w:p>
-            <w:pPr>
-              <w:pStyle w:val="TableText"/>
-            </w:pPr>
-            <w:r>
-              <w:t>팀원은 무엇을 하는가?</w:t>
+            <w:r>
+              <w:t>지금 무엇을 할 수 있나?</w:t>
             </w:r>
           </w:p>
         </w:tc>
@@ -14088,11 +13623,8 @@
             <w:vAlign w:val="center"/>
           </w:tcPr>
           <w:p>
-            <w:pPr>
-              <w:pStyle w:val="TableText"/>
-            </w:pPr>
-            <w:r>
-              <w:t>Name / Color / Team Status / Carrier</w:t>
+            <w:r>
+              <w:t>Interaction Prompt / Cast / Input Mode</w:t>
             </w:r>
           </w:p>
         </w:tc>
@@ -14108,9 +13640,6 @@
             <w:vAlign w:val="center"/>
           </w:tcPr>
           <w:p>
-            <w:pPr>
-              <w:pStyle w:val="TableText"/>
-            </w:pPr>
             <w:r>
               <w:t>5</w:t>
             </w:r>
@@ -14122,11 +13651,8 @@
             <w:vAlign w:val="center"/>
           </w:tcPr>
           <w:p>
-            <w:pPr>
-              <w:pStyle w:val="TableText"/>
-            </w:pPr>
-            <w:r>
-              <w:t>지금 무엇을 할 수 있나?</w:t>
+            <w:r>
+              <w:t>무엇을 열거나 사용할 수 있나?</w:t>
             </w:r>
           </w:p>
         </w:tc>
@@ -14136,11 +13662,8 @@
             <w:vAlign w:val="center"/>
           </w:tcPr>
           <w:p>
-            <w:pPr>
-              <w:pStyle w:val="TableText"/>
-            </w:pPr>
-            <w:r>
-              <w:t>Interaction Prompt / Cast / Input Mode</w:t>
+            <w:r>
+              <w:t>Inventory [TAB] 상태색 / QuickSlot 1~3</w:t>
             </w:r>
           </w:p>
         </w:tc>
@@ -14211,25 +13734,12 @@
             <w:vAlign w:val="center"/>
           </w:tcPr>
           <w:p>
-            <w:pPr>
-              <w:jc w:val="center"/>
-            </w:pPr>
-            <w:r>
-              <w:rPr>
-                <w:b/>
-                <w:color w:val="17365D"/>
-                <w:sz w:val="17"/>
-              </w:rPr>
-              <w:t>CONTRACT</w:t>
-            </w:r>
-            <w:r>
-              <w:rPr>
-                <w:b/>
-                <w:color w:val="17365D"/>
-                <w:sz w:val="17"/>
-              </w:rPr>
+            <w:r>
+              <w:t>미션</w:t>
               <w:br/>
-              <w:t>Required Target / Quota</w:t>
+              <w:t>MM : SS</w:t>
+              <w:br/>
+              <w:t>필수 목표 작품명</w:t>
             </w:r>
           </w:p>
         </w:tc>
@@ -14246,23 +13756,8 @@
             <w:vAlign w:val="center"/>
           </w:tcPr>
           <w:p>
-            <w:pPr>
-              <w:jc w:val="center"/>
-            </w:pPr>
-            <w:r>
-              <w:rPr>
-                <w:b/>
-                <w:color w:val="17365D"/>
-                <w:sz w:val="17"/>
-              </w:rPr>
+            <w:r>
               <w:t>WORLD VIEW</w:t>
-            </w:r>
-            <w:r>
-              <w:rPr>
-                <w:b/>
-                <w:color w:val="17365D"/>
-                <w:sz w:val="17"/>
-              </w:rPr>
               <w:br/>
               <w:t>Center Interaction / Crosshair</w:t>
             </w:r>
@@ -14281,25 +13776,10 @@
             <w:vAlign w:val="center"/>
           </w:tcPr>
           <w:p>
-            <w:pPr>
-              <w:jc w:val="center"/>
-            </w:pPr>
-            <w:r>
-              <w:rPr>
-                <w:b/>
-                <w:color w:val="17365D"/>
-                <w:sz w:val="17"/>
-              </w:rPr>
-              <w:t>SECURITY</w:t>
-            </w:r>
-            <w:r>
-              <w:rPr>
-                <w:b/>
-                <w:color w:val="17365D"/>
-                <w:sz w:val="17"/>
-              </w:rPr>
+            <w:r>
+              <w:t>경계도 10칸</w:t>
               <w:br/>
-              <w:t>Alert / Lockdown</w:t>
+              <w:t>사건 상태 Text</w:t>
             </w:r>
           </w:p>
         </w:tc>
@@ -14322,24 +13802,7 @@
             <w:vAlign w:val="center"/>
           </w:tcPr>
           <w:p>
-            <w:pPr>
-              <w:jc w:val="center"/>
-            </w:pPr>
-            <w:r>
-              <w:rPr>
-                <w:color w:val="17365D"/>
-                <w:sz w:val="17"/>
-              </w:rPr>
-              <w:t>TEAM STATUS</w:t>
-            </w:r>
-            <w:r>
-              <w:rPr>
-                <w:color w:val="17365D"/>
-                <w:sz w:val="17"/>
-              </w:rPr>
-              <w:br/>
-              <w:t>Name · Color · State</w:t>
-            </w:r>
+            <w:r/>
           </w:p>
         </w:tc>
         <w:tc>
@@ -14354,30 +13817,7 @@
             <w:vAlign w:val="center"/>
           </w:tcPr>
           <w:p>
-            <w:pPr>
-              <w:jc w:val="center"/>
-            </w:pPr>
-            <w:r>
-              <w:rPr>
-                <w:color w:val="17365D"/>
-                <w:sz w:val="17"/>
-              </w:rPr>
-              <w:br/>
-            </w:r>
-            <w:r>
-              <w:rPr>
-                <w:color w:val="17365D"/>
-                <w:sz w:val="17"/>
-              </w:rPr>
-              <w:br/>
-            </w:r>
-            <w:r>
-              <w:rPr>
-                <w:color w:val="17365D"/>
-                <w:sz w:val="17"/>
-              </w:rPr>
-              <w:br/>
-            </w:r>
+            <w:r/>
           </w:p>
         </w:tc>
         <w:tc>
@@ -14393,23 +13833,10 @@
             <w:vAlign w:val="center"/>
           </w:tcPr>
           <w:p>
-            <w:pPr>
-              <w:jc w:val="center"/>
-            </w:pPr>
-            <w:r>
-              <w:rPr>
-                <w:color w:val="17365D"/>
-                <w:sz w:val="17"/>
-              </w:rPr>
-              <w:t>CONTEXT</w:t>
-            </w:r>
-            <w:r>
-              <w:rPr>
-                <w:color w:val="17365D"/>
-                <w:sz w:val="17"/>
-              </w:rPr>
+            <w:r>
+              <w:t>TEAM CARD ×4</w:t>
               <w:br/>
-              <w:t>Cast / Detection / Stun</w:t>
+              <w:t>Profile · Name · Status · Mic</w:t>
             </w:r>
           </w:p>
         </w:tc>
@@ -14432,9 +13859,11 @@
             <w:vAlign w:val="center"/>
           </w:tcPr>
           <w:p>
-            <w:pPr>
-              <w:jc w:val="center"/>
-            </w:pPr>
+            <w:r>
+              <w:t>INVENTORY [TAB]</w:t>
+              <w:br/>
+              <w:t>Light→Heavy Color</w:t>
+            </w:r>
           </w:p>
         </w:tc>
         <w:tc>
@@ -14450,17 +13879,7 @@
             <w:vAlign w:val="center"/>
           </w:tcPr>
           <w:p>
-            <w:pPr>
-              <w:jc w:val="center"/>
-            </w:pPr>
-            <w:r>
-              <w:rPr>
-                <w:b/>
-                <w:color w:val="17365D"/>
-                <w:sz w:val="17"/>
-              </w:rPr>
-              <w:t>CARRIED  |  SECURED  |  QUOTA</w:t>
-            </w:r>
+            <w:r/>
           </w:p>
         </w:tc>
         <w:tc>
@@ -14476,9 +13895,11 @@
             <w:vAlign w:val="center"/>
           </w:tcPr>
           <w:p>
-            <w:pPr>
-              <w:jc w:val="center"/>
-            </w:pPr>
+            <w:r>
+              <w:t>QUICK SLOT ×3</w:t>
+              <w:br/>
+              <w:t>Image · Count · Key</w:t>
+            </w:r>
           </w:p>
         </w:tc>
       </w:tr>
@@ -14500,15 +13921,8 @@
             <w:vAlign w:val="center"/>
           </w:tcPr>
           <w:p>
-            <w:pPr>
-              <w:jc w:val="center"/>
-            </w:pPr>
-            <w:r>
-              <w:rPr>
-                <w:color w:val="17365D"/>
-                <w:sz w:val="17"/>
-              </w:rPr>
-              <w:t>COIN [Q]</w:t>
+            <w:r>
+              <w:t>MAP [M]</w:t>
             </w:r>
           </w:p>
         </w:tc>
@@ -14525,14 +13939,7 @@
             <w:vAlign w:val="center"/>
           </w:tcPr>
           <w:p>
-            <w:pPr>
-              <w:jc w:val="center"/>
-            </w:pPr>
-            <w:r>
-              <w:rPr>
-                <w:color w:val="17365D"/>
-                <w:sz w:val="17"/>
-              </w:rPr>
+            <w:r>
               <w:t>INTERACTION PROMPT</w:t>
             </w:r>
           </w:p>
@@ -14550,26 +13957,14 @@
             <w:vAlign w:val="center"/>
           </w:tcPr>
           <w:p>
-            <w:pPr>
-              <w:jc w:val="center"/>
-            </w:pPr>
-            <w:r>
-              <w:rPr>
-                <w:color w:val="17365D"/>
-                <w:sz w:val="17"/>
-              </w:rPr>
-              <w:t>MAP [M] · INVENTORY [TAB]</w:t>
-            </w:r>
+            <w:r/>
           </w:p>
         </w:tc>
       </w:tr>
     </w:tbl>
     <w:p>
       <w:r>
-        <w:rPr>
-          <w:i/>
-        </w:rPr>
-        <w:t>목표: 첫 20초 안에 Required Target, Quota, Carried, Secured를 구분할 수 있어야 한다.</w:t>
+        <w:t>목표: 한눈에 미션 남은 시간, 필수 목표 작품의 획득 여부, 현재 경계도와 팀원 상태를 판독할 수 있어야 한다.</w:t>
       </w:r>
     </w:p>
     <w:p>
@@ -14580,23 +13975,9 @@
           <w:numId w:val="7"/>
         </w:numPr>
       </w:pPr>
-      <w:bookmarkStart w:id="36" w:name="_Toc238277977"/>
-      <w:r>
-        <w:t>값</w:t>
-      </w:r>
-      <w:r>
-        <w:t xml:space="preserve"> </w:t>
-      </w:r>
-      <w:r>
-        <w:t>구분과</w:t>
-      </w:r>
-      <w:r>
-        <w:t xml:space="preserve"> </w:t>
-      </w:r>
-      <w:r>
-        <w:t>카피</w:t>
-      </w:r>
-      <w:bookmarkEnd w:id="36"/>
+      <w:r>
+        <w:t>최소 정보 원칙과 카피</w:t>
+      </w:r>
     </w:p>
     <w:p>
       <w:pPr>
@@ -14607,7 +13988,7 @@
         </w:numPr>
       </w:pPr>
       <w:r>
-        <w:t>CARRIED는 주황색·비확정, SECURED는 청록색·확정, QUOTA는 목표선으로 구분한다.</w:t>
+        <w:t>좌측 상단은 ‘미션’, 남은 시간 MM : SS와 필수 목표 작품명만 표시한다. 작품명은 미획득 회색, 획득 초록이며 남은 시간이 60초 미만이면 시간만 빨간색으로 바꾼다.</w:t>
       </w:r>
     </w:p>
     <w:p>
@@ -14619,7 +14000,7 @@
         </w:numPr>
       </w:pPr>
       <w:r>
-        <w:t>QUALITY는 Exhibit별 0~100이며 Contract Value Bar와 같은 위치·색·단위를 쓰지 않는다.</w:t>
+        <w:t>확보 가치, 예상 점수, Carried/Secured/Quota와 무게 수치는 Main HUD에서 제외한다. 전리품과 무게 상세는 Inventory가 소유하고 HUD에는 Inventory 단축키와 가벼움 초록→무거움 빨강의 상태 색상만 남긴다.</w:t>
       </w:r>
     </w:p>
     <w:p>
@@ -14643,7 +14024,7 @@
         </w:numPr>
       </w:pPr>
       <w:r>
-        <w:t>경고 문장은 원인과 결과를 함께 말한다. 예: ‘THE MUSEUM WILL ENTER LOCKDOWN IN {0}.’</w:t>
+        <w:t>경계도 아래 단일 사건 문구는 CCTV 발각, Laser 접촉, Guard 포획, Stun, Arrest 같은 현재 사건을 짧게 표시한 뒤 사라진다. 별도 Lockdown Countdown 문구는 사용하지 않는다.</w:t>
       </w:r>
     </w:p>
     <w:p>
@@ -18031,11 +17412,8 @@
             <w:vAlign w:val="center"/>
           </w:tcPr>
           <w:p>
-            <w:pPr>
-              <w:pStyle w:val="TableText"/>
-            </w:pPr>
-            <w:r>
-              <w:t>Alert 단계와 Lockdown</w:t>
+            <w:r>
+              <w:t>0~10 경계도 사건과 즉시 Lockdown</w:t>
             </w:r>
           </w:p>
         </w:tc>
@@ -18045,11 +17423,8 @@
             <w:vAlign w:val="center"/>
           </w:tcPr>
           <w:p>
-            <w:pPr>
-              <w:pStyle w:val="TableText"/>
-            </w:pPr>
-            <w:r>
-              <w:t>Notice, 무전, CCTV Beep, Laser Hum/Trip, Alarm, Countdown</w:t>
+            <w:r>
+              <w:t>Notice, 무전, CCTV Beep, Laser Hum/Trip, Alarm</w:t>
             </w:r>
           </w:p>
         </w:tc>
@@ -19647,11 +19022,8 @@
             <w:vAlign w:val="center"/>
           </w:tcPr>
           <w:p>
-            <w:pPr>
-              <w:pStyle w:val="TableText"/>
-            </w:pPr>
-            <w:r>
-              <w:t>명확한 Cone/LED/Beep 뒤 완전 발각만 확정</w:t>
+            <w:r>
+              <w:t>명확한 Cone/LED/Beep 뒤 완전 발각만 확정하고 경계도 +0.5</w:t>
             </w:r>
           </w:p>
         </w:tc>
@@ -19887,11 +19259,8 @@
             <w:vAlign w:val="center"/>
           </w:tcPr>
           <w:p>
-            <w:pPr>
-              <w:pStyle w:val="TableText"/>
-            </w:pPr>
-            <w:r>
-              <w:t>고가 Painting 문턱에서 짧은 역할 교대</w:t>
+            <w:r>
+              <w:t>고가 Painting 문턱에서 짧은 역할 교대, 활성 Beam 접촉 시 경계도 +0.5</w:t>
             </w:r>
           </w:p>
         </w:tc>

</xml_diff>

<commit_message>
Expand surface forgery to 40 templates per map
Scaled the Surface Forgery content pipeline from 12 to 40 templates per pool (120 total), including new source-art metadata, updated manifests, DataTable rows, contract limits, and validation/build tooling. Match setup now draws 20 unique templates per run and assigns them per painting case (instead of relying on a single global selected template), with updated server-side assignment/replication, contract validation rules, debug output, and automation tests to enforce the new catalog and assignment targets. Also updated related UI/config details (including inventory cell sizing) to align with the revised content and HUD presentation pass.
</commit_message>
<xml_diff>
--- a/Museum_Heist_GDD.docx
+++ b/Museum_Heist_GDD.docx
@@ -8905,6 +8905,13 @@
     <w:p>
       <w:r>
         <w:t>v1.0의 활성 위조는 Painting Surface Forgery 하나다. 한글 중심 Mode Title, 70점 제출 기준을 포함한 단일 예상 품질, 남은 시간, Submit/Cancel과 하단 조작 안내를 사용한다. Object Assembly는 기존 구현과 자산을 삭제하지 않고 Deferred Expansion으로 보존하지만 현재 Runtime Assignment, UI Entry, Release Map과 Release Gate에는 포함하지 않는다.</w:t>
+      </w:r>
+    </w:p>
+    <w:p/>
+    <w:p>
+      <w:pPr/>
+      <w:r>
+        <w:t>각 Release Map은 고유한 Surface Template 40종을 카탈로그로 보유한다. 서버는 MatchStart에 해당 맵의 카탈로그를 섞어 Required Target을 포함한 20종을 중복 없이 선택하고, 20개의 활성 Painting Exhibit에 한 작품씩 배정한다. 한 판에 노출되는 절반만 바뀌므로 같은 맵을 반복해도 작품 구성과 탐색 동선이 달라진다. 활성 20종은 모두 관찰·위조·반출 후보이며, 실제로 몇 점을 노릴지는 Required Target, Quota, Alert와 남은 시간을 보고 팀이 결정한다.</w:t>
       </w:r>
     </w:p>
     <w:p>
@@ -18087,7 +18094,7 @@
               <w:pStyle w:val="TableText"/>
             </w:pPr>
             <w:r>
-              <w:t>Painting + Surface Template 36개, Object Assembly는 Deferred Expansion</w:t>
+              <w:t>Painting + 맵별 Surface Template 40종(총 120종), 매치별 활성 20종, Object Assembly는 Deferred Expansion</w:t>
             </w:r>
           </w:p>
         </w:tc>
@@ -18760,7 +18767,7 @@
               <w:pStyle w:val="TableText"/>
             </w:pPr>
             <w:r>
-              <w:t>36 Surface Template + 기본 Loot Variety</w:t>
+              <w:t>120 Surface Template 카탈로그 + 매치별 20종 배정 + 기본 Loot Variety</w:t>
             </w:r>
           </w:p>
         </w:tc>
@@ -19201,7 +19208,7 @@
               <w:pStyle w:val="TableText"/>
             </w:pPr>
             <w:r>
-              <w:t>맵별 12, 총 36</w:t>
+              <w:t>맵별 카탈로그 40, 총 120 / 매치별 활성 20</w:t>
             </w:r>
           </w:p>
         </w:tc>

</xml_diff>

<commit_message>
Stabilize W7 maps, audio, and contract tests
Adds Vent opened/settlement cue assets and wires new presentation generation paths, including geometry-driven floor plan export/rendering and updated floor plan/map assets. Tightens level build/nav verification (wall/floor alignment, M03 airlock closure, nav simplification setting), and strengthens packaging validation with expected config/version/git commit and clean-tree checks.

Gameplay/test reliability is improved by lifting projected supplemental guard spawns above floor collision and expanding contract-run automation to cover 3-4 player scenarios with robust interaction placement, dynamic quota collection, and updated result accounting. AGENTS/GDD/TDD were also updated to match the new workflow and runtime expectations.
</commit_message>
<xml_diff>
--- a/Museum_Heist_GDD.docx
+++ b/Museum_Heist_GDD.docx
@@ -104,6 +104,10 @@
             <w:r>
               <w:t>Rev 16 · 2026-08-27</w:t>
             </w:r>
+            <w:r>
+              <w:br/>
+              <w:t>문서 정합성 검토 · 2026-09-07</w:t>
+            </w:r>
           </w:p>
         </w:tc>
       </w:tr>
@@ -546,7 +550,7 @@
       <w:r>
         <w:fldChar w:fldCharType="separate"/>
       </w:r>
-      <w:hyperlink w:anchor="_Toc238746821" w:history="1">
+      <w:hyperlink w:anchor="_Toc239675495" w:history="1">
         <w:r>
           <w:rPr>
             <w:rStyle w:val="aff1"/>
@@ -573,7 +577,7 @@
             <w:noProof/>
             <w:webHidden/>
           </w:rPr>
-          <w:instrText xml:space="preserve"> PAGEREF _Toc238746821 \h </w:instrText>
+          <w:instrText xml:space="preserve"> PAGEREF _Toc239675495 \h </w:instrText>
         </w:r>
         <w:r>
           <w:rPr>
@@ -622,7 +626,7 @@
           <w14:ligatures w14:val="standardContextual"/>
         </w:rPr>
       </w:pPr>
-      <w:hyperlink w:anchor="_Toc238746822" w:history="1">
+      <w:hyperlink w:anchor="_Toc239675496" w:history="1">
         <w:r>
           <w:rPr>
             <w:rStyle w:val="aff1"/>
@@ -649,7 +653,7 @@
             <w:noProof/>
             <w:webHidden/>
           </w:rPr>
-          <w:instrText xml:space="preserve"> PAGEREF _Toc238746822 \h </w:instrText>
+          <w:instrText xml:space="preserve"> PAGEREF _Toc239675496 \h </w:instrText>
         </w:r>
         <w:r>
           <w:rPr>
@@ -698,7 +702,7 @@
           <w14:ligatures w14:val="standardContextual"/>
         </w:rPr>
       </w:pPr>
-      <w:hyperlink w:anchor="_Toc238746823" w:history="1">
+      <w:hyperlink w:anchor="_Toc239675497" w:history="1">
         <w:r>
           <w:rPr>
             <w:rStyle w:val="aff1"/>
@@ -725,7 +729,7 @@
             <w:noProof/>
             <w:webHidden/>
           </w:rPr>
-          <w:instrText xml:space="preserve"> PAGEREF _Toc238746823 \h </w:instrText>
+          <w:instrText xml:space="preserve"> PAGEREF _Toc239675497 \h </w:instrText>
         </w:r>
         <w:r>
           <w:rPr>
@@ -774,7 +778,7 @@
           <w14:ligatures w14:val="standardContextual"/>
         </w:rPr>
       </w:pPr>
-      <w:hyperlink w:anchor="_Toc238746824" w:history="1">
+      <w:hyperlink w:anchor="_Toc239675498" w:history="1">
         <w:r>
           <w:rPr>
             <w:rStyle w:val="aff1"/>
@@ -801,7 +805,7 @@
             <w:noProof/>
             <w:webHidden/>
           </w:rPr>
-          <w:instrText xml:space="preserve"> PAGEREF _Toc238746824 \h </w:instrText>
+          <w:instrText xml:space="preserve"> PAGEREF _Toc239675498 \h </w:instrText>
         </w:r>
         <w:r>
           <w:rPr>
@@ -850,7 +854,7 @@
           <w14:ligatures w14:val="standardContextual"/>
         </w:rPr>
       </w:pPr>
-      <w:hyperlink w:anchor="_Toc238746825" w:history="1">
+      <w:hyperlink w:anchor="_Toc239675499" w:history="1">
         <w:r>
           <w:rPr>
             <w:rStyle w:val="aff1"/>
@@ -877,7 +881,7 @@
             <w:noProof/>
             <w:webHidden/>
           </w:rPr>
-          <w:instrText xml:space="preserve"> PAGEREF _Toc238746825 \h </w:instrText>
+          <w:instrText xml:space="preserve"> PAGEREF _Toc239675499 \h </w:instrText>
         </w:r>
         <w:r>
           <w:rPr>
@@ -926,7 +930,7 @@
           <w14:ligatures w14:val="standardContextual"/>
         </w:rPr>
       </w:pPr>
-      <w:hyperlink w:anchor="_Toc238746826" w:history="1">
+      <w:hyperlink w:anchor="_Toc239675500" w:history="1">
         <w:r>
           <w:rPr>
             <w:rStyle w:val="aff1"/>
@@ -953,7 +957,7 @@
             <w:noProof/>
             <w:webHidden/>
           </w:rPr>
-          <w:instrText xml:space="preserve"> PAGEREF _Toc238746826 \h </w:instrText>
+          <w:instrText xml:space="preserve"> PAGEREF _Toc239675500 \h </w:instrText>
         </w:r>
         <w:r>
           <w:rPr>
@@ -1002,7 +1006,7 @@
           <w14:ligatures w14:val="standardContextual"/>
         </w:rPr>
       </w:pPr>
-      <w:hyperlink w:anchor="_Toc238746827" w:history="1">
+      <w:hyperlink w:anchor="_Toc239675501" w:history="1">
         <w:r>
           <w:rPr>
             <w:rStyle w:val="aff1"/>
@@ -1029,7 +1033,7 @@
             <w:noProof/>
             <w:webHidden/>
           </w:rPr>
-          <w:instrText xml:space="preserve"> PAGEREF _Toc238746827 \h </w:instrText>
+          <w:instrText xml:space="preserve"> PAGEREF _Toc239675501 \h </w:instrText>
         </w:r>
         <w:r>
           <w:rPr>
@@ -1077,7 +1081,7 @@
           <w14:ligatures w14:val="standardContextual"/>
         </w:rPr>
       </w:pPr>
-      <w:hyperlink w:anchor="_Toc238746828" w:history="1">
+      <w:hyperlink w:anchor="_Toc239675502" w:history="1">
         <w:r>
           <w:rPr>
             <w:rStyle w:val="aff1"/>
@@ -1104,7 +1108,7 @@
             <w:noProof/>
             <w:webHidden/>
           </w:rPr>
-          <w:instrText xml:space="preserve"> PAGEREF _Toc238746828 \h </w:instrText>
+          <w:instrText xml:space="preserve"> PAGEREF _Toc239675502 \h </w:instrText>
         </w:r>
         <w:r>
           <w:rPr>
@@ -1153,7 +1157,7 @@
           <w14:ligatures w14:val="standardContextual"/>
         </w:rPr>
       </w:pPr>
-      <w:hyperlink w:anchor="_Toc238746829" w:history="1">
+      <w:hyperlink w:anchor="_Toc239675503" w:history="1">
         <w:r>
           <w:rPr>
             <w:rStyle w:val="aff1"/>
@@ -1180,7 +1184,7 @@
             <w:noProof/>
             <w:webHidden/>
           </w:rPr>
-          <w:instrText xml:space="preserve"> PAGEREF _Toc238746829 \h </w:instrText>
+          <w:instrText xml:space="preserve"> PAGEREF _Toc239675503 \h </w:instrText>
         </w:r>
         <w:r>
           <w:rPr>
@@ -1229,7 +1233,7 @@
           <w14:ligatures w14:val="standardContextual"/>
         </w:rPr>
       </w:pPr>
-      <w:hyperlink w:anchor="_Toc238746830" w:history="1">
+      <w:hyperlink w:anchor="_Toc239675504" w:history="1">
         <w:r>
           <w:rPr>
             <w:rStyle w:val="aff1"/>
@@ -1256,7 +1260,7 @@
             <w:noProof/>
             <w:webHidden/>
           </w:rPr>
-          <w:instrText xml:space="preserve"> PAGEREF _Toc238746830 \h </w:instrText>
+          <w:instrText xml:space="preserve"> PAGEREF _Toc239675504 \h </w:instrText>
         </w:r>
         <w:r>
           <w:rPr>
@@ -1305,7 +1309,7 @@
           <w14:ligatures w14:val="standardContextual"/>
         </w:rPr>
       </w:pPr>
-      <w:hyperlink w:anchor="_Toc238746831" w:history="1">
+      <w:hyperlink w:anchor="_Toc239675505" w:history="1">
         <w:r>
           <w:rPr>
             <w:rStyle w:val="aff1"/>
@@ -1332,7 +1336,7 @@
             <w:noProof/>
             <w:webHidden/>
           </w:rPr>
-          <w:instrText xml:space="preserve"> PAGEREF _Toc238746831 \h </w:instrText>
+          <w:instrText xml:space="preserve"> PAGEREF _Toc239675505 \h </w:instrText>
         </w:r>
         <w:r>
           <w:rPr>
@@ -1381,7 +1385,7 @@
           <w14:ligatures w14:val="standardContextual"/>
         </w:rPr>
       </w:pPr>
-      <w:hyperlink w:anchor="_Toc238746832" w:history="1">
+      <w:hyperlink w:anchor="_Toc239675506" w:history="1">
         <w:r>
           <w:rPr>
             <w:rStyle w:val="aff1"/>
@@ -1408,7 +1412,7 @@
             <w:noProof/>
             <w:webHidden/>
           </w:rPr>
-          <w:instrText xml:space="preserve"> PAGEREF _Toc238746832 \h </w:instrText>
+          <w:instrText xml:space="preserve"> PAGEREF _Toc239675506 \h </w:instrText>
         </w:r>
         <w:r>
           <w:rPr>
@@ -1457,7 +1461,7 @@
           <w14:ligatures w14:val="standardContextual"/>
         </w:rPr>
       </w:pPr>
-      <w:hyperlink w:anchor="_Toc238746833" w:history="1">
+      <w:hyperlink w:anchor="_Toc239675507" w:history="1">
         <w:r>
           <w:rPr>
             <w:rStyle w:val="aff1"/>
@@ -1484,7 +1488,7 @@
             <w:noProof/>
             <w:webHidden/>
           </w:rPr>
-          <w:instrText xml:space="preserve"> PAGEREF _Toc238746833 \h </w:instrText>
+          <w:instrText xml:space="preserve"> PAGEREF _Toc239675507 \h </w:instrText>
         </w:r>
         <w:r>
           <w:rPr>
@@ -1532,7 +1536,7 @@
           <w14:ligatures w14:val="standardContextual"/>
         </w:rPr>
       </w:pPr>
-      <w:hyperlink w:anchor="_Toc238746834" w:history="1">
+      <w:hyperlink w:anchor="_Toc239675508" w:history="1">
         <w:r>
           <w:rPr>
             <w:rStyle w:val="aff1"/>
@@ -1559,7 +1563,7 @@
             <w:noProof/>
             <w:webHidden/>
           </w:rPr>
-          <w:instrText xml:space="preserve"> PAGEREF _Toc238746834 \h </w:instrText>
+          <w:instrText xml:space="preserve"> PAGEREF _Toc239675508 \h </w:instrText>
         </w:r>
         <w:r>
           <w:rPr>
@@ -1608,7 +1612,7 @@
           <w14:ligatures w14:val="standardContextual"/>
         </w:rPr>
       </w:pPr>
-      <w:hyperlink w:anchor="_Toc238746835" w:history="1">
+      <w:hyperlink w:anchor="_Toc239675509" w:history="1">
         <w:r>
           <w:rPr>
             <w:rStyle w:val="aff1"/>
@@ -1635,7 +1639,7 @@
             <w:noProof/>
             <w:webHidden/>
           </w:rPr>
-          <w:instrText xml:space="preserve"> PAGEREF _Toc238746835 \h </w:instrText>
+          <w:instrText xml:space="preserve"> PAGEREF _Toc239675509 \h </w:instrText>
         </w:r>
         <w:r>
           <w:rPr>
@@ -1684,7 +1688,7 @@
           <w14:ligatures w14:val="standardContextual"/>
         </w:rPr>
       </w:pPr>
-      <w:hyperlink w:anchor="_Toc238746836" w:history="1">
+      <w:hyperlink w:anchor="_Toc239675510" w:history="1">
         <w:r>
           <w:rPr>
             <w:rStyle w:val="aff1"/>
@@ -1711,7 +1715,7 @@
             <w:noProof/>
             <w:webHidden/>
           </w:rPr>
-          <w:instrText xml:space="preserve"> PAGEREF _Toc238746836 \h </w:instrText>
+          <w:instrText xml:space="preserve"> PAGEREF _Toc239675510 \h </w:instrText>
         </w:r>
         <w:r>
           <w:rPr>
@@ -1760,7 +1764,7 @@
           <w14:ligatures w14:val="standardContextual"/>
         </w:rPr>
       </w:pPr>
-      <w:hyperlink w:anchor="_Toc238746837" w:history="1">
+      <w:hyperlink w:anchor="_Toc239675511" w:history="1">
         <w:r>
           <w:rPr>
             <w:rStyle w:val="aff1"/>
@@ -1787,7 +1791,7 @@
             <w:noProof/>
             <w:webHidden/>
           </w:rPr>
-          <w:instrText xml:space="preserve"> PAGEREF _Toc238746837 \h </w:instrText>
+          <w:instrText xml:space="preserve"> PAGEREF _Toc239675511 \h </w:instrText>
         </w:r>
         <w:r>
           <w:rPr>
@@ -1836,7 +1840,7 @@
           <w14:ligatures w14:val="standardContextual"/>
         </w:rPr>
       </w:pPr>
-      <w:hyperlink w:anchor="_Toc238746838" w:history="1">
+      <w:hyperlink w:anchor="_Toc239675512" w:history="1">
         <w:r>
           <w:rPr>
             <w:rStyle w:val="aff1"/>
@@ -1863,7 +1867,7 @@
             <w:noProof/>
             <w:webHidden/>
           </w:rPr>
-          <w:instrText xml:space="preserve"> PAGEREF _Toc238746838 \h </w:instrText>
+          <w:instrText xml:space="preserve"> PAGEREF _Toc239675512 \h </w:instrText>
         </w:r>
         <w:r>
           <w:rPr>
@@ -1912,7 +1916,7 @@
           <w14:ligatures w14:val="standardContextual"/>
         </w:rPr>
       </w:pPr>
-      <w:hyperlink w:anchor="_Toc238746839" w:history="1">
+      <w:hyperlink w:anchor="_Toc239675513" w:history="1">
         <w:r>
           <w:rPr>
             <w:rStyle w:val="aff1"/>
@@ -1939,7 +1943,7 @@
             <w:noProof/>
             <w:webHidden/>
           </w:rPr>
-          <w:instrText xml:space="preserve"> PAGEREF _Toc238746839 \h </w:instrText>
+          <w:instrText xml:space="preserve"> PAGEREF _Toc239675513 \h </w:instrText>
         </w:r>
         <w:r>
           <w:rPr>
@@ -1988,7 +1992,7 @@
           <w14:ligatures w14:val="standardContextual"/>
         </w:rPr>
       </w:pPr>
-      <w:hyperlink w:anchor="_Toc238746840" w:history="1">
+      <w:hyperlink w:anchor="_Toc239675514" w:history="1">
         <w:r>
           <w:rPr>
             <w:rStyle w:val="aff1"/>
@@ -2015,7 +2019,7 @@
             <w:noProof/>
             <w:webHidden/>
           </w:rPr>
-          <w:instrText xml:space="preserve"> PAGEREF _Toc238746840 \h </w:instrText>
+          <w:instrText xml:space="preserve"> PAGEREF _Toc239675514 \h </w:instrText>
         </w:r>
         <w:r>
           <w:rPr>
@@ -2063,7 +2067,7 @@
           <w14:ligatures w14:val="standardContextual"/>
         </w:rPr>
       </w:pPr>
-      <w:hyperlink w:anchor="_Toc238746841" w:history="1">
+      <w:hyperlink w:anchor="_Toc239675515" w:history="1">
         <w:r>
           <w:rPr>
             <w:rStyle w:val="aff1"/>
@@ -2090,7 +2094,7 @@
             <w:noProof/>
             <w:webHidden/>
           </w:rPr>
-          <w:instrText xml:space="preserve"> PAGEREF _Toc238746841 \h </w:instrText>
+          <w:instrText xml:space="preserve"> PAGEREF _Toc239675515 \h </w:instrText>
         </w:r>
         <w:r>
           <w:rPr>
@@ -2139,7 +2143,7 @@
           <w14:ligatures w14:val="standardContextual"/>
         </w:rPr>
       </w:pPr>
-      <w:hyperlink w:anchor="_Toc238746842" w:history="1">
+      <w:hyperlink w:anchor="_Toc239675516" w:history="1">
         <w:r>
           <w:rPr>
             <w:rStyle w:val="aff1"/>
@@ -2166,7 +2170,7 @@
             <w:noProof/>
             <w:webHidden/>
           </w:rPr>
-          <w:instrText xml:space="preserve"> PAGEREF _Toc238746842 \h </w:instrText>
+          <w:instrText xml:space="preserve"> PAGEREF _Toc239675516 \h </w:instrText>
         </w:r>
         <w:r>
           <w:rPr>
@@ -2215,7 +2219,7 @@
           <w14:ligatures w14:val="standardContextual"/>
         </w:rPr>
       </w:pPr>
-      <w:hyperlink w:anchor="_Toc238746843" w:history="1">
+      <w:hyperlink w:anchor="_Toc239675517" w:history="1">
         <w:r>
           <w:rPr>
             <w:rStyle w:val="aff1"/>
@@ -2242,7 +2246,7 @@
             <w:noProof/>
             <w:webHidden/>
           </w:rPr>
-          <w:instrText xml:space="preserve"> PAGEREF _Toc238746843 \h </w:instrText>
+          <w:instrText xml:space="preserve"> PAGEREF _Toc239675517 \h </w:instrText>
         </w:r>
         <w:r>
           <w:rPr>
@@ -2291,7 +2295,7 @@
           <w14:ligatures w14:val="standardContextual"/>
         </w:rPr>
       </w:pPr>
-      <w:hyperlink w:anchor="_Toc238746844" w:history="1">
+      <w:hyperlink w:anchor="_Toc239675518" w:history="1">
         <w:r>
           <w:rPr>
             <w:rStyle w:val="aff1"/>
@@ -2318,7 +2322,7 @@
             <w:noProof/>
             <w:webHidden/>
           </w:rPr>
-          <w:instrText xml:space="preserve"> PAGEREF _Toc238746844 \h </w:instrText>
+          <w:instrText xml:space="preserve"> PAGEREF _Toc239675518 \h </w:instrText>
         </w:r>
         <w:r>
           <w:rPr>
@@ -2367,7 +2371,7 @@
           <w14:ligatures w14:val="standardContextual"/>
         </w:rPr>
       </w:pPr>
-      <w:hyperlink w:anchor="_Toc238746845" w:history="1">
+      <w:hyperlink w:anchor="_Toc239675519" w:history="1">
         <w:r>
           <w:rPr>
             <w:rStyle w:val="aff1"/>
@@ -2394,7 +2398,7 @@
             <w:noProof/>
             <w:webHidden/>
           </w:rPr>
-          <w:instrText xml:space="preserve"> PAGEREF _Toc238746845 \h </w:instrText>
+          <w:instrText xml:space="preserve"> PAGEREF _Toc239675519 \h </w:instrText>
         </w:r>
         <w:r>
           <w:rPr>
@@ -2443,7 +2447,7 @@
           <w14:ligatures w14:val="standardContextual"/>
         </w:rPr>
       </w:pPr>
-      <w:hyperlink w:anchor="_Toc238746846" w:history="1">
+      <w:hyperlink w:anchor="_Toc239675520" w:history="1">
         <w:r>
           <w:rPr>
             <w:rStyle w:val="aff1"/>
@@ -2470,7 +2474,7 @@
             <w:noProof/>
             <w:webHidden/>
           </w:rPr>
-          <w:instrText xml:space="preserve"> PAGEREF _Toc238746846 \h </w:instrText>
+          <w:instrText xml:space="preserve"> PAGEREF _Toc239675520 \h </w:instrText>
         </w:r>
         <w:r>
           <w:rPr>
@@ -2519,7 +2523,7 @@
           <w14:ligatures w14:val="standardContextual"/>
         </w:rPr>
       </w:pPr>
-      <w:hyperlink w:anchor="_Toc238746847" w:history="1">
+      <w:hyperlink w:anchor="_Toc239675521" w:history="1">
         <w:r>
           <w:rPr>
             <w:rStyle w:val="aff1"/>
@@ -2546,7 +2550,7 @@
             <w:noProof/>
             <w:webHidden/>
           </w:rPr>
-          <w:instrText xml:space="preserve"> PAGEREF _Toc238746847 \h </w:instrText>
+          <w:instrText xml:space="preserve"> PAGEREF _Toc239675521 \h </w:instrText>
         </w:r>
         <w:r>
           <w:rPr>
@@ -2594,7 +2598,7 @@
           <w14:ligatures w14:val="standardContextual"/>
         </w:rPr>
       </w:pPr>
-      <w:hyperlink w:anchor="_Toc238746848" w:history="1">
+      <w:hyperlink w:anchor="_Toc239675522" w:history="1">
         <w:r>
           <w:rPr>
             <w:rStyle w:val="aff1"/>
@@ -2621,7 +2625,7 @@
             <w:noProof/>
             <w:webHidden/>
           </w:rPr>
-          <w:instrText xml:space="preserve"> PAGEREF _Toc238746848 \h </w:instrText>
+          <w:instrText xml:space="preserve"> PAGEREF _Toc239675522 \h </w:instrText>
         </w:r>
         <w:r>
           <w:rPr>
@@ -2670,7 +2674,7 @@
           <w14:ligatures w14:val="standardContextual"/>
         </w:rPr>
       </w:pPr>
-      <w:hyperlink w:anchor="_Toc238746849" w:history="1">
+      <w:hyperlink w:anchor="_Toc239675523" w:history="1">
         <w:r>
           <w:rPr>
             <w:rStyle w:val="aff1"/>
@@ -2697,7 +2701,7 @@
             <w:noProof/>
             <w:webHidden/>
           </w:rPr>
-          <w:instrText xml:space="preserve"> PAGEREF _Toc238746849 \h </w:instrText>
+          <w:instrText xml:space="preserve"> PAGEREF _Toc239675523 \h </w:instrText>
         </w:r>
         <w:r>
           <w:rPr>
@@ -2746,7 +2750,7 @@
           <w14:ligatures w14:val="standardContextual"/>
         </w:rPr>
       </w:pPr>
-      <w:hyperlink w:anchor="_Toc238746850" w:history="1">
+      <w:hyperlink w:anchor="_Toc239675524" w:history="1">
         <w:r>
           <w:rPr>
             <w:rStyle w:val="aff1"/>
@@ -2773,7 +2777,7 @@
             <w:noProof/>
             <w:webHidden/>
           </w:rPr>
-          <w:instrText xml:space="preserve"> PAGEREF _Toc238746850 \h </w:instrText>
+          <w:instrText xml:space="preserve"> PAGEREF _Toc239675524 \h </w:instrText>
         </w:r>
         <w:r>
           <w:rPr>
@@ -2822,7 +2826,7 @@
           <w14:ligatures w14:val="standardContextual"/>
         </w:rPr>
       </w:pPr>
-      <w:hyperlink w:anchor="_Toc238746851" w:history="1">
+      <w:hyperlink w:anchor="_Toc239675525" w:history="1">
         <w:r>
           <w:rPr>
             <w:rStyle w:val="aff1"/>
@@ -2849,7 +2853,7 @@
             <w:noProof/>
             <w:webHidden/>
           </w:rPr>
-          <w:instrText xml:space="preserve"> PAGEREF _Toc238746851 \h </w:instrText>
+          <w:instrText xml:space="preserve"> PAGEREF _Toc239675525 \h </w:instrText>
         </w:r>
         <w:r>
           <w:rPr>
@@ -2898,7 +2902,7 @@
           <w14:ligatures w14:val="standardContextual"/>
         </w:rPr>
       </w:pPr>
-      <w:hyperlink w:anchor="_Toc238746852" w:history="1">
+      <w:hyperlink w:anchor="_Toc239675526" w:history="1">
         <w:r>
           <w:rPr>
             <w:rStyle w:val="aff1"/>
@@ -2925,7 +2929,7 @@
             <w:noProof/>
             <w:webHidden/>
           </w:rPr>
-          <w:instrText xml:space="preserve"> PAGEREF _Toc238746852 \h </w:instrText>
+          <w:instrText xml:space="preserve"> PAGEREF _Toc239675526 \h </w:instrText>
         </w:r>
         <w:r>
           <w:rPr>
@@ -2974,7 +2978,7 @@
           <w14:ligatures w14:val="standardContextual"/>
         </w:rPr>
       </w:pPr>
-      <w:hyperlink w:anchor="_Toc238746853" w:history="1">
+      <w:hyperlink w:anchor="_Toc239675527" w:history="1">
         <w:r>
           <w:rPr>
             <w:rStyle w:val="aff1"/>
@@ -3001,7 +3005,7 @@
             <w:noProof/>
             <w:webHidden/>
           </w:rPr>
-          <w:instrText xml:space="preserve"> PAGEREF _Toc238746853 \h </w:instrText>
+          <w:instrText xml:space="preserve"> PAGEREF _Toc239675527 \h </w:instrText>
         </w:r>
         <w:r>
           <w:rPr>
@@ -3050,7 +3054,7 @@
           <w14:ligatures w14:val="standardContextual"/>
         </w:rPr>
       </w:pPr>
-      <w:hyperlink w:anchor="_Toc238746854" w:history="1">
+      <w:hyperlink w:anchor="_Toc239675528" w:history="1">
         <w:r>
           <w:rPr>
             <w:rStyle w:val="aff1"/>
@@ -3077,7 +3081,7 @@
             <w:noProof/>
             <w:webHidden/>
           </w:rPr>
-          <w:instrText xml:space="preserve"> PAGEREF _Toc238746854 \h </w:instrText>
+          <w:instrText xml:space="preserve"> PAGEREF _Toc239675528 \h </w:instrText>
         </w:r>
         <w:r>
           <w:rPr>
@@ -3125,7 +3129,7 @@
           <w14:ligatures w14:val="standardContextual"/>
         </w:rPr>
       </w:pPr>
-      <w:hyperlink w:anchor="_Toc238746855" w:history="1">
+      <w:hyperlink w:anchor="_Toc239675529" w:history="1">
         <w:r>
           <w:rPr>
             <w:rStyle w:val="aff1"/>
@@ -3152,7 +3156,7 @@
             <w:noProof/>
             <w:webHidden/>
           </w:rPr>
-          <w:instrText xml:space="preserve"> PAGEREF _Toc238746855 \h </w:instrText>
+          <w:instrText xml:space="preserve"> PAGEREF _Toc239675529 \h </w:instrText>
         </w:r>
         <w:r>
           <w:rPr>
@@ -3201,7 +3205,7 @@
           <w14:ligatures w14:val="standardContextual"/>
         </w:rPr>
       </w:pPr>
-      <w:hyperlink w:anchor="_Toc238746856" w:history="1">
+      <w:hyperlink w:anchor="_Toc239675530" w:history="1">
         <w:r>
           <w:rPr>
             <w:rStyle w:val="aff1"/>
@@ -3228,7 +3232,7 @@
             <w:noProof/>
             <w:webHidden/>
           </w:rPr>
-          <w:instrText xml:space="preserve"> PAGEREF _Toc238746856 \h </w:instrText>
+          <w:instrText xml:space="preserve"> PAGEREF _Toc239675530 \h </w:instrText>
         </w:r>
         <w:r>
           <w:rPr>
@@ -3277,7 +3281,7 @@
           <w14:ligatures w14:val="standardContextual"/>
         </w:rPr>
       </w:pPr>
-      <w:hyperlink w:anchor="_Toc238746857" w:history="1">
+      <w:hyperlink w:anchor="_Toc239675531" w:history="1">
         <w:r>
           <w:rPr>
             <w:rStyle w:val="aff1"/>
@@ -3304,7 +3308,7 @@
             <w:noProof/>
             <w:webHidden/>
           </w:rPr>
-          <w:instrText xml:space="preserve"> PAGEREF _Toc238746857 \h </w:instrText>
+          <w:instrText xml:space="preserve"> PAGEREF _Toc239675531 \h </w:instrText>
         </w:r>
         <w:r>
           <w:rPr>
@@ -3353,7 +3357,7 @@
           <w14:ligatures w14:val="standardContextual"/>
         </w:rPr>
       </w:pPr>
-      <w:hyperlink w:anchor="_Toc238746858" w:history="1">
+      <w:hyperlink w:anchor="_Toc239675532" w:history="1">
         <w:r>
           <w:rPr>
             <w:rStyle w:val="aff1"/>
@@ -3380,7 +3384,7 @@
             <w:noProof/>
             <w:webHidden/>
           </w:rPr>
-          <w:instrText xml:space="preserve"> PAGEREF _Toc238746858 \h </w:instrText>
+          <w:instrText xml:space="preserve"> PAGEREF _Toc239675532 \h </w:instrText>
         </w:r>
         <w:r>
           <w:rPr>
@@ -3429,7 +3433,7 @@
           <w14:ligatures w14:val="standardContextual"/>
         </w:rPr>
       </w:pPr>
-      <w:hyperlink w:anchor="_Toc238746859" w:history="1">
+      <w:hyperlink w:anchor="_Toc239675533" w:history="1">
         <w:r>
           <w:rPr>
             <w:rStyle w:val="aff1"/>
@@ -3456,7 +3460,7 @@
             <w:noProof/>
             <w:webHidden/>
           </w:rPr>
-          <w:instrText xml:space="preserve"> PAGEREF _Toc238746859 \h </w:instrText>
+          <w:instrText xml:space="preserve"> PAGEREF _Toc239675533 \h </w:instrText>
         </w:r>
         <w:r>
           <w:rPr>
@@ -3505,7 +3509,7 @@
           <w14:ligatures w14:val="standardContextual"/>
         </w:rPr>
       </w:pPr>
-      <w:hyperlink w:anchor="_Toc238746860" w:history="1">
+      <w:hyperlink w:anchor="_Toc239675534" w:history="1">
         <w:r>
           <w:rPr>
             <w:rStyle w:val="aff1"/>
@@ -3532,7 +3536,7 @@
             <w:noProof/>
             <w:webHidden/>
           </w:rPr>
-          <w:instrText xml:space="preserve"> PAGEREF _Toc238746860 \h </w:instrText>
+          <w:instrText xml:space="preserve"> PAGEREF _Toc239675534 \h </w:instrText>
         </w:r>
         <w:r>
           <w:rPr>
@@ -3581,7 +3585,7 @@
           <w14:ligatures w14:val="standardContextual"/>
         </w:rPr>
       </w:pPr>
-      <w:hyperlink w:anchor="_Toc238746861" w:history="1">
+      <w:hyperlink w:anchor="_Toc239675535" w:history="1">
         <w:r>
           <w:rPr>
             <w:rStyle w:val="aff1"/>
@@ -3608,7 +3612,7 @@
             <w:noProof/>
             <w:webHidden/>
           </w:rPr>
-          <w:instrText xml:space="preserve"> PAGEREF _Toc238746861 \h </w:instrText>
+          <w:instrText xml:space="preserve"> PAGEREF _Toc239675535 \h </w:instrText>
         </w:r>
         <w:r>
           <w:rPr>
@@ -3657,7 +3661,7 @@
           <w14:ligatures w14:val="standardContextual"/>
         </w:rPr>
       </w:pPr>
-      <w:hyperlink w:anchor="_Toc238746862" w:history="1">
+      <w:hyperlink w:anchor="_Toc239675536" w:history="1">
         <w:r>
           <w:rPr>
             <w:rStyle w:val="aff1"/>
@@ -3684,7 +3688,7 @@
             <w:noProof/>
             <w:webHidden/>
           </w:rPr>
-          <w:instrText xml:space="preserve"> PAGEREF _Toc238746862 \h </w:instrText>
+          <w:instrText xml:space="preserve"> PAGEREF _Toc239675536 \h </w:instrText>
         </w:r>
         <w:r>
           <w:rPr>
@@ -3733,7 +3737,7 @@
           <w14:ligatures w14:val="standardContextual"/>
         </w:rPr>
       </w:pPr>
-      <w:hyperlink w:anchor="_Toc238746863" w:history="1">
+      <w:hyperlink w:anchor="_Toc239675537" w:history="1">
         <w:r>
           <w:rPr>
             <w:rStyle w:val="aff1"/>
@@ -3760,7 +3764,7 @@
             <w:noProof/>
             <w:webHidden/>
           </w:rPr>
-          <w:instrText xml:space="preserve"> PAGEREF _Toc238746863 \h </w:instrText>
+          <w:instrText xml:space="preserve"> PAGEREF _Toc239675537 \h </w:instrText>
         </w:r>
         <w:r>
           <w:rPr>
@@ -3809,7 +3813,7 @@
           <w14:ligatures w14:val="standardContextual"/>
         </w:rPr>
       </w:pPr>
-      <w:hyperlink w:anchor="_Toc238746864" w:history="1">
+      <w:hyperlink w:anchor="_Toc239675538" w:history="1">
         <w:r>
           <w:rPr>
             <w:rStyle w:val="aff1"/>
@@ -3836,7 +3840,7 @@
             <w:noProof/>
             <w:webHidden/>
           </w:rPr>
-          <w:instrText xml:space="preserve"> PAGEREF _Toc238746864 \h </w:instrText>
+          <w:instrText xml:space="preserve"> PAGEREF _Toc239675538 \h </w:instrText>
         </w:r>
         <w:r>
           <w:rPr>
@@ -3884,7 +3888,7 @@
           <w14:ligatures w14:val="standardContextual"/>
         </w:rPr>
       </w:pPr>
-      <w:hyperlink w:anchor="_Toc238746865" w:history="1">
+      <w:hyperlink w:anchor="_Toc239675539" w:history="1">
         <w:r>
           <w:rPr>
             <w:rStyle w:val="aff1"/>
@@ -3911,7 +3915,7 @@
             <w:noProof/>
             <w:webHidden/>
           </w:rPr>
-          <w:instrText xml:space="preserve"> PAGEREF _Toc238746865 \h </w:instrText>
+          <w:instrText xml:space="preserve"> PAGEREF _Toc239675539 \h </w:instrText>
         </w:r>
         <w:r>
           <w:rPr>
@@ -3960,7 +3964,7 @@
           <w14:ligatures w14:val="standardContextual"/>
         </w:rPr>
       </w:pPr>
-      <w:hyperlink w:anchor="_Toc238746866" w:history="1">
+      <w:hyperlink w:anchor="_Toc239675540" w:history="1">
         <w:r>
           <w:rPr>
             <w:rStyle w:val="aff1"/>
@@ -3987,7 +3991,7 @@
             <w:noProof/>
             <w:webHidden/>
           </w:rPr>
-          <w:instrText xml:space="preserve"> PAGEREF _Toc238746866 \h </w:instrText>
+          <w:instrText xml:space="preserve"> PAGEREF _Toc239675540 \h </w:instrText>
         </w:r>
         <w:r>
           <w:rPr>
@@ -4036,7 +4040,7 @@
           <w14:ligatures w14:val="standardContextual"/>
         </w:rPr>
       </w:pPr>
-      <w:hyperlink w:anchor="_Toc238746867" w:history="1">
+      <w:hyperlink w:anchor="_Toc239675541" w:history="1">
         <w:r>
           <w:rPr>
             <w:rStyle w:val="aff1"/>
@@ -4063,7 +4067,7 @@
             <w:noProof/>
             <w:webHidden/>
           </w:rPr>
-          <w:instrText xml:space="preserve"> PAGEREF _Toc238746867 \h </w:instrText>
+          <w:instrText xml:space="preserve"> PAGEREF _Toc239675541 \h </w:instrText>
         </w:r>
         <w:r>
           <w:rPr>
@@ -4112,7 +4116,7 @@
           <w14:ligatures w14:val="standardContextual"/>
         </w:rPr>
       </w:pPr>
-      <w:hyperlink w:anchor="_Toc238746868" w:history="1">
+      <w:hyperlink w:anchor="_Toc239675542" w:history="1">
         <w:r>
           <w:rPr>
             <w:rStyle w:val="aff1"/>
@@ -4139,7 +4143,7 @@
             <w:noProof/>
             <w:webHidden/>
           </w:rPr>
-          <w:instrText xml:space="preserve"> PAGEREF _Toc238746868 \h </w:instrText>
+          <w:instrText xml:space="preserve"> PAGEREF _Toc239675542 \h </w:instrText>
         </w:r>
         <w:r>
           <w:rPr>
@@ -4188,7 +4192,7 @@
           <w14:ligatures w14:val="standardContextual"/>
         </w:rPr>
       </w:pPr>
-      <w:hyperlink w:anchor="_Toc238746869" w:history="1">
+      <w:hyperlink w:anchor="_Toc239675543" w:history="1">
         <w:r>
           <w:rPr>
             <w:rStyle w:val="aff1"/>
@@ -4215,7 +4219,7 @@
             <w:noProof/>
             <w:webHidden/>
           </w:rPr>
-          <w:instrText xml:space="preserve"> PAGEREF _Toc238746869 \h </w:instrText>
+          <w:instrText xml:space="preserve"> PAGEREF _Toc239675543 \h </w:instrText>
         </w:r>
         <w:r>
           <w:rPr>
@@ -4264,7 +4268,7 @@
           <w14:ligatures w14:val="standardContextual"/>
         </w:rPr>
       </w:pPr>
-      <w:hyperlink w:anchor="_Toc238746870" w:history="1">
+      <w:hyperlink w:anchor="_Toc239675544" w:history="1">
         <w:r>
           <w:rPr>
             <w:rStyle w:val="aff1"/>
@@ -4291,7 +4295,7 @@
             <w:noProof/>
             <w:webHidden/>
           </w:rPr>
-          <w:instrText xml:space="preserve"> PAGEREF _Toc238746870 \h </w:instrText>
+          <w:instrText xml:space="preserve"> PAGEREF _Toc239675544 \h </w:instrText>
         </w:r>
         <w:r>
           <w:rPr>
@@ -4340,7 +4344,7 @@
           <w14:ligatures w14:val="standardContextual"/>
         </w:rPr>
       </w:pPr>
-      <w:hyperlink w:anchor="_Toc238746871" w:history="1">
+      <w:hyperlink w:anchor="_Toc239675545" w:history="1">
         <w:r>
           <w:rPr>
             <w:rStyle w:val="aff1"/>
@@ -4367,7 +4371,7 @@
             <w:noProof/>
             <w:webHidden/>
           </w:rPr>
-          <w:instrText xml:space="preserve"> PAGEREF _Toc238746871 \h </w:instrText>
+          <w:instrText xml:space="preserve"> PAGEREF _Toc239675545 \h </w:instrText>
         </w:r>
         <w:r>
           <w:rPr>
@@ -4416,7 +4420,7 @@
           <w14:ligatures w14:val="standardContextual"/>
         </w:rPr>
       </w:pPr>
-      <w:hyperlink w:anchor="_Toc238746872" w:history="1">
+      <w:hyperlink w:anchor="_Toc239675546" w:history="1">
         <w:r>
           <w:rPr>
             <w:rStyle w:val="aff1"/>
@@ -4443,7 +4447,7 @@
             <w:noProof/>
             <w:webHidden/>
           </w:rPr>
-          <w:instrText xml:space="preserve"> PAGEREF _Toc238746872 \h </w:instrText>
+          <w:instrText xml:space="preserve"> PAGEREF _Toc239675546 \h </w:instrText>
         </w:r>
         <w:r>
           <w:rPr>
@@ -4492,7 +4496,7 @@
           <w14:ligatures w14:val="standardContextual"/>
         </w:rPr>
       </w:pPr>
-      <w:hyperlink w:anchor="_Toc238746873" w:history="1">
+      <w:hyperlink w:anchor="_Toc239675547" w:history="1">
         <w:r>
           <w:rPr>
             <w:rStyle w:val="aff1"/>
@@ -4519,7 +4523,7 @@
             <w:noProof/>
             <w:webHidden/>
           </w:rPr>
-          <w:instrText xml:space="preserve"> PAGEREF _Toc238746873 \h </w:instrText>
+          <w:instrText xml:space="preserve"> PAGEREF _Toc239675547 \h </w:instrText>
         </w:r>
         <w:r>
           <w:rPr>
@@ -4567,7 +4571,7 @@
           <w14:ligatures w14:val="standardContextual"/>
         </w:rPr>
       </w:pPr>
-      <w:hyperlink w:anchor="_Toc238746874" w:history="1">
+      <w:hyperlink w:anchor="_Toc239675548" w:history="1">
         <w:r>
           <w:rPr>
             <w:rStyle w:val="aff1"/>
@@ -4594,7 +4598,7 @@
             <w:noProof/>
             <w:webHidden/>
           </w:rPr>
-          <w:instrText xml:space="preserve"> PAGEREF _Toc238746874 \h </w:instrText>
+          <w:instrText xml:space="preserve"> PAGEREF _Toc239675548 \h </w:instrText>
         </w:r>
         <w:r>
           <w:rPr>
@@ -4643,7 +4647,7 @@
           <w14:ligatures w14:val="standardContextual"/>
         </w:rPr>
       </w:pPr>
-      <w:hyperlink w:anchor="_Toc238746875" w:history="1">
+      <w:hyperlink w:anchor="_Toc239675549" w:history="1">
         <w:r>
           <w:rPr>
             <w:rStyle w:val="aff1"/>
@@ -4670,7 +4674,7 @@
             <w:noProof/>
             <w:webHidden/>
           </w:rPr>
-          <w:instrText xml:space="preserve"> PAGEREF _Toc238746875 \h </w:instrText>
+          <w:instrText xml:space="preserve"> PAGEREF _Toc239675549 \h </w:instrText>
         </w:r>
         <w:r>
           <w:rPr>
@@ -4719,7 +4723,7 @@
           <w14:ligatures w14:val="standardContextual"/>
         </w:rPr>
       </w:pPr>
-      <w:hyperlink w:anchor="_Toc238746876" w:history="1">
+      <w:hyperlink w:anchor="_Toc239675550" w:history="1">
         <w:r>
           <w:rPr>
             <w:rStyle w:val="aff1"/>
@@ -4746,7 +4750,7 @@
             <w:noProof/>
             <w:webHidden/>
           </w:rPr>
-          <w:instrText xml:space="preserve"> PAGEREF _Toc238746876 \h </w:instrText>
+          <w:instrText xml:space="preserve"> PAGEREF _Toc239675550 \h </w:instrText>
         </w:r>
         <w:r>
           <w:rPr>
@@ -4795,7 +4799,7 @@
           <w14:ligatures w14:val="standardContextual"/>
         </w:rPr>
       </w:pPr>
-      <w:hyperlink w:anchor="_Toc238746877" w:history="1">
+      <w:hyperlink w:anchor="_Toc239675551" w:history="1">
         <w:r>
           <w:rPr>
             <w:rStyle w:val="aff1"/>
@@ -4822,7 +4826,7 @@
             <w:noProof/>
             <w:webHidden/>
           </w:rPr>
-          <w:instrText xml:space="preserve"> PAGEREF _Toc238746877 \h </w:instrText>
+          <w:instrText xml:space="preserve"> PAGEREF _Toc239675551 \h </w:instrText>
         </w:r>
         <w:r>
           <w:rPr>
@@ -4871,7 +4875,7 @@
           <w14:ligatures w14:val="standardContextual"/>
         </w:rPr>
       </w:pPr>
-      <w:hyperlink w:anchor="_Toc238746878" w:history="1">
+      <w:hyperlink w:anchor="_Toc239675552" w:history="1">
         <w:r>
           <w:rPr>
             <w:rStyle w:val="aff1"/>
@@ -4898,7 +4902,7 @@
             <w:noProof/>
             <w:webHidden/>
           </w:rPr>
-          <w:instrText xml:space="preserve"> PAGEREF _Toc238746878 \h </w:instrText>
+          <w:instrText xml:space="preserve"> PAGEREF _Toc239675552 \h </w:instrText>
         </w:r>
         <w:r>
           <w:rPr>
@@ -4947,7 +4951,7 @@
           <w14:ligatures w14:val="standardContextual"/>
         </w:rPr>
       </w:pPr>
-      <w:hyperlink w:anchor="_Toc238746879" w:history="1">
+      <w:hyperlink w:anchor="_Toc239675553" w:history="1">
         <w:r>
           <w:rPr>
             <w:rStyle w:val="aff1"/>
@@ -4974,7 +4978,7 @@
             <w:noProof/>
             <w:webHidden/>
           </w:rPr>
-          <w:instrText xml:space="preserve"> PAGEREF _Toc238746879 \h </w:instrText>
+          <w:instrText xml:space="preserve"> PAGEREF _Toc239675553 \h </w:instrText>
         </w:r>
         <w:r>
           <w:rPr>
@@ -5023,7 +5027,7 @@
           <w14:ligatures w14:val="standardContextual"/>
         </w:rPr>
       </w:pPr>
-      <w:hyperlink w:anchor="_Toc238746880" w:history="1">
+      <w:hyperlink w:anchor="_Toc239675554" w:history="1">
         <w:r>
           <w:rPr>
             <w:rStyle w:val="aff1"/>
@@ -5050,7 +5054,7 @@
             <w:noProof/>
             <w:webHidden/>
           </w:rPr>
-          <w:instrText xml:space="preserve"> PAGEREF _Toc238746880 \h </w:instrText>
+          <w:instrText xml:space="preserve"> PAGEREF _Toc239675554 \h </w:instrText>
         </w:r>
         <w:r>
           <w:rPr>
@@ -5099,7 +5103,7 @@
           <w14:ligatures w14:val="standardContextual"/>
         </w:rPr>
       </w:pPr>
-      <w:hyperlink w:anchor="_Toc238746881" w:history="1">
+      <w:hyperlink w:anchor="_Toc239675555" w:history="1">
         <w:r>
           <w:rPr>
             <w:rStyle w:val="aff1"/>
@@ -5126,7 +5130,7 @@
             <w:noProof/>
             <w:webHidden/>
           </w:rPr>
-          <w:instrText xml:space="preserve"> PAGEREF _Toc238746881 \h </w:instrText>
+          <w:instrText xml:space="preserve"> PAGEREF _Toc239675555 \h </w:instrText>
         </w:r>
         <w:r>
           <w:rPr>
@@ -5174,7 +5178,7 @@
           <w14:ligatures w14:val="standardContextual"/>
         </w:rPr>
       </w:pPr>
-      <w:hyperlink w:anchor="_Toc238746882" w:history="1">
+      <w:hyperlink w:anchor="_Toc239675556" w:history="1">
         <w:r>
           <w:rPr>
             <w:rStyle w:val="aff1"/>
@@ -5201,7 +5205,7 @@
             <w:noProof/>
             <w:webHidden/>
           </w:rPr>
-          <w:instrText xml:space="preserve"> PAGEREF _Toc238746882 \h </w:instrText>
+          <w:instrText xml:space="preserve"> PAGEREF _Toc239675556 \h </w:instrText>
         </w:r>
         <w:r>
           <w:rPr>
@@ -5249,7 +5253,7 @@
           <w14:ligatures w14:val="standardContextual"/>
         </w:rPr>
       </w:pPr>
-      <w:hyperlink w:anchor="_Toc238746883" w:history="1">
+      <w:hyperlink w:anchor="_Toc239675557" w:history="1">
         <w:r>
           <w:rPr>
             <w:rStyle w:val="aff1"/>
@@ -5276,7 +5280,7 @@
             <w:noProof/>
             <w:webHidden/>
           </w:rPr>
-          <w:instrText xml:space="preserve"> PAGEREF _Toc238746883 \h </w:instrText>
+          <w:instrText xml:space="preserve"> PAGEREF _Toc239675557 \h </w:instrText>
         </w:r>
         <w:r>
           <w:rPr>
@@ -5324,7 +5328,7 @@
           <w14:ligatures w14:val="standardContextual"/>
         </w:rPr>
       </w:pPr>
-      <w:hyperlink w:anchor="_Toc238746884" w:history="1">
+      <w:hyperlink w:anchor="_Toc239675558" w:history="1">
         <w:r>
           <w:rPr>
             <w:rStyle w:val="aff1"/>
@@ -5351,7 +5355,7 @@
             <w:noProof/>
             <w:webHidden/>
           </w:rPr>
-          <w:instrText xml:space="preserve"> PAGEREF _Toc238746884 \h </w:instrText>
+          <w:instrText xml:space="preserve"> PAGEREF _Toc239675558 \h </w:instrText>
         </w:r>
         <w:r>
           <w:rPr>
@@ -5399,7 +5403,7 @@
           <w:numId w:val="7"/>
         </w:numPr>
       </w:pPr>
-      <w:bookmarkStart w:id="0" w:name="_Toc238746821"/>
+      <w:bookmarkStart w:id="0" w:name="_Toc239675495"/>
       <w:r>
         <w:lastRenderedPageBreak/>
         <w:t>게임</w:t>
@@ -5432,7 +5436,7 @@
           <w:numId w:val="7"/>
         </w:numPr>
       </w:pPr>
-      <w:bookmarkStart w:id="1" w:name="_Toc238746822"/>
+      <w:bookmarkStart w:id="1" w:name="_Toc239675496"/>
       <w:r>
         <w:t>Executive Summary</w:t>
       </w:r>
@@ -5445,7 +5449,7 @@
     </w:p>
     <w:p>
       <w:r>
-        <w:t>한 판은 15~25분이다. 팀은 최소 계약만 달성하고 빠질 수도 있고, 더 많은 전시품과 Loose Loot를 노려 Extra Value를 키울 수도 있다. 하지만 Carried Value는 Extraction에 Deposit되기 전까지 안전하지 않다. 이 ‘더 훔칠까, 지금 나갈까’의 반복 판단이 한 판의 중심 리듬을 만든다.</w:t>
+        <w:t>한 판의 목표 플레이 시간은 15~25분이다. 팀은 최소 계약만 달성하고 빠질 수도 있고, 더 많은 전시품과 Loose Loot를 노려 Extra Value를 키울 수도 있다. 하지만 Carried Value는 Extraction에 Deposit되기 전까지 안전하지 않다. 이 ‘더 훔칠까, 지금 나갈까’의 반복 판단이 한 판의 중심 리듬을 만든다.</w:t>
       </w:r>
     </w:p>
     <w:tbl>
@@ -5500,7 +5504,7 @@
           <w:numId w:val="7"/>
         </w:numPr>
       </w:pPr>
-      <w:bookmarkStart w:id="2" w:name="_Toc238746823"/>
+      <w:bookmarkStart w:id="2" w:name="_Toc239675497"/>
       <w:r>
         <w:t>Rev 16 Release Profile</w:t>
       </w:r>
@@ -5524,7 +5528,7 @@
           <w:numId w:val="7"/>
         </w:numPr>
       </w:pPr>
-      <w:bookmarkStart w:id="3" w:name="_Toc238746824"/>
+      <w:bookmarkStart w:id="3" w:name="_Toc239675498"/>
       <w:r>
         <w:t>제품</w:t>
       </w:r>
@@ -5808,7 +5812,7 @@
           <w:numId w:val="7"/>
         </w:numPr>
       </w:pPr>
-      <w:bookmarkStart w:id="4" w:name="_Toc238746825"/>
+      <w:bookmarkStart w:id="4" w:name="_Toc239675499"/>
       <w:r>
         <w:t>디자인</w:t>
       </w:r>
@@ -6171,7 +6175,7 @@
           <w:numId w:val="7"/>
         </w:numPr>
       </w:pPr>
-      <w:bookmarkStart w:id="5" w:name="_Toc238746826"/>
+      <w:bookmarkStart w:id="5" w:name="_Toc239675500"/>
       <w:r>
         <w:t>Target Experience</w:t>
       </w:r>
@@ -6245,7 +6249,7 @@
           <w:numId w:val="7"/>
         </w:numPr>
       </w:pPr>
-      <w:bookmarkStart w:id="6" w:name="_Toc238746827"/>
+      <w:bookmarkStart w:id="6" w:name="_Toc239675501"/>
       <w:r>
         <w:t>명시적</w:t>
       </w:r>
@@ -6511,7 +6515,7 @@
           <w:numId w:val="7"/>
         </w:numPr>
       </w:pPr>
-      <w:bookmarkStart w:id="7" w:name="_Toc238746828"/>
+      <w:bookmarkStart w:id="7" w:name="_Toc239675502"/>
       <w:r>
         <w:lastRenderedPageBreak/>
         <w:t>Contract Run</w:t>
@@ -6547,7 +6551,7 @@
           <w:numId w:val="7"/>
         </w:numPr>
       </w:pPr>
-      <w:bookmarkStart w:id="8" w:name="_Toc238746829"/>
+      <w:bookmarkStart w:id="8" w:name="_Toc239675503"/>
       <w:r>
         <w:t>Core Loop</w:t>
       </w:r>
@@ -6908,7 +6912,7 @@
           </w:tcPr>
           <w:p>
             <w:r>
-              <w:t>교체 소음이나 작업 Timeout에 근처 경비가 조사하고, 시야 발각·추격은 별도 Alert 흐름을 만든다.</w:t>
+              <w:t>교체 소음이나 작업 Timeout에 근처 경비가 조사한다. 시야 발각은 추격으로, 포획 확정은 경계도 상승으로 이어진다.</w:t>
             </w:r>
           </w:p>
         </w:tc>
@@ -7034,7 +7038,7 @@
           <w:numId w:val="7"/>
         </w:numPr>
       </w:pPr>
-      <w:bookmarkStart w:id="9" w:name="_Toc238746830"/>
+      <w:bookmarkStart w:id="9" w:name="_Toc239675504"/>
       <w:r>
         <w:t xml:space="preserve">Contract </w:t>
       </w:r>
@@ -7243,7 +7247,7 @@
               <w:pStyle w:val="TableText"/>
             </w:pPr>
             <w:r>
-              <w:t>HUD 목표선</w:t>
+              <w:t>Inventory에서 Secured Value와 함께 확인하고 Result에서 최종 비교</w:t>
             </w:r>
           </w:p>
         </w:tc>
@@ -7451,9 +7455,8 @@
           <w:numId w:val="7"/>
         </w:numPr>
       </w:pPr>
-      <w:bookmarkStart w:id="10" w:name="_Toc238746831"/>
-      <w:r>
-        <w:lastRenderedPageBreak/>
+      <w:bookmarkStart w:id="10" w:name="_Toc239675505"/>
+      <w:r>
         <w:t>성공</w:t>
       </w:r>
       <w:r>
@@ -7650,7 +7653,7 @@
               <w:pStyle w:val="TableText"/>
             </w:pPr>
             <w:r>
-              <w:t>Required Target은 확보했으나 Quota 미달, 또는 계약 가치 일부만 확보</w:t>
+              <w:t>Required Target을 Secured했으나 Secured Value가 Quota 미달</w:t>
             </w:r>
           </w:p>
         </w:tc>
@@ -7736,7 +7739,7 @@
           <w:numId w:val="7"/>
         </w:numPr>
       </w:pPr>
-      <w:bookmarkStart w:id="11" w:name="_Toc238746832"/>
+      <w:bookmarkStart w:id="11" w:name="_Toc239675506"/>
       <w:r>
         <w:t>Greed Decision</w:t>
       </w:r>
@@ -8098,7 +8101,7 @@
           <w:numId w:val="7"/>
         </w:numPr>
       </w:pPr>
-      <w:bookmarkStart w:id="12" w:name="_Toc238746833"/>
+      <w:bookmarkStart w:id="12" w:name="_Toc239675507"/>
       <w:r>
         <w:t>15~25</w:t>
       </w:r>
@@ -8461,7 +8464,7 @@
           <w:numId w:val="7"/>
         </w:numPr>
       </w:pPr>
-      <w:bookmarkStart w:id="13" w:name="_Toc238746834"/>
+      <w:bookmarkStart w:id="13" w:name="_Toc239675508"/>
       <w:r>
         <w:lastRenderedPageBreak/>
         <w:t>위조와</w:t>
@@ -8488,7 +8491,7 @@
           <w:numId w:val="7"/>
         </w:numPr>
       </w:pPr>
-      <w:bookmarkStart w:id="14" w:name="_Toc238746835"/>
+      <w:bookmarkStart w:id="14" w:name="_Toc239675509"/>
       <w:r>
         <w:t>Artifact</w:t>
       </w:r>
@@ -8776,7 +8779,7 @@
           <w:numId w:val="7"/>
         </w:numPr>
       </w:pPr>
-      <w:bookmarkStart w:id="15" w:name="_Toc238746836"/>
+      <w:bookmarkStart w:id="15" w:name="_Toc239675510"/>
       <w:r>
         <w:t xml:space="preserve">Surface Forgery </w:t>
       </w:r>
@@ -8958,7 +8961,7 @@
           <w:numId w:val="7"/>
         </w:numPr>
       </w:pPr>
-      <w:bookmarkStart w:id="16" w:name="_Toc238746837"/>
+      <w:bookmarkStart w:id="16" w:name="_Toc239675511"/>
       <w:r>
         <w:t>Object Assembly — Deferred Expansion</w:t>
       </w:r>
@@ -9026,7 +9029,7 @@
           <w:numId w:val="7"/>
         </w:numPr>
       </w:pPr>
-      <w:bookmarkStart w:id="17" w:name="_Toc238746838"/>
+      <w:bookmarkStart w:id="17" w:name="_Toc239675512"/>
       <w:r>
         <w:t>Quality</w:t>
       </w:r>
@@ -9299,7 +9302,7 @@
           <w:numId w:val="7"/>
         </w:numPr>
       </w:pPr>
-      <w:bookmarkStart w:id="18" w:name="_Toc238746839"/>
+      <w:bookmarkStart w:id="18" w:name="_Toc239675513"/>
       <w:r>
         <w:t>핵심</w:t>
       </w:r>
@@ -9792,7 +9795,7 @@
           <w:numId w:val="7"/>
         </w:numPr>
       </w:pPr>
-      <w:bookmarkStart w:id="19" w:name="_Toc238746840"/>
+      <w:bookmarkStart w:id="19" w:name="_Toc239675514"/>
       <w:r>
         <w:t xml:space="preserve">Owner-only Forgery </w:t>
       </w:r>
@@ -10029,7 +10032,7 @@
           <w:numId w:val="7"/>
         </w:numPr>
       </w:pPr>
-      <w:bookmarkStart w:id="20" w:name="_Toc238746841"/>
+      <w:bookmarkStart w:id="20" w:name="_Toc239675515"/>
       <w:r>
         <w:lastRenderedPageBreak/>
         <w:t>잠입</w:t>
@@ -10062,7 +10065,7 @@
           <w:numId w:val="7"/>
         </w:numPr>
       </w:pPr>
-      <w:bookmarkStart w:id="21" w:name="_Toc238746842"/>
+      <w:bookmarkStart w:id="21" w:name="_Toc239675516"/>
       <w:r>
         <w:t xml:space="preserve">First-Person </w:t>
       </w:r>
@@ -10127,7 +10130,7 @@
           <w:numId w:val="7"/>
         </w:numPr>
       </w:pPr>
-      <w:bookmarkStart w:id="22" w:name="_Toc238746843"/>
+      <w:bookmarkStart w:id="22" w:name="_Toc239675517"/>
       <w:r>
         <w:t>Walk, Sprint, Weight, Footstep</w:t>
       </w:r>
@@ -10462,7 +10465,7 @@
           <w:numId w:val="7"/>
         </w:numPr>
       </w:pPr>
-      <w:bookmarkStart w:id="23" w:name="_Toc238746844"/>
+      <w:bookmarkStart w:id="23" w:name="_Toc239675518"/>
       <w:r>
         <w:t>Patrol Guard</w:t>
       </w:r>
@@ -10800,7 +10803,7 @@
           <w:numId w:val="7"/>
         </w:numPr>
       </w:pPr>
-      <w:bookmarkStart w:id="24" w:name="_Toc238746845"/>
+      <w:bookmarkStart w:id="24" w:name="_Toc239675519"/>
       <w:r>
         <w:t>CCTV</w:t>
       </w:r>
@@ -11050,7 +11053,7 @@
           <w:numId w:val="7"/>
         </w:numPr>
       </w:pPr>
-      <w:bookmarkStart w:id="25" w:name="_Toc238746846"/>
+      <w:bookmarkStart w:id="25" w:name="_Toc239675520"/>
       <w:r>
         <w:lastRenderedPageBreak/>
         <w:t>Stun, Arrest, Recovery</w:t>
@@ -11125,7 +11128,7 @@
           <w:numId w:val="7"/>
         </w:numPr>
       </w:pPr>
-      <w:bookmarkStart w:id="26" w:name="_Toc238746847"/>
+      <w:bookmarkStart w:id="26" w:name="_Toc239675521"/>
       <w:r>
         <w:t>두</w:t>
       </w:r>
@@ -11593,7 +11596,7 @@
           <w:numId w:val="7"/>
         </w:numPr>
       </w:pPr>
-      <w:bookmarkStart w:id="27" w:name="_Toc238746848"/>
+      <w:bookmarkStart w:id="27" w:name="_Toc239675522"/>
       <w:r>
         <w:lastRenderedPageBreak/>
         <w:t>협동</w:t>
@@ -11620,7 +11623,7 @@
           <w:numId w:val="7"/>
         </w:numPr>
       </w:pPr>
-      <w:bookmarkStart w:id="28" w:name="_Toc238746849"/>
+      <w:bookmarkStart w:id="28" w:name="_Toc239675523"/>
       <w:r>
         <w:t>Role Switching</w:t>
       </w:r>
@@ -12032,7 +12035,7 @@
       <w:pPr>
         <w:pStyle w:val="21"/>
       </w:pPr>
-      <w:bookmarkStart w:id="29" w:name="_Toc238746850"/>
+      <w:bookmarkStart w:id="29" w:name="_Toc239675524"/>
       <w:r>
         <w:t>거리</w:t>
       </w:r>
@@ -12076,7 +12079,7 @@
           <w:numId w:val="7"/>
         </w:numPr>
       </w:pPr>
-      <w:bookmarkStart w:id="30" w:name="_Toc238746851"/>
+      <w:bookmarkStart w:id="30" w:name="_Toc239675525"/>
       <w:r>
         <w:t>Inventory, Loose Loot, Coin</w:t>
       </w:r>
@@ -12139,7 +12142,7 @@
           <w:numId w:val="7"/>
         </w:numPr>
       </w:pPr>
-      <w:bookmarkStart w:id="31" w:name="_Toc238746852"/>
+      <w:bookmarkStart w:id="31" w:name="_Toc239675526"/>
       <w:r>
         <w:t>Player Identity</w:t>
       </w:r>
@@ -12555,7 +12558,7 @@
           <w:numId w:val="7"/>
         </w:numPr>
       </w:pPr>
-      <w:bookmarkStart w:id="32" w:name="_Toc238746853"/>
+      <w:bookmarkStart w:id="32" w:name="_Toc239675527"/>
       <w:r>
         <w:t xml:space="preserve">Floor Plan Map </w:t>
       </w:r>
@@ -12761,7 +12764,7 @@
           <w:numId w:val="7"/>
         </w:numPr>
       </w:pPr>
-      <w:bookmarkStart w:id="33" w:name="_Toc238746854"/>
+      <w:bookmarkStart w:id="33" w:name="_Toc239675528"/>
       <w:r>
         <w:t>Shared Extraction</w:t>
       </w:r>
@@ -12841,7 +12844,7 @@
           <w:numId w:val="7"/>
         </w:numPr>
       </w:pPr>
-      <w:bookmarkStart w:id="34" w:name="_Toc238746855"/>
+      <w:bookmarkStart w:id="34" w:name="_Toc239675529"/>
       <w:r>
         <w:lastRenderedPageBreak/>
         <w:t xml:space="preserve">UI, </w:t>
@@ -12865,7 +12868,7 @@
           <w:numId w:val="7"/>
         </w:numPr>
       </w:pPr>
-      <w:bookmarkStart w:id="35" w:name="_Toc238746856"/>
+      <w:bookmarkStart w:id="35" w:name="_Toc239675530"/>
       <w:r>
         <w:t>HUD Information Architecture</w:t>
       </w:r>
@@ -13153,7 +13156,7 @@
           <w:numId w:val="7"/>
         </w:numPr>
       </w:pPr>
-      <w:bookmarkStart w:id="36" w:name="_Toc238746857"/>
+      <w:bookmarkStart w:id="36" w:name="_Toc239675531"/>
       <w:r>
         <w:t xml:space="preserve">Main HUD </w:t>
       </w:r>
@@ -13452,7 +13455,7 @@
           <w:numId w:val="7"/>
         </w:numPr>
       </w:pPr>
-      <w:bookmarkStart w:id="37" w:name="_Toc238746858"/>
+      <w:bookmarkStart w:id="37" w:name="_Toc239675532"/>
       <w:r>
         <w:lastRenderedPageBreak/>
         <w:t>최소</w:t>
@@ -13538,7 +13541,7 @@
           <w:numId w:val="7"/>
         </w:numPr>
       </w:pPr>
-      <w:bookmarkStart w:id="38" w:name="_Toc238746859"/>
+      <w:bookmarkStart w:id="38" w:name="_Toc239675533"/>
       <w:r>
         <w:lastRenderedPageBreak/>
         <w:t xml:space="preserve">Input Mode </w:t>
@@ -14011,7 +14014,7 @@
           <w:numId w:val="7"/>
         </w:numPr>
       </w:pPr>
-      <w:bookmarkStart w:id="39" w:name="_Toc238746860"/>
+      <w:bookmarkStart w:id="39" w:name="_Toc239675534"/>
       <w:r>
         <w:t>Floor Plan</w:t>
       </w:r>
@@ -14034,7 +14037,7 @@
           <w:numId w:val="7"/>
         </w:numPr>
       </w:pPr>
-      <w:bookmarkStart w:id="40" w:name="_Toc238746861"/>
+      <w:bookmarkStart w:id="40" w:name="_Toc239675535"/>
       <w:r>
         <w:t xml:space="preserve">Floor Plan Map </w:t>
       </w:r>
@@ -14341,7 +14344,7 @@
           <w:numId w:val="7"/>
         </w:numPr>
       </w:pPr>
-      <w:bookmarkStart w:id="41" w:name="_Toc238746862"/>
+      <w:bookmarkStart w:id="41" w:name="_Toc239675536"/>
       <w:r>
         <w:t xml:space="preserve">Team Result / Replica Recap </w:t>
       </w:r>
@@ -14706,7 +14709,7 @@
           <w:numId w:val="7"/>
         </w:numPr>
       </w:pPr>
-      <w:bookmarkStart w:id="42" w:name="_Toc238746863"/>
+      <w:bookmarkStart w:id="42" w:name="_Toc239675537"/>
       <w:r>
         <w:t>첫</w:t>
       </w:r>
@@ -14974,7 +14977,7 @@
           <w:numId w:val="7"/>
         </w:numPr>
       </w:pPr>
-      <w:bookmarkStart w:id="43" w:name="_Toc238746864"/>
+      <w:bookmarkStart w:id="43" w:name="_Toc239675538"/>
       <w:r>
         <w:t>접근성</w:t>
       </w:r>
@@ -15042,7 +15045,7 @@
           <w:numId w:val="7"/>
         </w:numPr>
       </w:pPr>
-      <w:bookmarkStart w:id="44" w:name="_Toc238746865"/>
+      <w:bookmarkStart w:id="44" w:name="_Toc239675539"/>
       <w:r>
         <w:lastRenderedPageBreak/>
         <w:t>레벨</w:t>
@@ -15075,7 +15078,7 @@
           <w:numId w:val="7"/>
         </w:numPr>
       </w:pPr>
-      <w:bookmarkStart w:id="45" w:name="_Toc238746866"/>
+      <w:bookmarkStart w:id="45" w:name="_Toc239675540"/>
       <w:r>
         <w:t>세</w:t>
       </w:r>
@@ -15173,7 +15176,7 @@
           <w:numId w:val="7"/>
         </w:numPr>
       </w:pPr>
-      <w:bookmarkStart w:id="46" w:name="_Toc238746867"/>
+      <w:bookmarkStart w:id="46" w:name="_Toc239675541"/>
       <w:r>
         <w:t>맵</w:t>
       </w:r>
@@ -15610,7 +15613,7 @@
           <w:numId w:val="7"/>
         </w:numPr>
       </w:pPr>
-      <w:bookmarkStart w:id="47" w:name="_Toc238746868"/>
+      <w:bookmarkStart w:id="47" w:name="_Toc239675542"/>
       <w:r>
         <w:t xml:space="preserve">M01 — </w:t>
       </w:r>
@@ -15915,7 +15918,7 @@
           <w:numId w:val="7"/>
         </w:numPr>
       </w:pPr>
-      <w:bookmarkStart w:id="48" w:name="_Toc238746869"/>
+      <w:bookmarkStart w:id="48" w:name="_Toc239675543"/>
       <w:r>
         <w:t xml:space="preserve">M02 — </w:t>
       </w:r>
@@ -16220,7 +16223,7 @@
           <w:numId w:val="7"/>
         </w:numPr>
       </w:pPr>
-      <w:bookmarkStart w:id="49" w:name="_Toc238746870"/>
+      <w:bookmarkStart w:id="49" w:name="_Toc239675544"/>
       <w:r>
         <w:lastRenderedPageBreak/>
         <w:t xml:space="preserve">M03 — </w:t>
@@ -16526,7 +16529,7 @@
           <w:numId w:val="7"/>
         </w:numPr>
       </w:pPr>
-      <w:bookmarkStart w:id="50" w:name="_Toc238746871"/>
+      <w:bookmarkStart w:id="50" w:name="_Toc239675545"/>
       <w:r>
         <w:lastRenderedPageBreak/>
         <w:t xml:space="preserve">First-Person </w:t>
@@ -16610,7 +16613,7 @@
           <w:numId w:val="7"/>
         </w:numPr>
       </w:pPr>
-      <w:bookmarkStart w:id="51" w:name="_Toc238746872"/>
+      <w:bookmarkStart w:id="51" w:name="_Toc239675546"/>
       <w:r>
         <w:t>사운드</w:t>
       </w:r>
@@ -17043,7 +17046,7 @@
           <w:numId w:val="7"/>
         </w:numPr>
       </w:pPr>
-      <w:bookmarkStart w:id="52" w:name="_Toc238746873"/>
+      <w:bookmarkStart w:id="52" w:name="_Toc239675547"/>
       <w:r>
         <w:lastRenderedPageBreak/>
         <w:t>세계관과</w:t>
@@ -17284,7 +17287,7 @@
           <w:numId w:val="7"/>
         </w:numPr>
       </w:pPr>
-      <w:bookmarkStart w:id="53" w:name="_Toc238746874"/>
+      <w:bookmarkStart w:id="53" w:name="_Toc239675548"/>
       <w:r>
         <w:lastRenderedPageBreak/>
         <w:t>범위</w:t>
@@ -17311,7 +17314,7 @@
           <w:numId w:val="7"/>
         </w:numPr>
       </w:pPr>
-      <w:bookmarkStart w:id="54" w:name="_Toc238746875"/>
+      <w:bookmarkStart w:id="54" w:name="_Toc239675549"/>
       <w:r>
         <w:t>v1.0 Required Scope</w:t>
       </w:r>
@@ -17673,7 +17676,7 @@
           <w:numId w:val="7"/>
         </w:numPr>
       </w:pPr>
-      <w:bookmarkStart w:id="55" w:name="_Toc238746876"/>
+      <w:bookmarkStart w:id="55" w:name="_Toc239675550"/>
       <w:r>
         <w:t>Deferred Expansion</w:t>
       </w:r>
@@ -17697,7 +17700,7 @@
           <w:numId w:val="7"/>
         </w:numPr>
       </w:pPr>
-      <w:bookmarkStart w:id="56" w:name="_Toc238746877"/>
+      <w:bookmarkStart w:id="56" w:name="_Toc239675551"/>
       <w:r>
         <w:t>Stretch</w:t>
       </w:r>
@@ -18069,7 +18072,7 @@
           <w:numId w:val="7"/>
         </w:numPr>
       </w:pPr>
-      <w:bookmarkStart w:id="57" w:name="_Toc238746878"/>
+      <w:bookmarkStart w:id="57" w:name="_Toc239675552"/>
       <w:r>
         <w:t>Starting Balance Targets</w:t>
       </w:r>
@@ -18660,7 +18663,7 @@
           <w:numId w:val="7"/>
         </w:numPr>
       </w:pPr>
-      <w:bookmarkStart w:id="58" w:name="_Toc238746879"/>
+      <w:bookmarkStart w:id="58" w:name="_Toc239675553"/>
       <w:r>
         <w:t>Playtest Questions</w:t>
       </w:r>
@@ -18746,7 +18749,7 @@
           <w:numId w:val="7"/>
         </w:numPr>
       </w:pPr>
-      <w:bookmarkStart w:id="59" w:name="_Toc238746880"/>
+      <w:bookmarkStart w:id="59" w:name="_Toc239675554"/>
       <w:r>
         <w:lastRenderedPageBreak/>
         <w:t>Release KPI</w:t>
@@ -19072,7 +19075,7 @@
           <w:numId w:val="7"/>
         </w:numPr>
       </w:pPr>
-      <w:bookmarkStart w:id="60" w:name="_Toc238746881"/>
+      <w:bookmarkStart w:id="60" w:name="_Toc239675555"/>
       <w:r>
         <w:t>W6~W12 Roadmap</w:t>
       </w:r>
@@ -19425,7 +19428,7 @@
         <w:keepLines/>
         <w:pageBreakBefore w:val="0"/>
       </w:pPr>
-      <w:bookmarkStart w:id="61" w:name="_Toc238746882"/>
+      <w:bookmarkStart w:id="61" w:name="_Toc239675556"/>
       <w:r>
         <w:t>Appendix A — 용어</w:t>
       </w:r>
@@ -19810,7 +19813,7 @@
         <w:keepLines/>
         <w:pageBreakBefore w:val="0"/>
       </w:pPr>
-      <w:bookmarkStart w:id="62" w:name="_Toc238746883"/>
+      <w:bookmarkStart w:id="62" w:name="_Toc239675557"/>
       <w:r>
         <w:rPr>
           <w:sz w:val="32"/>
@@ -20034,7 +20037,7 @@
         <w:keepLines/>
         <w:pageBreakBefore w:val="0"/>
       </w:pPr>
-      <w:bookmarkStart w:id="63" w:name="_Toc238746884"/>
+      <w:bookmarkStart w:id="63" w:name="_Toc239675558"/>
       <w:r>
         <w:rPr>
           <w:sz w:val="32"/>

</xml_diff>

<commit_message>
Fix authority edge cases and harden content validation
Reject late Stun actions, preserve preview gates, resolve the final disconnect after PlayerState removal, and show the observed artifact in the HUD.

Validate import completion and package roots, cover failure cases and travel readiness, and reconcile Rev16 design and QA documents.
</commit_message>
<xml_diff>
--- a/Museum_Heist_GDD.docx
+++ b/Museum_Heist_GDD.docx
@@ -63,6 +63,7 @@
       <w:tr>
         <w:trPr>
           <w:cantSplit/>
+          <w:tblHeader/>
           <w:jc w:val="center"/>
         </w:trPr>
         <w:tc>
@@ -79,6 +80,7 @@
           <w:p>
             <w:pPr>
               <w:pStyle w:val="TableText"/>
+              <w:keepNext/>
             </w:pPr>
             <w:r>
               <w:rPr>
@@ -101,12 +103,15 @@
             </w:tcMar>
           </w:tcPr>
           <w:p>
+            <w:pPr>
+              <w:keepNext/>
+            </w:pPr>
             <w:r>
               <w:t>Rev 16 · 2026-08-27</w:t>
             </w:r>
             <w:r>
               <w:br/>
-              <w:t>문서 정합성 검토 · 2026-09-07</w:t>
+              <w:t>문서 정합성 검토 · 2026-09-09</w:t>
             </w:r>
           </w:p>
         </w:tc>
@@ -241,6 +246,7 @@
       <w:tr>
         <w:trPr>
           <w:cantSplit/>
+          <w:tblHeader/>
           <w:jc w:val="center"/>
         </w:trPr>
         <w:tc>
@@ -258,6 +264,7 @@
           <w:p>
             <w:pPr>
               <w:pStyle w:val="TableText"/>
+              <w:keepNext/>
               <w:jc w:val="center"/>
             </w:pPr>
             <w:r>
@@ -284,6 +291,7 @@
           <w:p>
             <w:pPr>
               <w:pStyle w:val="TableText"/>
+              <w:keepNext/>
               <w:jc w:val="center"/>
             </w:pPr>
             <w:r>
@@ -469,7 +477,10 @@
     </w:tbl>
     <w:p>
       <w:pPr>
-        <w:spacing w:after="20"/>
+        <w:spacing w:after="0" w:line="20" w:lineRule="exact"/>
+        <w:rPr>
+          <w:sz w:val="2"/>
+        </w:rPr>
       </w:pPr>
     </w:p>
     <w:tbl>
@@ -513,7 +524,10 @@
     </w:tbl>
     <w:p>
       <w:pPr>
-        <w:spacing w:after="20"/>
+        <w:spacing w:after="0" w:line="20" w:lineRule="exact"/>
+        <w:rPr>
+          <w:sz w:val="2"/>
+        </w:rPr>
       </w:pPr>
     </w:p>
     <w:p>
@@ -550,7 +564,7 @@
       <w:r>
         <w:fldChar w:fldCharType="separate"/>
       </w:r>
-      <w:hyperlink w:anchor="_Toc239675495" w:history="1">
+      <w:hyperlink w:anchor="_Toc239828095" w:history="1">
         <w:r>
           <w:rPr>
             <w:rStyle w:val="aff1"/>
@@ -577,7 +591,7 @@
             <w:noProof/>
             <w:webHidden/>
           </w:rPr>
-          <w:instrText xml:space="preserve"> PAGEREF _Toc239675495 \h </w:instrText>
+          <w:instrText xml:space="preserve"> PAGEREF _Toc239828095 \h </w:instrText>
         </w:r>
         <w:r>
           <w:rPr>
@@ -597,7 +611,7 @@
             <w:noProof/>
             <w:webHidden/>
           </w:rPr>
-          <w:t>6</w:t>
+          <w:t>5</w:t>
         </w:r>
         <w:r>
           <w:rPr>
@@ -626,7 +640,7 @@
           <w14:ligatures w14:val="standardContextual"/>
         </w:rPr>
       </w:pPr>
-      <w:hyperlink w:anchor="_Toc239675496" w:history="1">
+      <w:hyperlink w:anchor="_Toc239828096" w:history="1">
         <w:r>
           <w:rPr>
             <w:rStyle w:val="aff1"/>
@@ -653,7 +667,7 @@
             <w:noProof/>
             <w:webHidden/>
           </w:rPr>
-          <w:instrText xml:space="preserve"> PAGEREF _Toc239675496 \h </w:instrText>
+          <w:instrText xml:space="preserve"> PAGEREF _Toc239828096 \h </w:instrText>
         </w:r>
         <w:r>
           <w:rPr>
@@ -673,7 +687,7 @@
             <w:noProof/>
             <w:webHidden/>
           </w:rPr>
-          <w:t>6</w:t>
+          <w:t>5</w:t>
         </w:r>
         <w:r>
           <w:rPr>
@@ -702,7 +716,7 @@
           <w14:ligatures w14:val="standardContextual"/>
         </w:rPr>
       </w:pPr>
-      <w:hyperlink w:anchor="_Toc239675497" w:history="1">
+      <w:hyperlink w:anchor="_Toc239828097" w:history="1">
         <w:r>
           <w:rPr>
             <w:rStyle w:val="aff1"/>
@@ -729,7 +743,7 @@
             <w:noProof/>
             <w:webHidden/>
           </w:rPr>
-          <w:instrText xml:space="preserve"> PAGEREF _Toc239675497 \h </w:instrText>
+          <w:instrText xml:space="preserve"> PAGEREF _Toc239828097 \h </w:instrText>
         </w:r>
         <w:r>
           <w:rPr>
@@ -749,7 +763,7 @@
             <w:noProof/>
             <w:webHidden/>
           </w:rPr>
-          <w:t>6</w:t>
+          <w:t>5</w:t>
         </w:r>
         <w:r>
           <w:rPr>
@@ -778,7 +792,7 @@
           <w14:ligatures w14:val="standardContextual"/>
         </w:rPr>
       </w:pPr>
-      <w:hyperlink w:anchor="_Toc239675498" w:history="1">
+      <w:hyperlink w:anchor="_Toc239828098" w:history="1">
         <w:r>
           <w:rPr>
             <w:rStyle w:val="aff1"/>
@@ -805,7 +819,7 @@
             <w:noProof/>
             <w:webHidden/>
           </w:rPr>
-          <w:instrText xml:space="preserve"> PAGEREF _Toc239675498 \h </w:instrText>
+          <w:instrText xml:space="preserve"> PAGEREF _Toc239828098 \h </w:instrText>
         </w:r>
         <w:r>
           <w:rPr>
@@ -825,7 +839,7 @@
             <w:noProof/>
             <w:webHidden/>
           </w:rPr>
-          <w:t>6</w:t>
+          <w:t>5</w:t>
         </w:r>
         <w:r>
           <w:rPr>
@@ -854,7 +868,7 @@
           <w14:ligatures w14:val="standardContextual"/>
         </w:rPr>
       </w:pPr>
-      <w:hyperlink w:anchor="_Toc239675499" w:history="1">
+      <w:hyperlink w:anchor="_Toc239828099" w:history="1">
         <w:r>
           <w:rPr>
             <w:rStyle w:val="aff1"/>
@@ -881,7 +895,7 @@
             <w:noProof/>
             <w:webHidden/>
           </w:rPr>
-          <w:instrText xml:space="preserve"> PAGEREF _Toc239675499 \h </w:instrText>
+          <w:instrText xml:space="preserve"> PAGEREF _Toc239828099 \h </w:instrText>
         </w:r>
         <w:r>
           <w:rPr>
@@ -901,7 +915,7 @@
             <w:noProof/>
             <w:webHidden/>
           </w:rPr>
-          <w:t>7</w:t>
+          <w:t>6</w:t>
         </w:r>
         <w:r>
           <w:rPr>
@@ -930,7 +944,7 @@
           <w14:ligatures w14:val="standardContextual"/>
         </w:rPr>
       </w:pPr>
-      <w:hyperlink w:anchor="_Toc239675500" w:history="1">
+      <w:hyperlink w:anchor="_Toc239828100" w:history="1">
         <w:r>
           <w:rPr>
             <w:rStyle w:val="aff1"/>
@@ -957,7 +971,7 @@
             <w:noProof/>
             <w:webHidden/>
           </w:rPr>
-          <w:instrText xml:space="preserve"> PAGEREF _Toc239675500 \h </w:instrText>
+          <w:instrText xml:space="preserve"> PAGEREF _Toc239828100 \h </w:instrText>
         </w:r>
         <w:r>
           <w:rPr>
@@ -977,7 +991,7 @@
             <w:noProof/>
             <w:webHidden/>
           </w:rPr>
-          <w:t>7</w:t>
+          <w:t>6</w:t>
         </w:r>
         <w:r>
           <w:rPr>
@@ -1006,7 +1020,7 @@
           <w14:ligatures w14:val="standardContextual"/>
         </w:rPr>
       </w:pPr>
-      <w:hyperlink w:anchor="_Toc239675501" w:history="1">
+      <w:hyperlink w:anchor="_Toc239828101" w:history="1">
         <w:r>
           <w:rPr>
             <w:rStyle w:val="aff1"/>
@@ -1033,7 +1047,7 @@
             <w:noProof/>
             <w:webHidden/>
           </w:rPr>
-          <w:instrText xml:space="preserve"> PAGEREF _Toc239675501 \h </w:instrText>
+          <w:instrText xml:space="preserve"> PAGEREF _Toc239828101 \h </w:instrText>
         </w:r>
         <w:r>
           <w:rPr>
@@ -1053,7 +1067,7 @@
             <w:noProof/>
             <w:webHidden/>
           </w:rPr>
-          <w:t>7</w:t>
+          <w:t>6</w:t>
         </w:r>
         <w:r>
           <w:rPr>
@@ -1081,7 +1095,7 @@
           <w14:ligatures w14:val="standardContextual"/>
         </w:rPr>
       </w:pPr>
-      <w:hyperlink w:anchor="_Toc239675502" w:history="1">
+      <w:hyperlink w:anchor="_Toc239828102" w:history="1">
         <w:r>
           <w:rPr>
             <w:rStyle w:val="aff1"/>
@@ -1108,7 +1122,7 @@
             <w:noProof/>
             <w:webHidden/>
           </w:rPr>
-          <w:instrText xml:space="preserve"> PAGEREF _Toc239675502 \h </w:instrText>
+          <w:instrText xml:space="preserve"> PAGEREF _Toc239828102 \h </w:instrText>
         </w:r>
         <w:r>
           <w:rPr>
@@ -1128,7 +1142,7 @@
             <w:noProof/>
             <w:webHidden/>
           </w:rPr>
-          <w:t>9</w:t>
+          <w:t>7</w:t>
         </w:r>
         <w:r>
           <w:rPr>
@@ -1157,7 +1171,7 @@
           <w14:ligatures w14:val="standardContextual"/>
         </w:rPr>
       </w:pPr>
-      <w:hyperlink w:anchor="_Toc239675503" w:history="1">
+      <w:hyperlink w:anchor="_Toc239828103" w:history="1">
         <w:r>
           <w:rPr>
             <w:rStyle w:val="aff1"/>
@@ -1184,7 +1198,7 @@
             <w:noProof/>
             <w:webHidden/>
           </w:rPr>
-          <w:instrText xml:space="preserve"> PAGEREF _Toc239675503 \h </w:instrText>
+          <w:instrText xml:space="preserve"> PAGEREF _Toc239828103 \h </w:instrText>
         </w:r>
         <w:r>
           <w:rPr>
@@ -1204,7 +1218,7 @@
             <w:noProof/>
             <w:webHidden/>
           </w:rPr>
-          <w:t>9</w:t>
+          <w:t>7</w:t>
         </w:r>
         <w:r>
           <w:rPr>
@@ -1233,7 +1247,7 @@
           <w14:ligatures w14:val="standardContextual"/>
         </w:rPr>
       </w:pPr>
-      <w:hyperlink w:anchor="_Toc239675504" w:history="1">
+      <w:hyperlink w:anchor="_Toc239828104" w:history="1">
         <w:r>
           <w:rPr>
             <w:rStyle w:val="aff1"/>
@@ -1260,7 +1274,7 @@
             <w:noProof/>
             <w:webHidden/>
           </w:rPr>
-          <w:instrText xml:space="preserve"> PAGEREF _Toc239675504 \h </w:instrText>
+          <w:instrText xml:space="preserve"> PAGEREF _Toc239828104 \h </w:instrText>
         </w:r>
         <w:r>
           <w:rPr>
@@ -1280,7 +1294,7 @@
             <w:noProof/>
             <w:webHidden/>
           </w:rPr>
-          <w:t>9</w:t>
+          <w:t>7</w:t>
         </w:r>
         <w:r>
           <w:rPr>
@@ -1309,7 +1323,7 @@
           <w14:ligatures w14:val="standardContextual"/>
         </w:rPr>
       </w:pPr>
-      <w:hyperlink w:anchor="_Toc239675505" w:history="1">
+      <w:hyperlink w:anchor="_Toc239828105" w:history="1">
         <w:r>
           <w:rPr>
             <w:rStyle w:val="aff1"/>
@@ -1336,7 +1350,7 @@
             <w:noProof/>
             <w:webHidden/>
           </w:rPr>
-          <w:instrText xml:space="preserve"> PAGEREF _Toc239675505 \h </w:instrText>
+          <w:instrText xml:space="preserve"> PAGEREF _Toc239828105 \h </w:instrText>
         </w:r>
         <w:r>
           <w:rPr>
@@ -1356,7 +1370,7 @@
             <w:noProof/>
             <w:webHidden/>
           </w:rPr>
-          <w:t>10</w:t>
+          <w:t>8</w:t>
         </w:r>
         <w:r>
           <w:rPr>
@@ -1385,7 +1399,7 @@
           <w14:ligatures w14:val="standardContextual"/>
         </w:rPr>
       </w:pPr>
-      <w:hyperlink w:anchor="_Toc239675506" w:history="1">
+      <w:hyperlink w:anchor="_Toc239828106" w:history="1">
         <w:r>
           <w:rPr>
             <w:rStyle w:val="aff1"/>
@@ -1412,7 +1426,7 @@
             <w:noProof/>
             <w:webHidden/>
           </w:rPr>
-          <w:instrText xml:space="preserve"> PAGEREF _Toc239675506 \h </w:instrText>
+          <w:instrText xml:space="preserve"> PAGEREF _Toc239828106 \h </w:instrText>
         </w:r>
         <w:r>
           <w:rPr>
@@ -1432,7 +1446,7 @@
             <w:noProof/>
             <w:webHidden/>
           </w:rPr>
-          <w:t>10</w:t>
+          <w:t>8</w:t>
         </w:r>
         <w:r>
           <w:rPr>
@@ -1461,7 +1475,7 @@
           <w14:ligatures w14:val="standardContextual"/>
         </w:rPr>
       </w:pPr>
-      <w:hyperlink w:anchor="_Toc239675507" w:history="1">
+      <w:hyperlink w:anchor="_Toc239828107" w:history="1">
         <w:r>
           <w:rPr>
             <w:rStyle w:val="aff1"/>
@@ -1488,7 +1502,7 @@
             <w:noProof/>
             <w:webHidden/>
           </w:rPr>
-          <w:instrText xml:space="preserve"> PAGEREF _Toc239675507 \h </w:instrText>
+          <w:instrText xml:space="preserve"> PAGEREF _Toc239828107 \h </w:instrText>
         </w:r>
         <w:r>
           <w:rPr>
@@ -1508,7 +1522,7 @@
             <w:noProof/>
             <w:webHidden/>
           </w:rPr>
-          <w:t>10</w:t>
+          <w:t>8</w:t>
         </w:r>
         <w:r>
           <w:rPr>
@@ -1536,7 +1550,7 @@
           <w14:ligatures w14:val="standardContextual"/>
         </w:rPr>
       </w:pPr>
-      <w:hyperlink w:anchor="_Toc239675508" w:history="1">
+      <w:hyperlink w:anchor="_Toc239828108" w:history="1">
         <w:r>
           <w:rPr>
             <w:rStyle w:val="aff1"/>
@@ -1563,7 +1577,7 @@
             <w:noProof/>
             <w:webHidden/>
           </w:rPr>
-          <w:instrText xml:space="preserve"> PAGEREF _Toc239675508 \h </w:instrText>
+          <w:instrText xml:space="preserve"> PAGEREF _Toc239828108 \h </w:instrText>
         </w:r>
         <w:r>
           <w:rPr>
@@ -1583,7 +1597,7 @@
             <w:noProof/>
             <w:webHidden/>
           </w:rPr>
-          <w:t>11</w:t>
+          <w:t>9</w:t>
         </w:r>
         <w:r>
           <w:rPr>
@@ -1612,7 +1626,7 @@
           <w14:ligatures w14:val="standardContextual"/>
         </w:rPr>
       </w:pPr>
-      <w:hyperlink w:anchor="_Toc239675509" w:history="1">
+      <w:hyperlink w:anchor="_Toc239828109" w:history="1">
         <w:r>
           <w:rPr>
             <w:rStyle w:val="aff1"/>
@@ -1639,7 +1653,7 @@
             <w:noProof/>
             <w:webHidden/>
           </w:rPr>
-          <w:instrText xml:space="preserve"> PAGEREF _Toc239675509 \h </w:instrText>
+          <w:instrText xml:space="preserve"> PAGEREF _Toc239828109 \h </w:instrText>
         </w:r>
         <w:r>
           <w:rPr>
@@ -1659,7 +1673,7 @@
             <w:noProof/>
             <w:webHidden/>
           </w:rPr>
-          <w:t>11</w:t>
+          <w:t>9</w:t>
         </w:r>
         <w:r>
           <w:rPr>
@@ -1688,7 +1702,7 @@
           <w14:ligatures w14:val="standardContextual"/>
         </w:rPr>
       </w:pPr>
-      <w:hyperlink w:anchor="_Toc239675510" w:history="1">
+      <w:hyperlink w:anchor="_Toc239828110" w:history="1">
         <w:r>
           <w:rPr>
             <w:rStyle w:val="aff1"/>
@@ -1715,7 +1729,7 @@
             <w:noProof/>
             <w:webHidden/>
           </w:rPr>
-          <w:instrText xml:space="preserve"> PAGEREF _Toc239675510 \h </w:instrText>
+          <w:instrText xml:space="preserve"> PAGEREF _Toc239828110 \h </w:instrText>
         </w:r>
         <w:r>
           <w:rPr>
@@ -1735,7 +1749,7 @@
             <w:noProof/>
             <w:webHidden/>
           </w:rPr>
-          <w:t>11</w:t>
+          <w:t>9</w:t>
         </w:r>
         <w:r>
           <w:rPr>
@@ -1764,7 +1778,7 @@
           <w14:ligatures w14:val="standardContextual"/>
         </w:rPr>
       </w:pPr>
-      <w:hyperlink w:anchor="_Toc239675511" w:history="1">
+      <w:hyperlink w:anchor="_Toc239828111" w:history="1">
         <w:r>
           <w:rPr>
             <w:rStyle w:val="aff1"/>
@@ -1791,7 +1805,7 @@
             <w:noProof/>
             <w:webHidden/>
           </w:rPr>
-          <w:instrText xml:space="preserve"> PAGEREF _Toc239675511 \h </w:instrText>
+          <w:instrText xml:space="preserve"> PAGEREF _Toc239828111 \h </w:instrText>
         </w:r>
         <w:r>
           <w:rPr>
@@ -1811,7 +1825,7 @@
             <w:noProof/>
             <w:webHidden/>
           </w:rPr>
-          <w:t>12</w:t>
+          <w:t>10</w:t>
         </w:r>
         <w:r>
           <w:rPr>
@@ -1840,7 +1854,7 @@
           <w14:ligatures w14:val="standardContextual"/>
         </w:rPr>
       </w:pPr>
-      <w:hyperlink w:anchor="_Toc239675512" w:history="1">
+      <w:hyperlink w:anchor="_Toc239828112" w:history="1">
         <w:r>
           <w:rPr>
             <w:rStyle w:val="aff1"/>
@@ -1867,7 +1881,7 @@
             <w:noProof/>
             <w:webHidden/>
           </w:rPr>
-          <w:instrText xml:space="preserve"> PAGEREF _Toc239675512 \h </w:instrText>
+          <w:instrText xml:space="preserve"> PAGEREF _Toc239828112 \h </w:instrText>
         </w:r>
         <w:r>
           <w:rPr>
@@ -1887,7 +1901,7 @@
             <w:noProof/>
             <w:webHidden/>
           </w:rPr>
-          <w:t>13</w:t>
+          <w:t>11</w:t>
         </w:r>
         <w:r>
           <w:rPr>
@@ -1916,7 +1930,7 @@
           <w14:ligatures w14:val="standardContextual"/>
         </w:rPr>
       </w:pPr>
-      <w:hyperlink w:anchor="_Toc239675513" w:history="1">
+      <w:hyperlink w:anchor="_Toc239828113" w:history="1">
         <w:r>
           <w:rPr>
             <w:rStyle w:val="aff1"/>
@@ -1943,7 +1957,7 @@
             <w:noProof/>
             <w:webHidden/>
           </w:rPr>
-          <w:instrText xml:space="preserve"> PAGEREF _Toc239675513 \h </w:instrText>
+          <w:instrText xml:space="preserve"> PAGEREF _Toc239828113 \h </w:instrText>
         </w:r>
         <w:r>
           <w:rPr>
@@ -1963,7 +1977,7 @@
             <w:noProof/>
             <w:webHidden/>
           </w:rPr>
-          <w:t>13</w:t>
+          <w:t>11</w:t>
         </w:r>
         <w:r>
           <w:rPr>
@@ -1992,7 +2006,7 @@
           <w14:ligatures w14:val="standardContextual"/>
         </w:rPr>
       </w:pPr>
-      <w:hyperlink w:anchor="_Toc239675514" w:history="1">
+      <w:hyperlink w:anchor="_Toc239828114" w:history="1">
         <w:r>
           <w:rPr>
             <w:rStyle w:val="aff1"/>
@@ -2019,7 +2033,7 @@
             <w:noProof/>
             <w:webHidden/>
           </w:rPr>
-          <w:instrText xml:space="preserve"> PAGEREF _Toc239675514 \h </w:instrText>
+          <w:instrText xml:space="preserve"> PAGEREF _Toc239828114 \h </w:instrText>
         </w:r>
         <w:r>
           <w:rPr>
@@ -2039,7 +2053,7 @@
             <w:noProof/>
             <w:webHidden/>
           </w:rPr>
-          <w:t>14</w:t>
+          <w:t>12</w:t>
         </w:r>
         <w:r>
           <w:rPr>
@@ -2067,7 +2081,7 @@
           <w14:ligatures w14:val="standardContextual"/>
         </w:rPr>
       </w:pPr>
-      <w:hyperlink w:anchor="_Toc239675515" w:history="1">
+      <w:hyperlink w:anchor="_Toc239828115" w:history="1">
         <w:r>
           <w:rPr>
             <w:rStyle w:val="aff1"/>
@@ -2094,7 +2108,7 @@
             <w:noProof/>
             <w:webHidden/>
           </w:rPr>
-          <w:instrText xml:space="preserve"> PAGEREF _Toc239675515 \h </w:instrText>
+          <w:instrText xml:space="preserve"> PAGEREF _Toc239828115 \h </w:instrText>
         </w:r>
         <w:r>
           <w:rPr>
@@ -2114,7 +2128,7 @@
             <w:noProof/>
             <w:webHidden/>
           </w:rPr>
-          <w:t>15</w:t>
+          <w:t>13</w:t>
         </w:r>
         <w:r>
           <w:rPr>
@@ -2143,7 +2157,7 @@
           <w14:ligatures w14:val="standardContextual"/>
         </w:rPr>
       </w:pPr>
-      <w:hyperlink w:anchor="_Toc239675516" w:history="1">
+      <w:hyperlink w:anchor="_Toc239828116" w:history="1">
         <w:r>
           <w:rPr>
             <w:rStyle w:val="aff1"/>
@@ -2170,7 +2184,7 @@
             <w:noProof/>
             <w:webHidden/>
           </w:rPr>
-          <w:instrText xml:space="preserve"> PAGEREF _Toc239675516 \h </w:instrText>
+          <w:instrText xml:space="preserve"> PAGEREF _Toc239828116 \h </w:instrText>
         </w:r>
         <w:r>
           <w:rPr>
@@ -2190,7 +2204,7 @@
             <w:noProof/>
             <w:webHidden/>
           </w:rPr>
-          <w:t>15</w:t>
+          <w:t>13</w:t>
         </w:r>
         <w:r>
           <w:rPr>
@@ -2219,7 +2233,7 @@
           <w14:ligatures w14:val="standardContextual"/>
         </w:rPr>
       </w:pPr>
-      <w:hyperlink w:anchor="_Toc239675517" w:history="1">
+      <w:hyperlink w:anchor="_Toc239828117" w:history="1">
         <w:r>
           <w:rPr>
             <w:rStyle w:val="aff1"/>
@@ -2246,7 +2260,7 @@
             <w:noProof/>
             <w:webHidden/>
           </w:rPr>
-          <w:instrText xml:space="preserve"> PAGEREF _Toc239675517 \h </w:instrText>
+          <w:instrText xml:space="preserve"> PAGEREF _Toc239828117 \h </w:instrText>
         </w:r>
         <w:r>
           <w:rPr>
@@ -2266,7 +2280,7 @@
             <w:noProof/>
             <w:webHidden/>
           </w:rPr>
-          <w:t>15</w:t>
+          <w:t>13</w:t>
         </w:r>
         <w:r>
           <w:rPr>
@@ -2295,7 +2309,7 @@
           <w14:ligatures w14:val="standardContextual"/>
         </w:rPr>
       </w:pPr>
-      <w:hyperlink w:anchor="_Toc239675518" w:history="1">
+      <w:hyperlink w:anchor="_Toc239828118" w:history="1">
         <w:r>
           <w:rPr>
             <w:rStyle w:val="aff1"/>
@@ -2322,7 +2336,7 @@
             <w:noProof/>
             <w:webHidden/>
           </w:rPr>
-          <w:instrText xml:space="preserve"> PAGEREF _Toc239675518 \h </w:instrText>
+          <w:instrText xml:space="preserve"> PAGEREF _Toc239828118 \h </w:instrText>
         </w:r>
         <w:r>
           <w:rPr>
@@ -2342,7 +2356,7 @@
             <w:noProof/>
             <w:webHidden/>
           </w:rPr>
-          <w:t>15</w:t>
+          <w:t>13</w:t>
         </w:r>
         <w:r>
           <w:rPr>
@@ -2371,7 +2385,7 @@
           <w14:ligatures w14:val="standardContextual"/>
         </w:rPr>
       </w:pPr>
-      <w:hyperlink w:anchor="_Toc239675519" w:history="1">
+      <w:hyperlink w:anchor="_Toc239828119" w:history="1">
         <w:r>
           <w:rPr>
             <w:rStyle w:val="aff1"/>
@@ -2398,7 +2412,7 @@
             <w:noProof/>
             <w:webHidden/>
           </w:rPr>
-          <w:instrText xml:space="preserve"> PAGEREF _Toc239675519 \h </w:instrText>
+          <w:instrText xml:space="preserve"> PAGEREF _Toc239828119 \h </w:instrText>
         </w:r>
         <w:r>
           <w:rPr>
@@ -2418,7 +2432,7 @@
             <w:noProof/>
             <w:webHidden/>
           </w:rPr>
-          <w:t>16</w:t>
+          <w:t>14</w:t>
         </w:r>
         <w:r>
           <w:rPr>
@@ -2447,7 +2461,7 @@
           <w14:ligatures w14:val="standardContextual"/>
         </w:rPr>
       </w:pPr>
-      <w:hyperlink w:anchor="_Toc239675520" w:history="1">
+      <w:hyperlink w:anchor="_Toc239828120" w:history="1">
         <w:r>
           <w:rPr>
             <w:rStyle w:val="aff1"/>
@@ -2474,7 +2488,7 @@
             <w:noProof/>
             <w:webHidden/>
           </w:rPr>
-          <w:instrText xml:space="preserve"> PAGEREF _Toc239675520 \h </w:instrText>
+          <w:instrText xml:space="preserve"> PAGEREF _Toc239828120 \h </w:instrText>
         </w:r>
         <w:r>
           <w:rPr>
@@ -2494,7 +2508,7 @@
             <w:noProof/>
             <w:webHidden/>
           </w:rPr>
-          <w:t>17</w:t>
+          <w:t>15</w:t>
         </w:r>
         <w:r>
           <w:rPr>
@@ -2523,7 +2537,7 @@
           <w14:ligatures w14:val="standardContextual"/>
         </w:rPr>
       </w:pPr>
-      <w:hyperlink w:anchor="_Toc239675521" w:history="1">
+      <w:hyperlink w:anchor="_Toc239828121" w:history="1">
         <w:r>
           <w:rPr>
             <w:rStyle w:val="aff1"/>
@@ -2550,7 +2564,7 @@
             <w:noProof/>
             <w:webHidden/>
           </w:rPr>
-          <w:instrText xml:space="preserve"> PAGEREF _Toc239675521 \h </w:instrText>
+          <w:instrText xml:space="preserve"> PAGEREF _Toc239828121 \h </w:instrText>
         </w:r>
         <w:r>
           <w:rPr>
@@ -2570,7 +2584,7 @@
             <w:noProof/>
             <w:webHidden/>
           </w:rPr>
-          <w:t>17</w:t>
+          <w:t>15</w:t>
         </w:r>
         <w:r>
           <w:rPr>
@@ -2598,7 +2612,7 @@
           <w14:ligatures w14:val="standardContextual"/>
         </w:rPr>
       </w:pPr>
-      <w:hyperlink w:anchor="_Toc239675522" w:history="1">
+      <w:hyperlink w:anchor="_Toc239828122" w:history="1">
         <w:r>
           <w:rPr>
             <w:rStyle w:val="aff1"/>
@@ -2625,7 +2639,7 @@
             <w:noProof/>
             <w:webHidden/>
           </w:rPr>
-          <w:instrText xml:space="preserve"> PAGEREF _Toc239675522 \h </w:instrText>
+          <w:instrText xml:space="preserve"> PAGEREF _Toc239828122 \h </w:instrText>
         </w:r>
         <w:r>
           <w:rPr>
@@ -2645,7 +2659,7 @@
             <w:noProof/>
             <w:webHidden/>
           </w:rPr>
-          <w:t>18</w:t>
+          <w:t>16</w:t>
         </w:r>
         <w:r>
           <w:rPr>
@@ -2674,7 +2688,7 @@
           <w14:ligatures w14:val="standardContextual"/>
         </w:rPr>
       </w:pPr>
-      <w:hyperlink w:anchor="_Toc239675523" w:history="1">
+      <w:hyperlink w:anchor="_Toc239828123" w:history="1">
         <w:r>
           <w:rPr>
             <w:rStyle w:val="aff1"/>
@@ -2701,7 +2715,7 @@
             <w:noProof/>
             <w:webHidden/>
           </w:rPr>
-          <w:instrText xml:space="preserve"> PAGEREF _Toc239675523 \h </w:instrText>
+          <w:instrText xml:space="preserve"> PAGEREF _Toc239828123 \h </w:instrText>
         </w:r>
         <w:r>
           <w:rPr>
@@ -2721,7 +2735,7 @@
             <w:noProof/>
             <w:webHidden/>
           </w:rPr>
-          <w:t>18</w:t>
+          <w:t>16</w:t>
         </w:r>
         <w:r>
           <w:rPr>
@@ -2750,13 +2764,13 @@
           <w14:ligatures w14:val="standardContextual"/>
         </w:rPr>
       </w:pPr>
-      <w:hyperlink w:anchor="_Toc239675524" w:history="1">
+      <w:hyperlink w:anchor="_Toc239828124" w:history="1">
         <w:r>
           <w:rPr>
             <w:rStyle w:val="aff1"/>
             <w:noProof/>
           </w:rPr>
-          <w:t>거리 기반 팀 보이스와 발화 위험</w:t>
+          <w:t>5.2 거리 기반 팀 보이스와 발화 위험</w:t>
         </w:r>
         <w:r>
           <w:rPr>
@@ -2777,7 +2791,7 @@
             <w:noProof/>
             <w:webHidden/>
           </w:rPr>
-          <w:instrText xml:space="preserve"> PAGEREF _Toc239675524 \h </w:instrText>
+          <w:instrText xml:space="preserve"> PAGEREF _Toc239828124 \h </w:instrText>
         </w:r>
         <w:r>
           <w:rPr>
@@ -2797,7 +2811,7 @@
             <w:noProof/>
             <w:webHidden/>
           </w:rPr>
-          <w:t>18</w:t>
+          <w:t>16</w:t>
         </w:r>
         <w:r>
           <w:rPr>
@@ -2826,13 +2840,13 @@
           <w14:ligatures w14:val="standardContextual"/>
         </w:rPr>
       </w:pPr>
-      <w:hyperlink w:anchor="_Toc239675525" w:history="1">
+      <w:hyperlink w:anchor="_Toc239828125" w:history="1">
         <w:r>
           <w:rPr>
             <w:rStyle w:val="aff1"/>
             <w:noProof/>
           </w:rPr>
-          <w:t>5.2 Inventory, Loose Loot, Coin</w:t>
+          <w:t>5.3 Inventory, Loose Loot, Coin</w:t>
         </w:r>
         <w:r>
           <w:rPr>
@@ -2853,7 +2867,7 @@
             <w:noProof/>
             <w:webHidden/>
           </w:rPr>
-          <w:instrText xml:space="preserve"> PAGEREF _Toc239675525 \h </w:instrText>
+          <w:instrText xml:space="preserve"> PAGEREF _Toc239828125 \h </w:instrText>
         </w:r>
         <w:r>
           <w:rPr>
@@ -2873,7 +2887,7 @@
             <w:noProof/>
             <w:webHidden/>
           </w:rPr>
-          <w:t>18</w:t>
+          <w:t>16</w:t>
         </w:r>
         <w:r>
           <w:rPr>
@@ -2902,13 +2916,13 @@
           <w14:ligatures w14:val="standardContextual"/>
         </w:rPr>
       </w:pPr>
-      <w:hyperlink w:anchor="_Toc239675526" w:history="1">
+      <w:hyperlink w:anchor="_Toc239828126" w:history="1">
         <w:r>
           <w:rPr>
             <w:rStyle w:val="aff1"/>
             <w:noProof/>
           </w:rPr>
-          <w:t>5.3 Player Identity와 Team Status</w:t>
+          <w:t>5.4 Player Identity와 Team Status</w:t>
         </w:r>
         <w:r>
           <w:rPr>
@@ -2929,7 +2943,7 @@
             <w:noProof/>
             <w:webHidden/>
           </w:rPr>
-          <w:instrText xml:space="preserve"> PAGEREF _Toc239675526 \h </w:instrText>
+          <w:instrText xml:space="preserve"> PAGEREF _Toc239828126 \h </w:instrText>
         </w:r>
         <w:r>
           <w:rPr>
@@ -2949,7 +2963,7 @@
             <w:noProof/>
             <w:webHidden/>
           </w:rPr>
-          <w:t>19</w:t>
+          <w:t>17</w:t>
         </w:r>
         <w:r>
           <w:rPr>
@@ -2978,13 +2992,13 @@
           <w14:ligatures w14:val="standardContextual"/>
         </w:rPr>
       </w:pPr>
-      <w:hyperlink w:anchor="_Toc239675527" w:history="1">
+      <w:hyperlink w:anchor="_Toc239828127" w:history="1">
         <w:r>
           <w:rPr>
             <w:rStyle w:val="aff1"/>
             <w:noProof/>
           </w:rPr>
-          <w:t>5.4 Floor Plan Map 정보 정책</w:t>
+          <w:t>5.5 Floor Plan Map 정보 정책</w:t>
         </w:r>
         <w:r>
           <w:rPr>
@@ -3005,7 +3019,7 @@
             <w:noProof/>
             <w:webHidden/>
           </w:rPr>
-          <w:instrText xml:space="preserve"> PAGEREF _Toc239675527 \h </w:instrText>
+          <w:instrText xml:space="preserve"> PAGEREF _Toc239828127 \h </w:instrText>
         </w:r>
         <w:r>
           <w:rPr>
@@ -3025,7 +3039,7 @@
             <w:noProof/>
             <w:webHidden/>
           </w:rPr>
-          <w:t>19</w:t>
+          <w:t>17</w:t>
         </w:r>
         <w:r>
           <w:rPr>
@@ -3054,13 +3068,13 @@
           <w14:ligatures w14:val="standardContextual"/>
         </w:rPr>
       </w:pPr>
-      <w:hyperlink w:anchor="_Toc239675528" w:history="1">
+      <w:hyperlink w:anchor="_Toc239828128" w:history="1">
         <w:r>
           <w:rPr>
             <w:rStyle w:val="aff1"/>
             <w:noProof/>
           </w:rPr>
-          <w:t>5.5 Shared Extraction과 개인 Deposit</w:t>
+          <w:t>5.6 Shared Extraction과 개인 Deposit</w:t>
         </w:r>
         <w:r>
           <w:rPr>
@@ -3081,7 +3095,7 @@
             <w:noProof/>
             <w:webHidden/>
           </w:rPr>
-          <w:instrText xml:space="preserve"> PAGEREF _Toc239675528 \h </w:instrText>
+          <w:instrText xml:space="preserve"> PAGEREF _Toc239828128 \h </w:instrText>
         </w:r>
         <w:r>
           <w:rPr>
@@ -3101,7 +3115,7 @@
             <w:noProof/>
             <w:webHidden/>
           </w:rPr>
-          <w:t>19</w:t>
+          <w:t>17</w:t>
         </w:r>
         <w:r>
           <w:rPr>
@@ -3129,7 +3143,7 @@
           <w14:ligatures w14:val="standardContextual"/>
         </w:rPr>
       </w:pPr>
-      <w:hyperlink w:anchor="_Toc239675529" w:history="1">
+      <w:hyperlink w:anchor="_Toc239828129" w:history="1">
         <w:r>
           <w:rPr>
             <w:rStyle w:val="aff1"/>
@@ -3156,7 +3170,7 @@
             <w:noProof/>
             <w:webHidden/>
           </w:rPr>
-          <w:instrText xml:space="preserve"> PAGEREF _Toc239675529 \h </w:instrText>
+          <w:instrText xml:space="preserve"> PAGEREF _Toc239828129 \h </w:instrText>
         </w:r>
         <w:r>
           <w:rPr>
@@ -3176,7 +3190,7 @@
             <w:noProof/>
             <w:webHidden/>
           </w:rPr>
-          <w:t>21</w:t>
+          <w:t>19</w:t>
         </w:r>
         <w:r>
           <w:rPr>
@@ -3205,7 +3219,7 @@
           <w14:ligatures w14:val="standardContextual"/>
         </w:rPr>
       </w:pPr>
-      <w:hyperlink w:anchor="_Toc239675530" w:history="1">
+      <w:hyperlink w:anchor="_Toc239828130" w:history="1">
         <w:r>
           <w:rPr>
             <w:rStyle w:val="aff1"/>
@@ -3232,7 +3246,7 @@
             <w:noProof/>
             <w:webHidden/>
           </w:rPr>
-          <w:instrText xml:space="preserve"> PAGEREF _Toc239675530 \h </w:instrText>
+          <w:instrText xml:space="preserve"> PAGEREF _Toc239828130 \h </w:instrText>
         </w:r>
         <w:r>
           <w:rPr>
@@ -3252,7 +3266,7 @@
             <w:noProof/>
             <w:webHidden/>
           </w:rPr>
-          <w:t>21</w:t>
+          <w:t>19</w:t>
         </w:r>
         <w:r>
           <w:rPr>
@@ -3281,7 +3295,7 @@
           <w14:ligatures w14:val="standardContextual"/>
         </w:rPr>
       </w:pPr>
-      <w:hyperlink w:anchor="_Toc239675531" w:history="1">
+      <w:hyperlink w:anchor="_Toc239828131" w:history="1">
         <w:r>
           <w:rPr>
             <w:rStyle w:val="aff1"/>
@@ -3308,7 +3322,7 @@
             <w:noProof/>
             <w:webHidden/>
           </w:rPr>
-          <w:instrText xml:space="preserve"> PAGEREF _Toc239675531 \h </w:instrText>
+          <w:instrText xml:space="preserve"> PAGEREF _Toc239828131 \h </w:instrText>
         </w:r>
         <w:r>
           <w:rPr>
@@ -3328,7 +3342,7 @@
             <w:noProof/>
             <w:webHidden/>
           </w:rPr>
-          <w:t>21</w:t>
+          <w:t>19</w:t>
         </w:r>
         <w:r>
           <w:rPr>
@@ -3357,7 +3371,7 @@
           <w14:ligatures w14:val="standardContextual"/>
         </w:rPr>
       </w:pPr>
-      <w:hyperlink w:anchor="_Toc239675532" w:history="1">
+      <w:hyperlink w:anchor="_Toc239828132" w:history="1">
         <w:r>
           <w:rPr>
             <w:rStyle w:val="aff1"/>
@@ -3384,7 +3398,7 @@
             <w:noProof/>
             <w:webHidden/>
           </w:rPr>
-          <w:instrText xml:space="preserve"> PAGEREF _Toc239675532 \h </w:instrText>
+          <w:instrText xml:space="preserve"> PAGEREF _Toc239828132 \h </w:instrText>
         </w:r>
         <w:r>
           <w:rPr>
@@ -3404,7 +3418,7 @@
             <w:noProof/>
             <w:webHidden/>
           </w:rPr>
-          <w:t>22</w:t>
+          <w:t>20</w:t>
         </w:r>
         <w:r>
           <w:rPr>
@@ -3433,7 +3447,7 @@
           <w14:ligatures w14:val="standardContextual"/>
         </w:rPr>
       </w:pPr>
-      <w:hyperlink w:anchor="_Toc239675533" w:history="1">
+      <w:hyperlink w:anchor="_Toc239828133" w:history="1">
         <w:r>
           <w:rPr>
             <w:rStyle w:val="aff1"/>
@@ -3460,7 +3474,7 @@
             <w:noProof/>
             <w:webHidden/>
           </w:rPr>
-          <w:instrText xml:space="preserve"> PAGEREF _Toc239675533 \h </w:instrText>
+          <w:instrText xml:space="preserve"> PAGEREF _Toc239828133 \h </w:instrText>
         </w:r>
         <w:r>
           <w:rPr>
@@ -3480,7 +3494,7 @@
             <w:noProof/>
             <w:webHidden/>
           </w:rPr>
-          <w:t>23</w:t>
+          <w:t>20</w:t>
         </w:r>
         <w:r>
           <w:rPr>
@@ -3509,7 +3523,7 @@
           <w14:ligatures w14:val="standardContextual"/>
         </w:rPr>
       </w:pPr>
-      <w:hyperlink w:anchor="_Toc239675534" w:history="1">
+      <w:hyperlink w:anchor="_Toc239828134" w:history="1">
         <w:r>
           <w:rPr>
             <w:rStyle w:val="aff1"/>
@@ -3536,7 +3550,7 @@
             <w:noProof/>
             <w:webHidden/>
           </w:rPr>
-          <w:instrText xml:space="preserve"> PAGEREF _Toc239675534 \h </w:instrText>
+          <w:instrText xml:space="preserve"> PAGEREF _Toc239828134 \h </w:instrText>
         </w:r>
         <w:r>
           <w:rPr>
@@ -3556,7 +3570,7 @@
             <w:noProof/>
             <w:webHidden/>
           </w:rPr>
-          <w:t>23</w:t>
+          <w:t>21</w:t>
         </w:r>
         <w:r>
           <w:rPr>
@@ -3585,7 +3599,7 @@
           <w14:ligatures w14:val="standardContextual"/>
         </w:rPr>
       </w:pPr>
-      <w:hyperlink w:anchor="_Toc239675535" w:history="1">
+      <w:hyperlink w:anchor="_Toc239828135" w:history="1">
         <w:r>
           <w:rPr>
             <w:rStyle w:val="aff1"/>
@@ -3612,7 +3626,7 @@
             <w:noProof/>
             <w:webHidden/>
           </w:rPr>
-          <w:instrText xml:space="preserve"> PAGEREF _Toc239675535 \h </w:instrText>
+          <w:instrText xml:space="preserve"> PAGEREF _Toc239828135 \h </w:instrText>
         </w:r>
         <w:r>
           <w:rPr>
@@ -3632,7 +3646,7 @@
             <w:noProof/>
             <w:webHidden/>
           </w:rPr>
-          <w:t>23</w:t>
+          <w:t>21</w:t>
         </w:r>
         <w:r>
           <w:rPr>
@@ -3661,7 +3675,7 @@
           <w14:ligatures w14:val="standardContextual"/>
         </w:rPr>
       </w:pPr>
-      <w:hyperlink w:anchor="_Toc239675536" w:history="1">
+      <w:hyperlink w:anchor="_Toc239828136" w:history="1">
         <w:r>
           <w:rPr>
             <w:rStyle w:val="aff1"/>
@@ -3688,7 +3702,7 @@
             <w:noProof/>
             <w:webHidden/>
           </w:rPr>
-          <w:instrText xml:space="preserve"> PAGEREF _Toc239675536 \h </w:instrText>
+          <w:instrText xml:space="preserve"> PAGEREF _Toc239828136 \h </w:instrText>
         </w:r>
         <w:r>
           <w:rPr>
@@ -3708,7 +3722,7 @@
             <w:noProof/>
             <w:webHidden/>
           </w:rPr>
-          <w:t>23</w:t>
+          <w:t>21</w:t>
         </w:r>
         <w:r>
           <w:rPr>
@@ -3737,7 +3751,7 @@
           <w14:ligatures w14:val="standardContextual"/>
         </w:rPr>
       </w:pPr>
-      <w:hyperlink w:anchor="_Toc239675537" w:history="1">
+      <w:hyperlink w:anchor="_Toc239828137" w:history="1">
         <w:r>
           <w:rPr>
             <w:rStyle w:val="aff1"/>
@@ -3764,7 +3778,7 @@
             <w:noProof/>
             <w:webHidden/>
           </w:rPr>
-          <w:instrText xml:space="preserve"> PAGEREF _Toc239675537 \h </w:instrText>
+          <w:instrText xml:space="preserve"> PAGEREF _Toc239828137 \h </w:instrText>
         </w:r>
         <w:r>
           <w:rPr>
@@ -3784,7 +3798,7 @@
             <w:noProof/>
             <w:webHidden/>
           </w:rPr>
-          <w:t>24</w:t>
+          <w:t>21</w:t>
         </w:r>
         <w:r>
           <w:rPr>
@@ -3813,7 +3827,7 @@
           <w14:ligatures w14:val="standardContextual"/>
         </w:rPr>
       </w:pPr>
-      <w:hyperlink w:anchor="_Toc239675538" w:history="1">
+      <w:hyperlink w:anchor="_Toc239828138" w:history="1">
         <w:r>
           <w:rPr>
             <w:rStyle w:val="aff1"/>
@@ -3840,7 +3854,7 @@
             <w:noProof/>
             <w:webHidden/>
           </w:rPr>
-          <w:instrText xml:space="preserve"> PAGEREF _Toc239675538 \h </w:instrText>
+          <w:instrText xml:space="preserve"> PAGEREF _Toc239828138 \h </w:instrText>
         </w:r>
         <w:r>
           <w:rPr>
@@ -3860,7 +3874,7 @@
             <w:noProof/>
             <w:webHidden/>
           </w:rPr>
-          <w:t>24</w:t>
+          <w:t>22</w:t>
         </w:r>
         <w:r>
           <w:rPr>
@@ -3888,7 +3902,7 @@
           <w14:ligatures w14:val="standardContextual"/>
         </w:rPr>
       </w:pPr>
-      <w:hyperlink w:anchor="_Toc239675539" w:history="1">
+      <w:hyperlink w:anchor="_Toc239828139" w:history="1">
         <w:r>
           <w:rPr>
             <w:rStyle w:val="aff1"/>
@@ -3915,7 +3929,7 @@
             <w:noProof/>
             <w:webHidden/>
           </w:rPr>
-          <w:instrText xml:space="preserve"> PAGEREF _Toc239675539 \h </w:instrText>
+          <w:instrText xml:space="preserve"> PAGEREF _Toc239828139 \h </w:instrText>
         </w:r>
         <w:r>
           <w:rPr>
@@ -3935,7 +3949,7 @@
             <w:noProof/>
             <w:webHidden/>
           </w:rPr>
-          <w:t>25</w:t>
+          <w:t>23</w:t>
         </w:r>
         <w:r>
           <w:rPr>
@@ -3964,7 +3978,7 @@
           <w14:ligatures w14:val="standardContextual"/>
         </w:rPr>
       </w:pPr>
-      <w:hyperlink w:anchor="_Toc239675540" w:history="1">
+      <w:hyperlink w:anchor="_Toc239828140" w:history="1">
         <w:r>
           <w:rPr>
             <w:rStyle w:val="aff1"/>
@@ -3991,7 +4005,7 @@
             <w:noProof/>
             <w:webHidden/>
           </w:rPr>
-          <w:instrText xml:space="preserve"> PAGEREF _Toc239675540 \h </w:instrText>
+          <w:instrText xml:space="preserve"> PAGEREF _Toc239828140 \h </w:instrText>
         </w:r>
         <w:r>
           <w:rPr>
@@ -4011,7 +4025,7 @@
             <w:noProof/>
             <w:webHidden/>
           </w:rPr>
-          <w:t>25</w:t>
+          <w:t>23</w:t>
         </w:r>
         <w:r>
           <w:rPr>
@@ -4040,7 +4054,7 @@
           <w14:ligatures w14:val="standardContextual"/>
         </w:rPr>
       </w:pPr>
-      <w:hyperlink w:anchor="_Toc239675541" w:history="1">
+      <w:hyperlink w:anchor="_Toc239828141" w:history="1">
         <w:r>
           <w:rPr>
             <w:rStyle w:val="aff1"/>
@@ -4067,7 +4081,7 @@
             <w:noProof/>
             <w:webHidden/>
           </w:rPr>
-          <w:instrText xml:space="preserve"> PAGEREF _Toc239675541 \h </w:instrText>
+          <w:instrText xml:space="preserve"> PAGEREF _Toc239828141 \h </w:instrText>
         </w:r>
         <w:r>
           <w:rPr>
@@ -4087,7 +4101,7 @@
             <w:noProof/>
             <w:webHidden/>
           </w:rPr>
-          <w:t>25</w:t>
+          <w:t>23</w:t>
         </w:r>
         <w:r>
           <w:rPr>
@@ -4116,7 +4130,7 @@
           <w14:ligatures w14:val="standardContextual"/>
         </w:rPr>
       </w:pPr>
-      <w:hyperlink w:anchor="_Toc239675542" w:history="1">
+      <w:hyperlink w:anchor="_Toc239828142" w:history="1">
         <w:r>
           <w:rPr>
             <w:rStyle w:val="aff1"/>
@@ -4143,7 +4157,7 @@
             <w:noProof/>
             <w:webHidden/>
           </w:rPr>
-          <w:instrText xml:space="preserve"> PAGEREF _Toc239675542 \h </w:instrText>
+          <w:instrText xml:space="preserve"> PAGEREF _Toc239828142 \h </w:instrText>
         </w:r>
         <w:r>
           <w:rPr>
@@ -4163,7 +4177,7 @@
             <w:noProof/>
             <w:webHidden/>
           </w:rPr>
-          <w:t>25</w:t>
+          <w:t>23</w:t>
         </w:r>
         <w:r>
           <w:rPr>
@@ -4192,7 +4206,7 @@
           <w14:ligatures w14:val="standardContextual"/>
         </w:rPr>
       </w:pPr>
-      <w:hyperlink w:anchor="_Toc239675543" w:history="1">
+      <w:hyperlink w:anchor="_Toc239828143" w:history="1">
         <w:r>
           <w:rPr>
             <w:rStyle w:val="aff1"/>
@@ -4219,7 +4233,7 @@
             <w:noProof/>
             <w:webHidden/>
           </w:rPr>
-          <w:instrText xml:space="preserve"> PAGEREF _Toc239675543 \h </w:instrText>
+          <w:instrText xml:space="preserve"> PAGEREF _Toc239828143 \h </w:instrText>
         </w:r>
         <w:r>
           <w:rPr>
@@ -4239,7 +4253,7 @@
             <w:noProof/>
             <w:webHidden/>
           </w:rPr>
-          <w:t>26</w:t>
+          <w:t>24</w:t>
         </w:r>
         <w:r>
           <w:rPr>
@@ -4268,7 +4282,7 @@
           <w14:ligatures w14:val="standardContextual"/>
         </w:rPr>
       </w:pPr>
-      <w:hyperlink w:anchor="_Toc239675544" w:history="1">
+      <w:hyperlink w:anchor="_Toc239828144" w:history="1">
         <w:r>
           <w:rPr>
             <w:rStyle w:val="aff1"/>
@@ -4295,7 +4309,7 @@
             <w:noProof/>
             <w:webHidden/>
           </w:rPr>
-          <w:instrText xml:space="preserve"> PAGEREF _Toc239675544 \h </w:instrText>
+          <w:instrText xml:space="preserve"> PAGEREF _Toc239828144 \h </w:instrText>
         </w:r>
         <w:r>
           <w:rPr>
@@ -4315,7 +4329,7 @@
             <w:noProof/>
             <w:webHidden/>
           </w:rPr>
-          <w:t>27</w:t>
+          <w:t>25</w:t>
         </w:r>
         <w:r>
           <w:rPr>
@@ -4344,7 +4358,7 @@
           <w14:ligatures w14:val="standardContextual"/>
         </w:rPr>
       </w:pPr>
-      <w:hyperlink w:anchor="_Toc239675545" w:history="1">
+      <w:hyperlink w:anchor="_Toc239828145" w:history="1">
         <w:r>
           <w:rPr>
             <w:rStyle w:val="aff1"/>
@@ -4371,7 +4385,7 @@
             <w:noProof/>
             <w:webHidden/>
           </w:rPr>
-          <w:instrText xml:space="preserve"> PAGEREF _Toc239675545 \h </w:instrText>
+          <w:instrText xml:space="preserve"> PAGEREF _Toc239828145 \h </w:instrText>
         </w:r>
         <w:r>
           <w:rPr>
@@ -4391,7 +4405,7 @@
             <w:noProof/>
             <w:webHidden/>
           </w:rPr>
-          <w:t>28</w:t>
+          <w:t>26</w:t>
         </w:r>
         <w:r>
           <w:rPr>
@@ -4420,7 +4434,7 @@
           <w14:ligatures w14:val="standardContextual"/>
         </w:rPr>
       </w:pPr>
-      <w:hyperlink w:anchor="_Toc239675546" w:history="1">
+      <w:hyperlink w:anchor="_Toc239828146" w:history="1">
         <w:r>
           <w:rPr>
             <w:rStyle w:val="aff1"/>
@@ -4447,7 +4461,7 @@
             <w:noProof/>
             <w:webHidden/>
           </w:rPr>
-          <w:instrText xml:space="preserve"> PAGEREF _Toc239675546 \h </w:instrText>
+          <w:instrText xml:space="preserve"> PAGEREF _Toc239828146 \h </w:instrText>
         </w:r>
         <w:r>
           <w:rPr>
@@ -4467,7 +4481,7 @@
             <w:noProof/>
             <w:webHidden/>
           </w:rPr>
-          <w:t>28</w:t>
+          <w:t>26</w:t>
         </w:r>
         <w:r>
           <w:rPr>
@@ -4496,7 +4510,7 @@
           <w14:ligatures w14:val="standardContextual"/>
         </w:rPr>
       </w:pPr>
-      <w:hyperlink w:anchor="_Toc239675547" w:history="1">
+      <w:hyperlink w:anchor="_Toc239828147" w:history="1">
         <w:r>
           <w:rPr>
             <w:rStyle w:val="aff1"/>
@@ -4523,7 +4537,7 @@
             <w:noProof/>
             <w:webHidden/>
           </w:rPr>
-          <w:instrText xml:space="preserve"> PAGEREF _Toc239675547 \h </w:instrText>
+          <w:instrText xml:space="preserve"> PAGEREF _Toc239828147 \h </w:instrText>
         </w:r>
         <w:r>
           <w:rPr>
@@ -4543,7 +4557,7 @@
             <w:noProof/>
             <w:webHidden/>
           </w:rPr>
-          <w:t>29</w:t>
+          <w:t>27</w:t>
         </w:r>
         <w:r>
           <w:rPr>
@@ -4571,7 +4585,7 @@
           <w14:ligatures w14:val="standardContextual"/>
         </w:rPr>
       </w:pPr>
-      <w:hyperlink w:anchor="_Toc239675548" w:history="1">
+      <w:hyperlink w:anchor="_Toc239828148" w:history="1">
         <w:r>
           <w:rPr>
             <w:rStyle w:val="aff1"/>
@@ -4598,7 +4612,7 @@
             <w:noProof/>
             <w:webHidden/>
           </w:rPr>
-          <w:instrText xml:space="preserve"> PAGEREF _Toc239675548 \h </w:instrText>
+          <w:instrText xml:space="preserve"> PAGEREF _Toc239828148 \h </w:instrText>
         </w:r>
         <w:r>
           <w:rPr>
@@ -4618,7 +4632,7 @@
             <w:noProof/>
             <w:webHidden/>
           </w:rPr>
-          <w:t>30</w:t>
+          <w:t>28</w:t>
         </w:r>
         <w:r>
           <w:rPr>
@@ -4647,7 +4661,7 @@
           <w14:ligatures w14:val="standardContextual"/>
         </w:rPr>
       </w:pPr>
-      <w:hyperlink w:anchor="_Toc239675549" w:history="1">
+      <w:hyperlink w:anchor="_Toc239828149" w:history="1">
         <w:r>
           <w:rPr>
             <w:rStyle w:val="aff1"/>
@@ -4674,7 +4688,7 @@
             <w:noProof/>
             <w:webHidden/>
           </w:rPr>
-          <w:instrText xml:space="preserve"> PAGEREF _Toc239675549 \h </w:instrText>
+          <w:instrText xml:space="preserve"> PAGEREF _Toc239828149 \h </w:instrText>
         </w:r>
         <w:r>
           <w:rPr>
@@ -4694,7 +4708,7 @@
             <w:noProof/>
             <w:webHidden/>
           </w:rPr>
-          <w:t>30</w:t>
+          <w:t>28</w:t>
         </w:r>
         <w:r>
           <w:rPr>
@@ -4723,7 +4737,7 @@
           <w14:ligatures w14:val="standardContextual"/>
         </w:rPr>
       </w:pPr>
-      <w:hyperlink w:anchor="_Toc239675550" w:history="1">
+      <w:hyperlink w:anchor="_Toc239828150" w:history="1">
         <w:r>
           <w:rPr>
             <w:rStyle w:val="aff1"/>
@@ -4750,7 +4764,7 @@
             <w:noProof/>
             <w:webHidden/>
           </w:rPr>
-          <w:instrText xml:space="preserve"> PAGEREF _Toc239675550 \h </w:instrText>
+          <w:instrText xml:space="preserve"> PAGEREF _Toc239828150 \h </w:instrText>
         </w:r>
         <w:r>
           <w:rPr>
@@ -4770,7 +4784,7 @@
             <w:noProof/>
             <w:webHidden/>
           </w:rPr>
-          <w:t>30</w:t>
+          <w:t>28</w:t>
         </w:r>
         <w:r>
           <w:rPr>
@@ -4799,7 +4813,7 @@
           <w14:ligatures w14:val="standardContextual"/>
         </w:rPr>
       </w:pPr>
-      <w:hyperlink w:anchor="_Toc239675551" w:history="1">
+      <w:hyperlink w:anchor="_Toc239828151" w:history="1">
         <w:r>
           <w:rPr>
             <w:rStyle w:val="aff1"/>
@@ -4826,7 +4840,7 @@
             <w:noProof/>
             <w:webHidden/>
           </w:rPr>
-          <w:instrText xml:space="preserve"> PAGEREF _Toc239675551 \h </w:instrText>
+          <w:instrText xml:space="preserve"> PAGEREF _Toc239828151 \h </w:instrText>
         </w:r>
         <w:r>
           <w:rPr>
@@ -4846,7 +4860,7 @@
             <w:noProof/>
             <w:webHidden/>
           </w:rPr>
-          <w:t>30</w:t>
+          <w:t>28</w:t>
         </w:r>
         <w:r>
           <w:rPr>
@@ -4875,7 +4889,7 @@
           <w14:ligatures w14:val="standardContextual"/>
         </w:rPr>
       </w:pPr>
-      <w:hyperlink w:anchor="_Toc239675552" w:history="1">
+      <w:hyperlink w:anchor="_Toc239828152" w:history="1">
         <w:r>
           <w:rPr>
             <w:rStyle w:val="aff1"/>
@@ -4902,7 +4916,7 @@
             <w:noProof/>
             <w:webHidden/>
           </w:rPr>
-          <w:instrText xml:space="preserve"> PAGEREF _Toc239675552 \h </w:instrText>
+          <w:instrText xml:space="preserve"> PAGEREF _Toc239828152 \h </w:instrText>
         </w:r>
         <w:r>
           <w:rPr>
@@ -4922,7 +4936,7 @@
             <w:noProof/>
             <w:webHidden/>
           </w:rPr>
-          <w:t>31</w:t>
+          <w:t>29</w:t>
         </w:r>
         <w:r>
           <w:rPr>
@@ -4951,7 +4965,7 @@
           <w14:ligatures w14:val="standardContextual"/>
         </w:rPr>
       </w:pPr>
-      <w:hyperlink w:anchor="_Toc239675553" w:history="1">
+      <w:hyperlink w:anchor="_Toc239828153" w:history="1">
         <w:r>
           <w:rPr>
             <w:rStyle w:val="aff1"/>
@@ -4978,7 +4992,7 @@
             <w:noProof/>
             <w:webHidden/>
           </w:rPr>
-          <w:instrText xml:space="preserve"> PAGEREF _Toc239675553 \h </w:instrText>
+          <w:instrText xml:space="preserve"> PAGEREF _Toc239828153 \h </w:instrText>
         </w:r>
         <w:r>
           <w:rPr>
@@ -4998,7 +5012,7 @@
             <w:noProof/>
             <w:webHidden/>
           </w:rPr>
-          <w:t>31</w:t>
+          <w:t>29</w:t>
         </w:r>
         <w:r>
           <w:rPr>
@@ -5027,7 +5041,7 @@
           <w14:ligatures w14:val="standardContextual"/>
         </w:rPr>
       </w:pPr>
-      <w:hyperlink w:anchor="_Toc239675554" w:history="1">
+      <w:hyperlink w:anchor="_Toc239828154" w:history="1">
         <w:r>
           <w:rPr>
             <w:rStyle w:val="aff1"/>
@@ -5054,7 +5068,7 @@
             <w:noProof/>
             <w:webHidden/>
           </w:rPr>
-          <w:instrText xml:space="preserve"> PAGEREF _Toc239675554 \h </w:instrText>
+          <w:instrText xml:space="preserve"> PAGEREF _Toc239828154 \h </w:instrText>
         </w:r>
         <w:r>
           <w:rPr>
@@ -5074,7 +5088,7 @@
             <w:noProof/>
             <w:webHidden/>
           </w:rPr>
-          <w:t>32</w:t>
+          <w:t>30</w:t>
         </w:r>
         <w:r>
           <w:rPr>
@@ -5103,7 +5117,7 @@
           <w14:ligatures w14:val="standardContextual"/>
         </w:rPr>
       </w:pPr>
-      <w:hyperlink w:anchor="_Toc239675555" w:history="1">
+      <w:hyperlink w:anchor="_Toc239828155" w:history="1">
         <w:r>
           <w:rPr>
             <w:rStyle w:val="aff1"/>
@@ -5130,7 +5144,7 @@
             <w:noProof/>
             <w:webHidden/>
           </w:rPr>
-          <w:instrText xml:space="preserve"> PAGEREF _Toc239675555 \h </w:instrText>
+          <w:instrText xml:space="preserve"> PAGEREF _Toc239828155 \h </w:instrText>
         </w:r>
         <w:r>
           <w:rPr>
@@ -5150,7 +5164,7 @@
             <w:noProof/>
             <w:webHidden/>
           </w:rPr>
-          <w:t>32</w:t>
+          <w:t>30</w:t>
         </w:r>
         <w:r>
           <w:rPr>
@@ -5178,7 +5192,7 @@
           <w14:ligatures w14:val="standardContextual"/>
         </w:rPr>
       </w:pPr>
-      <w:hyperlink w:anchor="_Toc239675556" w:history="1">
+      <w:hyperlink w:anchor="_Toc239828156" w:history="1">
         <w:r>
           <w:rPr>
             <w:rStyle w:val="aff1"/>
@@ -5205,7 +5219,7 @@
             <w:noProof/>
             <w:webHidden/>
           </w:rPr>
-          <w:instrText xml:space="preserve"> PAGEREF _Toc239675556 \h </w:instrText>
+          <w:instrText xml:space="preserve"> PAGEREF _Toc239828156 \h </w:instrText>
         </w:r>
         <w:r>
           <w:rPr>
@@ -5225,7 +5239,7 @@
             <w:noProof/>
             <w:webHidden/>
           </w:rPr>
-          <w:t>33</w:t>
+          <w:t>31</w:t>
         </w:r>
         <w:r>
           <w:rPr>
@@ -5253,7 +5267,7 @@
           <w14:ligatures w14:val="standardContextual"/>
         </w:rPr>
       </w:pPr>
-      <w:hyperlink w:anchor="_Toc239675557" w:history="1">
+      <w:hyperlink w:anchor="_Toc239828157" w:history="1">
         <w:r>
           <w:rPr>
             <w:rStyle w:val="aff1"/>
@@ -5280,7 +5294,7 @@
             <w:noProof/>
             <w:webHidden/>
           </w:rPr>
-          <w:instrText xml:space="preserve"> PAGEREF _Toc239675557 \h </w:instrText>
+          <w:instrText xml:space="preserve"> PAGEREF _Toc239828157 \h </w:instrText>
         </w:r>
         <w:r>
           <w:rPr>
@@ -5300,7 +5314,7 @@
             <w:noProof/>
             <w:webHidden/>
           </w:rPr>
-          <w:t>33</w:t>
+          <w:t>31</w:t>
         </w:r>
         <w:r>
           <w:rPr>
@@ -5328,7 +5342,7 @@
           <w14:ligatures w14:val="standardContextual"/>
         </w:rPr>
       </w:pPr>
-      <w:hyperlink w:anchor="_Toc239675558" w:history="1">
+      <w:hyperlink w:anchor="_Toc239828158" w:history="1">
         <w:r>
           <w:rPr>
             <w:rStyle w:val="aff1"/>
@@ -5355,7 +5369,7 @@
             <w:noProof/>
             <w:webHidden/>
           </w:rPr>
-          <w:instrText xml:space="preserve"> PAGEREF _Toc239675558 \h </w:instrText>
+          <w:instrText xml:space="preserve"> PAGEREF _Toc239828158 \h </w:instrText>
         </w:r>
         <w:r>
           <w:rPr>
@@ -5375,7 +5389,7 @@
             <w:noProof/>
             <w:webHidden/>
           </w:rPr>
-          <w:t>34</w:t>
+          <w:t>32</w:t>
         </w:r>
         <w:r>
           <w:rPr>
@@ -5388,10 +5402,12 @@
     </w:p>
     <w:p>
       <w:pPr>
-        <w:spacing w:after="160"/>
-      </w:pPr>
-      <w:r>
-        <w:lastRenderedPageBreak/>
+        <w:spacing w:after="0" w:line="20" w:lineRule="exact"/>
+        <w:rPr>
+          <w:sz w:val="2"/>
+        </w:rPr>
+      </w:pPr>
+      <w:r>
         <w:fldChar w:fldCharType="end"/>
       </w:r>
     </w:p>
@@ -5403,7 +5419,7 @@
           <w:numId w:val="7"/>
         </w:numPr>
       </w:pPr>
-      <w:bookmarkStart w:id="0" w:name="_Toc239675495"/>
+      <w:bookmarkStart w:id="0" w:name="_Toc239828095"/>
       <w:r>
         <w:lastRenderedPageBreak/>
         <w:t>게임</w:t>
@@ -5436,7 +5452,7 @@
           <w:numId w:val="7"/>
         </w:numPr>
       </w:pPr>
-      <w:bookmarkStart w:id="1" w:name="_Toc239675496"/>
+      <w:bookmarkStart w:id="1" w:name="_Toc239828096"/>
       <w:r>
         <w:t>Executive Summary</w:t>
       </w:r>
@@ -5493,7 +5509,10 @@
     </w:tbl>
     <w:p>
       <w:pPr>
-        <w:spacing w:after="20"/>
+        <w:spacing w:after="0" w:line="20" w:lineRule="exact"/>
+        <w:rPr>
+          <w:sz w:val="2"/>
+        </w:rPr>
       </w:pPr>
     </w:p>
     <w:p>
@@ -5504,7 +5523,7 @@
           <w:numId w:val="7"/>
         </w:numPr>
       </w:pPr>
-      <w:bookmarkStart w:id="2" w:name="_Toc239675497"/>
+      <w:bookmarkStart w:id="2" w:name="_Toc239828097"/>
       <w:r>
         <w:t>Rev 16 Release Profile</w:t>
       </w:r>
@@ -5528,7 +5547,7 @@
           <w:numId w:val="7"/>
         </w:numPr>
       </w:pPr>
-      <w:bookmarkStart w:id="3" w:name="_Toc239675498"/>
+      <w:bookmarkStart w:id="3" w:name="_Toc239828098"/>
       <w:r>
         <w:t>제품</w:t>
       </w:r>
@@ -5558,6 +5577,7 @@
       <w:tr>
         <w:trPr>
           <w:cantSplit/>
+          <w:tblHeader/>
           <w:jc w:val="center"/>
         </w:trPr>
         <w:tc>
@@ -5575,6 +5595,7 @@
           <w:p>
             <w:pPr>
               <w:pStyle w:val="TableText"/>
+              <w:keepNext/>
               <w:jc w:val="center"/>
             </w:pPr>
             <w:r>
@@ -5601,6 +5622,7 @@
           <w:p>
             <w:pPr>
               <w:pStyle w:val="TableText"/>
+              <w:keepNext/>
               <w:jc w:val="center"/>
             </w:pPr>
             <w:r>
@@ -5752,7 +5774,10 @@
     </w:tbl>
     <w:p>
       <w:pPr>
-        <w:spacing w:after="20"/>
+        <w:spacing w:after="0" w:line="20" w:lineRule="exact"/>
+        <w:rPr>
+          <w:sz w:val="2"/>
+        </w:rPr>
       </w:pPr>
     </w:p>
     <w:p>
@@ -5776,7 +5801,6 @@
         </w:numPr>
       </w:pPr>
       <w:r>
-        <w:lastRenderedPageBreak/>
         <w:t>W8은 세 맵 Release Shape와 Feature Lock 준비 구간이다.</w:t>
       </w:r>
     </w:p>
@@ -5801,6 +5825,7 @@
         </w:numPr>
       </w:pPr>
       <w:r>
+        <w:lastRenderedPageBreak/>
         <w:t>W12 Final Gate를 통과한 경우에만 Public Release를 승인하며, 프로젝트 목표는 실제 출시 가능한 Final RC다.</w:t>
       </w:r>
     </w:p>
@@ -5812,7 +5837,7 @@
           <w:numId w:val="7"/>
         </w:numPr>
       </w:pPr>
-      <w:bookmarkStart w:id="4" w:name="_Toc239675499"/>
+      <w:bookmarkStart w:id="4" w:name="_Toc239828099"/>
       <w:r>
         <w:t>디자인</w:t>
       </w:r>
@@ -5840,6 +5865,7 @@
       <w:tr>
         <w:trPr>
           <w:cantSplit/>
+          <w:tblHeader/>
           <w:jc w:val="center"/>
         </w:trPr>
         <w:tc>
@@ -5857,6 +5883,7 @@
           <w:p>
             <w:pPr>
               <w:pStyle w:val="TableText"/>
+              <w:keepNext/>
               <w:jc w:val="center"/>
             </w:pPr>
             <w:r>
@@ -5883,6 +5910,7 @@
           <w:p>
             <w:pPr>
               <w:pStyle w:val="TableText"/>
+              <w:keepNext/>
               <w:jc w:val="center"/>
             </w:pPr>
             <w:r>
@@ -5909,6 +5937,7 @@
           <w:p>
             <w:pPr>
               <w:pStyle w:val="TableText"/>
+              <w:keepNext/>
               <w:jc w:val="center"/>
             </w:pPr>
             <w:r>
@@ -6164,7 +6193,10 @@
     </w:tbl>
     <w:p>
       <w:pPr>
-        <w:spacing w:after="20"/>
+        <w:spacing w:after="0" w:line="20" w:lineRule="exact"/>
+        <w:rPr>
+          <w:sz w:val="2"/>
+        </w:rPr>
       </w:pPr>
     </w:p>
     <w:p>
@@ -6175,7 +6207,7 @@
           <w:numId w:val="7"/>
         </w:numPr>
       </w:pPr>
-      <w:bookmarkStart w:id="5" w:name="_Toc239675500"/>
+      <w:bookmarkStart w:id="5" w:name="_Toc239828100"/>
       <w:r>
         <w:t>Target Experience</w:t>
       </w:r>
@@ -6249,7 +6281,7 @@
           <w:numId w:val="7"/>
         </w:numPr>
       </w:pPr>
-      <w:bookmarkStart w:id="6" w:name="_Toc239675501"/>
+      <w:bookmarkStart w:id="6" w:name="_Toc239828101"/>
       <w:r>
         <w:t>명시적</w:t>
       </w:r>
@@ -6276,6 +6308,7 @@
       <w:tr>
         <w:trPr>
           <w:cantSplit/>
+          <w:tblHeader/>
           <w:jc w:val="center"/>
         </w:trPr>
         <w:tc>
@@ -6293,6 +6326,7 @@
           <w:p>
             <w:pPr>
               <w:pStyle w:val="TableText"/>
+              <w:keepNext/>
               <w:jc w:val="center"/>
             </w:pPr>
             <w:r>
@@ -6319,6 +6353,7 @@
           <w:p>
             <w:pPr>
               <w:pStyle w:val="TableText"/>
+              <w:keepNext/>
               <w:jc w:val="center"/>
             </w:pPr>
             <w:r>
@@ -6504,7 +6539,10 @@
     </w:tbl>
     <w:p>
       <w:pPr>
-        <w:spacing w:after="20"/>
+        <w:spacing w:after="0" w:line="20" w:lineRule="exact"/>
+        <w:rPr>
+          <w:sz w:val="2"/>
+        </w:rPr>
       </w:pPr>
     </w:p>
     <w:p>
@@ -6515,7 +6553,7 @@
           <w:numId w:val="7"/>
         </w:numPr>
       </w:pPr>
-      <w:bookmarkStart w:id="7" w:name="_Toc239675502"/>
+      <w:bookmarkStart w:id="7" w:name="_Toc239828102"/>
       <w:r>
         <w:lastRenderedPageBreak/>
         <w:t>Contract Run</w:t>
@@ -6551,7 +6589,7 @@
           <w:numId w:val="7"/>
         </w:numPr>
       </w:pPr>
-      <w:bookmarkStart w:id="8" w:name="_Toc239675503"/>
+      <w:bookmarkStart w:id="8" w:name="_Toc239828103"/>
       <w:r>
         <w:t>Core Loop</w:t>
       </w:r>
@@ -6573,6 +6611,7 @@
       <w:tr>
         <w:trPr>
           <w:cantSplit/>
+          <w:tblHeader/>
           <w:jc w:val="center"/>
         </w:trPr>
         <w:tc>
@@ -6590,6 +6629,7 @@
           <w:p>
             <w:pPr>
               <w:pStyle w:val="TableText"/>
+              <w:keepNext/>
               <w:jc w:val="center"/>
             </w:pPr>
             <w:r>
@@ -6616,6 +6656,7 @@
           <w:p>
             <w:pPr>
               <w:pStyle w:val="TableText"/>
+              <w:keepNext/>
               <w:jc w:val="center"/>
             </w:pPr>
             <w:r>
@@ -6642,6 +6683,7 @@
           <w:p>
             <w:pPr>
               <w:pStyle w:val="TableText"/>
+              <w:keepNext/>
               <w:jc w:val="center"/>
             </w:pPr>
             <w:r>
@@ -7027,7 +7069,10 @@
     </w:tbl>
     <w:p>
       <w:pPr>
-        <w:spacing w:after="20"/>
+        <w:spacing w:after="0" w:line="20" w:lineRule="exact"/>
+        <w:rPr>
+          <w:sz w:val="2"/>
+        </w:rPr>
       </w:pPr>
     </w:p>
     <w:p>
@@ -7038,7 +7083,7 @@
           <w:numId w:val="7"/>
         </w:numPr>
       </w:pPr>
-      <w:bookmarkStart w:id="9" w:name="_Toc239675504"/>
+      <w:bookmarkStart w:id="9" w:name="_Toc239828104"/>
       <w:r>
         <w:t xml:space="preserve">Contract </w:t>
       </w:r>
@@ -7075,6 +7120,7 @@
       <w:tr>
         <w:trPr>
           <w:cantSplit/>
+          <w:tblHeader/>
           <w:jc w:val="center"/>
         </w:trPr>
         <w:tc>
@@ -7092,6 +7138,7 @@
           <w:p>
             <w:pPr>
               <w:pStyle w:val="TableText"/>
+              <w:keepNext/>
               <w:jc w:val="center"/>
             </w:pPr>
             <w:r>
@@ -7118,6 +7165,7 @@
           <w:p>
             <w:pPr>
               <w:pStyle w:val="TableText"/>
+              <w:keepNext/>
               <w:jc w:val="center"/>
             </w:pPr>
             <w:r>
@@ -7144,6 +7192,7 @@
           <w:p>
             <w:pPr>
               <w:pStyle w:val="TableText"/>
+              <w:keepNext/>
               <w:jc w:val="center"/>
             </w:pPr>
             <w:r>
@@ -7444,7 +7493,10 @@
     </w:tbl>
     <w:p>
       <w:pPr>
-        <w:spacing w:after="20"/>
+        <w:spacing w:after="0" w:line="20" w:lineRule="exact"/>
+        <w:rPr>
+          <w:sz w:val="2"/>
+        </w:rPr>
       </w:pPr>
     </w:p>
     <w:p>
@@ -7455,8 +7507,9 @@
           <w:numId w:val="7"/>
         </w:numPr>
       </w:pPr>
-      <w:bookmarkStart w:id="10" w:name="_Toc239675505"/>
-      <w:r>
+      <w:bookmarkStart w:id="10" w:name="_Toc239828105"/>
+      <w:r>
+        <w:lastRenderedPageBreak/>
         <w:t>성공</w:t>
       </w:r>
       <w:r>
@@ -7495,6 +7548,7 @@
       <w:tr>
         <w:trPr>
           <w:cantSplit/>
+          <w:tblHeader/>
           <w:jc w:val="center"/>
         </w:trPr>
         <w:tc>
@@ -7512,6 +7566,7 @@
           <w:p>
             <w:pPr>
               <w:pStyle w:val="TableText"/>
+              <w:keepNext/>
               <w:jc w:val="center"/>
             </w:pPr>
             <w:r>
@@ -7538,6 +7593,7 @@
           <w:p>
             <w:pPr>
               <w:pStyle w:val="TableText"/>
+              <w:keepNext/>
               <w:jc w:val="center"/>
             </w:pPr>
             <w:r>
@@ -7564,6 +7620,7 @@
           <w:p>
             <w:pPr>
               <w:pStyle w:val="TableText"/>
+              <w:keepNext/>
               <w:jc w:val="center"/>
             </w:pPr>
             <w:r>
@@ -7723,7 +7780,10 @@
     </w:tbl>
     <w:p>
       <w:pPr>
-        <w:spacing w:after="20"/>
+        <w:spacing w:after="0" w:line="20" w:lineRule="exact"/>
+        <w:rPr>
+          <w:sz w:val="2"/>
+        </w:rPr>
       </w:pPr>
     </w:p>
     <w:p>
@@ -7739,7 +7799,7 @@
           <w:numId w:val="7"/>
         </w:numPr>
       </w:pPr>
-      <w:bookmarkStart w:id="11" w:name="_Toc239675506"/>
+      <w:bookmarkStart w:id="11" w:name="_Toc239828106"/>
       <w:r>
         <w:t>Greed Decision</w:t>
       </w:r>
@@ -7766,6 +7826,7 @@
       <w:tr>
         <w:trPr>
           <w:cantSplit/>
+          <w:tblHeader/>
           <w:jc w:val="center"/>
         </w:trPr>
         <w:tc>
@@ -7783,6 +7844,7 @@
           <w:p>
             <w:pPr>
               <w:pStyle w:val="TableText"/>
+              <w:keepNext/>
               <w:jc w:val="center"/>
             </w:pPr>
             <w:r>
@@ -7809,6 +7871,7 @@
           <w:p>
             <w:pPr>
               <w:pStyle w:val="TableText"/>
+              <w:keepNext/>
               <w:jc w:val="center"/>
             </w:pPr>
             <w:r>
@@ -7835,6 +7898,7 @@
           <w:p>
             <w:pPr>
               <w:pStyle w:val="TableText"/>
+              <w:keepNext/>
               <w:jc w:val="center"/>
             </w:pPr>
             <w:r>
@@ -8090,7 +8154,10 @@
     </w:tbl>
     <w:p>
       <w:pPr>
-        <w:spacing w:after="20"/>
+        <w:spacing w:after="0" w:line="20" w:lineRule="exact"/>
+        <w:rPr>
+          <w:sz w:val="2"/>
+        </w:rPr>
       </w:pPr>
     </w:p>
     <w:p>
@@ -8101,7 +8168,7 @@
           <w:numId w:val="7"/>
         </w:numPr>
       </w:pPr>
-      <w:bookmarkStart w:id="12" w:name="_Toc239675507"/>
+      <w:bookmarkStart w:id="12" w:name="_Toc239828107"/>
       <w:r>
         <w:t>15~25</w:t>
       </w:r>
@@ -8129,6 +8196,7 @@
       <w:tr>
         <w:trPr>
           <w:cantSplit/>
+          <w:tblHeader/>
           <w:jc w:val="center"/>
         </w:trPr>
         <w:tc>
@@ -8146,6 +8214,7 @@
           <w:p>
             <w:pPr>
               <w:pStyle w:val="TableText"/>
+              <w:keepNext/>
               <w:jc w:val="center"/>
             </w:pPr>
             <w:r>
@@ -8172,6 +8241,7 @@
           <w:p>
             <w:pPr>
               <w:pStyle w:val="TableText"/>
+              <w:keepNext/>
               <w:jc w:val="center"/>
             </w:pPr>
             <w:r>
@@ -8198,6 +8268,7 @@
           <w:p>
             <w:pPr>
               <w:pStyle w:val="TableText"/>
+              <w:keepNext/>
               <w:jc w:val="center"/>
             </w:pPr>
             <w:r>
@@ -8453,7 +8524,10 @@
     </w:tbl>
     <w:p>
       <w:pPr>
-        <w:spacing w:after="20"/>
+        <w:spacing w:after="0" w:line="20" w:lineRule="exact"/>
+        <w:rPr>
+          <w:sz w:val="2"/>
+        </w:rPr>
       </w:pPr>
     </w:p>
     <w:p>
@@ -8464,7 +8538,7 @@
           <w:numId w:val="7"/>
         </w:numPr>
       </w:pPr>
-      <w:bookmarkStart w:id="13" w:name="_Toc239675508"/>
+      <w:bookmarkStart w:id="13" w:name="_Toc239828108"/>
       <w:r>
         <w:lastRenderedPageBreak/>
         <w:t>위조와</w:t>
@@ -8491,7 +8565,7 @@
           <w:numId w:val="7"/>
         </w:numPr>
       </w:pPr>
-      <w:bookmarkStart w:id="14" w:name="_Toc239675509"/>
+      <w:bookmarkStart w:id="14" w:name="_Toc239828109"/>
       <w:r>
         <w:t>Artifact</w:t>
       </w:r>
@@ -8535,6 +8609,7 @@
       <w:tr>
         <w:trPr>
           <w:cantSplit/>
+          <w:tblHeader/>
           <w:jc w:val="center"/>
         </w:trPr>
         <w:tc>
@@ -8552,6 +8627,7 @@
           <w:p>
             <w:pPr>
               <w:pStyle w:val="TableText"/>
+              <w:keepNext/>
               <w:jc w:val="center"/>
             </w:pPr>
             <w:r>
@@ -8578,6 +8654,7 @@
           <w:p>
             <w:pPr>
               <w:pStyle w:val="TableText"/>
+              <w:keepNext/>
               <w:jc w:val="center"/>
             </w:pPr>
             <w:r>
@@ -8604,6 +8681,7 @@
           <w:p>
             <w:pPr>
               <w:pStyle w:val="TableText"/>
+              <w:keepNext/>
               <w:jc w:val="center"/>
             </w:pPr>
             <w:r>
@@ -8630,6 +8708,7 @@
           <w:p>
             <w:pPr>
               <w:pStyle w:val="TableText"/>
+              <w:keepNext/>
               <w:jc w:val="center"/>
             </w:pPr>
             <w:r>
@@ -8757,7 +8836,10 @@
     </w:tbl>
     <w:p>
       <w:pPr>
-        <w:spacing w:after="20"/>
+        <w:spacing w:after="0" w:line="20" w:lineRule="exact"/>
+        <w:rPr>
+          <w:sz w:val="2"/>
+        </w:rPr>
       </w:pPr>
     </w:p>
     <w:p>
@@ -8779,7 +8861,7 @@
           <w:numId w:val="7"/>
         </w:numPr>
       </w:pPr>
-      <w:bookmarkStart w:id="15" w:name="_Toc239675510"/>
+      <w:bookmarkStart w:id="15" w:name="_Toc239828110"/>
       <w:r>
         <w:t xml:space="preserve">Surface Forgery </w:t>
       </w:r>
@@ -8827,11 +8909,11 @@
         </w:numPr>
       </w:pPr>
       <w:r>
-        <w:t xml:space="preserve">Template Palette 2~8색 중 색을 고르고 승인된 Brush Size Preset을 전환해 Draw/Erase한다. 화면에는 현재 Palette, Drawing Content 안에서 크기가 다른 소/중/대 Brush 표식, 남은 시간과 </w:t>
+        <w:t xml:space="preserve">Template Palette 2~8색 중 색을 고르고 승인된 Brush Size Preset을 전환해 Draw/Erase한다. 화면에는 현재 Palette, Drawing Content 안에서 크기가 다른 소/중/대 Brush 표식, 남은 시간과 ‘예상 품질 {점수}/100 · 제출 가능 70+’ 한 줄만 표시한다. 별도 InstructionText와 </w:t>
       </w:r>
       <w:r>
         <w:lastRenderedPageBreak/>
-        <w:t>‘예상 품질 {점수}/100 · 제출 가능 70+’ 한 줄만 표시한다. 별도 InstructionText와 ModeStatusText는 표시하지 않는다. 별도 서버 점수나 중복된 품질 기준 문구는 표시하지 않고, Draw/Erase/Reset/Submit/Cancel 안내는 하단 한 줄로 통합한다. 예상 품질이 70 미만이면 Submit을 비활성화하며 Point Budget이나 판정 해상도 같은 기술 정보는 노출하지 않는다.</w:t>
+        <w:t>ModeStatusText는 표시하지 않는다. 별도 서버 점수나 중복된 품질 기준 문구는 표시하지 않고, Draw/Erase/Reset/Submit/Cancel 안내는 하단 한 줄로 통합한다. 예상 품질이 70 미만이면 Submit을 비활성화하며 Point Budget이나 판정 해상도 같은 기술 정보는 노출하지 않는다.</w:t>
       </w:r>
     </w:p>
     <w:p>
@@ -8950,7 +9032,10 @@
     </w:tbl>
     <w:p>
       <w:pPr>
-        <w:spacing w:after="20"/>
+        <w:spacing w:after="0" w:line="20" w:lineRule="exact"/>
+        <w:rPr>
+          <w:sz w:val="2"/>
+        </w:rPr>
       </w:pPr>
     </w:p>
     <w:p>
@@ -8961,7 +9046,7 @@
           <w:numId w:val="7"/>
         </w:numPr>
       </w:pPr>
-      <w:bookmarkStart w:id="16" w:name="_Toc239675511"/>
+      <w:bookmarkStart w:id="16" w:name="_Toc239828111"/>
       <w:r>
         <w:t>Object Assembly — Deferred Expansion</w:t>
       </w:r>
@@ -9012,12 +9097,12 @@
         </w:numPr>
       </w:pPr>
       <w:r>
-        <w:lastRenderedPageBreak/>
         <w:t>재활성화는 Surface Forgery와 같은 시스템으로 합치지 않고, 별도 GDD/TDD 승인과 새로운 Release Gate를 통과한 뒤 수행한다.</w:t>
       </w:r>
     </w:p>
     <w:p>
       <w:r>
+        <w:lastRenderedPageBreak/>
         <w:t>이번 보류는 기존 구현 실패나 제거 결정이 아니라, 현재 출시의 협동 보안·Painting 콘텐츠·3-Map 완성도를 우선하기 위한 Scope Lock이다.</w:t>
       </w:r>
     </w:p>
@@ -9029,7 +9114,7 @@
           <w:numId w:val="7"/>
         </w:numPr>
       </w:pPr>
-      <w:bookmarkStart w:id="17" w:name="_Toc239675512"/>
+      <w:bookmarkStart w:id="17" w:name="_Toc239828112"/>
       <w:r>
         <w:t>Quality</w:t>
       </w:r>
@@ -9058,6 +9143,7 @@
       <w:tr>
         <w:trPr>
           <w:cantSplit/>
+          <w:tblHeader/>
           <w:jc w:val="center"/>
         </w:trPr>
         <w:tc>
@@ -9073,6 +9159,9 @@
             <w:vAlign w:val="center"/>
           </w:tcPr>
           <w:p>
+            <w:pPr>
+              <w:keepNext/>
+            </w:pPr>
             <w:r>
               <w:t>Quality 구간</w:t>
             </w:r>
@@ -9091,6 +9180,9 @@
             <w:vAlign w:val="center"/>
           </w:tcPr>
           <w:p>
+            <w:pPr>
+              <w:keepNext/>
+            </w:pPr>
             <w:r>
               <w:t>제출 결과</w:t>
             </w:r>
@@ -9109,6 +9201,9 @@
             <w:vAlign w:val="center"/>
           </w:tcPr>
           <w:p>
+            <w:pPr>
+              <w:keepNext/>
+            </w:pPr>
             <w:r>
               <w:t>Guard/Alert 결과</w:t>
             </w:r>
@@ -9127,6 +9222,9 @@
             <w:vAlign w:val="center"/>
           </w:tcPr>
           <w:p>
+            <w:pPr>
+              <w:keepNext/>
+            </w:pPr>
             <w:r>
               <w:t>플레이 의미</w:t>
             </w:r>
@@ -9286,7 +9384,10 @@
     </w:tbl>
     <w:p>
       <w:pPr>
-        <w:spacing w:after="20"/>
+        <w:spacing w:after="0" w:line="20" w:lineRule="exact"/>
+        <w:rPr>
+          <w:sz w:val="2"/>
+        </w:rPr>
       </w:pPr>
     </w:p>
     <w:p>
@@ -9302,7 +9403,7 @@
           <w:numId w:val="7"/>
         </w:numPr>
       </w:pPr>
-      <w:bookmarkStart w:id="18" w:name="_Toc239675513"/>
+      <w:bookmarkStart w:id="18" w:name="_Toc239828113"/>
       <w:r>
         <w:t>핵심</w:t>
       </w:r>
@@ -9338,6 +9439,7 @@
       <w:tr>
         <w:trPr>
           <w:cantSplit/>
+          <w:tblHeader/>
           <w:jc w:val="center"/>
         </w:trPr>
         <w:tc>
@@ -9355,6 +9457,7 @@
           <w:p>
             <w:pPr>
               <w:pStyle w:val="TableText"/>
+              <w:keepNext/>
               <w:jc w:val="center"/>
             </w:pPr>
             <w:r>
@@ -9382,6 +9485,7 @@
           <w:p>
             <w:pPr>
               <w:pStyle w:val="TableText"/>
+              <w:keepNext/>
               <w:jc w:val="center"/>
             </w:pPr>
             <w:r>
@@ -9409,6 +9513,7 @@
           <w:p>
             <w:pPr>
               <w:pStyle w:val="TableText"/>
+              <w:keepNext/>
               <w:jc w:val="center"/>
             </w:pPr>
             <w:r>
@@ -9436,6 +9541,7 @@
           <w:p>
             <w:pPr>
               <w:pStyle w:val="TableText"/>
+              <w:keepNext/>
               <w:jc w:val="center"/>
             </w:pPr>
             <w:r>
@@ -9463,6 +9569,7 @@
           <w:p>
             <w:pPr>
               <w:pStyle w:val="TableText"/>
+              <w:keepNext/>
               <w:jc w:val="center"/>
             </w:pPr>
             <w:r>
@@ -9549,7 +9656,6 @@
           </w:tcPr>
           <w:p>
             <w:r>
-              <w:lastRenderedPageBreak/>
               <w:t>기준 미달 제출</w:t>
             </w:r>
           </w:p>
@@ -9617,6 +9723,7 @@
               <w:rPr>
                 <w:sz w:val="16"/>
               </w:rPr>
+              <w:lastRenderedPageBreak/>
               <w:t>Guard Notice</w:t>
             </w:r>
           </w:p>
@@ -9784,7 +9891,10 @@
     </w:tbl>
     <w:p>
       <w:pPr>
-        <w:spacing w:after="20"/>
+        <w:spacing w:after="0" w:line="20" w:lineRule="exact"/>
+        <w:rPr>
+          <w:sz w:val="2"/>
+        </w:rPr>
       </w:pPr>
     </w:p>
     <w:p>
@@ -9795,7 +9905,7 @@
           <w:numId w:val="7"/>
         </w:numPr>
       </w:pPr>
-      <w:bookmarkStart w:id="19" w:name="_Toc239675514"/>
+      <w:bookmarkStart w:id="19" w:name="_Toc239828114"/>
       <w:r>
         <w:t xml:space="preserve">Owner-only Forgery </w:t>
       </w:r>
@@ -9826,6 +9936,7 @@
       <w:tr>
         <w:trPr>
           <w:cantSplit/>
+          <w:tblHeader/>
           <w:jc w:val="center"/>
         </w:trPr>
         <w:tc>
@@ -9841,6 +9952,9 @@
             <w:vAlign w:val="center"/>
           </w:tcPr>
           <w:p>
+            <w:pPr>
+              <w:keepNext/>
+            </w:pPr>
             <w:r>
               <w:t>MODE TITLE</w:t>
             </w:r>
@@ -9859,6 +9973,9 @@
             <w:vAlign w:val="center"/>
           </w:tcPr>
           <w:p>
+            <w:pPr>
+              <w:keepNext/>
+            </w:pPr>
             <w:r>
               <w:t>한 문장 INSTRUCTION / TIME</w:t>
             </w:r>
@@ -9877,6 +9994,9 @@
             <w:vAlign w:val="center"/>
           </w:tcPr>
           <w:p>
+            <w:pPr>
+              <w:keepNext/>
+            </w:pPr>
             <w:r>
               <w:t>예상 품질 · 제출 가능 70+</w:t>
             </w:r>
@@ -10032,7 +10152,7 @@
           <w:numId w:val="7"/>
         </w:numPr>
       </w:pPr>
-      <w:bookmarkStart w:id="20" w:name="_Toc239675515"/>
+      <w:bookmarkStart w:id="20" w:name="_Toc239828115"/>
       <w:r>
         <w:lastRenderedPageBreak/>
         <w:t>잠입</w:t>
@@ -10065,7 +10185,7 @@
           <w:numId w:val="7"/>
         </w:numPr>
       </w:pPr>
-      <w:bookmarkStart w:id="21" w:name="_Toc239675516"/>
+      <w:bookmarkStart w:id="21" w:name="_Toc239828116"/>
       <w:r>
         <w:t xml:space="preserve">First-Person </w:t>
       </w:r>
@@ -10130,7 +10250,7 @@
           <w:numId w:val="7"/>
         </w:numPr>
       </w:pPr>
-      <w:bookmarkStart w:id="22" w:name="_Toc239675517"/>
+      <w:bookmarkStart w:id="22" w:name="_Toc239828117"/>
       <w:r>
         <w:t>Walk, Sprint, Weight, Footstep</w:t>
       </w:r>
@@ -10153,6 +10273,7 @@
       <w:tr>
         <w:trPr>
           <w:cantSplit/>
+          <w:tblHeader/>
           <w:jc w:val="center"/>
         </w:trPr>
         <w:tc>
@@ -10170,6 +10291,7 @@
           <w:p>
             <w:pPr>
               <w:pStyle w:val="TableText"/>
+              <w:keepNext/>
               <w:jc w:val="center"/>
             </w:pPr>
             <w:r>
@@ -10196,6 +10318,7 @@
           <w:p>
             <w:pPr>
               <w:pStyle w:val="TableText"/>
+              <w:keepNext/>
               <w:jc w:val="center"/>
             </w:pPr>
             <w:r>
@@ -10222,6 +10345,7 @@
           <w:p>
             <w:pPr>
               <w:pStyle w:val="TableText"/>
+              <w:keepNext/>
               <w:jc w:val="center"/>
             </w:pPr>
             <w:r>
@@ -10248,6 +10372,7 @@
           <w:p>
             <w:pPr>
               <w:pStyle w:val="TableText"/>
+              <w:keepNext/>
               <w:jc w:val="center"/>
             </w:pPr>
             <w:r>
@@ -10449,7 +10574,10 @@
     </w:tbl>
     <w:p>
       <w:pPr>
-        <w:spacing w:after="20"/>
+        <w:spacing w:after="0" w:line="20" w:lineRule="exact"/>
+        <w:rPr>
+          <w:sz w:val="2"/>
+        </w:rPr>
       </w:pPr>
     </w:p>
     <w:p>
@@ -10465,7 +10593,7 @@
           <w:numId w:val="7"/>
         </w:numPr>
       </w:pPr>
-      <w:bookmarkStart w:id="23" w:name="_Toc239675518"/>
+      <w:bookmarkStart w:id="23" w:name="_Toc239828118"/>
       <w:r>
         <w:t>Patrol Guard</w:t>
       </w:r>
@@ -10536,6 +10664,7 @@
       <w:tr>
         <w:trPr>
           <w:cantSplit/>
+          <w:tblHeader/>
           <w:jc w:val="center"/>
         </w:trPr>
         <w:tc>
@@ -10551,6 +10680,9 @@
             <w:vAlign w:val="center"/>
           </w:tcPr>
           <w:p>
+            <w:pPr>
+              <w:keepNext/>
+            </w:pPr>
             <w:r>
               <w:lastRenderedPageBreak/>
               <w:t>경계도</w:t>
@@ -10570,6 +10702,9 @@
             <w:vAlign w:val="center"/>
           </w:tcPr>
           <w:p>
+            <w:pPr>
+              <w:keepNext/>
+            </w:pPr>
             <w:r>
               <w:t>플레이어가 알아야 할 변화</w:t>
             </w:r>
@@ -10588,6 +10723,9 @@
             <w:vAlign w:val="center"/>
           </w:tcPr>
           <w:p>
+            <w:pPr>
+              <w:keepNext/>
+            </w:pPr>
             <w:r>
               <w:t>최소 피드백</w:t>
             </w:r>
@@ -10792,7 +10930,10 @@
     </w:tbl>
     <w:p>
       <w:pPr>
-        <w:spacing w:after="20"/>
+        <w:spacing w:after="0" w:line="20" w:lineRule="exact"/>
+        <w:rPr>
+          <w:sz w:val="2"/>
+        </w:rPr>
       </w:pPr>
     </w:p>
     <w:p>
@@ -10803,7 +10944,7 @@
           <w:numId w:val="7"/>
         </w:numPr>
       </w:pPr>
-      <w:bookmarkStart w:id="24" w:name="_Toc239675519"/>
+      <w:bookmarkStart w:id="24" w:name="_Toc239828119"/>
       <w:r>
         <w:t>CCTV</w:t>
       </w:r>
@@ -11053,7 +11194,7 @@
           <w:numId w:val="7"/>
         </w:numPr>
       </w:pPr>
-      <w:bookmarkStart w:id="25" w:name="_Toc239675520"/>
+      <w:bookmarkStart w:id="25" w:name="_Toc239828120"/>
       <w:r>
         <w:lastRenderedPageBreak/>
         <w:t>Stun, Arrest, Recovery</w:t>
@@ -11128,7 +11269,7 @@
           <w:numId w:val="7"/>
         </w:numPr>
       </w:pPr>
-      <w:bookmarkStart w:id="26" w:name="_Toc239675521"/>
+      <w:bookmarkStart w:id="26" w:name="_Toc239828121"/>
       <w:r>
         <w:t>두</w:t>
       </w:r>
@@ -11165,6 +11306,7 @@
       <w:tr>
         <w:trPr>
           <w:cantSplit/>
+          <w:tblHeader/>
           <w:jc w:val="center"/>
         </w:trPr>
         <w:tc>
@@ -11182,6 +11324,7 @@
           <w:p>
             <w:pPr>
               <w:pStyle w:val="TableText"/>
+              <w:keepNext/>
               <w:jc w:val="center"/>
             </w:pPr>
             <w:r>
@@ -11208,6 +11351,7 @@
           <w:p>
             <w:pPr>
               <w:pStyle w:val="TableText"/>
+              <w:keepNext/>
               <w:jc w:val="center"/>
             </w:pPr>
             <w:r>
@@ -11234,6 +11378,7 @@
           <w:p>
             <w:pPr>
               <w:pStyle w:val="TableText"/>
+              <w:keepNext/>
               <w:jc w:val="center"/>
             </w:pPr>
             <w:r>
@@ -11260,6 +11405,7 @@
           <w:p>
             <w:pPr>
               <w:pStyle w:val="TableText"/>
+              <w:keepNext/>
               <w:jc w:val="center"/>
             </w:pPr>
             <w:r>
@@ -11585,7 +11731,10 @@
     </w:tbl>
     <w:p>
       <w:pPr>
-        <w:spacing w:after="20"/>
+        <w:spacing w:after="0" w:line="20" w:lineRule="exact"/>
+        <w:rPr>
+          <w:sz w:val="2"/>
+        </w:rPr>
       </w:pPr>
     </w:p>
     <w:p>
@@ -11596,7 +11745,7 @@
           <w:numId w:val="7"/>
         </w:numPr>
       </w:pPr>
-      <w:bookmarkStart w:id="27" w:name="_Toc239675522"/>
+      <w:bookmarkStart w:id="27" w:name="_Toc239828122"/>
       <w:r>
         <w:lastRenderedPageBreak/>
         <w:t>협동</w:t>
@@ -11623,7 +11772,7 @@
           <w:numId w:val="7"/>
         </w:numPr>
       </w:pPr>
-      <w:bookmarkStart w:id="28" w:name="_Toc239675523"/>
+      <w:bookmarkStart w:id="28" w:name="_Toc239828123"/>
       <w:r>
         <w:t>Role Switching</w:t>
       </w:r>
@@ -11650,6 +11799,7 @@
       <w:tr>
         <w:trPr>
           <w:cantSplit/>
+          <w:tblHeader/>
           <w:jc w:val="center"/>
         </w:trPr>
         <w:tc>
@@ -11667,6 +11817,7 @@
           <w:p>
             <w:pPr>
               <w:pStyle w:val="TableText"/>
+              <w:keepNext/>
               <w:jc w:val="center"/>
             </w:pPr>
             <w:r>
@@ -11693,6 +11844,7 @@
           <w:p>
             <w:pPr>
               <w:pStyle w:val="TableText"/>
+              <w:keepNext/>
               <w:jc w:val="center"/>
             </w:pPr>
             <w:r>
@@ -11719,6 +11871,7 @@
           <w:p>
             <w:pPr>
               <w:pStyle w:val="TableText"/>
+              <w:keepNext/>
               <w:jc w:val="center"/>
             </w:pPr>
             <w:r>
@@ -12013,63 +12166,11 @@
     </w:tbl>
     <w:p>
       <w:pPr>
-        <w:spacing w:after="20"/>
-      </w:pPr>
-    </w:p>
-    <w:p>
-      <w:r>
-        <w:t>플레이어가 특정 동료의 출력을 음소거해도 박물관 경비가 듣는 발화 위험은 사라지지 않는다. PTT 해제 또는 입력 음소거만 Voice SoundPing을 중단한다. 외부 음성 앱으로 우회할 수 있으므로 보이스는 Required Target, Laser, Extraction의 필수 Gate로 사용하지 않는다.</w:t>
-      </w:r>
-    </w:p>
-    <w:p>
-      <w:r>
-        <w:t>V를 누른 동안만 송신한다. 0~250cm는 정상 음량, 250~1,500cm는 거리 감쇠, 1,500cm 밖은 들리지 않는다. 실제 발화가 감지되는 동안 서버는 플레이어의 확정 위치에서 800cm Voice SoundPing을 최대 0.8초마다 발생시킨다. 이 소음은 Alert를 직접 올리지 않고 근처 Patrol Guard를 InvestigateNoise로 전환한다.</w:t>
-      </w:r>
-    </w:p>
-    <w:p>
-      <w:r>
-        <w:t>팀 보이스는 협동 정보를 전달하는 동시에 잠입 위험을 만든다. Lobby와 Result에서는 거리 제한 없는 팀 채널을 사용하고, InGame에서는 캐릭터 위치를 기준으로 감쇠되는 Push-to-Talk를 사용한다.</w:t>
-      </w:r>
-    </w:p>
-    <w:p>
-      <w:pPr>
-        <w:pStyle w:val="21"/>
-      </w:pPr>
-      <w:bookmarkStart w:id="29" w:name="_Toc239675524"/>
-      <w:r>
-        <w:t>거리</w:t>
-      </w:r>
-      <w:r>
-        <w:t xml:space="preserve"> </w:t>
-      </w:r>
-      <w:r>
-        <w:t>기반</w:t>
-      </w:r>
-      <w:r>
-        <w:t xml:space="preserve"> </w:t>
-      </w:r>
-      <w:r>
-        <w:t>팀</w:t>
-      </w:r>
-      <w:r>
-        <w:t xml:space="preserve"> </w:t>
-      </w:r>
-      <w:r>
-        <w:t>보이스와</w:t>
-      </w:r>
-      <w:r>
-        <w:t xml:space="preserve"> </w:t>
-      </w:r>
-      <w:r>
-        <w:t>발화</w:t>
-      </w:r>
-      <w:r>
-        <w:t xml:space="preserve"> </w:t>
-      </w:r>
-      <w:r>
-        <w:t>위험</w:t>
-      </w:r>
-      <w:bookmarkEnd w:id="29"/>
+        <w:spacing w:after="0" w:line="20" w:lineRule="exact"/>
+        <w:rPr>
+          <w:sz w:val="2"/>
+        </w:rPr>
+      </w:pPr>
     </w:p>
     <w:p>
       <w:pPr>
@@ -12079,7 +12180,66 @@
           <w:numId w:val="7"/>
         </w:numPr>
       </w:pPr>
-      <w:bookmarkStart w:id="30" w:name="_Toc239675525"/>
+      <w:bookmarkStart w:id="29" w:name="_Toc239828124"/>
+      <w:r>
+        <w:t>거리</w:t>
+      </w:r>
+      <w:r>
+        <w:t xml:space="preserve"> </w:t>
+      </w:r>
+      <w:r>
+        <w:t>기반</w:t>
+      </w:r>
+      <w:r>
+        <w:t xml:space="preserve"> </w:t>
+      </w:r>
+      <w:r>
+        <w:t>팀</w:t>
+      </w:r>
+      <w:r>
+        <w:t xml:space="preserve"> </w:t>
+      </w:r>
+      <w:r>
+        <w:t>보이스와</w:t>
+      </w:r>
+      <w:r>
+        <w:t xml:space="preserve"> </w:t>
+      </w:r>
+      <w:r>
+        <w:t>발화</w:t>
+      </w:r>
+      <w:r>
+        <w:t xml:space="preserve"> </w:t>
+      </w:r>
+      <w:r>
+        <w:t>위험</w:t>
+      </w:r>
+      <w:bookmarkEnd w:id="29"/>
+    </w:p>
+    <w:p>
+      <w:r>
+        <w:t>팀 보이스는 협동 정보를 전달하는 동시에 잠입 위험을 만든다. Lobby와 Result에서는 거리 제한 없는 팀 채널을 사용하고, InGame에서는 캐릭터 위치를 기준으로 감쇠되는 Push-to-Talk를 사용한다.</w:t>
+      </w:r>
+    </w:p>
+    <w:p>
+      <w:r>
+        <w:t>V를 누른 동안만 송신한다. 0~250cm는 정상 음량, 250~1,500cm는 거리 감쇠, 1,500cm 밖은 들리지 않는다. 실제 발화가 감지되는 동안 서버는 플레이어의 확정 위치에서 800cm Voice SoundPing을 최대 0.8초마다 발생시킨다. 이 소음은 Alert를 직접 올리지 않고 근처 Patrol Guard를 InvestigateNoise로 전환한다.</w:t>
+      </w:r>
+    </w:p>
+    <w:p>
+      <w:r>
+        <w:t>플레이어가 특정 동료의 출력을 음소거해도 박물관 경비가 듣는 발화 위험은 사라지지 않는다. PTT 해제 또는 입력 음소거만 Voice SoundPing을 중단한다. 외부 음성 앱으로 우회할 수 있으므로 보이스는 Required Target, Laser, Extraction의 필수 Gate로 사용하지 않는다.</w:t>
+      </w:r>
+    </w:p>
+    <w:p>
+      <w:pPr>
+        <w:pStyle w:val="21"/>
+        <w:numPr>
+          <w:ilvl w:val="1"/>
+          <w:numId w:val="7"/>
+        </w:numPr>
+      </w:pPr>
+      <w:bookmarkStart w:id="30" w:name="_Toc239828125"/>
       <w:r>
         <w:t>Inventory, Loose Loot, Coin</w:t>
       </w:r>
@@ -12142,7 +12302,7 @@
           <w:numId w:val="7"/>
         </w:numPr>
       </w:pPr>
-      <w:bookmarkStart w:id="31" w:name="_Toc239675526"/>
+      <w:bookmarkStart w:id="31" w:name="_Toc239828126"/>
       <w:r>
         <w:t>Player Identity</w:t>
       </w:r>
@@ -12170,6 +12330,7 @@
       <w:tr>
         <w:trPr>
           <w:cantSplit/>
+          <w:tblHeader/>
           <w:jc w:val="center"/>
         </w:trPr>
         <w:tc>
@@ -12187,6 +12348,7 @@
           <w:p>
             <w:pPr>
               <w:pStyle w:val="TableText"/>
+              <w:keepNext/>
               <w:jc w:val="center"/>
             </w:pPr>
             <w:r>
@@ -12213,6 +12375,7 @@
           <w:p>
             <w:pPr>
               <w:pStyle w:val="TableText"/>
+              <w:keepNext/>
               <w:jc w:val="center"/>
             </w:pPr>
             <w:r>
@@ -12239,6 +12402,7 @@
           <w:p>
             <w:pPr>
               <w:pStyle w:val="TableText"/>
+              <w:keepNext/>
               <w:jc w:val="center"/>
             </w:pPr>
             <w:r>
@@ -12376,7 +12540,7 @@
               <w:pStyle w:val="TableText"/>
             </w:pPr>
             <w:r>
-              <w:t>필수 작품 운반</w:t>
+              <w:t>원본 작품 운반</w:t>
             </w:r>
           </w:p>
         </w:tc>
@@ -12542,7 +12706,10 @@
     </w:tbl>
     <w:p>
       <w:pPr>
-        <w:spacing w:after="20"/>
+        <w:spacing w:after="0" w:line="20" w:lineRule="exact"/>
+        <w:rPr>
+          <w:sz w:val="2"/>
+        </w:rPr>
       </w:pPr>
     </w:p>
     <w:p>
@@ -12558,7 +12725,7 @@
           <w:numId w:val="7"/>
         </w:numPr>
       </w:pPr>
-      <w:bookmarkStart w:id="32" w:name="_Toc239675527"/>
+      <w:bookmarkStart w:id="32" w:name="_Toc239828127"/>
       <w:r>
         <w:t xml:space="preserve">Floor Plan Map </w:t>
       </w:r>
@@ -12588,6 +12755,7 @@
       <w:tr>
         <w:trPr>
           <w:cantSplit/>
+          <w:tblHeader/>
           <w:jc w:val="center"/>
         </w:trPr>
         <w:tc>
@@ -12605,6 +12773,7 @@
           <w:p>
             <w:pPr>
               <w:pStyle w:val="TableText"/>
+              <w:keepNext/>
               <w:jc w:val="center"/>
             </w:pPr>
             <w:r>
@@ -12631,6 +12800,7 @@
           <w:p>
             <w:pPr>
               <w:pStyle w:val="TableText"/>
+              <w:keepNext/>
               <w:jc w:val="center"/>
             </w:pPr>
             <w:r>
@@ -12748,7 +12918,10 @@
     </w:tbl>
     <w:p>
       <w:pPr>
-        <w:spacing w:after="20"/>
+        <w:spacing w:after="0" w:line="20" w:lineRule="exact"/>
+        <w:rPr>
+          <w:sz w:val="2"/>
+        </w:rPr>
       </w:pPr>
     </w:p>
     <w:p>
@@ -12764,7 +12937,7 @@
           <w:numId w:val="7"/>
         </w:numPr>
       </w:pPr>
-      <w:bookmarkStart w:id="33" w:name="_Toc239675528"/>
+      <w:bookmarkStart w:id="33" w:name="_Toc239828128"/>
       <w:r>
         <w:t>Shared Extraction</w:t>
       </w:r>
@@ -12796,7 +12969,6 @@
         </w:numPr>
       </w:pPr>
       <w:r>
-        <w:lastRenderedPageBreak/>
         <w:t>Contract InGame 시작 후 180초가 지나면 Vent가 열린다. 개방 전 정산은 거부하며, 개방 후 첫 상호작용은 Grid의 Loose Loot만 한 번에 제거해 Mid-run Settlement로 Secured 처리하고 Player를 Active 상태로 유지한다.</w:t>
       </w:r>
     </w:p>
@@ -12809,6 +12981,7 @@
         </w:numPr>
       </w:pPr>
       <w:r>
+        <w:lastRenderedPageBreak/>
         <w:t>Mid-run Settlement는 Painting Original과 Required Target을 Inventory에 유지한다. 정산할 Loose Loot가 없으면 중간 정산을 만들지 않고 같은 Vent의 기존 Final Escape 경로를 사용한다.</w:t>
       </w:r>
     </w:p>
@@ -12844,7 +13017,7 @@
           <w:numId w:val="7"/>
         </w:numPr>
       </w:pPr>
-      <w:bookmarkStart w:id="34" w:name="_Toc239675529"/>
+      <w:bookmarkStart w:id="34" w:name="_Toc239828129"/>
       <w:r>
         <w:lastRenderedPageBreak/>
         <w:t xml:space="preserve">UI, </w:t>
@@ -12868,7 +13041,7 @@
           <w:numId w:val="7"/>
         </w:numPr>
       </w:pPr>
-      <w:bookmarkStart w:id="35" w:name="_Toc239675530"/>
+      <w:bookmarkStart w:id="35" w:name="_Toc239828130"/>
       <w:r>
         <w:t>HUD Information Architecture</w:t>
       </w:r>
@@ -12890,6 +13063,7 @@
       <w:tr>
         <w:trPr>
           <w:cantSplit/>
+          <w:tblHeader/>
           <w:jc w:val="center"/>
         </w:trPr>
         <w:tc>
@@ -12905,6 +13079,9 @@
             <w:vAlign w:val="center"/>
           </w:tcPr>
           <w:p>
+            <w:pPr>
+              <w:keepNext/>
+            </w:pPr>
             <w:r>
               <w:t>우선순위</w:t>
             </w:r>
@@ -12923,6 +13100,9 @@
             <w:vAlign w:val="center"/>
           </w:tcPr>
           <w:p>
+            <w:pPr>
+              <w:keepNext/>
+            </w:pPr>
             <w:r>
               <w:t>항상 답해야 할 질문</w:t>
             </w:r>
@@ -12941,6 +13121,9 @@
             <w:vAlign w:val="center"/>
           </w:tcPr>
           <w:p>
+            <w:pPr>
+              <w:keepNext/>
+            </w:pPr>
             <w:r>
               <w:t>UI 요소</w:t>
             </w:r>
@@ -13145,7 +13328,10 @@
     </w:tbl>
     <w:p>
       <w:pPr>
-        <w:spacing w:after="20"/>
+        <w:spacing w:after="0" w:line="20" w:lineRule="exact"/>
+        <w:rPr>
+          <w:sz w:val="2"/>
+        </w:rPr>
       </w:pPr>
     </w:p>
     <w:p>
@@ -13156,7 +13342,7 @@
           <w:numId w:val="7"/>
         </w:numPr>
       </w:pPr>
-      <w:bookmarkStart w:id="36" w:name="_Toc239675531"/>
+      <w:bookmarkStart w:id="36" w:name="_Toc239828131"/>
       <w:r>
         <w:t xml:space="preserve">Main HUD </w:t>
       </w:r>
@@ -13193,6 +13379,7 @@
       <w:tr>
         <w:trPr>
           <w:cantSplit/>
+          <w:tblHeader/>
           <w:jc w:val="center"/>
         </w:trPr>
         <w:tc>
@@ -13208,6 +13395,9 @@
             <w:vAlign w:val="center"/>
           </w:tcPr>
           <w:p>
+            <w:pPr>
+              <w:keepNext/>
+            </w:pPr>
             <w:r>
               <w:t>미션</w:t>
             </w:r>
@@ -13234,6 +13424,9 @@
             <w:vAlign w:val="center"/>
           </w:tcPr>
           <w:p>
+            <w:pPr>
+              <w:keepNext/>
+            </w:pPr>
             <w:r>
               <w:t>WORLD VIEW</w:t>
             </w:r>
@@ -13256,6 +13449,9 @@
             <w:vAlign w:val="center"/>
           </w:tcPr>
           <w:p>
+            <w:pPr>
+              <w:keepNext/>
+            </w:pPr>
             <w:r>
               <w:t>경계도 10칸</w:t>
             </w:r>
@@ -13455,7 +13651,7 @@
           <w:numId w:val="7"/>
         </w:numPr>
       </w:pPr>
-      <w:bookmarkStart w:id="37" w:name="_Toc239675532"/>
+      <w:bookmarkStart w:id="37" w:name="_Toc239828132"/>
       <w:r>
         <w:lastRenderedPageBreak/>
         <w:t>최소</w:t>
@@ -13528,11 +13724,7 @@
         <w:t>경계도 아래 단일 사건 문구는 CCTV 발각, Laser 접촉, Guard 포획, Stun, Arrest 같은 현재 사건을 짧게 표시한 뒤 사라진다. 별도 Lockdown Countdown 문구는 사용하지 않는다.</w:t>
       </w:r>
     </w:p>
-    <w:p>
-      <w:r>
-        <w:br w:type="page"/>
-      </w:r>
-    </w:p>
+    <w:p/>
     <w:p>
       <w:pPr>
         <w:pStyle w:val="21"/>
@@ -13541,9 +13733,8 @@
           <w:numId w:val="7"/>
         </w:numPr>
       </w:pPr>
-      <w:bookmarkStart w:id="38" w:name="_Toc239675533"/>
-      <w:r>
-        <w:lastRenderedPageBreak/>
+      <w:bookmarkStart w:id="38" w:name="_Toc239828133"/>
+      <w:r>
         <w:t xml:space="preserve">Input Mode </w:t>
       </w:r>
       <w:r>
@@ -13568,6 +13759,7 @@
       <w:tr>
         <w:trPr>
           <w:cantSplit/>
+          <w:tblHeader/>
           <w:jc w:val="center"/>
         </w:trPr>
         <w:tc>
@@ -13585,6 +13777,7 @@
           <w:p>
             <w:pPr>
               <w:pStyle w:val="TableText"/>
+              <w:keepNext/>
               <w:jc w:val="center"/>
             </w:pPr>
             <w:r>
@@ -13612,6 +13805,7 @@
           <w:p>
             <w:pPr>
               <w:pStyle w:val="TableText"/>
+              <w:keepNext/>
               <w:jc w:val="center"/>
             </w:pPr>
             <w:r>
@@ -13639,6 +13833,7 @@
           <w:p>
             <w:pPr>
               <w:pStyle w:val="TableText"/>
+              <w:keepNext/>
               <w:jc w:val="center"/>
             </w:pPr>
             <w:r>
@@ -13666,6 +13861,7 @@
           <w:p>
             <w:pPr>
               <w:pStyle w:val="TableText"/>
+              <w:keepNext/>
               <w:jc w:val="center"/>
             </w:pPr>
             <w:r>
@@ -13998,7 +14194,10 @@
     </w:tbl>
     <w:p>
       <w:pPr>
-        <w:spacing w:after="20"/>
+        <w:spacing w:after="0" w:line="20" w:lineRule="exact"/>
+        <w:rPr>
+          <w:sz w:val="2"/>
+        </w:rPr>
       </w:pPr>
     </w:p>
     <w:p>
@@ -14014,8 +14213,9 @@
           <w:numId w:val="7"/>
         </w:numPr>
       </w:pPr>
-      <w:bookmarkStart w:id="39" w:name="_Toc239675534"/>
-      <w:r>
+      <w:bookmarkStart w:id="39" w:name="_Toc239828134"/>
+      <w:r>
+        <w:lastRenderedPageBreak/>
         <w:t>Floor Plan</w:t>
       </w:r>
       <w:r>
@@ -14037,7 +14237,7 @@
           <w:numId w:val="7"/>
         </w:numPr>
       </w:pPr>
-      <w:bookmarkStart w:id="40" w:name="_Toc239675535"/>
+      <w:bookmarkStart w:id="40" w:name="_Toc239828135"/>
       <w:r>
         <w:t xml:space="preserve">Floor Plan Map </w:t>
       </w:r>
@@ -14078,6 +14278,7 @@
           </w:tcPr>
           <w:p>
             <w:pPr>
+              <w:keepNext/>
               <w:jc w:val="center"/>
             </w:pPr>
             <w:r>
@@ -14104,6 +14305,7 @@
           </w:tcPr>
           <w:p>
             <w:pPr>
+              <w:keepNext/>
               <w:jc w:val="center"/>
             </w:pPr>
             <w:r>
@@ -14130,6 +14332,7 @@
           </w:tcPr>
           <w:p>
             <w:pPr>
+              <w:keepNext/>
               <w:jc w:val="center"/>
             </w:pPr>
             <w:r>
@@ -14162,6 +14365,7 @@
           </w:tcPr>
           <w:p>
             <w:pPr>
+              <w:keepNext/>
               <w:jc w:val="center"/>
             </w:pPr>
             <w:r>
@@ -14197,6 +14401,7 @@
           </w:tcPr>
           <w:p>
             <w:pPr>
+              <w:keepNext/>
               <w:jc w:val="center"/>
             </w:pPr>
             <w:r>
@@ -14238,6 +14443,7 @@
           </w:tcPr>
           <w:p>
             <w:pPr>
+              <w:keepNext/>
               <w:jc w:val="center"/>
             </w:pPr>
             <w:r>
@@ -14270,6 +14476,7 @@
           </w:tcPr>
           <w:p>
             <w:pPr>
+              <w:keepNext/>
               <w:jc w:val="center"/>
             </w:pPr>
             <w:r>
@@ -14296,6 +14503,7 @@
           </w:tcPr>
           <w:p>
             <w:pPr>
+              <w:keepNext/>
               <w:jc w:val="center"/>
             </w:pPr>
             <w:r>
@@ -14344,7 +14552,7 @@
           <w:numId w:val="7"/>
         </w:numPr>
       </w:pPr>
-      <w:bookmarkStart w:id="41" w:name="_Toc239675536"/>
+      <w:bookmarkStart w:id="41" w:name="_Toc239828136"/>
       <w:r>
         <w:t xml:space="preserve">Team Result / Replica Recap </w:t>
       </w:r>
@@ -14369,6 +14577,7 @@
       <w:tr>
         <w:trPr>
           <w:cantSplit/>
+          <w:tblHeader/>
           <w:jc w:val="center"/>
         </w:trPr>
         <w:tc>
@@ -14386,6 +14595,7 @@
           <w:p>
             <w:pPr>
               <w:pStyle w:val="TableText"/>
+              <w:keepNext/>
               <w:jc w:val="center"/>
             </w:pPr>
             <w:r>
@@ -14412,6 +14622,7 @@
           <w:p>
             <w:pPr>
               <w:pStyle w:val="TableText"/>
+              <w:keepNext/>
               <w:jc w:val="center"/>
             </w:pPr>
             <w:r>
@@ -14438,6 +14649,7 @@
           <w:p>
             <w:pPr>
               <w:pStyle w:val="TableText"/>
+              <w:keepNext/>
               <w:jc w:val="center"/>
             </w:pPr>
             <w:r>
@@ -14501,7 +14713,10 @@
     </w:tbl>
     <w:p>
       <w:pPr>
-        <w:spacing w:after="20"/>
+        <w:spacing w:after="0" w:line="20" w:lineRule="exact"/>
+        <w:rPr>
+          <w:sz w:val="2"/>
+        </w:rPr>
       </w:pPr>
     </w:p>
     <w:tbl>
@@ -14520,6 +14735,7 @@
       <w:tr>
         <w:trPr>
           <w:cantSplit/>
+          <w:tblHeader/>
           <w:jc w:val="center"/>
         </w:trPr>
         <w:tc>
@@ -14537,6 +14753,7 @@
           <w:p>
             <w:pPr>
               <w:pStyle w:val="TableText"/>
+              <w:keepNext/>
               <w:jc w:val="center"/>
             </w:pPr>
             <w:r>
@@ -14563,6 +14780,7 @@
           <w:p>
             <w:pPr>
               <w:pStyle w:val="TableText"/>
+              <w:keepNext/>
               <w:jc w:val="center"/>
             </w:pPr>
             <w:r>
@@ -14589,6 +14807,7 @@
           <w:p>
             <w:pPr>
               <w:pStyle w:val="TableText"/>
+              <w:keepNext/>
               <w:jc w:val="center"/>
             </w:pPr>
             <w:r>
@@ -14616,7 +14835,6 @@
               <w:pStyle w:val="TableText"/>
             </w:pPr>
             <w:r>
-              <w:lastRenderedPageBreak/>
               <w:t>실제 제출 Painting</w:t>
             </w:r>
           </w:p>
@@ -14698,7 +14916,10 @@
     </w:tbl>
     <w:p>
       <w:pPr>
-        <w:spacing w:after="20"/>
+        <w:spacing w:after="0" w:line="20" w:lineRule="exact"/>
+        <w:rPr>
+          <w:sz w:val="2"/>
+        </w:rPr>
       </w:pPr>
     </w:p>
     <w:p>
@@ -14709,7 +14930,7 @@
           <w:numId w:val="7"/>
         </w:numPr>
       </w:pPr>
-      <w:bookmarkStart w:id="42" w:name="_Toc239675537"/>
+      <w:bookmarkStart w:id="42" w:name="_Toc239828137"/>
       <w:r>
         <w:t>첫</w:t>
       </w:r>
@@ -14742,6 +14963,7 @@
       <w:tr>
         <w:trPr>
           <w:cantSplit/>
+          <w:tblHeader/>
           <w:jc w:val="center"/>
         </w:trPr>
         <w:tc>
@@ -14759,6 +14981,7 @@
           <w:p>
             <w:pPr>
               <w:pStyle w:val="TableText"/>
+              <w:keepNext/>
               <w:jc w:val="center"/>
             </w:pPr>
             <w:r>
@@ -14785,6 +15008,7 @@
           <w:p>
             <w:pPr>
               <w:pStyle w:val="TableText"/>
+              <w:keepNext/>
               <w:jc w:val="center"/>
             </w:pPr>
             <w:r>
@@ -14930,7 +15154,10 @@
     </w:tbl>
     <w:p>
       <w:pPr>
-        <w:spacing w:after="20"/>
+        <w:spacing w:after="0" w:line="20" w:lineRule="exact"/>
+        <w:rPr>
+          <w:sz w:val="2"/>
+        </w:rPr>
       </w:pPr>
     </w:p>
     <w:p>
@@ -14977,8 +15204,9 @@
           <w:numId w:val="7"/>
         </w:numPr>
       </w:pPr>
-      <w:bookmarkStart w:id="43" w:name="_Toc239675538"/>
-      <w:r>
+      <w:bookmarkStart w:id="43" w:name="_Toc239828138"/>
+      <w:r>
+        <w:lastRenderedPageBreak/>
         <w:t>접근성</w:t>
       </w:r>
       <w:r>
@@ -14996,6 +15224,7 @@
           <w:ilvl w:val="0"/>
           <w:numId w:val="8"/>
         </w:numPr>
+        <w:spacing w:after="40" w:line="240" w:lineRule="auto"/>
       </w:pPr>
       <w:r>
         <w:t>색상 외에 Shape/Icon/Text를 함께 사용한다.</w:t>
@@ -15008,6 +15237,7 @@
           <w:ilvl w:val="0"/>
           <w:numId w:val="8"/>
         </w:numPr>
+        <w:spacing w:after="40" w:line="240" w:lineRule="auto"/>
       </w:pPr>
       <w:r>
         <w:t>강한 Blur·지속 Camera Shake·빠른 FOV 변화에 의존하지 않는다.</w:t>
@@ -15020,6 +15250,7 @@
           <w:ilvl w:val="0"/>
           <w:numId w:val="8"/>
         </w:numPr>
+        <w:spacing w:after="40" w:line="240" w:lineRule="auto"/>
       </w:pPr>
       <w:r>
         <w:t>FOV, Mouse Sensitivity, Master Volume, Resolution/Window Mode를 Title에서 제공하고 로컬 저장한다.</w:t>
@@ -15032,6 +15263,7 @@
           <w:ilvl w:val="0"/>
           <w:numId w:val="8"/>
         </w:numPr>
+        <w:spacing w:after="40" w:line="240" w:lineRule="auto"/>
       </w:pPr>
       <w:r>
         <w:t>중요 Countdown은 독립 Text로 표시하고 배경과 충분한 대비를 유지한다.</w:t>
@@ -15045,7 +15277,7 @@
           <w:numId w:val="7"/>
         </w:numPr>
       </w:pPr>
-      <w:bookmarkStart w:id="44" w:name="_Toc239675539"/>
+      <w:bookmarkStart w:id="44" w:name="_Toc239828139"/>
       <w:r>
         <w:lastRenderedPageBreak/>
         <w:t>레벨</w:t>
@@ -15078,7 +15310,7 @@
           <w:numId w:val="7"/>
         </w:numPr>
       </w:pPr>
-      <w:bookmarkStart w:id="45" w:name="_Toc239675540"/>
+      <w:bookmarkStart w:id="45" w:name="_Toc239828140"/>
       <w:r>
         <w:t>세</w:t>
       </w:r>
@@ -15176,7 +15408,7 @@
           <w:numId w:val="7"/>
         </w:numPr>
       </w:pPr>
-      <w:bookmarkStart w:id="46" w:name="_Toc239675541"/>
+      <w:bookmarkStart w:id="46" w:name="_Toc239828141"/>
       <w:r>
         <w:t>맵</w:t>
       </w:r>
@@ -15206,6 +15438,7 @@
       <w:tr>
         <w:trPr>
           <w:cantSplit/>
+          <w:tblHeader/>
           <w:jc w:val="center"/>
         </w:trPr>
         <w:tc>
@@ -15223,6 +15456,7 @@
           <w:p>
             <w:pPr>
               <w:pStyle w:val="TableText"/>
+              <w:keepNext/>
               <w:jc w:val="center"/>
             </w:pPr>
             <w:r>
@@ -15250,6 +15484,7 @@
           <w:p>
             <w:pPr>
               <w:pStyle w:val="TableText"/>
+              <w:keepNext/>
               <w:jc w:val="center"/>
             </w:pPr>
             <w:r>
@@ -15277,6 +15512,7 @@
           <w:p>
             <w:pPr>
               <w:pStyle w:val="TableText"/>
+              <w:keepNext/>
               <w:jc w:val="center"/>
             </w:pPr>
             <w:r>
@@ -15304,6 +15540,7 @@
           <w:p>
             <w:pPr>
               <w:pStyle w:val="TableText"/>
+              <w:keepNext/>
               <w:jc w:val="center"/>
             </w:pPr>
             <w:r>
@@ -15331,6 +15568,7 @@
           <w:p>
             <w:pPr>
               <w:pStyle w:val="TableText"/>
+              <w:keepNext/>
               <w:jc w:val="center"/>
             </w:pPr>
             <w:r>
@@ -15602,7 +15840,10 @@
     </w:tbl>
     <w:p>
       <w:pPr>
-        <w:spacing w:after="20"/>
+        <w:spacing w:after="0" w:line="20" w:lineRule="exact"/>
+        <w:rPr>
+          <w:sz w:val="2"/>
+        </w:rPr>
       </w:pPr>
     </w:p>
     <w:p>
@@ -15613,7 +15854,7 @@
           <w:numId w:val="7"/>
         </w:numPr>
       </w:pPr>
-      <w:bookmarkStart w:id="47" w:name="_Toc239675542"/>
+      <w:bookmarkStart w:id="47" w:name="_Toc239828142"/>
       <w:r>
         <w:t xml:space="preserve">M01 — </w:t>
       </w:r>
@@ -15650,6 +15891,7 @@
       <w:tr>
         <w:trPr>
           <w:cantSplit/>
+          <w:tblHeader/>
           <w:jc w:val="center"/>
         </w:trPr>
         <w:tc>
@@ -15667,6 +15909,7 @@
           <w:p>
             <w:pPr>
               <w:pStyle w:val="TableText"/>
+              <w:keepNext/>
               <w:jc w:val="center"/>
             </w:pPr>
             <w:r>
@@ -15693,6 +15936,7 @@
           <w:p>
             <w:pPr>
               <w:pStyle w:val="TableText"/>
+              <w:keepNext/>
               <w:jc w:val="center"/>
             </w:pPr>
             <w:r>
@@ -15719,6 +15963,7 @@
           <w:p>
             <w:pPr>
               <w:pStyle w:val="TableText"/>
+              <w:keepNext/>
               <w:jc w:val="center"/>
             </w:pPr>
             <w:r>
@@ -15745,6 +15990,7 @@
           <w:p>
             <w:pPr>
               <w:pStyle w:val="TableText"/>
+              <w:keepNext/>
               <w:jc w:val="center"/>
             </w:pPr>
             <w:r>
@@ -15822,7 +16068,10 @@
     </w:tbl>
     <w:p>
       <w:pPr>
-        <w:spacing w:after="20"/>
+        <w:spacing w:after="0" w:line="20" w:lineRule="exact"/>
+        <w:rPr>
+          <w:sz w:val="2"/>
+        </w:rPr>
       </w:pPr>
     </w:p>
     <w:tbl>
@@ -15918,7 +16167,7 @@
           <w:numId w:val="7"/>
         </w:numPr>
       </w:pPr>
-      <w:bookmarkStart w:id="48" w:name="_Toc239675543"/>
+      <w:bookmarkStart w:id="48" w:name="_Toc239828143"/>
       <w:r>
         <w:t xml:space="preserve">M02 — </w:t>
       </w:r>
@@ -15955,6 +16204,7 @@
       <w:tr>
         <w:trPr>
           <w:cantSplit/>
+          <w:tblHeader/>
           <w:jc w:val="center"/>
         </w:trPr>
         <w:tc>
@@ -15972,6 +16222,7 @@
           <w:p>
             <w:pPr>
               <w:pStyle w:val="TableText"/>
+              <w:keepNext/>
               <w:jc w:val="center"/>
             </w:pPr>
             <w:r>
@@ -15998,6 +16249,7 @@
           <w:p>
             <w:pPr>
               <w:pStyle w:val="TableText"/>
+              <w:keepNext/>
               <w:jc w:val="center"/>
             </w:pPr>
             <w:r>
@@ -16024,6 +16276,7 @@
           <w:p>
             <w:pPr>
               <w:pStyle w:val="TableText"/>
+              <w:keepNext/>
               <w:jc w:val="center"/>
             </w:pPr>
             <w:r>
@@ -16050,6 +16303,7 @@
           <w:p>
             <w:pPr>
               <w:pStyle w:val="TableText"/>
+              <w:keepNext/>
               <w:jc w:val="center"/>
             </w:pPr>
             <w:r>
@@ -16127,7 +16381,10 @@
     </w:tbl>
     <w:p>
       <w:pPr>
-        <w:spacing w:after="20"/>
+        <w:spacing w:after="0" w:line="20" w:lineRule="exact"/>
+        <w:rPr>
+          <w:sz w:val="2"/>
+        </w:rPr>
       </w:pPr>
     </w:p>
     <w:tbl>
@@ -16223,7 +16480,7 @@
           <w:numId w:val="7"/>
         </w:numPr>
       </w:pPr>
-      <w:bookmarkStart w:id="49" w:name="_Toc239675544"/>
+      <w:bookmarkStart w:id="49" w:name="_Toc239828144"/>
       <w:r>
         <w:lastRenderedPageBreak/>
         <w:t xml:space="preserve">M03 — </w:t>
@@ -16261,6 +16518,7 @@
       <w:tr>
         <w:trPr>
           <w:cantSplit/>
+          <w:tblHeader/>
           <w:jc w:val="center"/>
         </w:trPr>
         <w:tc>
@@ -16278,6 +16536,7 @@
           <w:p>
             <w:pPr>
               <w:pStyle w:val="TableText"/>
+              <w:keepNext/>
               <w:jc w:val="center"/>
             </w:pPr>
             <w:r>
@@ -16304,6 +16563,7 @@
           <w:p>
             <w:pPr>
               <w:pStyle w:val="TableText"/>
+              <w:keepNext/>
               <w:jc w:val="center"/>
             </w:pPr>
             <w:r>
@@ -16330,6 +16590,7 @@
           <w:p>
             <w:pPr>
               <w:pStyle w:val="TableText"/>
+              <w:keepNext/>
               <w:jc w:val="center"/>
             </w:pPr>
             <w:r>
@@ -16356,6 +16617,7 @@
           <w:p>
             <w:pPr>
               <w:pStyle w:val="TableText"/>
+              <w:keepNext/>
               <w:jc w:val="center"/>
             </w:pPr>
             <w:r>
@@ -16433,7 +16695,10 @@
     </w:tbl>
     <w:p>
       <w:pPr>
-        <w:spacing w:after="20"/>
+        <w:spacing w:after="0" w:line="20" w:lineRule="exact"/>
+        <w:rPr>
+          <w:sz w:val="2"/>
+        </w:rPr>
       </w:pPr>
     </w:p>
     <w:tbl>
@@ -16529,7 +16794,7 @@
           <w:numId w:val="7"/>
         </w:numPr>
       </w:pPr>
-      <w:bookmarkStart w:id="50" w:name="_Toc239675545"/>
+      <w:bookmarkStart w:id="50" w:name="_Toc239828145"/>
       <w:r>
         <w:lastRenderedPageBreak/>
         <w:t xml:space="preserve">First-Person </w:t>
@@ -16613,7 +16878,7 @@
           <w:numId w:val="7"/>
         </w:numPr>
       </w:pPr>
-      <w:bookmarkStart w:id="51" w:name="_Toc239675546"/>
+      <w:bookmarkStart w:id="51" w:name="_Toc239828146"/>
       <w:r>
         <w:t>사운드</w:t>
       </w:r>
@@ -16641,6 +16906,7 @@
       <w:tr>
         <w:trPr>
           <w:cantSplit/>
+          <w:tblHeader/>
           <w:jc w:val="center"/>
         </w:trPr>
         <w:tc>
@@ -16658,6 +16924,7 @@
           <w:p>
             <w:pPr>
               <w:pStyle w:val="TableText"/>
+              <w:keepNext/>
               <w:jc w:val="center"/>
             </w:pPr>
             <w:r>
@@ -16684,6 +16951,7 @@
           <w:p>
             <w:pPr>
               <w:pStyle w:val="TableText"/>
+              <w:keepNext/>
               <w:jc w:val="center"/>
             </w:pPr>
             <w:r>
@@ -16710,6 +16978,7 @@
           <w:p>
             <w:pPr>
               <w:pStyle w:val="TableText"/>
+              <w:keepNext/>
               <w:jc w:val="center"/>
             </w:pPr>
             <w:r>
@@ -16998,7 +17267,10 @@
     </w:tbl>
     <w:p>
       <w:pPr>
-        <w:spacing w:after="20"/>
+        <w:spacing w:after="0" w:line="20" w:lineRule="exact"/>
+        <w:rPr>
+          <w:sz w:val="2"/>
+        </w:rPr>
       </w:pPr>
     </w:p>
     <w:p>
@@ -17046,7 +17318,7 @@
           <w:numId w:val="7"/>
         </w:numPr>
       </w:pPr>
-      <w:bookmarkStart w:id="52" w:name="_Toc239675547"/>
+      <w:bookmarkStart w:id="52" w:name="_Toc239828147"/>
       <w:r>
         <w:lastRenderedPageBreak/>
         <w:t>세계관과</w:t>
@@ -17085,6 +17357,7 @@
       <w:tr>
         <w:trPr>
           <w:cantSplit/>
+          <w:tblHeader/>
           <w:jc w:val="center"/>
         </w:trPr>
         <w:tc>
@@ -17102,6 +17375,7 @@
           <w:p>
             <w:pPr>
               <w:pStyle w:val="TableText"/>
+              <w:keepNext/>
               <w:jc w:val="center"/>
             </w:pPr>
             <w:r>
@@ -17128,6 +17402,7 @@
           <w:p>
             <w:pPr>
               <w:pStyle w:val="TableText"/>
+              <w:keepNext/>
               <w:jc w:val="center"/>
             </w:pPr>
             <w:r>
@@ -17276,7 +17551,10 @@
     </w:tbl>
     <w:p>
       <w:pPr>
-        <w:spacing w:after="20"/>
+        <w:spacing w:after="0" w:line="20" w:lineRule="exact"/>
+        <w:rPr>
+          <w:sz w:val="2"/>
+        </w:rPr>
       </w:pPr>
     </w:p>
     <w:p>
@@ -17287,7 +17565,7 @@
           <w:numId w:val="7"/>
         </w:numPr>
       </w:pPr>
-      <w:bookmarkStart w:id="53" w:name="_Toc239675548"/>
+      <w:bookmarkStart w:id="53" w:name="_Toc239828148"/>
       <w:r>
         <w:lastRenderedPageBreak/>
         <w:t>범위</w:t>
@@ -17314,7 +17592,7 @@
           <w:numId w:val="7"/>
         </w:numPr>
       </w:pPr>
-      <w:bookmarkStart w:id="54" w:name="_Toc239675549"/>
+      <w:bookmarkStart w:id="54" w:name="_Toc239828149"/>
       <w:r>
         <w:t>v1.0 Required Scope</w:t>
       </w:r>
@@ -17335,6 +17613,7 @@
       <w:tr>
         <w:trPr>
           <w:cantSplit/>
+          <w:tblHeader/>
           <w:jc w:val="center"/>
         </w:trPr>
         <w:tc>
@@ -17352,6 +17631,7 @@
           <w:p>
             <w:pPr>
               <w:pStyle w:val="TableText"/>
+              <w:keepNext/>
               <w:jc w:val="center"/>
             </w:pPr>
             <w:r>
@@ -17378,6 +17658,7 @@
           <w:p>
             <w:pPr>
               <w:pStyle w:val="TableText"/>
+              <w:keepNext/>
               <w:jc w:val="center"/>
             </w:pPr>
             <w:r>
@@ -17665,7 +17946,10 @@
     </w:tbl>
     <w:p>
       <w:pPr>
-        <w:spacing w:after="20"/>
+        <w:spacing w:after="0" w:line="20" w:lineRule="exact"/>
+        <w:rPr>
+          <w:sz w:val="2"/>
+        </w:rPr>
       </w:pPr>
     </w:p>
     <w:p>
@@ -17676,7 +17960,7 @@
           <w:numId w:val="7"/>
         </w:numPr>
       </w:pPr>
-      <w:bookmarkStart w:id="55" w:name="_Toc239675550"/>
+      <w:bookmarkStart w:id="55" w:name="_Toc239828150"/>
       <w:r>
         <w:t>Deferred Expansion</w:t>
       </w:r>
@@ -17700,7 +17984,7 @@
           <w:numId w:val="7"/>
         </w:numPr>
       </w:pPr>
-      <w:bookmarkStart w:id="56" w:name="_Toc239675551"/>
+      <w:bookmarkStart w:id="56" w:name="_Toc239828151"/>
       <w:r>
         <w:t>Stretch</w:t>
       </w:r>
@@ -17731,6 +18015,7 @@
       <w:tr>
         <w:trPr>
           <w:cantSplit/>
+          <w:tblHeader/>
           <w:jc w:val="center"/>
         </w:trPr>
         <w:tc>
@@ -17748,6 +18033,7 @@
           <w:p>
             <w:pPr>
               <w:pStyle w:val="TableText"/>
+              <w:keepNext/>
               <w:jc w:val="center"/>
             </w:pPr>
             <w:r>
@@ -17774,6 +18060,7 @@
           <w:p>
             <w:pPr>
               <w:pStyle w:val="TableText"/>
+              <w:keepNext/>
               <w:jc w:val="center"/>
             </w:pPr>
             <w:r>
@@ -17800,6 +18087,7 @@
           <w:p>
             <w:pPr>
               <w:pStyle w:val="TableText"/>
+              <w:keepNext/>
               <w:jc w:val="center"/>
             </w:pPr>
             <w:r>
@@ -18055,12 +18343,14 @@
     </w:tbl>
     <w:p>
       <w:pPr>
-        <w:spacing w:after="20"/>
+        <w:spacing w:after="0" w:line="20" w:lineRule="exact"/>
+        <w:rPr>
+          <w:sz w:val="2"/>
+        </w:rPr>
       </w:pPr>
     </w:p>
     <w:p>
       <w:r>
-        <w:lastRenderedPageBreak/>
         <w:t>Smoke와 Trap 계열은 Stretch가 아니라 제거 기능이다. 범위를 줄여도 다시 추가하지 않는다.</w:t>
       </w:r>
     </w:p>
@@ -18072,8 +18362,9 @@
           <w:numId w:val="7"/>
         </w:numPr>
       </w:pPr>
-      <w:bookmarkStart w:id="57" w:name="_Toc239675552"/>
-      <w:r>
+      <w:bookmarkStart w:id="57" w:name="_Toc239828152"/>
+      <w:r>
+        <w:lastRenderedPageBreak/>
         <w:t>Starting Balance Targets</w:t>
       </w:r>
       <w:bookmarkEnd w:id="57"/>
@@ -18094,6 +18385,7 @@
       <w:tr>
         <w:trPr>
           <w:cantSplit/>
+          <w:tblHeader/>
           <w:jc w:val="center"/>
         </w:trPr>
         <w:tc>
@@ -18111,6 +18403,7 @@
           <w:p>
             <w:pPr>
               <w:pStyle w:val="TableText"/>
+              <w:keepNext/>
               <w:jc w:val="center"/>
             </w:pPr>
             <w:r>
@@ -18137,6 +18430,7 @@
           <w:p>
             <w:pPr>
               <w:pStyle w:val="TableText"/>
+              <w:keepNext/>
               <w:jc w:val="center"/>
             </w:pPr>
             <w:r>
@@ -18163,6 +18457,7 @@
           <w:p>
             <w:pPr>
               <w:pStyle w:val="TableText"/>
+              <w:keepNext/>
               <w:jc w:val="center"/>
             </w:pPr>
             <w:r>
@@ -18652,7 +18947,10 @@
     </w:tbl>
     <w:p>
       <w:pPr>
-        <w:spacing w:after="20"/>
+        <w:spacing w:after="0" w:line="20" w:lineRule="exact"/>
+        <w:rPr>
+          <w:sz w:val="2"/>
+        </w:rPr>
       </w:pPr>
     </w:p>
     <w:p>
@@ -18663,7 +18961,7 @@
           <w:numId w:val="7"/>
         </w:numPr>
       </w:pPr>
-      <w:bookmarkStart w:id="58" w:name="_Toc239675553"/>
+      <w:bookmarkStart w:id="58" w:name="_Toc239828153"/>
       <w:r>
         <w:t>Playtest Questions</w:t>
       </w:r>
@@ -18749,7 +19047,7 @@
           <w:numId w:val="7"/>
         </w:numPr>
       </w:pPr>
-      <w:bookmarkStart w:id="59" w:name="_Toc239675554"/>
+      <w:bookmarkStart w:id="59" w:name="_Toc239828154"/>
       <w:r>
         <w:lastRenderedPageBreak/>
         <w:t>Release KPI</w:t>
@@ -18771,6 +19069,7 @@
       <w:tr>
         <w:trPr>
           <w:cantSplit/>
+          <w:tblHeader/>
           <w:jc w:val="center"/>
         </w:trPr>
         <w:tc>
@@ -18788,6 +19087,7 @@
           <w:p>
             <w:pPr>
               <w:pStyle w:val="TableText"/>
+              <w:keepNext/>
               <w:jc w:val="center"/>
             </w:pPr>
             <w:r>
@@ -18814,6 +19114,7 @@
           <w:p>
             <w:pPr>
               <w:pStyle w:val="TableText"/>
+              <w:keepNext/>
               <w:jc w:val="center"/>
             </w:pPr>
             <w:r>
@@ -19064,7 +19365,10 @@
     </w:tbl>
     <w:p>
       <w:pPr>
-        <w:spacing w:after="20"/>
+        <w:spacing w:after="0" w:line="20" w:lineRule="exact"/>
+        <w:rPr>
+          <w:sz w:val="2"/>
+        </w:rPr>
       </w:pPr>
     </w:p>
     <w:p>
@@ -19075,7 +19379,7 @@
           <w:numId w:val="7"/>
         </w:numPr>
       </w:pPr>
-      <w:bookmarkStart w:id="60" w:name="_Toc239675555"/>
+      <w:bookmarkStart w:id="60" w:name="_Toc239828155"/>
       <w:r>
         <w:t>W6~W12 Roadmap</w:t>
       </w:r>
@@ -19097,6 +19401,7 @@
       <w:tr>
         <w:trPr>
           <w:cantSplit/>
+          <w:tblHeader/>
           <w:jc w:val="center"/>
         </w:trPr>
         <w:tc>
@@ -19112,6 +19417,9 @@
             <w:vAlign w:val="center"/>
           </w:tcPr>
           <w:p>
+            <w:pPr>
+              <w:keepNext/>
+            </w:pPr>
             <w:r>
               <w:t>주차</w:t>
             </w:r>
@@ -19130,6 +19438,9 @@
             <w:vAlign w:val="center"/>
           </w:tcPr>
           <w:p>
+            <w:pPr>
+              <w:keepNext/>
+            </w:pPr>
             <w:r>
               <w:t>제품 결과</w:t>
             </w:r>
@@ -19148,6 +19459,9 @@
             <w:vAlign w:val="center"/>
           </w:tcPr>
           <w:p>
+            <w:pPr>
+              <w:keepNext/>
+            </w:pPr>
             <w:r>
               <w:t>Gate</w:t>
             </w:r>
@@ -19419,7 +19733,10 @@
     </w:tbl>
     <w:p>
       <w:pPr>
-        <w:spacing w:after="20"/>
+        <w:spacing w:after="0" w:line="20" w:lineRule="exact"/>
+        <w:rPr>
+          <w:sz w:val="2"/>
+        </w:rPr>
       </w:pPr>
     </w:p>
     <w:p>
@@ -19428,7 +19745,7 @@
         <w:keepLines/>
         <w:pageBreakBefore w:val="0"/>
       </w:pPr>
-      <w:bookmarkStart w:id="61" w:name="_Toc239675556"/>
+      <w:bookmarkStart w:id="61" w:name="_Toc239828156"/>
       <w:r>
         <w:t>Appendix A — 용어</w:t>
       </w:r>
@@ -19449,6 +19766,7 @@
       <w:tr>
         <w:trPr>
           <w:cantSplit/>
+          <w:tblHeader/>
           <w:jc w:val="center"/>
         </w:trPr>
         <w:tc>
@@ -19466,6 +19784,7 @@
           <w:p>
             <w:pPr>
               <w:pStyle w:val="TableText"/>
+              <w:keepNext/>
               <w:jc w:val="center"/>
             </w:pPr>
             <w:r>
@@ -19492,6 +19811,7 @@
           <w:p>
             <w:pPr>
               <w:pStyle w:val="TableText"/>
+              <w:keepNext/>
               <w:jc w:val="center"/>
             </w:pPr>
             <w:r>
@@ -19804,7 +20124,10 @@
     </w:tbl>
     <w:p>
       <w:pPr>
-        <w:spacing w:after="20"/>
+        <w:spacing w:after="0" w:line="20" w:lineRule="exact"/>
+        <w:rPr>
+          <w:sz w:val="2"/>
+        </w:rPr>
       </w:pPr>
     </w:p>
     <w:p>
@@ -19813,7 +20136,7 @@
         <w:keepLines/>
         <w:pageBreakBefore w:val="0"/>
       </w:pPr>
-      <w:bookmarkStart w:id="62" w:name="_Toc239675557"/>
+      <w:bookmarkStart w:id="62" w:name="_Toc239828157"/>
       <w:r>
         <w:rPr>
           <w:sz w:val="32"/>
@@ -19837,6 +20160,7 @@
       <w:tr>
         <w:trPr>
           <w:cantSplit/>
+          <w:tblHeader/>
           <w:jc w:val="center"/>
         </w:trPr>
         <w:tc>
@@ -19854,6 +20178,7 @@
           <w:p>
             <w:pPr>
               <w:pStyle w:val="TableText"/>
+              <w:keepNext/>
               <w:jc w:val="center"/>
             </w:pPr>
             <w:r>
@@ -19880,6 +20205,7 @@
           <w:p>
             <w:pPr>
               <w:pStyle w:val="TableText"/>
+              <w:keepNext/>
               <w:jc w:val="center"/>
             </w:pPr>
             <w:r>
@@ -20037,7 +20363,7 @@
         <w:keepLines/>
         <w:pageBreakBefore w:val="0"/>
       </w:pPr>
-      <w:bookmarkStart w:id="63" w:name="_Toc239675558"/>
+      <w:bookmarkStart w:id="63" w:name="_Toc239828158"/>
       <w:r>
         <w:rPr>
           <w:sz w:val="32"/>

</xml_diff>

<commit_message>
Refine gallery layouts and exhibit mounting
Adds a new gallery refinement pass to the editor build pipeline that authors partition walls, mounts all 20 active painting cases to valid wall surfaces, generates decorative non-interactive prints, and creates per-map gallery print material instances. Updates map/floor-plan assets and source geometry exports for the new layouts, plus new verification checks for navigation/collision/laser egress and automation test fixes so interaction/chase fixtures remain valid with wall-mounted exhibits.
</commit_message>
<xml_diff>
--- a/Museum_Heist_GDD.docx
+++ b/Museum_Heist_GDD.docx
@@ -111,7 +111,7 @@
             </w:r>
             <w:r>
               <w:br/>
-              <w:t>문서 정합성 검토 · 2026-09-09</w:t>
+              <w:t>문서 정합성 검토 · 2026-09-11</w:t>
             </w:r>
           </w:p>
         </w:tc>
@@ -564,7 +564,7 @@
       <w:r>
         <w:fldChar w:fldCharType="separate"/>
       </w:r>
-      <w:hyperlink w:anchor="_Toc239828095" w:history="1">
+      <w:hyperlink w:anchor="_Toc240003249" w:history="1">
         <w:r>
           <w:rPr>
             <w:rStyle w:val="aff1"/>
@@ -591,7 +591,7 @@
             <w:noProof/>
             <w:webHidden/>
           </w:rPr>
-          <w:instrText xml:space="preserve"> PAGEREF _Toc239828095 \h </w:instrText>
+          <w:instrText xml:space="preserve"> PAGEREF _Toc240003249 \h </w:instrText>
         </w:r>
         <w:r>
           <w:rPr>
@@ -640,7 +640,7 @@
           <w14:ligatures w14:val="standardContextual"/>
         </w:rPr>
       </w:pPr>
-      <w:hyperlink w:anchor="_Toc239828096" w:history="1">
+      <w:hyperlink w:anchor="_Toc240003250" w:history="1">
         <w:r>
           <w:rPr>
             <w:rStyle w:val="aff1"/>
@@ -667,7 +667,7 @@
             <w:noProof/>
             <w:webHidden/>
           </w:rPr>
-          <w:instrText xml:space="preserve"> PAGEREF _Toc239828096 \h </w:instrText>
+          <w:instrText xml:space="preserve"> PAGEREF _Toc240003250 \h </w:instrText>
         </w:r>
         <w:r>
           <w:rPr>
@@ -716,7 +716,7 @@
           <w14:ligatures w14:val="standardContextual"/>
         </w:rPr>
       </w:pPr>
-      <w:hyperlink w:anchor="_Toc239828097" w:history="1">
+      <w:hyperlink w:anchor="_Toc240003251" w:history="1">
         <w:r>
           <w:rPr>
             <w:rStyle w:val="aff1"/>
@@ -743,7 +743,7 @@
             <w:noProof/>
             <w:webHidden/>
           </w:rPr>
-          <w:instrText xml:space="preserve"> PAGEREF _Toc239828097 \h </w:instrText>
+          <w:instrText xml:space="preserve"> PAGEREF _Toc240003251 \h </w:instrText>
         </w:r>
         <w:r>
           <w:rPr>
@@ -792,7 +792,7 @@
           <w14:ligatures w14:val="standardContextual"/>
         </w:rPr>
       </w:pPr>
-      <w:hyperlink w:anchor="_Toc239828098" w:history="1">
+      <w:hyperlink w:anchor="_Toc240003252" w:history="1">
         <w:r>
           <w:rPr>
             <w:rStyle w:val="aff1"/>
@@ -819,7 +819,7 @@
             <w:noProof/>
             <w:webHidden/>
           </w:rPr>
-          <w:instrText xml:space="preserve"> PAGEREF _Toc239828098 \h </w:instrText>
+          <w:instrText xml:space="preserve"> PAGEREF _Toc240003252 \h </w:instrText>
         </w:r>
         <w:r>
           <w:rPr>
@@ -868,7 +868,7 @@
           <w14:ligatures w14:val="standardContextual"/>
         </w:rPr>
       </w:pPr>
-      <w:hyperlink w:anchor="_Toc239828099" w:history="1">
+      <w:hyperlink w:anchor="_Toc240003253" w:history="1">
         <w:r>
           <w:rPr>
             <w:rStyle w:val="aff1"/>
@@ -895,7 +895,7 @@
             <w:noProof/>
             <w:webHidden/>
           </w:rPr>
-          <w:instrText xml:space="preserve"> PAGEREF _Toc239828099 \h </w:instrText>
+          <w:instrText xml:space="preserve"> PAGEREF _Toc240003253 \h </w:instrText>
         </w:r>
         <w:r>
           <w:rPr>
@@ -944,7 +944,7 @@
           <w14:ligatures w14:val="standardContextual"/>
         </w:rPr>
       </w:pPr>
-      <w:hyperlink w:anchor="_Toc239828100" w:history="1">
+      <w:hyperlink w:anchor="_Toc240003254" w:history="1">
         <w:r>
           <w:rPr>
             <w:rStyle w:val="aff1"/>
@@ -971,7 +971,7 @@
             <w:noProof/>
             <w:webHidden/>
           </w:rPr>
-          <w:instrText xml:space="preserve"> PAGEREF _Toc239828100 \h </w:instrText>
+          <w:instrText xml:space="preserve"> PAGEREF _Toc240003254 \h </w:instrText>
         </w:r>
         <w:r>
           <w:rPr>
@@ -1020,7 +1020,7 @@
           <w14:ligatures w14:val="standardContextual"/>
         </w:rPr>
       </w:pPr>
-      <w:hyperlink w:anchor="_Toc239828101" w:history="1">
+      <w:hyperlink w:anchor="_Toc240003255" w:history="1">
         <w:r>
           <w:rPr>
             <w:rStyle w:val="aff1"/>
@@ -1047,7 +1047,7 @@
             <w:noProof/>
             <w:webHidden/>
           </w:rPr>
-          <w:instrText xml:space="preserve"> PAGEREF _Toc239828101 \h </w:instrText>
+          <w:instrText xml:space="preserve"> PAGEREF _Toc240003255 \h </w:instrText>
         </w:r>
         <w:r>
           <w:rPr>
@@ -1095,7 +1095,7 @@
           <w14:ligatures w14:val="standardContextual"/>
         </w:rPr>
       </w:pPr>
-      <w:hyperlink w:anchor="_Toc239828102" w:history="1">
+      <w:hyperlink w:anchor="_Toc240003256" w:history="1">
         <w:r>
           <w:rPr>
             <w:rStyle w:val="aff1"/>
@@ -1122,7 +1122,7 @@
             <w:noProof/>
             <w:webHidden/>
           </w:rPr>
-          <w:instrText xml:space="preserve"> PAGEREF _Toc239828102 \h </w:instrText>
+          <w:instrText xml:space="preserve"> PAGEREF _Toc240003256 \h </w:instrText>
         </w:r>
         <w:r>
           <w:rPr>
@@ -1171,7 +1171,7 @@
           <w14:ligatures w14:val="standardContextual"/>
         </w:rPr>
       </w:pPr>
-      <w:hyperlink w:anchor="_Toc239828103" w:history="1">
+      <w:hyperlink w:anchor="_Toc240003257" w:history="1">
         <w:r>
           <w:rPr>
             <w:rStyle w:val="aff1"/>
@@ -1198,7 +1198,7 @@
             <w:noProof/>
             <w:webHidden/>
           </w:rPr>
-          <w:instrText xml:space="preserve"> PAGEREF _Toc239828103 \h </w:instrText>
+          <w:instrText xml:space="preserve"> PAGEREF _Toc240003257 \h </w:instrText>
         </w:r>
         <w:r>
           <w:rPr>
@@ -1247,7 +1247,7 @@
           <w14:ligatures w14:val="standardContextual"/>
         </w:rPr>
       </w:pPr>
-      <w:hyperlink w:anchor="_Toc239828104" w:history="1">
+      <w:hyperlink w:anchor="_Toc240003258" w:history="1">
         <w:r>
           <w:rPr>
             <w:rStyle w:val="aff1"/>
@@ -1274,7 +1274,7 @@
             <w:noProof/>
             <w:webHidden/>
           </w:rPr>
-          <w:instrText xml:space="preserve"> PAGEREF _Toc239828104 \h </w:instrText>
+          <w:instrText xml:space="preserve"> PAGEREF _Toc240003258 \h </w:instrText>
         </w:r>
         <w:r>
           <w:rPr>
@@ -1323,7 +1323,7 @@
           <w14:ligatures w14:val="standardContextual"/>
         </w:rPr>
       </w:pPr>
-      <w:hyperlink w:anchor="_Toc239828105" w:history="1">
+      <w:hyperlink w:anchor="_Toc240003259" w:history="1">
         <w:r>
           <w:rPr>
             <w:rStyle w:val="aff1"/>
@@ -1350,7 +1350,7 @@
             <w:noProof/>
             <w:webHidden/>
           </w:rPr>
-          <w:instrText xml:space="preserve"> PAGEREF _Toc239828105 \h </w:instrText>
+          <w:instrText xml:space="preserve"> PAGEREF _Toc240003259 \h </w:instrText>
         </w:r>
         <w:r>
           <w:rPr>
@@ -1399,7 +1399,7 @@
           <w14:ligatures w14:val="standardContextual"/>
         </w:rPr>
       </w:pPr>
-      <w:hyperlink w:anchor="_Toc239828106" w:history="1">
+      <w:hyperlink w:anchor="_Toc240003260" w:history="1">
         <w:r>
           <w:rPr>
             <w:rStyle w:val="aff1"/>
@@ -1426,7 +1426,7 @@
             <w:noProof/>
             <w:webHidden/>
           </w:rPr>
-          <w:instrText xml:space="preserve"> PAGEREF _Toc239828106 \h </w:instrText>
+          <w:instrText xml:space="preserve"> PAGEREF _Toc240003260 \h </w:instrText>
         </w:r>
         <w:r>
           <w:rPr>
@@ -1475,7 +1475,7 @@
           <w14:ligatures w14:val="standardContextual"/>
         </w:rPr>
       </w:pPr>
-      <w:hyperlink w:anchor="_Toc239828107" w:history="1">
+      <w:hyperlink w:anchor="_Toc240003261" w:history="1">
         <w:r>
           <w:rPr>
             <w:rStyle w:val="aff1"/>
@@ -1502,7 +1502,7 @@
             <w:noProof/>
             <w:webHidden/>
           </w:rPr>
-          <w:instrText xml:space="preserve"> PAGEREF _Toc239828107 \h </w:instrText>
+          <w:instrText xml:space="preserve"> PAGEREF _Toc240003261 \h </w:instrText>
         </w:r>
         <w:r>
           <w:rPr>
@@ -1550,7 +1550,7 @@
           <w14:ligatures w14:val="standardContextual"/>
         </w:rPr>
       </w:pPr>
-      <w:hyperlink w:anchor="_Toc239828108" w:history="1">
+      <w:hyperlink w:anchor="_Toc240003262" w:history="1">
         <w:r>
           <w:rPr>
             <w:rStyle w:val="aff1"/>
@@ -1577,7 +1577,7 @@
             <w:noProof/>
             <w:webHidden/>
           </w:rPr>
-          <w:instrText xml:space="preserve"> PAGEREF _Toc239828108 \h </w:instrText>
+          <w:instrText xml:space="preserve"> PAGEREF _Toc240003262 \h </w:instrText>
         </w:r>
         <w:r>
           <w:rPr>
@@ -1626,7 +1626,7 @@
           <w14:ligatures w14:val="standardContextual"/>
         </w:rPr>
       </w:pPr>
-      <w:hyperlink w:anchor="_Toc239828109" w:history="1">
+      <w:hyperlink w:anchor="_Toc240003263" w:history="1">
         <w:r>
           <w:rPr>
             <w:rStyle w:val="aff1"/>
@@ -1653,7 +1653,7 @@
             <w:noProof/>
             <w:webHidden/>
           </w:rPr>
-          <w:instrText xml:space="preserve"> PAGEREF _Toc239828109 \h </w:instrText>
+          <w:instrText xml:space="preserve"> PAGEREF _Toc240003263 \h </w:instrText>
         </w:r>
         <w:r>
           <w:rPr>
@@ -1702,7 +1702,7 @@
           <w14:ligatures w14:val="standardContextual"/>
         </w:rPr>
       </w:pPr>
-      <w:hyperlink w:anchor="_Toc239828110" w:history="1">
+      <w:hyperlink w:anchor="_Toc240003264" w:history="1">
         <w:r>
           <w:rPr>
             <w:rStyle w:val="aff1"/>
@@ -1729,7 +1729,7 @@
             <w:noProof/>
             <w:webHidden/>
           </w:rPr>
-          <w:instrText xml:space="preserve"> PAGEREF _Toc239828110 \h </w:instrText>
+          <w:instrText xml:space="preserve"> PAGEREF _Toc240003264 \h </w:instrText>
         </w:r>
         <w:r>
           <w:rPr>
@@ -1778,7 +1778,7 @@
           <w14:ligatures w14:val="standardContextual"/>
         </w:rPr>
       </w:pPr>
-      <w:hyperlink w:anchor="_Toc239828111" w:history="1">
+      <w:hyperlink w:anchor="_Toc240003265" w:history="1">
         <w:r>
           <w:rPr>
             <w:rStyle w:val="aff1"/>
@@ -1805,7 +1805,7 @@
             <w:noProof/>
             <w:webHidden/>
           </w:rPr>
-          <w:instrText xml:space="preserve"> PAGEREF _Toc239828111 \h </w:instrText>
+          <w:instrText xml:space="preserve"> PAGEREF _Toc240003265 \h </w:instrText>
         </w:r>
         <w:r>
           <w:rPr>
@@ -1854,7 +1854,7 @@
           <w14:ligatures w14:val="standardContextual"/>
         </w:rPr>
       </w:pPr>
-      <w:hyperlink w:anchor="_Toc239828112" w:history="1">
+      <w:hyperlink w:anchor="_Toc240003266" w:history="1">
         <w:r>
           <w:rPr>
             <w:rStyle w:val="aff1"/>
@@ -1881,7 +1881,7 @@
             <w:noProof/>
             <w:webHidden/>
           </w:rPr>
-          <w:instrText xml:space="preserve"> PAGEREF _Toc239828112 \h </w:instrText>
+          <w:instrText xml:space="preserve"> PAGEREF _Toc240003266 \h </w:instrText>
         </w:r>
         <w:r>
           <w:rPr>
@@ -1930,7 +1930,7 @@
           <w14:ligatures w14:val="standardContextual"/>
         </w:rPr>
       </w:pPr>
-      <w:hyperlink w:anchor="_Toc239828113" w:history="1">
+      <w:hyperlink w:anchor="_Toc240003267" w:history="1">
         <w:r>
           <w:rPr>
             <w:rStyle w:val="aff1"/>
@@ -1957,7 +1957,7 @@
             <w:noProof/>
             <w:webHidden/>
           </w:rPr>
-          <w:instrText xml:space="preserve"> PAGEREF _Toc239828113 \h </w:instrText>
+          <w:instrText xml:space="preserve"> PAGEREF _Toc240003267 \h </w:instrText>
         </w:r>
         <w:r>
           <w:rPr>
@@ -2006,7 +2006,7 @@
           <w14:ligatures w14:val="standardContextual"/>
         </w:rPr>
       </w:pPr>
-      <w:hyperlink w:anchor="_Toc239828114" w:history="1">
+      <w:hyperlink w:anchor="_Toc240003268" w:history="1">
         <w:r>
           <w:rPr>
             <w:rStyle w:val="aff1"/>
@@ -2033,7 +2033,7 @@
             <w:noProof/>
             <w:webHidden/>
           </w:rPr>
-          <w:instrText xml:space="preserve"> PAGEREF _Toc239828114 \h </w:instrText>
+          <w:instrText xml:space="preserve"> PAGEREF _Toc240003268 \h </w:instrText>
         </w:r>
         <w:r>
           <w:rPr>
@@ -2081,7 +2081,7 @@
           <w14:ligatures w14:val="standardContextual"/>
         </w:rPr>
       </w:pPr>
-      <w:hyperlink w:anchor="_Toc239828115" w:history="1">
+      <w:hyperlink w:anchor="_Toc240003269" w:history="1">
         <w:r>
           <w:rPr>
             <w:rStyle w:val="aff1"/>
@@ -2108,7 +2108,7 @@
             <w:noProof/>
             <w:webHidden/>
           </w:rPr>
-          <w:instrText xml:space="preserve"> PAGEREF _Toc239828115 \h </w:instrText>
+          <w:instrText xml:space="preserve"> PAGEREF _Toc240003269 \h </w:instrText>
         </w:r>
         <w:r>
           <w:rPr>
@@ -2157,7 +2157,7 @@
           <w14:ligatures w14:val="standardContextual"/>
         </w:rPr>
       </w:pPr>
-      <w:hyperlink w:anchor="_Toc239828116" w:history="1">
+      <w:hyperlink w:anchor="_Toc240003270" w:history="1">
         <w:r>
           <w:rPr>
             <w:rStyle w:val="aff1"/>
@@ -2184,7 +2184,7 @@
             <w:noProof/>
             <w:webHidden/>
           </w:rPr>
-          <w:instrText xml:space="preserve"> PAGEREF _Toc239828116 \h </w:instrText>
+          <w:instrText xml:space="preserve"> PAGEREF _Toc240003270 \h </w:instrText>
         </w:r>
         <w:r>
           <w:rPr>
@@ -2233,7 +2233,7 @@
           <w14:ligatures w14:val="standardContextual"/>
         </w:rPr>
       </w:pPr>
-      <w:hyperlink w:anchor="_Toc239828117" w:history="1">
+      <w:hyperlink w:anchor="_Toc240003271" w:history="1">
         <w:r>
           <w:rPr>
             <w:rStyle w:val="aff1"/>
@@ -2260,7 +2260,7 @@
             <w:noProof/>
             <w:webHidden/>
           </w:rPr>
-          <w:instrText xml:space="preserve"> PAGEREF _Toc239828117 \h </w:instrText>
+          <w:instrText xml:space="preserve"> PAGEREF _Toc240003271 \h </w:instrText>
         </w:r>
         <w:r>
           <w:rPr>
@@ -2309,7 +2309,7 @@
           <w14:ligatures w14:val="standardContextual"/>
         </w:rPr>
       </w:pPr>
-      <w:hyperlink w:anchor="_Toc239828118" w:history="1">
+      <w:hyperlink w:anchor="_Toc240003272" w:history="1">
         <w:r>
           <w:rPr>
             <w:rStyle w:val="aff1"/>
@@ -2336,7 +2336,7 @@
             <w:noProof/>
             <w:webHidden/>
           </w:rPr>
-          <w:instrText xml:space="preserve"> PAGEREF _Toc239828118 \h </w:instrText>
+          <w:instrText xml:space="preserve"> PAGEREF _Toc240003272 \h </w:instrText>
         </w:r>
         <w:r>
           <w:rPr>
@@ -2385,7 +2385,7 @@
           <w14:ligatures w14:val="standardContextual"/>
         </w:rPr>
       </w:pPr>
-      <w:hyperlink w:anchor="_Toc239828119" w:history="1">
+      <w:hyperlink w:anchor="_Toc240003273" w:history="1">
         <w:r>
           <w:rPr>
             <w:rStyle w:val="aff1"/>
@@ -2412,7 +2412,7 @@
             <w:noProof/>
             <w:webHidden/>
           </w:rPr>
-          <w:instrText xml:space="preserve"> PAGEREF _Toc239828119 \h </w:instrText>
+          <w:instrText xml:space="preserve"> PAGEREF _Toc240003273 \h </w:instrText>
         </w:r>
         <w:r>
           <w:rPr>
@@ -2461,7 +2461,7 @@
           <w14:ligatures w14:val="standardContextual"/>
         </w:rPr>
       </w:pPr>
-      <w:hyperlink w:anchor="_Toc239828120" w:history="1">
+      <w:hyperlink w:anchor="_Toc240003274" w:history="1">
         <w:r>
           <w:rPr>
             <w:rStyle w:val="aff1"/>
@@ -2488,7 +2488,7 @@
             <w:noProof/>
             <w:webHidden/>
           </w:rPr>
-          <w:instrText xml:space="preserve"> PAGEREF _Toc239828120 \h </w:instrText>
+          <w:instrText xml:space="preserve"> PAGEREF _Toc240003274 \h </w:instrText>
         </w:r>
         <w:r>
           <w:rPr>
@@ -2537,7 +2537,7 @@
           <w14:ligatures w14:val="standardContextual"/>
         </w:rPr>
       </w:pPr>
-      <w:hyperlink w:anchor="_Toc239828121" w:history="1">
+      <w:hyperlink w:anchor="_Toc240003275" w:history="1">
         <w:r>
           <w:rPr>
             <w:rStyle w:val="aff1"/>
@@ -2564,7 +2564,7 @@
             <w:noProof/>
             <w:webHidden/>
           </w:rPr>
-          <w:instrText xml:space="preserve"> PAGEREF _Toc239828121 \h </w:instrText>
+          <w:instrText xml:space="preserve"> PAGEREF _Toc240003275 \h </w:instrText>
         </w:r>
         <w:r>
           <w:rPr>
@@ -2612,7 +2612,7 @@
           <w14:ligatures w14:val="standardContextual"/>
         </w:rPr>
       </w:pPr>
-      <w:hyperlink w:anchor="_Toc239828122" w:history="1">
+      <w:hyperlink w:anchor="_Toc240003276" w:history="1">
         <w:r>
           <w:rPr>
             <w:rStyle w:val="aff1"/>
@@ -2639,7 +2639,7 @@
             <w:noProof/>
             <w:webHidden/>
           </w:rPr>
-          <w:instrText xml:space="preserve"> PAGEREF _Toc239828122 \h </w:instrText>
+          <w:instrText xml:space="preserve"> PAGEREF _Toc240003276 \h </w:instrText>
         </w:r>
         <w:r>
           <w:rPr>
@@ -2688,7 +2688,7 @@
           <w14:ligatures w14:val="standardContextual"/>
         </w:rPr>
       </w:pPr>
-      <w:hyperlink w:anchor="_Toc239828123" w:history="1">
+      <w:hyperlink w:anchor="_Toc240003277" w:history="1">
         <w:r>
           <w:rPr>
             <w:rStyle w:val="aff1"/>
@@ -2715,7 +2715,7 @@
             <w:noProof/>
             <w:webHidden/>
           </w:rPr>
-          <w:instrText xml:space="preserve"> PAGEREF _Toc239828123 \h </w:instrText>
+          <w:instrText xml:space="preserve"> PAGEREF _Toc240003277 \h </w:instrText>
         </w:r>
         <w:r>
           <w:rPr>
@@ -2764,7 +2764,7 @@
           <w14:ligatures w14:val="standardContextual"/>
         </w:rPr>
       </w:pPr>
-      <w:hyperlink w:anchor="_Toc239828124" w:history="1">
+      <w:hyperlink w:anchor="_Toc240003278" w:history="1">
         <w:r>
           <w:rPr>
             <w:rStyle w:val="aff1"/>
@@ -2791,7 +2791,7 @@
             <w:noProof/>
             <w:webHidden/>
           </w:rPr>
-          <w:instrText xml:space="preserve"> PAGEREF _Toc239828124 \h </w:instrText>
+          <w:instrText xml:space="preserve"> PAGEREF _Toc240003278 \h </w:instrText>
         </w:r>
         <w:r>
           <w:rPr>
@@ -2840,7 +2840,7 @@
           <w14:ligatures w14:val="standardContextual"/>
         </w:rPr>
       </w:pPr>
-      <w:hyperlink w:anchor="_Toc239828125" w:history="1">
+      <w:hyperlink w:anchor="_Toc240003279" w:history="1">
         <w:r>
           <w:rPr>
             <w:rStyle w:val="aff1"/>
@@ -2867,7 +2867,7 @@
             <w:noProof/>
             <w:webHidden/>
           </w:rPr>
-          <w:instrText xml:space="preserve"> PAGEREF _Toc239828125 \h </w:instrText>
+          <w:instrText xml:space="preserve"> PAGEREF _Toc240003279 \h </w:instrText>
         </w:r>
         <w:r>
           <w:rPr>
@@ -2916,7 +2916,7 @@
           <w14:ligatures w14:val="standardContextual"/>
         </w:rPr>
       </w:pPr>
-      <w:hyperlink w:anchor="_Toc239828126" w:history="1">
+      <w:hyperlink w:anchor="_Toc240003280" w:history="1">
         <w:r>
           <w:rPr>
             <w:rStyle w:val="aff1"/>
@@ -2943,7 +2943,7 @@
             <w:noProof/>
             <w:webHidden/>
           </w:rPr>
-          <w:instrText xml:space="preserve"> PAGEREF _Toc239828126 \h </w:instrText>
+          <w:instrText xml:space="preserve"> PAGEREF _Toc240003280 \h </w:instrText>
         </w:r>
         <w:r>
           <w:rPr>
@@ -2992,7 +2992,7 @@
           <w14:ligatures w14:val="standardContextual"/>
         </w:rPr>
       </w:pPr>
-      <w:hyperlink w:anchor="_Toc239828127" w:history="1">
+      <w:hyperlink w:anchor="_Toc240003281" w:history="1">
         <w:r>
           <w:rPr>
             <w:rStyle w:val="aff1"/>
@@ -3019,7 +3019,7 @@
             <w:noProof/>
             <w:webHidden/>
           </w:rPr>
-          <w:instrText xml:space="preserve"> PAGEREF _Toc239828127 \h </w:instrText>
+          <w:instrText xml:space="preserve"> PAGEREF _Toc240003281 \h </w:instrText>
         </w:r>
         <w:r>
           <w:rPr>
@@ -3068,7 +3068,7 @@
           <w14:ligatures w14:val="standardContextual"/>
         </w:rPr>
       </w:pPr>
-      <w:hyperlink w:anchor="_Toc239828128" w:history="1">
+      <w:hyperlink w:anchor="_Toc240003282" w:history="1">
         <w:r>
           <w:rPr>
             <w:rStyle w:val="aff1"/>
@@ -3095,7 +3095,7 @@
             <w:noProof/>
             <w:webHidden/>
           </w:rPr>
-          <w:instrText xml:space="preserve"> PAGEREF _Toc239828128 \h </w:instrText>
+          <w:instrText xml:space="preserve"> PAGEREF _Toc240003282 \h </w:instrText>
         </w:r>
         <w:r>
           <w:rPr>
@@ -3143,7 +3143,7 @@
           <w14:ligatures w14:val="standardContextual"/>
         </w:rPr>
       </w:pPr>
-      <w:hyperlink w:anchor="_Toc239828129" w:history="1">
+      <w:hyperlink w:anchor="_Toc240003283" w:history="1">
         <w:r>
           <w:rPr>
             <w:rStyle w:val="aff1"/>
@@ -3170,7 +3170,7 @@
             <w:noProof/>
             <w:webHidden/>
           </w:rPr>
-          <w:instrText xml:space="preserve"> PAGEREF _Toc239828129 \h </w:instrText>
+          <w:instrText xml:space="preserve"> PAGEREF _Toc240003283 \h </w:instrText>
         </w:r>
         <w:r>
           <w:rPr>
@@ -3219,7 +3219,7 @@
           <w14:ligatures w14:val="standardContextual"/>
         </w:rPr>
       </w:pPr>
-      <w:hyperlink w:anchor="_Toc239828130" w:history="1">
+      <w:hyperlink w:anchor="_Toc240003284" w:history="1">
         <w:r>
           <w:rPr>
             <w:rStyle w:val="aff1"/>
@@ -3246,7 +3246,7 @@
             <w:noProof/>
             <w:webHidden/>
           </w:rPr>
-          <w:instrText xml:space="preserve"> PAGEREF _Toc239828130 \h </w:instrText>
+          <w:instrText xml:space="preserve"> PAGEREF _Toc240003284 \h </w:instrText>
         </w:r>
         <w:r>
           <w:rPr>
@@ -3295,7 +3295,7 @@
           <w14:ligatures w14:val="standardContextual"/>
         </w:rPr>
       </w:pPr>
-      <w:hyperlink w:anchor="_Toc239828131" w:history="1">
+      <w:hyperlink w:anchor="_Toc240003285" w:history="1">
         <w:r>
           <w:rPr>
             <w:rStyle w:val="aff1"/>
@@ -3322,7 +3322,7 @@
             <w:noProof/>
             <w:webHidden/>
           </w:rPr>
-          <w:instrText xml:space="preserve"> PAGEREF _Toc239828131 \h </w:instrText>
+          <w:instrText xml:space="preserve"> PAGEREF _Toc240003285 \h </w:instrText>
         </w:r>
         <w:r>
           <w:rPr>
@@ -3371,7 +3371,7 @@
           <w14:ligatures w14:val="standardContextual"/>
         </w:rPr>
       </w:pPr>
-      <w:hyperlink w:anchor="_Toc239828132" w:history="1">
+      <w:hyperlink w:anchor="_Toc240003286" w:history="1">
         <w:r>
           <w:rPr>
             <w:rStyle w:val="aff1"/>
@@ -3398,7 +3398,7 @@
             <w:noProof/>
             <w:webHidden/>
           </w:rPr>
-          <w:instrText xml:space="preserve"> PAGEREF _Toc239828132 \h </w:instrText>
+          <w:instrText xml:space="preserve"> PAGEREF _Toc240003286 \h </w:instrText>
         </w:r>
         <w:r>
           <w:rPr>
@@ -3447,7 +3447,7 @@
           <w14:ligatures w14:val="standardContextual"/>
         </w:rPr>
       </w:pPr>
-      <w:hyperlink w:anchor="_Toc239828133" w:history="1">
+      <w:hyperlink w:anchor="_Toc240003287" w:history="1">
         <w:r>
           <w:rPr>
             <w:rStyle w:val="aff1"/>
@@ -3474,7 +3474,7 @@
             <w:noProof/>
             <w:webHidden/>
           </w:rPr>
-          <w:instrText xml:space="preserve"> PAGEREF _Toc239828133 \h </w:instrText>
+          <w:instrText xml:space="preserve"> PAGEREF _Toc240003287 \h </w:instrText>
         </w:r>
         <w:r>
           <w:rPr>
@@ -3523,7 +3523,7 @@
           <w14:ligatures w14:val="standardContextual"/>
         </w:rPr>
       </w:pPr>
-      <w:hyperlink w:anchor="_Toc239828134" w:history="1">
+      <w:hyperlink w:anchor="_Toc240003288" w:history="1">
         <w:r>
           <w:rPr>
             <w:rStyle w:val="aff1"/>
@@ -3550,7 +3550,7 @@
             <w:noProof/>
             <w:webHidden/>
           </w:rPr>
-          <w:instrText xml:space="preserve"> PAGEREF _Toc239828134 \h </w:instrText>
+          <w:instrText xml:space="preserve"> PAGEREF _Toc240003288 \h </w:instrText>
         </w:r>
         <w:r>
           <w:rPr>
@@ -3599,7 +3599,7 @@
           <w14:ligatures w14:val="standardContextual"/>
         </w:rPr>
       </w:pPr>
-      <w:hyperlink w:anchor="_Toc239828135" w:history="1">
+      <w:hyperlink w:anchor="_Toc240003289" w:history="1">
         <w:r>
           <w:rPr>
             <w:rStyle w:val="aff1"/>
@@ -3626,7 +3626,7 @@
             <w:noProof/>
             <w:webHidden/>
           </w:rPr>
-          <w:instrText xml:space="preserve"> PAGEREF _Toc239828135 \h </w:instrText>
+          <w:instrText xml:space="preserve"> PAGEREF _Toc240003289 \h </w:instrText>
         </w:r>
         <w:r>
           <w:rPr>
@@ -3675,7 +3675,7 @@
           <w14:ligatures w14:val="standardContextual"/>
         </w:rPr>
       </w:pPr>
-      <w:hyperlink w:anchor="_Toc239828136" w:history="1">
+      <w:hyperlink w:anchor="_Toc240003290" w:history="1">
         <w:r>
           <w:rPr>
             <w:rStyle w:val="aff1"/>
@@ -3702,7 +3702,7 @@
             <w:noProof/>
             <w:webHidden/>
           </w:rPr>
-          <w:instrText xml:space="preserve"> PAGEREF _Toc239828136 \h </w:instrText>
+          <w:instrText xml:space="preserve"> PAGEREF _Toc240003290 \h </w:instrText>
         </w:r>
         <w:r>
           <w:rPr>
@@ -3751,7 +3751,7 @@
           <w14:ligatures w14:val="standardContextual"/>
         </w:rPr>
       </w:pPr>
-      <w:hyperlink w:anchor="_Toc239828137" w:history="1">
+      <w:hyperlink w:anchor="_Toc240003291" w:history="1">
         <w:r>
           <w:rPr>
             <w:rStyle w:val="aff1"/>
@@ -3778,7 +3778,7 @@
             <w:noProof/>
             <w:webHidden/>
           </w:rPr>
-          <w:instrText xml:space="preserve"> PAGEREF _Toc239828137 \h </w:instrText>
+          <w:instrText xml:space="preserve"> PAGEREF _Toc240003291 \h </w:instrText>
         </w:r>
         <w:r>
           <w:rPr>
@@ -3827,7 +3827,7 @@
           <w14:ligatures w14:val="standardContextual"/>
         </w:rPr>
       </w:pPr>
-      <w:hyperlink w:anchor="_Toc239828138" w:history="1">
+      <w:hyperlink w:anchor="_Toc240003292" w:history="1">
         <w:r>
           <w:rPr>
             <w:rStyle w:val="aff1"/>
@@ -3854,7 +3854,7 @@
             <w:noProof/>
             <w:webHidden/>
           </w:rPr>
-          <w:instrText xml:space="preserve"> PAGEREF _Toc239828138 \h </w:instrText>
+          <w:instrText xml:space="preserve"> PAGEREF _Toc240003292 \h </w:instrText>
         </w:r>
         <w:r>
           <w:rPr>
@@ -3902,7 +3902,7 @@
           <w14:ligatures w14:val="standardContextual"/>
         </w:rPr>
       </w:pPr>
-      <w:hyperlink w:anchor="_Toc239828139" w:history="1">
+      <w:hyperlink w:anchor="_Toc240003293" w:history="1">
         <w:r>
           <w:rPr>
             <w:rStyle w:val="aff1"/>
@@ -3929,7 +3929,7 @@
             <w:noProof/>
             <w:webHidden/>
           </w:rPr>
-          <w:instrText xml:space="preserve"> PAGEREF _Toc239828139 \h </w:instrText>
+          <w:instrText xml:space="preserve"> PAGEREF _Toc240003293 \h </w:instrText>
         </w:r>
         <w:r>
           <w:rPr>
@@ -3978,7 +3978,7 @@
           <w14:ligatures w14:val="standardContextual"/>
         </w:rPr>
       </w:pPr>
-      <w:hyperlink w:anchor="_Toc239828140" w:history="1">
+      <w:hyperlink w:anchor="_Toc240003294" w:history="1">
         <w:r>
           <w:rPr>
             <w:rStyle w:val="aff1"/>
@@ -4005,7 +4005,7 @@
             <w:noProof/>
             <w:webHidden/>
           </w:rPr>
-          <w:instrText xml:space="preserve"> PAGEREF _Toc239828140 \h </w:instrText>
+          <w:instrText xml:space="preserve"> PAGEREF _Toc240003294 \h </w:instrText>
         </w:r>
         <w:r>
           <w:rPr>
@@ -4054,7 +4054,7 @@
           <w14:ligatures w14:val="standardContextual"/>
         </w:rPr>
       </w:pPr>
-      <w:hyperlink w:anchor="_Toc239828141" w:history="1">
+      <w:hyperlink w:anchor="_Toc240003295" w:history="1">
         <w:r>
           <w:rPr>
             <w:rStyle w:val="aff1"/>
@@ -4081,7 +4081,7 @@
             <w:noProof/>
             <w:webHidden/>
           </w:rPr>
-          <w:instrText xml:space="preserve"> PAGEREF _Toc239828141 \h </w:instrText>
+          <w:instrText xml:space="preserve"> PAGEREF _Toc240003295 \h </w:instrText>
         </w:r>
         <w:r>
           <w:rPr>
@@ -4130,7 +4130,7 @@
           <w14:ligatures w14:val="standardContextual"/>
         </w:rPr>
       </w:pPr>
-      <w:hyperlink w:anchor="_Toc239828142" w:history="1">
+      <w:hyperlink w:anchor="_Toc240003296" w:history="1">
         <w:r>
           <w:rPr>
             <w:rStyle w:val="aff1"/>
@@ -4157,7 +4157,7 @@
             <w:noProof/>
             <w:webHidden/>
           </w:rPr>
-          <w:instrText xml:space="preserve"> PAGEREF _Toc239828142 \h </w:instrText>
+          <w:instrText xml:space="preserve"> PAGEREF _Toc240003296 \h </w:instrText>
         </w:r>
         <w:r>
           <w:rPr>
@@ -4177,7 +4177,7 @@
             <w:noProof/>
             <w:webHidden/>
           </w:rPr>
-          <w:t>23</w:t>
+          <w:t>24</w:t>
         </w:r>
         <w:r>
           <w:rPr>
@@ -4206,7 +4206,7 @@
           <w14:ligatures w14:val="standardContextual"/>
         </w:rPr>
       </w:pPr>
-      <w:hyperlink w:anchor="_Toc239828143" w:history="1">
+      <w:hyperlink w:anchor="_Toc240003297" w:history="1">
         <w:r>
           <w:rPr>
             <w:rStyle w:val="aff1"/>
@@ -4233,7 +4233,7 @@
             <w:noProof/>
             <w:webHidden/>
           </w:rPr>
-          <w:instrText xml:space="preserve"> PAGEREF _Toc239828143 \h </w:instrText>
+          <w:instrText xml:space="preserve"> PAGEREF _Toc240003297 \h </w:instrText>
         </w:r>
         <w:r>
           <w:rPr>
@@ -4253,7 +4253,7 @@
             <w:noProof/>
             <w:webHidden/>
           </w:rPr>
-          <w:t>24</w:t>
+          <w:t>25</w:t>
         </w:r>
         <w:r>
           <w:rPr>
@@ -4282,7 +4282,7 @@
           <w14:ligatures w14:val="standardContextual"/>
         </w:rPr>
       </w:pPr>
-      <w:hyperlink w:anchor="_Toc239828144" w:history="1">
+      <w:hyperlink w:anchor="_Toc240003298" w:history="1">
         <w:r>
           <w:rPr>
             <w:rStyle w:val="aff1"/>
@@ -4309,7 +4309,7 @@
             <w:noProof/>
             <w:webHidden/>
           </w:rPr>
-          <w:instrText xml:space="preserve"> PAGEREF _Toc239828144 \h </w:instrText>
+          <w:instrText xml:space="preserve"> PAGEREF _Toc240003298 \h </w:instrText>
         </w:r>
         <w:r>
           <w:rPr>
@@ -4329,7 +4329,7 @@
             <w:noProof/>
             <w:webHidden/>
           </w:rPr>
-          <w:t>25</w:t>
+          <w:t>26</w:t>
         </w:r>
         <w:r>
           <w:rPr>
@@ -4358,7 +4358,7 @@
           <w14:ligatures w14:val="standardContextual"/>
         </w:rPr>
       </w:pPr>
-      <w:hyperlink w:anchor="_Toc239828145" w:history="1">
+      <w:hyperlink w:anchor="_Toc240003299" w:history="1">
         <w:r>
           <w:rPr>
             <w:rStyle w:val="aff1"/>
@@ -4385,7 +4385,7 @@
             <w:noProof/>
             <w:webHidden/>
           </w:rPr>
-          <w:instrText xml:space="preserve"> PAGEREF _Toc239828145 \h </w:instrText>
+          <w:instrText xml:space="preserve"> PAGEREF _Toc240003299 \h </w:instrText>
         </w:r>
         <w:r>
           <w:rPr>
@@ -4405,7 +4405,7 @@
             <w:noProof/>
             <w:webHidden/>
           </w:rPr>
-          <w:t>26</w:t>
+          <w:t>27</w:t>
         </w:r>
         <w:r>
           <w:rPr>
@@ -4434,7 +4434,7 @@
           <w14:ligatures w14:val="standardContextual"/>
         </w:rPr>
       </w:pPr>
-      <w:hyperlink w:anchor="_Toc239828146" w:history="1">
+      <w:hyperlink w:anchor="_Toc240003300" w:history="1">
         <w:r>
           <w:rPr>
             <w:rStyle w:val="aff1"/>
@@ -4461,7 +4461,7 @@
             <w:noProof/>
             <w:webHidden/>
           </w:rPr>
-          <w:instrText xml:space="preserve"> PAGEREF _Toc239828146 \h </w:instrText>
+          <w:instrText xml:space="preserve"> PAGEREF _Toc240003300 \h </w:instrText>
         </w:r>
         <w:r>
           <w:rPr>
@@ -4481,7 +4481,7 @@
             <w:noProof/>
             <w:webHidden/>
           </w:rPr>
-          <w:t>26</w:t>
+          <w:t>27</w:t>
         </w:r>
         <w:r>
           <w:rPr>
@@ -4510,7 +4510,7 @@
           <w14:ligatures w14:val="standardContextual"/>
         </w:rPr>
       </w:pPr>
-      <w:hyperlink w:anchor="_Toc239828147" w:history="1">
+      <w:hyperlink w:anchor="_Toc240003301" w:history="1">
         <w:r>
           <w:rPr>
             <w:rStyle w:val="aff1"/>
@@ -4537,7 +4537,7 @@
             <w:noProof/>
             <w:webHidden/>
           </w:rPr>
-          <w:instrText xml:space="preserve"> PAGEREF _Toc239828147 \h </w:instrText>
+          <w:instrText xml:space="preserve"> PAGEREF _Toc240003301 \h </w:instrText>
         </w:r>
         <w:r>
           <w:rPr>
@@ -4557,7 +4557,7 @@
             <w:noProof/>
             <w:webHidden/>
           </w:rPr>
-          <w:t>27</w:t>
+          <w:t>28</w:t>
         </w:r>
         <w:r>
           <w:rPr>
@@ -4585,7 +4585,7 @@
           <w14:ligatures w14:val="standardContextual"/>
         </w:rPr>
       </w:pPr>
-      <w:hyperlink w:anchor="_Toc239828148" w:history="1">
+      <w:hyperlink w:anchor="_Toc240003302" w:history="1">
         <w:r>
           <w:rPr>
             <w:rStyle w:val="aff1"/>
@@ -4612,7 +4612,7 @@
             <w:noProof/>
             <w:webHidden/>
           </w:rPr>
-          <w:instrText xml:space="preserve"> PAGEREF _Toc239828148 \h </w:instrText>
+          <w:instrText xml:space="preserve"> PAGEREF _Toc240003302 \h </w:instrText>
         </w:r>
         <w:r>
           <w:rPr>
@@ -4632,7 +4632,7 @@
             <w:noProof/>
             <w:webHidden/>
           </w:rPr>
-          <w:t>28</w:t>
+          <w:t>29</w:t>
         </w:r>
         <w:r>
           <w:rPr>
@@ -4661,7 +4661,7 @@
           <w14:ligatures w14:val="standardContextual"/>
         </w:rPr>
       </w:pPr>
-      <w:hyperlink w:anchor="_Toc239828149" w:history="1">
+      <w:hyperlink w:anchor="_Toc240003303" w:history="1">
         <w:r>
           <w:rPr>
             <w:rStyle w:val="aff1"/>
@@ -4688,7 +4688,7 @@
             <w:noProof/>
             <w:webHidden/>
           </w:rPr>
-          <w:instrText xml:space="preserve"> PAGEREF _Toc239828149 \h </w:instrText>
+          <w:instrText xml:space="preserve"> PAGEREF _Toc240003303 \h </w:instrText>
         </w:r>
         <w:r>
           <w:rPr>
@@ -4708,7 +4708,7 @@
             <w:noProof/>
             <w:webHidden/>
           </w:rPr>
-          <w:t>28</w:t>
+          <w:t>29</w:t>
         </w:r>
         <w:r>
           <w:rPr>
@@ -4737,7 +4737,7 @@
           <w14:ligatures w14:val="standardContextual"/>
         </w:rPr>
       </w:pPr>
-      <w:hyperlink w:anchor="_Toc239828150" w:history="1">
+      <w:hyperlink w:anchor="_Toc240003304" w:history="1">
         <w:r>
           <w:rPr>
             <w:rStyle w:val="aff1"/>
@@ -4764,7 +4764,7 @@
             <w:noProof/>
             <w:webHidden/>
           </w:rPr>
-          <w:instrText xml:space="preserve"> PAGEREF _Toc239828150 \h </w:instrText>
+          <w:instrText xml:space="preserve"> PAGEREF _Toc240003304 \h </w:instrText>
         </w:r>
         <w:r>
           <w:rPr>
@@ -4784,7 +4784,7 @@
             <w:noProof/>
             <w:webHidden/>
           </w:rPr>
-          <w:t>28</w:t>
+          <w:t>29</w:t>
         </w:r>
         <w:r>
           <w:rPr>
@@ -4813,7 +4813,7 @@
           <w14:ligatures w14:val="standardContextual"/>
         </w:rPr>
       </w:pPr>
-      <w:hyperlink w:anchor="_Toc239828151" w:history="1">
+      <w:hyperlink w:anchor="_Toc240003305" w:history="1">
         <w:r>
           <w:rPr>
             <w:rStyle w:val="aff1"/>
@@ -4840,7 +4840,7 @@
             <w:noProof/>
             <w:webHidden/>
           </w:rPr>
-          <w:instrText xml:space="preserve"> PAGEREF _Toc239828151 \h </w:instrText>
+          <w:instrText xml:space="preserve"> PAGEREF _Toc240003305 \h </w:instrText>
         </w:r>
         <w:r>
           <w:rPr>
@@ -4860,7 +4860,7 @@
             <w:noProof/>
             <w:webHidden/>
           </w:rPr>
-          <w:t>28</w:t>
+          <w:t>29</w:t>
         </w:r>
         <w:r>
           <w:rPr>
@@ -4889,7 +4889,7 @@
           <w14:ligatures w14:val="standardContextual"/>
         </w:rPr>
       </w:pPr>
-      <w:hyperlink w:anchor="_Toc239828152" w:history="1">
+      <w:hyperlink w:anchor="_Toc240003306" w:history="1">
         <w:r>
           <w:rPr>
             <w:rStyle w:val="aff1"/>
@@ -4916,7 +4916,7 @@
             <w:noProof/>
             <w:webHidden/>
           </w:rPr>
-          <w:instrText xml:space="preserve"> PAGEREF _Toc239828152 \h </w:instrText>
+          <w:instrText xml:space="preserve"> PAGEREF _Toc240003306 \h </w:instrText>
         </w:r>
         <w:r>
           <w:rPr>
@@ -4936,7 +4936,7 @@
             <w:noProof/>
             <w:webHidden/>
           </w:rPr>
-          <w:t>29</w:t>
+          <w:t>30</w:t>
         </w:r>
         <w:r>
           <w:rPr>
@@ -4965,7 +4965,7 @@
           <w14:ligatures w14:val="standardContextual"/>
         </w:rPr>
       </w:pPr>
-      <w:hyperlink w:anchor="_Toc239828153" w:history="1">
+      <w:hyperlink w:anchor="_Toc240003307" w:history="1">
         <w:r>
           <w:rPr>
             <w:rStyle w:val="aff1"/>
@@ -4992,7 +4992,7 @@
             <w:noProof/>
             <w:webHidden/>
           </w:rPr>
-          <w:instrText xml:space="preserve"> PAGEREF _Toc239828153 \h </w:instrText>
+          <w:instrText xml:space="preserve"> PAGEREF _Toc240003307 \h </w:instrText>
         </w:r>
         <w:r>
           <w:rPr>
@@ -5012,7 +5012,7 @@
             <w:noProof/>
             <w:webHidden/>
           </w:rPr>
-          <w:t>29</w:t>
+          <w:t>30</w:t>
         </w:r>
         <w:r>
           <w:rPr>
@@ -5041,7 +5041,7 @@
           <w14:ligatures w14:val="standardContextual"/>
         </w:rPr>
       </w:pPr>
-      <w:hyperlink w:anchor="_Toc239828154" w:history="1">
+      <w:hyperlink w:anchor="_Toc240003308" w:history="1">
         <w:r>
           <w:rPr>
             <w:rStyle w:val="aff1"/>
@@ -5068,7 +5068,7 @@
             <w:noProof/>
             <w:webHidden/>
           </w:rPr>
-          <w:instrText xml:space="preserve"> PAGEREF _Toc239828154 \h </w:instrText>
+          <w:instrText xml:space="preserve"> PAGEREF _Toc240003308 \h </w:instrText>
         </w:r>
         <w:r>
           <w:rPr>
@@ -5088,7 +5088,7 @@
             <w:noProof/>
             <w:webHidden/>
           </w:rPr>
-          <w:t>30</w:t>
+          <w:t>31</w:t>
         </w:r>
         <w:r>
           <w:rPr>
@@ -5117,7 +5117,7 @@
           <w14:ligatures w14:val="standardContextual"/>
         </w:rPr>
       </w:pPr>
-      <w:hyperlink w:anchor="_Toc239828155" w:history="1">
+      <w:hyperlink w:anchor="_Toc240003309" w:history="1">
         <w:r>
           <w:rPr>
             <w:rStyle w:val="aff1"/>
@@ -5144,7 +5144,7 @@
             <w:noProof/>
             <w:webHidden/>
           </w:rPr>
-          <w:instrText xml:space="preserve"> PAGEREF _Toc239828155 \h </w:instrText>
+          <w:instrText xml:space="preserve"> PAGEREF _Toc240003309 \h </w:instrText>
         </w:r>
         <w:r>
           <w:rPr>
@@ -5164,7 +5164,7 @@
             <w:noProof/>
             <w:webHidden/>
           </w:rPr>
-          <w:t>30</w:t>
+          <w:t>31</w:t>
         </w:r>
         <w:r>
           <w:rPr>
@@ -5192,7 +5192,7 @@
           <w14:ligatures w14:val="standardContextual"/>
         </w:rPr>
       </w:pPr>
-      <w:hyperlink w:anchor="_Toc239828156" w:history="1">
+      <w:hyperlink w:anchor="_Toc240003310" w:history="1">
         <w:r>
           <w:rPr>
             <w:rStyle w:val="aff1"/>
@@ -5219,7 +5219,7 @@
             <w:noProof/>
             <w:webHidden/>
           </w:rPr>
-          <w:instrText xml:space="preserve"> PAGEREF _Toc239828156 \h </w:instrText>
+          <w:instrText xml:space="preserve"> PAGEREF _Toc240003310 \h </w:instrText>
         </w:r>
         <w:r>
           <w:rPr>
@@ -5239,7 +5239,7 @@
             <w:noProof/>
             <w:webHidden/>
           </w:rPr>
-          <w:t>31</w:t>
+          <w:t>32</w:t>
         </w:r>
         <w:r>
           <w:rPr>
@@ -5267,7 +5267,7 @@
           <w14:ligatures w14:val="standardContextual"/>
         </w:rPr>
       </w:pPr>
-      <w:hyperlink w:anchor="_Toc239828157" w:history="1">
+      <w:hyperlink w:anchor="_Toc240003311" w:history="1">
         <w:r>
           <w:rPr>
             <w:rStyle w:val="aff1"/>
@@ -5294,7 +5294,7 @@
             <w:noProof/>
             <w:webHidden/>
           </w:rPr>
-          <w:instrText xml:space="preserve"> PAGEREF _Toc239828157 \h </w:instrText>
+          <w:instrText xml:space="preserve"> PAGEREF _Toc240003311 \h </w:instrText>
         </w:r>
         <w:r>
           <w:rPr>
@@ -5314,7 +5314,7 @@
             <w:noProof/>
             <w:webHidden/>
           </w:rPr>
-          <w:t>31</w:t>
+          <w:t>32</w:t>
         </w:r>
         <w:r>
           <w:rPr>
@@ -5342,7 +5342,7 @@
           <w14:ligatures w14:val="standardContextual"/>
         </w:rPr>
       </w:pPr>
-      <w:hyperlink w:anchor="_Toc239828158" w:history="1">
+      <w:hyperlink w:anchor="_Toc240003312" w:history="1">
         <w:r>
           <w:rPr>
             <w:rStyle w:val="aff1"/>
@@ -5369,7 +5369,7 @@
             <w:noProof/>
             <w:webHidden/>
           </w:rPr>
-          <w:instrText xml:space="preserve"> PAGEREF _Toc239828158 \h </w:instrText>
+          <w:instrText xml:space="preserve"> PAGEREF _Toc240003312 \h </w:instrText>
         </w:r>
         <w:r>
           <w:rPr>
@@ -5389,7 +5389,7 @@
             <w:noProof/>
             <w:webHidden/>
           </w:rPr>
-          <w:t>32</w:t>
+          <w:t>33</w:t>
         </w:r>
         <w:r>
           <w:rPr>
@@ -5419,7 +5419,7 @@
           <w:numId w:val="7"/>
         </w:numPr>
       </w:pPr>
-      <w:bookmarkStart w:id="0" w:name="_Toc239828095"/>
+      <w:bookmarkStart w:id="0" w:name="_Toc240003249"/>
       <w:r>
         <w:lastRenderedPageBreak/>
         <w:t>게임</w:t>
@@ -5452,7 +5452,7 @@
           <w:numId w:val="7"/>
         </w:numPr>
       </w:pPr>
-      <w:bookmarkStart w:id="1" w:name="_Toc239828096"/>
+      <w:bookmarkStart w:id="1" w:name="_Toc240003250"/>
       <w:r>
         <w:t>Executive Summary</w:t>
       </w:r>
@@ -5523,7 +5523,7 @@
           <w:numId w:val="7"/>
         </w:numPr>
       </w:pPr>
-      <w:bookmarkStart w:id="2" w:name="_Toc239828097"/>
+      <w:bookmarkStart w:id="2" w:name="_Toc240003251"/>
       <w:r>
         <w:t>Rev 16 Release Profile</w:t>
       </w:r>
@@ -5547,7 +5547,7 @@
           <w:numId w:val="7"/>
         </w:numPr>
       </w:pPr>
-      <w:bookmarkStart w:id="3" w:name="_Toc239828098"/>
+      <w:bookmarkStart w:id="3" w:name="_Toc240003252"/>
       <w:r>
         <w:t>제품</w:t>
       </w:r>
@@ -5837,7 +5837,7 @@
           <w:numId w:val="7"/>
         </w:numPr>
       </w:pPr>
-      <w:bookmarkStart w:id="4" w:name="_Toc239828099"/>
+      <w:bookmarkStart w:id="4" w:name="_Toc240003253"/>
       <w:r>
         <w:t>디자인</w:t>
       </w:r>
@@ -6207,7 +6207,7 @@
           <w:numId w:val="7"/>
         </w:numPr>
       </w:pPr>
-      <w:bookmarkStart w:id="5" w:name="_Toc239828100"/>
+      <w:bookmarkStart w:id="5" w:name="_Toc240003254"/>
       <w:r>
         <w:t>Target Experience</w:t>
       </w:r>
@@ -6281,7 +6281,7 @@
           <w:numId w:val="7"/>
         </w:numPr>
       </w:pPr>
-      <w:bookmarkStart w:id="6" w:name="_Toc239828101"/>
+      <w:bookmarkStart w:id="6" w:name="_Toc240003255"/>
       <w:r>
         <w:t>명시적</w:t>
       </w:r>
@@ -6553,7 +6553,7 @@
           <w:numId w:val="7"/>
         </w:numPr>
       </w:pPr>
-      <w:bookmarkStart w:id="7" w:name="_Toc239828102"/>
+      <w:bookmarkStart w:id="7" w:name="_Toc240003256"/>
       <w:r>
         <w:lastRenderedPageBreak/>
         <w:t>Contract Run</w:t>
@@ -6589,7 +6589,7 @@
           <w:numId w:val="7"/>
         </w:numPr>
       </w:pPr>
-      <w:bookmarkStart w:id="8" w:name="_Toc239828103"/>
+      <w:bookmarkStart w:id="8" w:name="_Toc240003257"/>
       <w:r>
         <w:t>Core Loop</w:t>
       </w:r>
@@ -7083,7 +7083,7 @@
           <w:numId w:val="7"/>
         </w:numPr>
       </w:pPr>
-      <w:bookmarkStart w:id="9" w:name="_Toc239828104"/>
+      <w:bookmarkStart w:id="9" w:name="_Toc240003258"/>
       <w:r>
         <w:t xml:space="preserve">Contract </w:t>
       </w:r>
@@ -7507,7 +7507,7 @@
           <w:numId w:val="7"/>
         </w:numPr>
       </w:pPr>
-      <w:bookmarkStart w:id="10" w:name="_Toc239828105"/>
+      <w:bookmarkStart w:id="10" w:name="_Toc240003259"/>
       <w:r>
         <w:lastRenderedPageBreak/>
         <w:t>성공</w:t>
@@ -7799,7 +7799,7 @@
           <w:numId w:val="7"/>
         </w:numPr>
       </w:pPr>
-      <w:bookmarkStart w:id="11" w:name="_Toc239828106"/>
+      <w:bookmarkStart w:id="11" w:name="_Toc240003260"/>
       <w:r>
         <w:t>Greed Decision</w:t>
       </w:r>
@@ -8168,7 +8168,7 @@
           <w:numId w:val="7"/>
         </w:numPr>
       </w:pPr>
-      <w:bookmarkStart w:id="12" w:name="_Toc239828107"/>
+      <w:bookmarkStart w:id="12" w:name="_Toc240003261"/>
       <w:r>
         <w:t>15~25</w:t>
       </w:r>
@@ -8538,7 +8538,7 @@
           <w:numId w:val="7"/>
         </w:numPr>
       </w:pPr>
-      <w:bookmarkStart w:id="13" w:name="_Toc239828108"/>
+      <w:bookmarkStart w:id="13" w:name="_Toc240003262"/>
       <w:r>
         <w:lastRenderedPageBreak/>
         <w:t>위조와</w:t>
@@ -8565,7 +8565,7 @@
           <w:numId w:val="7"/>
         </w:numPr>
       </w:pPr>
-      <w:bookmarkStart w:id="14" w:name="_Toc239828109"/>
+      <w:bookmarkStart w:id="14" w:name="_Toc240003263"/>
       <w:r>
         <w:t>Artifact</w:t>
       </w:r>
@@ -8854,6 +8854,11 @@
       </w:r>
     </w:p>
     <w:p>
+      <w:r>
+        <w:t>각 맵은 탈취 가능한 20점 외에 상호작용하지 않는 일반 전시물을 함께 배치한다. 일반 전시물은 얇은 액자와 작은 연작으로 공간을 구성하고, 탈취 가능한 작품은 두꺼운 프레임과 하단 보안 패널로 접근 전에 구별한다. 색상만으로 구분하지 않으며, 근거리 행동 안내는 탈취 대상에만 표시한다. 필수 작품은 기존 계약 단서와 발견 표시를 따른다.</w:t>
+      </w:r>
+    </w:p>
+    <w:p>
       <w:pPr>
         <w:pStyle w:val="21"/>
         <w:numPr>
@@ -8861,7 +8866,7 @@
           <w:numId w:val="7"/>
         </w:numPr>
       </w:pPr>
-      <w:bookmarkStart w:id="15" w:name="_Toc239828110"/>
+      <w:bookmarkStart w:id="15" w:name="_Toc240003264"/>
       <w:r>
         <w:t xml:space="preserve">Surface Forgery </w:t>
       </w:r>
@@ -8897,7 +8902,11 @@
         </w:numPr>
       </w:pPr>
       <w:r>
-        <w:t>World View가 완전히 가려진 Full-Screen 화면으로 전환된다. World Audio와 팀 음성은 유지하지만 Alert/Lockdown 상세 정보는 작업 화면에 중복 표시하지 않는다. Suspicious/Searching에서는 현재 작업을 유지한다. Alarmed/Lockdown 진입 시 서버가 작업 Session을 먼저 취소하고 화면을 닫아 이동·시점·탈출 판단을 즉시 복원하며, 위험 단계에서는 신규 작업 진입을 허용하지 않는다.</w:t>
+        <w:t xml:space="preserve">World View가 완전히 가려진 Full-Screen 화면으로 전환된다. World Audio와 팀 음성은 유지하지만 Alert/Lockdown 상세 정보는 작업 화면에 중복 표시하지 않는다. Suspicious/Searching에서는 현재 작업을 유지한다. Alarmed/Lockdown 진입 시 서버가 작업 </w:t>
+      </w:r>
+      <w:r>
+        <w:lastRenderedPageBreak/>
+        <w:t>Session을 먼저 취소하고 화면을 닫아 이동·시점·탈출 판단을 즉시 복원하며, 위험 단계에서는 신규 작업 진입을 허용하지 않는다.</w:t>
       </w:r>
     </w:p>
     <w:p>
@@ -8909,11 +8918,7 @@
         </w:numPr>
       </w:pPr>
       <w:r>
-        <w:t xml:space="preserve">Template Palette 2~8색 중 색을 고르고 승인된 Brush Size Preset을 전환해 Draw/Erase한다. 화면에는 현재 Palette, Drawing Content 안에서 크기가 다른 소/중/대 Brush 표식, 남은 시간과 ‘예상 품질 {점수}/100 · 제출 가능 70+’ 한 줄만 표시한다. 별도 InstructionText와 </w:t>
-      </w:r>
-      <w:r>
-        <w:lastRenderedPageBreak/>
-        <w:t>ModeStatusText는 표시하지 않는다. 별도 서버 점수나 중복된 품질 기준 문구는 표시하지 않고, Draw/Erase/Reset/Submit/Cancel 안내는 하단 한 줄로 통합한다. 예상 품질이 70 미만이면 Submit을 비활성화하며 Point Budget이나 판정 해상도 같은 기술 정보는 노출하지 않는다.</w:t>
+        <w:t>Template Palette 2~8색 중 색을 고르고 승인된 Brush Size Preset을 전환해 Draw/Erase한다. 화면에는 현재 Palette, Drawing Content 안에서 크기가 다른 소/중/대 Brush 표식, 남은 시간과 ‘예상 품질 {점수}/100 · 제출 가능 70+’ 한 줄만 표시한다. 별도 InstructionText와 ModeStatusText는 표시하지 않는다. 별도 서버 점수나 중복된 품질 기준 문구는 표시하지 않고, Draw/Erase/Reset/Submit/Cancel 안내는 하단 한 줄로 통합한다. 예상 품질이 70 미만이면 Submit을 비활성화하며 Point Budget이나 판정 해상도 같은 기술 정보는 노출하지 않는다.</w:t>
       </w:r>
     </w:p>
     <w:p>
@@ -9046,7 +9051,7 @@
           <w:numId w:val="7"/>
         </w:numPr>
       </w:pPr>
-      <w:bookmarkStart w:id="16" w:name="_Toc239828111"/>
+      <w:bookmarkStart w:id="16" w:name="_Toc240003265"/>
       <w:r>
         <w:t>Object Assembly — Deferred Expansion</w:t>
       </w:r>
@@ -9085,6 +9090,7 @@
         </w:numPr>
       </w:pPr>
       <w:r>
+        <w:lastRenderedPageBreak/>
         <w:t>보존된 Assembly 경로는 Compile·Load·Cleanup과 Serialization 호환만 유지하며, 신규 Kit·Template·UI·Gameplay 확장은 진행하지 않는다.</w:t>
       </w:r>
     </w:p>
@@ -9102,7 +9108,6 @@
     </w:p>
     <w:p>
       <w:r>
-        <w:lastRenderedPageBreak/>
         <w:t>이번 보류는 기존 구현 실패나 제거 결정이 아니라, 현재 출시의 협동 보안·Painting 콘텐츠·3-Map 완성도를 우선하기 위한 Scope Lock이다.</w:t>
       </w:r>
     </w:p>
@@ -9114,7 +9119,7 @@
           <w:numId w:val="7"/>
         </w:numPr>
       </w:pPr>
-      <w:bookmarkStart w:id="17" w:name="_Toc239828112"/>
+      <w:bookmarkStart w:id="17" w:name="_Toc240003266"/>
       <w:r>
         <w:t>Quality</w:t>
       </w:r>
@@ -9403,7 +9408,7 @@
           <w:numId w:val="7"/>
         </w:numPr>
       </w:pPr>
-      <w:bookmarkStart w:id="18" w:name="_Toc239828113"/>
+      <w:bookmarkStart w:id="18" w:name="_Toc240003267"/>
       <w:r>
         <w:t>핵심</w:t>
       </w:r>
@@ -9656,6 +9661,7 @@
           </w:tcPr>
           <w:p>
             <w:r>
+              <w:lastRenderedPageBreak/>
               <w:t>기준 미달 제출</w:t>
             </w:r>
           </w:p>
@@ -9723,7 +9729,6 @@
               <w:rPr>
                 <w:sz w:val="16"/>
               </w:rPr>
-              <w:lastRenderedPageBreak/>
               <w:t>Guard Notice</w:t>
             </w:r>
           </w:p>
@@ -9905,7 +9910,7 @@
           <w:numId w:val="7"/>
         </w:numPr>
       </w:pPr>
-      <w:bookmarkStart w:id="19" w:name="_Toc239828114"/>
+      <w:bookmarkStart w:id="19" w:name="_Toc240003268"/>
       <w:r>
         <w:t xml:space="preserve">Owner-only Forgery </w:t>
       </w:r>
@@ -10152,7 +10157,7 @@
           <w:numId w:val="7"/>
         </w:numPr>
       </w:pPr>
-      <w:bookmarkStart w:id="20" w:name="_Toc239828115"/>
+      <w:bookmarkStart w:id="20" w:name="_Toc240003269"/>
       <w:r>
         <w:lastRenderedPageBreak/>
         <w:t>잠입</w:t>
@@ -10185,7 +10190,7 @@
           <w:numId w:val="7"/>
         </w:numPr>
       </w:pPr>
-      <w:bookmarkStart w:id="21" w:name="_Toc239828116"/>
+      <w:bookmarkStart w:id="21" w:name="_Toc240003270"/>
       <w:r>
         <w:t xml:space="preserve">First-Person </w:t>
       </w:r>
@@ -10250,7 +10255,7 @@
           <w:numId w:val="7"/>
         </w:numPr>
       </w:pPr>
-      <w:bookmarkStart w:id="22" w:name="_Toc239828117"/>
+      <w:bookmarkStart w:id="22" w:name="_Toc240003271"/>
       <w:r>
         <w:t>Walk, Sprint, Weight, Footstep</w:t>
       </w:r>
@@ -10593,7 +10598,7 @@
           <w:numId w:val="7"/>
         </w:numPr>
       </w:pPr>
-      <w:bookmarkStart w:id="23" w:name="_Toc239828118"/>
+      <w:bookmarkStart w:id="23" w:name="_Toc240003272"/>
       <w:r>
         <w:t>Patrol Guard</w:t>
       </w:r>
@@ -10944,7 +10949,7 @@
           <w:numId w:val="7"/>
         </w:numPr>
       </w:pPr>
-      <w:bookmarkStart w:id="24" w:name="_Toc239828119"/>
+      <w:bookmarkStart w:id="24" w:name="_Toc240003273"/>
       <w:r>
         <w:t>CCTV</w:t>
       </w:r>
@@ -11194,7 +11199,7 @@
           <w:numId w:val="7"/>
         </w:numPr>
       </w:pPr>
-      <w:bookmarkStart w:id="25" w:name="_Toc239828120"/>
+      <w:bookmarkStart w:id="25" w:name="_Toc240003274"/>
       <w:r>
         <w:lastRenderedPageBreak/>
         <w:t>Stun, Arrest, Recovery</w:t>
@@ -11269,7 +11274,7 @@
           <w:numId w:val="7"/>
         </w:numPr>
       </w:pPr>
-      <w:bookmarkStart w:id="26" w:name="_Toc239828121"/>
+      <w:bookmarkStart w:id="26" w:name="_Toc240003275"/>
       <w:r>
         <w:t>두</w:t>
       </w:r>
@@ -11745,7 +11750,7 @@
           <w:numId w:val="7"/>
         </w:numPr>
       </w:pPr>
-      <w:bookmarkStart w:id="27" w:name="_Toc239828122"/>
+      <w:bookmarkStart w:id="27" w:name="_Toc240003276"/>
       <w:r>
         <w:lastRenderedPageBreak/>
         <w:t>협동</w:t>
@@ -11772,7 +11777,7 @@
           <w:numId w:val="7"/>
         </w:numPr>
       </w:pPr>
-      <w:bookmarkStart w:id="28" w:name="_Toc239828123"/>
+      <w:bookmarkStart w:id="28" w:name="_Toc240003277"/>
       <w:r>
         <w:t>Role Switching</w:t>
       </w:r>
@@ -12180,7 +12185,7 @@
           <w:numId w:val="7"/>
         </w:numPr>
       </w:pPr>
-      <w:bookmarkStart w:id="29" w:name="_Toc239828124"/>
+      <w:bookmarkStart w:id="29" w:name="_Toc240003278"/>
       <w:r>
         <w:t>거리</w:t>
       </w:r>
@@ -12239,7 +12244,7 @@
           <w:numId w:val="7"/>
         </w:numPr>
       </w:pPr>
-      <w:bookmarkStart w:id="30" w:name="_Toc239828125"/>
+      <w:bookmarkStart w:id="30" w:name="_Toc240003279"/>
       <w:r>
         <w:t>Inventory, Loose Loot, Coin</w:t>
       </w:r>
@@ -12302,7 +12307,7 @@
           <w:numId w:val="7"/>
         </w:numPr>
       </w:pPr>
-      <w:bookmarkStart w:id="31" w:name="_Toc239828126"/>
+      <w:bookmarkStart w:id="31" w:name="_Toc240003280"/>
       <w:r>
         <w:t>Player Identity</w:t>
       </w:r>
@@ -12725,7 +12730,7 @@
           <w:numId w:val="7"/>
         </w:numPr>
       </w:pPr>
-      <w:bookmarkStart w:id="32" w:name="_Toc239828127"/>
+      <w:bookmarkStart w:id="32" w:name="_Toc240003281"/>
       <w:r>
         <w:t xml:space="preserve">Floor Plan Map </w:t>
       </w:r>
@@ -12937,7 +12942,7 @@
           <w:numId w:val="7"/>
         </w:numPr>
       </w:pPr>
-      <w:bookmarkStart w:id="33" w:name="_Toc239828128"/>
+      <w:bookmarkStart w:id="33" w:name="_Toc240003282"/>
       <w:r>
         <w:t>Shared Extraction</w:t>
       </w:r>
@@ -13017,7 +13022,7 @@
           <w:numId w:val="7"/>
         </w:numPr>
       </w:pPr>
-      <w:bookmarkStart w:id="34" w:name="_Toc239828129"/>
+      <w:bookmarkStart w:id="34" w:name="_Toc240003283"/>
       <w:r>
         <w:lastRenderedPageBreak/>
         <w:t xml:space="preserve">UI, </w:t>
@@ -13041,7 +13046,7 @@
           <w:numId w:val="7"/>
         </w:numPr>
       </w:pPr>
-      <w:bookmarkStart w:id="35" w:name="_Toc239828130"/>
+      <w:bookmarkStart w:id="35" w:name="_Toc240003284"/>
       <w:r>
         <w:t>HUD Information Architecture</w:t>
       </w:r>
@@ -13342,7 +13347,7 @@
           <w:numId w:val="7"/>
         </w:numPr>
       </w:pPr>
-      <w:bookmarkStart w:id="36" w:name="_Toc239828131"/>
+      <w:bookmarkStart w:id="36" w:name="_Toc240003285"/>
       <w:r>
         <w:t xml:space="preserve">Main HUD </w:t>
       </w:r>
@@ -13651,7 +13656,7 @@
           <w:numId w:val="7"/>
         </w:numPr>
       </w:pPr>
-      <w:bookmarkStart w:id="37" w:name="_Toc239828132"/>
+      <w:bookmarkStart w:id="37" w:name="_Toc240003286"/>
       <w:r>
         <w:lastRenderedPageBreak/>
         <w:t>최소</w:t>
@@ -13733,7 +13738,7 @@
           <w:numId w:val="7"/>
         </w:numPr>
       </w:pPr>
-      <w:bookmarkStart w:id="38" w:name="_Toc239828133"/>
+      <w:bookmarkStart w:id="38" w:name="_Toc240003287"/>
       <w:r>
         <w:t xml:space="preserve">Input Mode </w:t>
       </w:r>
@@ -14213,7 +14218,7 @@
           <w:numId w:val="7"/>
         </w:numPr>
       </w:pPr>
-      <w:bookmarkStart w:id="39" w:name="_Toc239828134"/>
+      <w:bookmarkStart w:id="39" w:name="_Toc240003288"/>
       <w:r>
         <w:lastRenderedPageBreak/>
         <w:t>Floor Plan</w:t>
@@ -14237,7 +14242,7 @@
           <w:numId w:val="7"/>
         </w:numPr>
       </w:pPr>
-      <w:bookmarkStart w:id="40" w:name="_Toc239828135"/>
+      <w:bookmarkStart w:id="40" w:name="_Toc240003289"/>
       <w:r>
         <w:t xml:space="preserve">Floor Plan Map </w:t>
       </w:r>
@@ -14552,7 +14557,7 @@
           <w:numId w:val="7"/>
         </w:numPr>
       </w:pPr>
-      <w:bookmarkStart w:id="41" w:name="_Toc239828136"/>
+      <w:bookmarkStart w:id="41" w:name="_Toc240003290"/>
       <w:r>
         <w:t xml:space="preserve">Team Result / Replica Recap </w:t>
       </w:r>
@@ -14930,7 +14935,7 @@
           <w:numId w:val="7"/>
         </w:numPr>
       </w:pPr>
-      <w:bookmarkStart w:id="42" w:name="_Toc239828137"/>
+      <w:bookmarkStart w:id="42" w:name="_Toc240003291"/>
       <w:r>
         <w:t>첫</w:t>
       </w:r>
@@ -15204,7 +15209,7 @@
           <w:numId w:val="7"/>
         </w:numPr>
       </w:pPr>
-      <w:bookmarkStart w:id="43" w:name="_Toc239828138"/>
+      <w:bookmarkStart w:id="43" w:name="_Toc240003292"/>
       <w:r>
         <w:lastRenderedPageBreak/>
         <w:t>접근성</w:t>
@@ -15277,7 +15282,7 @@
           <w:numId w:val="7"/>
         </w:numPr>
       </w:pPr>
-      <w:bookmarkStart w:id="44" w:name="_Toc239828139"/>
+      <w:bookmarkStart w:id="44" w:name="_Toc240003293"/>
       <w:r>
         <w:lastRenderedPageBreak/>
         <w:t>레벨</w:t>
@@ -15310,7 +15315,7 @@
           <w:numId w:val="7"/>
         </w:numPr>
       </w:pPr>
-      <w:bookmarkStart w:id="45" w:name="_Toc239828140"/>
+      <w:bookmarkStart w:id="45" w:name="_Toc240003294"/>
       <w:r>
         <w:t>세</w:t>
       </w:r>
@@ -15402,13 +15407,29 @@
     </w:p>
     <w:p>
       <w:pPr>
+        <w:pStyle w:val="a0"/>
+      </w:pPr>
+      <w:r>
+        <w:t>전시실은 작품이 붙는 벽과 관람 공간을 함께 설계한다. 액자는 실제 벽면 또는 바닥에 지지된 독립 전시벽에 설치하고, 정면이 접근 가능한 관람 공간을 향하게 한다. 일반 연결부는 3~5m 폭을 초기 블록아웃 기준으로 삼으며, 눈높이 차폐·경비 관찰 자리·횡단 구간·귀환 길을 이어 배치한다. 최종 폭과 플레이 시간은 멀티플레이로 검증한다.</w:t>
+      </w:r>
+    </w:p>
+    <w:p>
+      <w:pPr>
+        <w:pStyle w:val="a0"/>
+      </w:pPr>
+      <w:r>
+        <w:t>M01은 중앙 Rotunda의 개방감을 유지하고 북·남 회랑을 여러 전시실로 나눈다. M02는 중정을 대표 개방 공간으로 남기고 벽에 연결된 병풍과 엇갈린 입구로 시야를 굴절시킨다. M03는 세 레인을 유지하면서 중앙의 긴 전망을 불투명 전시벽으로 구간화하고, 측면 복원 구역에 은폐 공간을 제공한다. Laser 고가 작품에는 경보 문턱과 독립적인 이탈 경로를 함께 둔다.</w:t>
+      </w:r>
+    </w:p>
+    <w:p>
+      <w:pPr>
         <w:pStyle w:val="21"/>
         <w:numPr>
           <w:ilvl w:val="1"/>
           <w:numId w:val="7"/>
         </w:numPr>
       </w:pPr>
-      <w:bookmarkStart w:id="46" w:name="_Toc239828141"/>
+      <w:bookmarkStart w:id="46" w:name="_Toc240003295"/>
       <w:r>
         <w:t>맵</w:t>
       </w:r>
@@ -15854,8 +15875,9 @@
           <w:numId w:val="7"/>
         </w:numPr>
       </w:pPr>
-      <w:bookmarkStart w:id="47" w:name="_Toc239828142"/>
-      <w:r>
+      <w:bookmarkStart w:id="47" w:name="_Toc240003296"/>
+      <w:r>
+        <w:lastRenderedPageBreak/>
         <w:t xml:space="preserve">M01 — </w:t>
       </w:r>
       <w:r>
@@ -16113,7 +16135,6 @@
                 <w:color w:val="C55A11"/>
                 <w:sz w:val="18"/>
               </w:rPr>
-              <w:lastRenderedPageBreak/>
               <w:t>IMAGE REFERENCE SLOT</w:t>
             </w:r>
             <w:r>
@@ -16162,13 +16183,15 @@
     <w:p>
       <w:pPr>
         <w:pStyle w:val="21"/>
+        <w:pageBreakBefore/>
         <w:numPr>
           <w:ilvl w:val="1"/>
           <w:numId w:val="7"/>
         </w:numPr>
       </w:pPr>
-      <w:bookmarkStart w:id="48" w:name="_Toc239828143"/>
-      <w:r>
+      <w:bookmarkStart w:id="48" w:name="_Toc240003297"/>
+      <w:r>
+        <w:lastRenderedPageBreak/>
         <w:t xml:space="preserve">M02 — </w:t>
       </w:r>
       <w:r>
@@ -16480,7 +16503,7 @@
           <w:numId w:val="7"/>
         </w:numPr>
       </w:pPr>
-      <w:bookmarkStart w:id="49" w:name="_Toc239828144"/>
+      <w:bookmarkStart w:id="49" w:name="_Toc240003298"/>
       <w:r>
         <w:lastRenderedPageBreak/>
         <w:t xml:space="preserve">M03 — </w:t>
@@ -16498,7 +16521,7 @@
     </w:p>
     <w:p>
       <w:r>
-        <w:t>숨을 곳은 적지만 경로 선택이 즉시 열리는 Braided 3-Lane 맵이다. 첫 10초 안에 북측 Glass, 중앙 Spine, 남측 Restoration 중 하나를 고르고 엇갈린 Crosslink에서만 레인을 전환한다. 동측 Target 획득 후 다른 레인으로 귀환하며, 고가 작품은 남→북 Service Airlock 협동 접근으로 분리한다.</w:t>
+        <w:t>중앙 시야를 전시벽으로 끊고 세 레인의 경로 선택을 유지하는 Braided 3-Lane 맵이다. 첫 10초 안에 북측 Glass, 중앙 Spine, 남측 Restoration 중 하나를 고르고 엇갈린 Crosslink에서만 레인을 전환한다. 동측 Target 획득 후 다른 레인으로 귀환하며, 고가 작품은 남→북 Service Airlock 협동 접근으로 분리한다.</w:t>
       </w:r>
     </w:p>
     <w:tbl>
@@ -16771,7 +16794,7 @@
                 <w:color w:val="66717C"/>
                 <w:sz w:val="19"/>
               </w:rPr>
-              <w:t>개방형 조각 홀, 유리 파티션, 비상등이 켜진 긴 시야선</w:t>
+              <w:t>유리 레인과 불투명 전시벽, 교차로를 비추는 비상등</w:t>
             </w:r>
           </w:p>
         </w:tc>
@@ -16794,7 +16817,7 @@
           <w:numId w:val="7"/>
         </w:numPr>
       </w:pPr>
-      <w:bookmarkStart w:id="50" w:name="_Toc239828145"/>
+      <w:bookmarkStart w:id="50" w:name="_Toc240003299"/>
       <w:r>
         <w:lastRenderedPageBreak/>
         <w:t xml:space="preserve">First-Person </w:t>
@@ -16878,7 +16901,7 @@
           <w:numId w:val="7"/>
         </w:numPr>
       </w:pPr>
-      <w:bookmarkStart w:id="51" w:name="_Toc239828146"/>
+      <w:bookmarkStart w:id="51" w:name="_Toc240003300"/>
       <w:r>
         <w:t>사운드</w:t>
       </w:r>
@@ -17318,7 +17341,7 @@
           <w:numId w:val="7"/>
         </w:numPr>
       </w:pPr>
-      <w:bookmarkStart w:id="52" w:name="_Toc239828147"/>
+      <w:bookmarkStart w:id="52" w:name="_Toc240003301"/>
       <w:r>
         <w:lastRenderedPageBreak/>
         <w:t>세계관과</w:t>
@@ -17565,7 +17588,7 @@
           <w:numId w:val="7"/>
         </w:numPr>
       </w:pPr>
-      <w:bookmarkStart w:id="53" w:name="_Toc239828148"/>
+      <w:bookmarkStart w:id="53" w:name="_Toc240003302"/>
       <w:r>
         <w:lastRenderedPageBreak/>
         <w:t>범위</w:t>
@@ -17592,7 +17615,7 @@
           <w:numId w:val="7"/>
         </w:numPr>
       </w:pPr>
-      <w:bookmarkStart w:id="54" w:name="_Toc239828149"/>
+      <w:bookmarkStart w:id="54" w:name="_Toc240003303"/>
       <w:r>
         <w:t>v1.0 Required Scope</w:t>
       </w:r>
@@ -17960,7 +17983,7 @@
           <w:numId w:val="7"/>
         </w:numPr>
       </w:pPr>
-      <w:bookmarkStart w:id="55" w:name="_Toc239828150"/>
+      <w:bookmarkStart w:id="55" w:name="_Toc240003304"/>
       <w:r>
         <w:t>Deferred Expansion</w:t>
       </w:r>
@@ -17984,7 +18007,7 @@
           <w:numId w:val="7"/>
         </w:numPr>
       </w:pPr>
-      <w:bookmarkStart w:id="56" w:name="_Toc239828151"/>
+      <w:bookmarkStart w:id="56" w:name="_Toc240003305"/>
       <w:r>
         <w:t>Stretch</w:t>
       </w:r>
@@ -18362,7 +18385,7 @@
           <w:numId w:val="7"/>
         </w:numPr>
       </w:pPr>
-      <w:bookmarkStart w:id="57" w:name="_Toc239828152"/>
+      <w:bookmarkStart w:id="57" w:name="_Toc240003306"/>
       <w:r>
         <w:lastRenderedPageBreak/>
         <w:t>Starting Balance Targets</w:t>
@@ -18961,7 +18984,7 @@
           <w:numId w:val="7"/>
         </w:numPr>
       </w:pPr>
-      <w:bookmarkStart w:id="58" w:name="_Toc239828153"/>
+      <w:bookmarkStart w:id="58" w:name="_Toc240003307"/>
       <w:r>
         <w:t>Playtest Questions</w:t>
       </w:r>
@@ -19047,7 +19070,7 @@
           <w:numId w:val="7"/>
         </w:numPr>
       </w:pPr>
-      <w:bookmarkStart w:id="59" w:name="_Toc239828154"/>
+      <w:bookmarkStart w:id="59" w:name="_Toc240003308"/>
       <w:r>
         <w:lastRenderedPageBreak/>
         <w:t>Release KPI</w:t>
@@ -19379,7 +19402,7 @@
           <w:numId w:val="7"/>
         </w:numPr>
       </w:pPr>
-      <w:bookmarkStart w:id="60" w:name="_Toc239828155"/>
+      <w:bookmarkStart w:id="60" w:name="_Toc240003309"/>
       <w:r>
         <w:t>W6~W12 Roadmap</w:t>
       </w:r>
@@ -19745,7 +19768,7 @@
         <w:keepLines/>
         <w:pageBreakBefore w:val="0"/>
       </w:pPr>
-      <w:bookmarkStart w:id="61" w:name="_Toc239828156"/>
+      <w:bookmarkStart w:id="61" w:name="_Toc240003310"/>
       <w:r>
         <w:t>Appendix A — 용어</w:t>
       </w:r>
@@ -20136,7 +20159,7 @@
         <w:keepLines/>
         <w:pageBreakBefore w:val="0"/>
       </w:pPr>
-      <w:bookmarkStart w:id="62" w:name="_Toc239828157"/>
+      <w:bookmarkStart w:id="62" w:name="_Toc240003311"/>
       <w:r>
         <w:rPr>
           <w:sz w:val="32"/>
@@ -20363,7 +20386,7 @@
         <w:keepLines/>
         <w:pageBreakBefore w:val="0"/>
       </w:pPr>
-      <w:bookmarkStart w:id="63" w:name="_Toc239828158"/>
+      <w:bookmarkStart w:id="63" w:name="_Toc240003312"/>
       <w:r>
         <w:rPr>
           <w:sz w:val="32"/>

</xml_diff>

<commit_message>
Refine gallery layouts and surface print catalog
This change adds authored museum-style hanging layouts for all three maps, expands the surface-print material catalog to 40 gallery references per map, and updates the gallery refinement scripts to generate, validate, and verify the new wall arrangements. It also updates AGENTS and the design docs to document the required 10+ distinct hanging patterns and the 20 active / decorative mix rules, while preserving the map-level gallery composition checks needed for future runtime validation.
</commit_message>
<xml_diff>
--- a/Museum_Heist_GDD.docx
+++ b/Museum_Heist_GDD.docx
@@ -564,7 +564,7 @@
       <w:r>
         <w:fldChar w:fldCharType="separate"/>
       </w:r>
-      <w:hyperlink w:anchor="_Toc240003249" w:history="1">
+      <w:hyperlink w:anchor="_Toc240045463" w:history="1">
         <w:r>
           <w:rPr>
             <w:rStyle w:val="aff1"/>
@@ -591,7 +591,7 @@
             <w:noProof/>
             <w:webHidden/>
           </w:rPr>
-          <w:instrText xml:space="preserve"> PAGEREF _Toc240003249 \h </w:instrText>
+          <w:instrText xml:space="preserve"> PAGEREF _Toc240045463 \h </w:instrText>
         </w:r>
         <w:r>
           <w:rPr>
@@ -640,7 +640,7 @@
           <w14:ligatures w14:val="standardContextual"/>
         </w:rPr>
       </w:pPr>
-      <w:hyperlink w:anchor="_Toc240003250" w:history="1">
+      <w:hyperlink w:anchor="_Toc240045464" w:history="1">
         <w:r>
           <w:rPr>
             <w:rStyle w:val="aff1"/>
@@ -667,7 +667,7 @@
             <w:noProof/>
             <w:webHidden/>
           </w:rPr>
-          <w:instrText xml:space="preserve"> PAGEREF _Toc240003250 \h </w:instrText>
+          <w:instrText xml:space="preserve"> PAGEREF _Toc240045464 \h </w:instrText>
         </w:r>
         <w:r>
           <w:rPr>
@@ -716,7 +716,7 @@
           <w14:ligatures w14:val="standardContextual"/>
         </w:rPr>
       </w:pPr>
-      <w:hyperlink w:anchor="_Toc240003251" w:history="1">
+      <w:hyperlink w:anchor="_Toc240045465" w:history="1">
         <w:r>
           <w:rPr>
             <w:rStyle w:val="aff1"/>
@@ -743,7 +743,7 @@
             <w:noProof/>
             <w:webHidden/>
           </w:rPr>
-          <w:instrText xml:space="preserve"> PAGEREF _Toc240003251 \h </w:instrText>
+          <w:instrText xml:space="preserve"> PAGEREF _Toc240045465 \h </w:instrText>
         </w:r>
         <w:r>
           <w:rPr>
@@ -792,7 +792,7 @@
           <w14:ligatures w14:val="standardContextual"/>
         </w:rPr>
       </w:pPr>
-      <w:hyperlink w:anchor="_Toc240003252" w:history="1">
+      <w:hyperlink w:anchor="_Toc240045466" w:history="1">
         <w:r>
           <w:rPr>
             <w:rStyle w:val="aff1"/>
@@ -819,7 +819,7 @@
             <w:noProof/>
             <w:webHidden/>
           </w:rPr>
-          <w:instrText xml:space="preserve"> PAGEREF _Toc240003252 \h </w:instrText>
+          <w:instrText xml:space="preserve"> PAGEREF _Toc240045466 \h </w:instrText>
         </w:r>
         <w:r>
           <w:rPr>
@@ -868,7 +868,7 @@
           <w14:ligatures w14:val="standardContextual"/>
         </w:rPr>
       </w:pPr>
-      <w:hyperlink w:anchor="_Toc240003253" w:history="1">
+      <w:hyperlink w:anchor="_Toc240045467" w:history="1">
         <w:r>
           <w:rPr>
             <w:rStyle w:val="aff1"/>
@@ -895,7 +895,7 @@
             <w:noProof/>
             <w:webHidden/>
           </w:rPr>
-          <w:instrText xml:space="preserve"> PAGEREF _Toc240003253 \h </w:instrText>
+          <w:instrText xml:space="preserve"> PAGEREF _Toc240045467 \h </w:instrText>
         </w:r>
         <w:r>
           <w:rPr>
@@ -944,7 +944,7 @@
           <w14:ligatures w14:val="standardContextual"/>
         </w:rPr>
       </w:pPr>
-      <w:hyperlink w:anchor="_Toc240003254" w:history="1">
+      <w:hyperlink w:anchor="_Toc240045468" w:history="1">
         <w:r>
           <w:rPr>
             <w:rStyle w:val="aff1"/>
@@ -971,7 +971,7 @@
             <w:noProof/>
             <w:webHidden/>
           </w:rPr>
-          <w:instrText xml:space="preserve"> PAGEREF _Toc240003254 \h </w:instrText>
+          <w:instrText xml:space="preserve"> PAGEREF _Toc240045468 \h </w:instrText>
         </w:r>
         <w:r>
           <w:rPr>
@@ -1020,7 +1020,7 @@
           <w14:ligatures w14:val="standardContextual"/>
         </w:rPr>
       </w:pPr>
-      <w:hyperlink w:anchor="_Toc240003255" w:history="1">
+      <w:hyperlink w:anchor="_Toc240045469" w:history="1">
         <w:r>
           <w:rPr>
             <w:rStyle w:val="aff1"/>
@@ -1047,7 +1047,7 @@
             <w:noProof/>
             <w:webHidden/>
           </w:rPr>
-          <w:instrText xml:space="preserve"> PAGEREF _Toc240003255 \h </w:instrText>
+          <w:instrText xml:space="preserve"> PAGEREF _Toc240045469 \h </w:instrText>
         </w:r>
         <w:r>
           <w:rPr>
@@ -1095,7 +1095,7 @@
           <w14:ligatures w14:val="standardContextual"/>
         </w:rPr>
       </w:pPr>
-      <w:hyperlink w:anchor="_Toc240003256" w:history="1">
+      <w:hyperlink w:anchor="_Toc240045470" w:history="1">
         <w:r>
           <w:rPr>
             <w:rStyle w:val="aff1"/>
@@ -1122,7 +1122,7 @@
             <w:noProof/>
             <w:webHidden/>
           </w:rPr>
-          <w:instrText xml:space="preserve"> PAGEREF _Toc240003256 \h </w:instrText>
+          <w:instrText xml:space="preserve"> PAGEREF _Toc240045470 \h </w:instrText>
         </w:r>
         <w:r>
           <w:rPr>
@@ -1171,7 +1171,7 @@
           <w14:ligatures w14:val="standardContextual"/>
         </w:rPr>
       </w:pPr>
-      <w:hyperlink w:anchor="_Toc240003257" w:history="1">
+      <w:hyperlink w:anchor="_Toc240045471" w:history="1">
         <w:r>
           <w:rPr>
             <w:rStyle w:val="aff1"/>
@@ -1198,7 +1198,7 @@
             <w:noProof/>
             <w:webHidden/>
           </w:rPr>
-          <w:instrText xml:space="preserve"> PAGEREF _Toc240003257 \h </w:instrText>
+          <w:instrText xml:space="preserve"> PAGEREF _Toc240045471 \h </w:instrText>
         </w:r>
         <w:r>
           <w:rPr>
@@ -1247,7 +1247,7 @@
           <w14:ligatures w14:val="standardContextual"/>
         </w:rPr>
       </w:pPr>
-      <w:hyperlink w:anchor="_Toc240003258" w:history="1">
+      <w:hyperlink w:anchor="_Toc240045472" w:history="1">
         <w:r>
           <w:rPr>
             <w:rStyle w:val="aff1"/>
@@ -1274,7 +1274,7 @@
             <w:noProof/>
             <w:webHidden/>
           </w:rPr>
-          <w:instrText xml:space="preserve"> PAGEREF _Toc240003258 \h </w:instrText>
+          <w:instrText xml:space="preserve"> PAGEREF _Toc240045472 \h </w:instrText>
         </w:r>
         <w:r>
           <w:rPr>
@@ -1323,7 +1323,7 @@
           <w14:ligatures w14:val="standardContextual"/>
         </w:rPr>
       </w:pPr>
-      <w:hyperlink w:anchor="_Toc240003259" w:history="1">
+      <w:hyperlink w:anchor="_Toc240045473" w:history="1">
         <w:r>
           <w:rPr>
             <w:rStyle w:val="aff1"/>
@@ -1350,7 +1350,7 @@
             <w:noProof/>
             <w:webHidden/>
           </w:rPr>
-          <w:instrText xml:space="preserve"> PAGEREF _Toc240003259 \h </w:instrText>
+          <w:instrText xml:space="preserve"> PAGEREF _Toc240045473 \h </w:instrText>
         </w:r>
         <w:r>
           <w:rPr>
@@ -1399,7 +1399,7 @@
           <w14:ligatures w14:val="standardContextual"/>
         </w:rPr>
       </w:pPr>
-      <w:hyperlink w:anchor="_Toc240003260" w:history="1">
+      <w:hyperlink w:anchor="_Toc240045474" w:history="1">
         <w:r>
           <w:rPr>
             <w:rStyle w:val="aff1"/>
@@ -1426,7 +1426,7 @@
             <w:noProof/>
             <w:webHidden/>
           </w:rPr>
-          <w:instrText xml:space="preserve"> PAGEREF _Toc240003260 \h </w:instrText>
+          <w:instrText xml:space="preserve"> PAGEREF _Toc240045474 \h </w:instrText>
         </w:r>
         <w:r>
           <w:rPr>
@@ -1475,7 +1475,7 @@
           <w14:ligatures w14:val="standardContextual"/>
         </w:rPr>
       </w:pPr>
-      <w:hyperlink w:anchor="_Toc240003261" w:history="1">
+      <w:hyperlink w:anchor="_Toc240045475" w:history="1">
         <w:r>
           <w:rPr>
             <w:rStyle w:val="aff1"/>
@@ -1502,7 +1502,7 @@
             <w:noProof/>
             <w:webHidden/>
           </w:rPr>
-          <w:instrText xml:space="preserve"> PAGEREF _Toc240003261 \h </w:instrText>
+          <w:instrText xml:space="preserve"> PAGEREF _Toc240045475 \h </w:instrText>
         </w:r>
         <w:r>
           <w:rPr>
@@ -1550,7 +1550,7 @@
           <w14:ligatures w14:val="standardContextual"/>
         </w:rPr>
       </w:pPr>
-      <w:hyperlink w:anchor="_Toc240003262" w:history="1">
+      <w:hyperlink w:anchor="_Toc240045476" w:history="1">
         <w:r>
           <w:rPr>
             <w:rStyle w:val="aff1"/>
@@ -1577,7 +1577,7 @@
             <w:noProof/>
             <w:webHidden/>
           </w:rPr>
-          <w:instrText xml:space="preserve"> PAGEREF _Toc240003262 \h </w:instrText>
+          <w:instrText xml:space="preserve"> PAGEREF _Toc240045476 \h </w:instrText>
         </w:r>
         <w:r>
           <w:rPr>
@@ -1626,7 +1626,7 @@
           <w14:ligatures w14:val="standardContextual"/>
         </w:rPr>
       </w:pPr>
-      <w:hyperlink w:anchor="_Toc240003263" w:history="1">
+      <w:hyperlink w:anchor="_Toc240045477" w:history="1">
         <w:r>
           <w:rPr>
             <w:rStyle w:val="aff1"/>
@@ -1653,7 +1653,7 @@
             <w:noProof/>
             <w:webHidden/>
           </w:rPr>
-          <w:instrText xml:space="preserve"> PAGEREF _Toc240003263 \h </w:instrText>
+          <w:instrText xml:space="preserve"> PAGEREF _Toc240045477 \h </w:instrText>
         </w:r>
         <w:r>
           <w:rPr>
@@ -1702,7 +1702,7 @@
           <w14:ligatures w14:val="standardContextual"/>
         </w:rPr>
       </w:pPr>
-      <w:hyperlink w:anchor="_Toc240003264" w:history="1">
+      <w:hyperlink w:anchor="_Toc240045478" w:history="1">
         <w:r>
           <w:rPr>
             <w:rStyle w:val="aff1"/>
@@ -1729,7 +1729,7 @@
             <w:noProof/>
             <w:webHidden/>
           </w:rPr>
-          <w:instrText xml:space="preserve"> PAGEREF _Toc240003264 \h </w:instrText>
+          <w:instrText xml:space="preserve"> PAGEREF _Toc240045478 \h </w:instrText>
         </w:r>
         <w:r>
           <w:rPr>
@@ -1778,7 +1778,7 @@
           <w14:ligatures w14:val="standardContextual"/>
         </w:rPr>
       </w:pPr>
-      <w:hyperlink w:anchor="_Toc240003265" w:history="1">
+      <w:hyperlink w:anchor="_Toc240045479" w:history="1">
         <w:r>
           <w:rPr>
             <w:rStyle w:val="aff1"/>
@@ -1805,7 +1805,7 @@
             <w:noProof/>
             <w:webHidden/>
           </w:rPr>
-          <w:instrText xml:space="preserve"> PAGEREF _Toc240003265 \h </w:instrText>
+          <w:instrText xml:space="preserve"> PAGEREF _Toc240045479 \h </w:instrText>
         </w:r>
         <w:r>
           <w:rPr>
@@ -1854,7 +1854,7 @@
           <w14:ligatures w14:val="standardContextual"/>
         </w:rPr>
       </w:pPr>
-      <w:hyperlink w:anchor="_Toc240003266" w:history="1">
+      <w:hyperlink w:anchor="_Toc240045480" w:history="1">
         <w:r>
           <w:rPr>
             <w:rStyle w:val="aff1"/>
@@ -1881,7 +1881,7 @@
             <w:noProof/>
             <w:webHidden/>
           </w:rPr>
-          <w:instrText xml:space="preserve"> PAGEREF _Toc240003266 \h </w:instrText>
+          <w:instrText xml:space="preserve"> PAGEREF _Toc240045480 \h </w:instrText>
         </w:r>
         <w:r>
           <w:rPr>
@@ -1930,7 +1930,7 @@
           <w14:ligatures w14:val="standardContextual"/>
         </w:rPr>
       </w:pPr>
-      <w:hyperlink w:anchor="_Toc240003267" w:history="1">
+      <w:hyperlink w:anchor="_Toc240045481" w:history="1">
         <w:r>
           <w:rPr>
             <w:rStyle w:val="aff1"/>
@@ -1957,7 +1957,7 @@
             <w:noProof/>
             <w:webHidden/>
           </w:rPr>
-          <w:instrText xml:space="preserve"> PAGEREF _Toc240003267 \h </w:instrText>
+          <w:instrText xml:space="preserve"> PAGEREF _Toc240045481 \h </w:instrText>
         </w:r>
         <w:r>
           <w:rPr>
@@ -2006,7 +2006,7 @@
           <w14:ligatures w14:val="standardContextual"/>
         </w:rPr>
       </w:pPr>
-      <w:hyperlink w:anchor="_Toc240003268" w:history="1">
+      <w:hyperlink w:anchor="_Toc240045482" w:history="1">
         <w:r>
           <w:rPr>
             <w:rStyle w:val="aff1"/>
@@ -2033,7 +2033,7 @@
             <w:noProof/>
             <w:webHidden/>
           </w:rPr>
-          <w:instrText xml:space="preserve"> PAGEREF _Toc240003268 \h </w:instrText>
+          <w:instrText xml:space="preserve"> PAGEREF _Toc240045482 \h </w:instrText>
         </w:r>
         <w:r>
           <w:rPr>
@@ -2081,7 +2081,7 @@
           <w14:ligatures w14:val="standardContextual"/>
         </w:rPr>
       </w:pPr>
-      <w:hyperlink w:anchor="_Toc240003269" w:history="1">
+      <w:hyperlink w:anchor="_Toc240045483" w:history="1">
         <w:r>
           <w:rPr>
             <w:rStyle w:val="aff1"/>
@@ -2108,7 +2108,7 @@
             <w:noProof/>
             <w:webHidden/>
           </w:rPr>
-          <w:instrText xml:space="preserve"> PAGEREF _Toc240003269 \h </w:instrText>
+          <w:instrText xml:space="preserve"> PAGEREF _Toc240045483 \h </w:instrText>
         </w:r>
         <w:r>
           <w:rPr>
@@ -2157,7 +2157,7 @@
           <w14:ligatures w14:val="standardContextual"/>
         </w:rPr>
       </w:pPr>
-      <w:hyperlink w:anchor="_Toc240003270" w:history="1">
+      <w:hyperlink w:anchor="_Toc240045484" w:history="1">
         <w:r>
           <w:rPr>
             <w:rStyle w:val="aff1"/>
@@ -2184,7 +2184,7 @@
             <w:noProof/>
             <w:webHidden/>
           </w:rPr>
-          <w:instrText xml:space="preserve"> PAGEREF _Toc240003270 \h </w:instrText>
+          <w:instrText xml:space="preserve"> PAGEREF _Toc240045484 \h </w:instrText>
         </w:r>
         <w:r>
           <w:rPr>
@@ -2233,7 +2233,7 @@
           <w14:ligatures w14:val="standardContextual"/>
         </w:rPr>
       </w:pPr>
-      <w:hyperlink w:anchor="_Toc240003271" w:history="1">
+      <w:hyperlink w:anchor="_Toc240045485" w:history="1">
         <w:r>
           <w:rPr>
             <w:rStyle w:val="aff1"/>
@@ -2260,7 +2260,7 @@
             <w:noProof/>
             <w:webHidden/>
           </w:rPr>
-          <w:instrText xml:space="preserve"> PAGEREF _Toc240003271 \h </w:instrText>
+          <w:instrText xml:space="preserve"> PAGEREF _Toc240045485 \h </w:instrText>
         </w:r>
         <w:r>
           <w:rPr>
@@ -2309,7 +2309,7 @@
           <w14:ligatures w14:val="standardContextual"/>
         </w:rPr>
       </w:pPr>
-      <w:hyperlink w:anchor="_Toc240003272" w:history="1">
+      <w:hyperlink w:anchor="_Toc240045486" w:history="1">
         <w:r>
           <w:rPr>
             <w:rStyle w:val="aff1"/>
@@ -2336,7 +2336,7 @@
             <w:noProof/>
             <w:webHidden/>
           </w:rPr>
-          <w:instrText xml:space="preserve"> PAGEREF _Toc240003272 \h </w:instrText>
+          <w:instrText xml:space="preserve"> PAGEREF _Toc240045486 \h </w:instrText>
         </w:r>
         <w:r>
           <w:rPr>
@@ -2385,7 +2385,7 @@
           <w14:ligatures w14:val="standardContextual"/>
         </w:rPr>
       </w:pPr>
-      <w:hyperlink w:anchor="_Toc240003273" w:history="1">
+      <w:hyperlink w:anchor="_Toc240045487" w:history="1">
         <w:r>
           <w:rPr>
             <w:rStyle w:val="aff1"/>
@@ -2412,7 +2412,7 @@
             <w:noProof/>
             <w:webHidden/>
           </w:rPr>
-          <w:instrText xml:space="preserve"> PAGEREF _Toc240003273 \h </w:instrText>
+          <w:instrText xml:space="preserve"> PAGEREF _Toc240045487 \h </w:instrText>
         </w:r>
         <w:r>
           <w:rPr>
@@ -2461,7 +2461,7 @@
           <w14:ligatures w14:val="standardContextual"/>
         </w:rPr>
       </w:pPr>
-      <w:hyperlink w:anchor="_Toc240003274" w:history="1">
+      <w:hyperlink w:anchor="_Toc240045488" w:history="1">
         <w:r>
           <w:rPr>
             <w:rStyle w:val="aff1"/>
@@ -2488,7 +2488,7 @@
             <w:noProof/>
             <w:webHidden/>
           </w:rPr>
-          <w:instrText xml:space="preserve"> PAGEREF _Toc240003274 \h </w:instrText>
+          <w:instrText xml:space="preserve"> PAGEREF _Toc240045488 \h </w:instrText>
         </w:r>
         <w:r>
           <w:rPr>
@@ -2537,7 +2537,7 @@
           <w14:ligatures w14:val="standardContextual"/>
         </w:rPr>
       </w:pPr>
-      <w:hyperlink w:anchor="_Toc240003275" w:history="1">
+      <w:hyperlink w:anchor="_Toc240045489" w:history="1">
         <w:r>
           <w:rPr>
             <w:rStyle w:val="aff1"/>
@@ -2564,7 +2564,7 @@
             <w:noProof/>
             <w:webHidden/>
           </w:rPr>
-          <w:instrText xml:space="preserve"> PAGEREF _Toc240003275 \h </w:instrText>
+          <w:instrText xml:space="preserve"> PAGEREF _Toc240045489 \h </w:instrText>
         </w:r>
         <w:r>
           <w:rPr>
@@ -2612,7 +2612,7 @@
           <w14:ligatures w14:val="standardContextual"/>
         </w:rPr>
       </w:pPr>
-      <w:hyperlink w:anchor="_Toc240003276" w:history="1">
+      <w:hyperlink w:anchor="_Toc240045490" w:history="1">
         <w:r>
           <w:rPr>
             <w:rStyle w:val="aff1"/>
@@ -2639,7 +2639,7 @@
             <w:noProof/>
             <w:webHidden/>
           </w:rPr>
-          <w:instrText xml:space="preserve"> PAGEREF _Toc240003276 \h </w:instrText>
+          <w:instrText xml:space="preserve"> PAGEREF _Toc240045490 \h </w:instrText>
         </w:r>
         <w:r>
           <w:rPr>
@@ -2688,7 +2688,7 @@
           <w14:ligatures w14:val="standardContextual"/>
         </w:rPr>
       </w:pPr>
-      <w:hyperlink w:anchor="_Toc240003277" w:history="1">
+      <w:hyperlink w:anchor="_Toc240045491" w:history="1">
         <w:r>
           <w:rPr>
             <w:rStyle w:val="aff1"/>
@@ -2715,7 +2715,7 @@
             <w:noProof/>
             <w:webHidden/>
           </w:rPr>
-          <w:instrText xml:space="preserve"> PAGEREF _Toc240003277 \h </w:instrText>
+          <w:instrText xml:space="preserve"> PAGEREF _Toc240045491 \h </w:instrText>
         </w:r>
         <w:r>
           <w:rPr>
@@ -2764,7 +2764,7 @@
           <w14:ligatures w14:val="standardContextual"/>
         </w:rPr>
       </w:pPr>
-      <w:hyperlink w:anchor="_Toc240003278" w:history="1">
+      <w:hyperlink w:anchor="_Toc240045492" w:history="1">
         <w:r>
           <w:rPr>
             <w:rStyle w:val="aff1"/>
@@ -2791,7 +2791,7 @@
             <w:noProof/>
             <w:webHidden/>
           </w:rPr>
-          <w:instrText xml:space="preserve"> PAGEREF _Toc240003278 \h </w:instrText>
+          <w:instrText xml:space="preserve"> PAGEREF _Toc240045492 \h </w:instrText>
         </w:r>
         <w:r>
           <w:rPr>
@@ -2840,7 +2840,7 @@
           <w14:ligatures w14:val="standardContextual"/>
         </w:rPr>
       </w:pPr>
-      <w:hyperlink w:anchor="_Toc240003279" w:history="1">
+      <w:hyperlink w:anchor="_Toc240045493" w:history="1">
         <w:r>
           <w:rPr>
             <w:rStyle w:val="aff1"/>
@@ -2867,7 +2867,7 @@
             <w:noProof/>
             <w:webHidden/>
           </w:rPr>
-          <w:instrText xml:space="preserve"> PAGEREF _Toc240003279 \h </w:instrText>
+          <w:instrText xml:space="preserve"> PAGEREF _Toc240045493 \h </w:instrText>
         </w:r>
         <w:r>
           <w:rPr>
@@ -2916,7 +2916,7 @@
           <w14:ligatures w14:val="standardContextual"/>
         </w:rPr>
       </w:pPr>
-      <w:hyperlink w:anchor="_Toc240003280" w:history="1">
+      <w:hyperlink w:anchor="_Toc240045494" w:history="1">
         <w:r>
           <w:rPr>
             <w:rStyle w:val="aff1"/>
@@ -2943,7 +2943,7 @@
             <w:noProof/>
             <w:webHidden/>
           </w:rPr>
-          <w:instrText xml:space="preserve"> PAGEREF _Toc240003280 \h </w:instrText>
+          <w:instrText xml:space="preserve"> PAGEREF _Toc240045494 \h </w:instrText>
         </w:r>
         <w:r>
           <w:rPr>
@@ -2992,7 +2992,7 @@
           <w14:ligatures w14:val="standardContextual"/>
         </w:rPr>
       </w:pPr>
-      <w:hyperlink w:anchor="_Toc240003281" w:history="1">
+      <w:hyperlink w:anchor="_Toc240045495" w:history="1">
         <w:r>
           <w:rPr>
             <w:rStyle w:val="aff1"/>
@@ -3019,7 +3019,7 @@
             <w:noProof/>
             <w:webHidden/>
           </w:rPr>
-          <w:instrText xml:space="preserve"> PAGEREF _Toc240003281 \h </w:instrText>
+          <w:instrText xml:space="preserve"> PAGEREF _Toc240045495 \h </w:instrText>
         </w:r>
         <w:r>
           <w:rPr>
@@ -3068,7 +3068,7 @@
           <w14:ligatures w14:val="standardContextual"/>
         </w:rPr>
       </w:pPr>
-      <w:hyperlink w:anchor="_Toc240003282" w:history="1">
+      <w:hyperlink w:anchor="_Toc240045496" w:history="1">
         <w:r>
           <w:rPr>
             <w:rStyle w:val="aff1"/>
@@ -3095,7 +3095,7 @@
             <w:noProof/>
             <w:webHidden/>
           </w:rPr>
-          <w:instrText xml:space="preserve"> PAGEREF _Toc240003282 \h </w:instrText>
+          <w:instrText xml:space="preserve"> PAGEREF _Toc240045496 \h </w:instrText>
         </w:r>
         <w:r>
           <w:rPr>
@@ -3143,7 +3143,7 @@
           <w14:ligatures w14:val="standardContextual"/>
         </w:rPr>
       </w:pPr>
-      <w:hyperlink w:anchor="_Toc240003283" w:history="1">
+      <w:hyperlink w:anchor="_Toc240045497" w:history="1">
         <w:r>
           <w:rPr>
             <w:rStyle w:val="aff1"/>
@@ -3170,7 +3170,7 @@
             <w:noProof/>
             <w:webHidden/>
           </w:rPr>
-          <w:instrText xml:space="preserve"> PAGEREF _Toc240003283 \h </w:instrText>
+          <w:instrText xml:space="preserve"> PAGEREF _Toc240045497 \h </w:instrText>
         </w:r>
         <w:r>
           <w:rPr>
@@ -3219,7 +3219,7 @@
           <w14:ligatures w14:val="standardContextual"/>
         </w:rPr>
       </w:pPr>
-      <w:hyperlink w:anchor="_Toc240003284" w:history="1">
+      <w:hyperlink w:anchor="_Toc240045498" w:history="1">
         <w:r>
           <w:rPr>
             <w:rStyle w:val="aff1"/>
@@ -3246,7 +3246,7 @@
             <w:noProof/>
             <w:webHidden/>
           </w:rPr>
-          <w:instrText xml:space="preserve"> PAGEREF _Toc240003284 \h </w:instrText>
+          <w:instrText xml:space="preserve"> PAGEREF _Toc240045498 \h </w:instrText>
         </w:r>
         <w:r>
           <w:rPr>
@@ -3295,7 +3295,7 @@
           <w14:ligatures w14:val="standardContextual"/>
         </w:rPr>
       </w:pPr>
-      <w:hyperlink w:anchor="_Toc240003285" w:history="1">
+      <w:hyperlink w:anchor="_Toc240045499" w:history="1">
         <w:r>
           <w:rPr>
             <w:rStyle w:val="aff1"/>
@@ -3322,7 +3322,7 @@
             <w:noProof/>
             <w:webHidden/>
           </w:rPr>
-          <w:instrText xml:space="preserve"> PAGEREF _Toc240003285 \h </w:instrText>
+          <w:instrText xml:space="preserve"> PAGEREF _Toc240045499 \h </w:instrText>
         </w:r>
         <w:r>
           <w:rPr>
@@ -3371,7 +3371,7 @@
           <w14:ligatures w14:val="standardContextual"/>
         </w:rPr>
       </w:pPr>
-      <w:hyperlink w:anchor="_Toc240003286" w:history="1">
+      <w:hyperlink w:anchor="_Toc240045500" w:history="1">
         <w:r>
           <w:rPr>
             <w:rStyle w:val="aff1"/>
@@ -3398,7 +3398,7 @@
             <w:noProof/>
             <w:webHidden/>
           </w:rPr>
-          <w:instrText xml:space="preserve"> PAGEREF _Toc240003286 \h </w:instrText>
+          <w:instrText xml:space="preserve"> PAGEREF _Toc240045500 \h </w:instrText>
         </w:r>
         <w:r>
           <w:rPr>
@@ -3447,7 +3447,7 @@
           <w14:ligatures w14:val="standardContextual"/>
         </w:rPr>
       </w:pPr>
-      <w:hyperlink w:anchor="_Toc240003287" w:history="1">
+      <w:hyperlink w:anchor="_Toc240045501" w:history="1">
         <w:r>
           <w:rPr>
             <w:rStyle w:val="aff1"/>
@@ -3474,7 +3474,7 @@
             <w:noProof/>
             <w:webHidden/>
           </w:rPr>
-          <w:instrText xml:space="preserve"> PAGEREF _Toc240003287 \h </w:instrText>
+          <w:instrText xml:space="preserve"> PAGEREF _Toc240045501 \h </w:instrText>
         </w:r>
         <w:r>
           <w:rPr>
@@ -3523,7 +3523,7 @@
           <w14:ligatures w14:val="standardContextual"/>
         </w:rPr>
       </w:pPr>
-      <w:hyperlink w:anchor="_Toc240003288" w:history="1">
+      <w:hyperlink w:anchor="_Toc240045502" w:history="1">
         <w:r>
           <w:rPr>
             <w:rStyle w:val="aff1"/>
@@ -3550,7 +3550,7 @@
             <w:noProof/>
             <w:webHidden/>
           </w:rPr>
-          <w:instrText xml:space="preserve"> PAGEREF _Toc240003288 \h </w:instrText>
+          <w:instrText xml:space="preserve"> PAGEREF _Toc240045502 \h </w:instrText>
         </w:r>
         <w:r>
           <w:rPr>
@@ -3599,7 +3599,7 @@
           <w14:ligatures w14:val="standardContextual"/>
         </w:rPr>
       </w:pPr>
-      <w:hyperlink w:anchor="_Toc240003289" w:history="1">
+      <w:hyperlink w:anchor="_Toc240045503" w:history="1">
         <w:r>
           <w:rPr>
             <w:rStyle w:val="aff1"/>
@@ -3626,7 +3626,7 @@
             <w:noProof/>
             <w:webHidden/>
           </w:rPr>
-          <w:instrText xml:space="preserve"> PAGEREF _Toc240003289 \h </w:instrText>
+          <w:instrText xml:space="preserve"> PAGEREF _Toc240045503 \h </w:instrText>
         </w:r>
         <w:r>
           <w:rPr>
@@ -3675,7 +3675,7 @@
           <w14:ligatures w14:val="standardContextual"/>
         </w:rPr>
       </w:pPr>
-      <w:hyperlink w:anchor="_Toc240003290" w:history="1">
+      <w:hyperlink w:anchor="_Toc240045504" w:history="1">
         <w:r>
           <w:rPr>
             <w:rStyle w:val="aff1"/>
@@ -3702,7 +3702,7 @@
             <w:noProof/>
             <w:webHidden/>
           </w:rPr>
-          <w:instrText xml:space="preserve"> PAGEREF _Toc240003290 \h </w:instrText>
+          <w:instrText xml:space="preserve"> PAGEREF _Toc240045504 \h </w:instrText>
         </w:r>
         <w:r>
           <w:rPr>
@@ -3751,7 +3751,7 @@
           <w14:ligatures w14:val="standardContextual"/>
         </w:rPr>
       </w:pPr>
-      <w:hyperlink w:anchor="_Toc240003291" w:history="1">
+      <w:hyperlink w:anchor="_Toc240045505" w:history="1">
         <w:r>
           <w:rPr>
             <w:rStyle w:val="aff1"/>
@@ -3778,7 +3778,7 @@
             <w:noProof/>
             <w:webHidden/>
           </w:rPr>
-          <w:instrText xml:space="preserve"> PAGEREF _Toc240003291 \h </w:instrText>
+          <w:instrText xml:space="preserve"> PAGEREF _Toc240045505 \h </w:instrText>
         </w:r>
         <w:r>
           <w:rPr>
@@ -3827,7 +3827,7 @@
           <w14:ligatures w14:val="standardContextual"/>
         </w:rPr>
       </w:pPr>
-      <w:hyperlink w:anchor="_Toc240003292" w:history="1">
+      <w:hyperlink w:anchor="_Toc240045506" w:history="1">
         <w:r>
           <w:rPr>
             <w:rStyle w:val="aff1"/>
@@ -3854,7 +3854,7 @@
             <w:noProof/>
             <w:webHidden/>
           </w:rPr>
-          <w:instrText xml:space="preserve"> PAGEREF _Toc240003292 \h </w:instrText>
+          <w:instrText xml:space="preserve"> PAGEREF _Toc240045506 \h </w:instrText>
         </w:r>
         <w:r>
           <w:rPr>
@@ -3902,7 +3902,7 @@
           <w14:ligatures w14:val="standardContextual"/>
         </w:rPr>
       </w:pPr>
-      <w:hyperlink w:anchor="_Toc240003293" w:history="1">
+      <w:hyperlink w:anchor="_Toc240045507" w:history="1">
         <w:r>
           <w:rPr>
             <w:rStyle w:val="aff1"/>
@@ -3929,7 +3929,7 @@
             <w:noProof/>
             <w:webHidden/>
           </w:rPr>
-          <w:instrText xml:space="preserve"> PAGEREF _Toc240003293 \h </w:instrText>
+          <w:instrText xml:space="preserve"> PAGEREF _Toc240045507 \h </w:instrText>
         </w:r>
         <w:r>
           <w:rPr>
@@ -3978,7 +3978,7 @@
           <w14:ligatures w14:val="standardContextual"/>
         </w:rPr>
       </w:pPr>
-      <w:hyperlink w:anchor="_Toc240003294" w:history="1">
+      <w:hyperlink w:anchor="_Toc240045508" w:history="1">
         <w:r>
           <w:rPr>
             <w:rStyle w:val="aff1"/>
@@ -4005,7 +4005,83 @@
             <w:noProof/>
             <w:webHidden/>
           </w:rPr>
-          <w:instrText xml:space="preserve"> PAGEREF _Toc240003294 \h </w:instrText>
+          <w:instrText xml:space="preserve"> PAGEREF _Toc240045508 \h </w:instrText>
+        </w:r>
+        <w:r>
+          <w:rPr>
+            <w:noProof/>
+            <w:webHidden/>
+          </w:rPr>
+        </w:r>
+        <w:r>
+          <w:rPr>
+            <w:noProof/>
+            <w:webHidden/>
+          </w:rPr>
+          <w:fldChar w:fldCharType="separate"/>
+        </w:r>
+        <w:r>
+          <w:rPr>
+            <w:noProof/>
+            <w:webHidden/>
+          </w:rPr>
+          <w:t>23</w:t>
+        </w:r>
+        <w:r>
+          <w:rPr>
+            <w:noProof/>
+            <w:webHidden/>
+          </w:rPr>
+          <w:fldChar w:fldCharType="end"/>
+        </w:r>
+      </w:hyperlink>
+    </w:p>
+    <w:p>
+      <w:pPr>
+        <w:pStyle w:val="36"/>
+        <w:tabs>
+          <w:tab w:val="right" w:leader="dot" w:pos="9856"/>
+        </w:tabs>
+        <w:ind w:left="840"/>
+        <w:rPr>
+          <w:rFonts w:asciiTheme="minorHAnsi" w:eastAsiaTheme="minorEastAsia" w:hAnsiTheme="minorHAnsi" w:cstheme="minorBidi"/>
+          <w:noProof/>
+          <w:color w:val="auto"/>
+          <w:kern w:val="2"/>
+          <w:sz w:val="22"/>
+          <w:szCs w:val="24"/>
+          <w:lang w:eastAsia="ko-KR"/>
+          <w14:ligatures w14:val="standardContextual"/>
+        </w:rPr>
+      </w:pPr>
+      <w:hyperlink w:anchor="_Toc240045509" w:history="1">
+        <w:r>
+          <w:rPr>
+            <w:rStyle w:val="aff1"/>
+            <w:noProof/>
+          </w:rPr>
+          <w:t>전시 배치의 다양성과 관람 리듬</w:t>
+        </w:r>
+        <w:r>
+          <w:rPr>
+            <w:noProof/>
+            <w:webHidden/>
+          </w:rPr>
+          <w:tab/>
+        </w:r>
+        <w:r>
+          <w:rPr>
+            <w:noProof/>
+            <w:webHidden/>
+          </w:rPr>
+          <w:fldChar w:fldCharType="begin"/>
+        </w:r>
+        <w:r>
+          <w:rPr>
+            <w:noProof/>
+            <w:webHidden/>
+          </w:rPr>
+          <w:instrText xml:space="preserve"> PAGEREF _Toc240045509 \h </w:instrText>
         </w:r>
         <w:r>
           <w:rPr>
@@ -4054,7 +4130,7 @@
           <w14:ligatures w14:val="standardContextual"/>
         </w:rPr>
       </w:pPr>
-      <w:hyperlink w:anchor="_Toc240003295" w:history="1">
+      <w:hyperlink w:anchor="_Toc240045510" w:history="1">
         <w:r>
           <w:rPr>
             <w:rStyle w:val="aff1"/>
@@ -4081,7 +4157,7 @@
             <w:noProof/>
             <w:webHidden/>
           </w:rPr>
-          <w:instrText xml:space="preserve"> PAGEREF _Toc240003295 \h </w:instrText>
+          <w:instrText xml:space="preserve"> PAGEREF _Toc240045510 \h </w:instrText>
         </w:r>
         <w:r>
           <w:rPr>
@@ -4101,7 +4177,7 @@
             <w:noProof/>
             <w:webHidden/>
           </w:rPr>
-          <w:t>23</w:t>
+          <w:t>24</w:t>
         </w:r>
         <w:r>
           <w:rPr>
@@ -4130,7 +4206,7 @@
           <w14:ligatures w14:val="standardContextual"/>
         </w:rPr>
       </w:pPr>
-      <w:hyperlink w:anchor="_Toc240003296" w:history="1">
+      <w:hyperlink w:anchor="_Toc240045511" w:history="1">
         <w:r>
           <w:rPr>
             <w:rStyle w:val="aff1"/>
@@ -4157,7 +4233,7 @@
             <w:noProof/>
             <w:webHidden/>
           </w:rPr>
-          <w:instrText xml:space="preserve"> PAGEREF _Toc240003296 \h </w:instrText>
+          <w:instrText xml:space="preserve"> PAGEREF _Toc240045511 \h </w:instrText>
         </w:r>
         <w:r>
           <w:rPr>
@@ -4206,7 +4282,7 @@
           <w14:ligatures w14:val="standardContextual"/>
         </w:rPr>
       </w:pPr>
-      <w:hyperlink w:anchor="_Toc240003297" w:history="1">
+      <w:hyperlink w:anchor="_Toc240045512" w:history="1">
         <w:r>
           <w:rPr>
             <w:rStyle w:val="aff1"/>
@@ -4233,7 +4309,7 @@
             <w:noProof/>
             <w:webHidden/>
           </w:rPr>
-          <w:instrText xml:space="preserve"> PAGEREF _Toc240003297 \h </w:instrText>
+          <w:instrText xml:space="preserve"> PAGEREF _Toc240045512 \h </w:instrText>
         </w:r>
         <w:r>
           <w:rPr>
@@ -4282,7 +4358,7 @@
           <w14:ligatures w14:val="standardContextual"/>
         </w:rPr>
       </w:pPr>
-      <w:hyperlink w:anchor="_Toc240003298" w:history="1">
+      <w:hyperlink w:anchor="_Toc240045513" w:history="1">
         <w:r>
           <w:rPr>
             <w:rStyle w:val="aff1"/>
@@ -4309,7 +4385,7 @@
             <w:noProof/>
             <w:webHidden/>
           </w:rPr>
-          <w:instrText xml:space="preserve"> PAGEREF _Toc240003298 \h </w:instrText>
+          <w:instrText xml:space="preserve"> PAGEREF _Toc240045513 \h </w:instrText>
         </w:r>
         <w:r>
           <w:rPr>
@@ -4358,7 +4434,7 @@
           <w14:ligatures w14:val="standardContextual"/>
         </w:rPr>
       </w:pPr>
-      <w:hyperlink w:anchor="_Toc240003299" w:history="1">
+      <w:hyperlink w:anchor="_Toc240045514" w:history="1">
         <w:r>
           <w:rPr>
             <w:rStyle w:val="aff1"/>
@@ -4385,7 +4461,7 @@
             <w:noProof/>
             <w:webHidden/>
           </w:rPr>
-          <w:instrText xml:space="preserve"> PAGEREF _Toc240003299 \h </w:instrText>
+          <w:instrText xml:space="preserve"> PAGEREF _Toc240045514 \h </w:instrText>
         </w:r>
         <w:r>
           <w:rPr>
@@ -4434,7 +4510,7 @@
           <w14:ligatures w14:val="standardContextual"/>
         </w:rPr>
       </w:pPr>
-      <w:hyperlink w:anchor="_Toc240003300" w:history="1">
+      <w:hyperlink w:anchor="_Toc240045515" w:history="1">
         <w:r>
           <w:rPr>
             <w:rStyle w:val="aff1"/>
@@ -4461,7 +4537,7 @@
             <w:noProof/>
             <w:webHidden/>
           </w:rPr>
-          <w:instrText xml:space="preserve"> PAGEREF _Toc240003300 \h </w:instrText>
+          <w:instrText xml:space="preserve"> PAGEREF _Toc240045515 \h </w:instrText>
         </w:r>
         <w:r>
           <w:rPr>
@@ -4510,7 +4586,7 @@
           <w14:ligatures w14:val="standardContextual"/>
         </w:rPr>
       </w:pPr>
-      <w:hyperlink w:anchor="_Toc240003301" w:history="1">
+      <w:hyperlink w:anchor="_Toc240045516" w:history="1">
         <w:r>
           <w:rPr>
             <w:rStyle w:val="aff1"/>
@@ -4537,7 +4613,7 @@
             <w:noProof/>
             <w:webHidden/>
           </w:rPr>
-          <w:instrText xml:space="preserve"> PAGEREF _Toc240003301 \h </w:instrText>
+          <w:instrText xml:space="preserve"> PAGEREF _Toc240045516 \h </w:instrText>
         </w:r>
         <w:r>
           <w:rPr>
@@ -4585,7 +4661,7 @@
           <w14:ligatures w14:val="standardContextual"/>
         </w:rPr>
       </w:pPr>
-      <w:hyperlink w:anchor="_Toc240003302" w:history="1">
+      <w:hyperlink w:anchor="_Toc240045517" w:history="1">
         <w:r>
           <w:rPr>
             <w:rStyle w:val="aff1"/>
@@ -4612,7 +4688,7 @@
             <w:noProof/>
             <w:webHidden/>
           </w:rPr>
-          <w:instrText xml:space="preserve"> PAGEREF _Toc240003302 \h </w:instrText>
+          <w:instrText xml:space="preserve"> PAGEREF _Toc240045517 \h </w:instrText>
         </w:r>
         <w:r>
           <w:rPr>
@@ -4661,7 +4737,7 @@
           <w14:ligatures w14:val="standardContextual"/>
         </w:rPr>
       </w:pPr>
-      <w:hyperlink w:anchor="_Toc240003303" w:history="1">
+      <w:hyperlink w:anchor="_Toc240045518" w:history="1">
         <w:r>
           <w:rPr>
             <w:rStyle w:val="aff1"/>
@@ -4688,7 +4764,7 @@
             <w:noProof/>
             <w:webHidden/>
           </w:rPr>
-          <w:instrText xml:space="preserve"> PAGEREF _Toc240003303 \h </w:instrText>
+          <w:instrText xml:space="preserve"> PAGEREF _Toc240045518 \h </w:instrText>
         </w:r>
         <w:r>
           <w:rPr>
@@ -4737,7 +4813,7 @@
           <w14:ligatures w14:val="standardContextual"/>
         </w:rPr>
       </w:pPr>
-      <w:hyperlink w:anchor="_Toc240003304" w:history="1">
+      <w:hyperlink w:anchor="_Toc240045519" w:history="1">
         <w:r>
           <w:rPr>
             <w:rStyle w:val="aff1"/>
@@ -4764,7 +4840,7 @@
             <w:noProof/>
             <w:webHidden/>
           </w:rPr>
-          <w:instrText xml:space="preserve"> PAGEREF _Toc240003304 \h </w:instrText>
+          <w:instrText xml:space="preserve"> PAGEREF _Toc240045519 \h </w:instrText>
         </w:r>
         <w:r>
           <w:rPr>
@@ -4813,7 +4889,7 @@
           <w14:ligatures w14:val="standardContextual"/>
         </w:rPr>
       </w:pPr>
-      <w:hyperlink w:anchor="_Toc240003305" w:history="1">
+      <w:hyperlink w:anchor="_Toc240045520" w:history="1">
         <w:r>
           <w:rPr>
             <w:rStyle w:val="aff1"/>
@@ -4840,7 +4916,7 @@
             <w:noProof/>
             <w:webHidden/>
           </w:rPr>
-          <w:instrText xml:space="preserve"> PAGEREF _Toc240003305 \h </w:instrText>
+          <w:instrText xml:space="preserve"> PAGEREF _Toc240045520 \h </w:instrText>
         </w:r>
         <w:r>
           <w:rPr>
@@ -4889,7 +4965,7 @@
           <w14:ligatures w14:val="standardContextual"/>
         </w:rPr>
       </w:pPr>
-      <w:hyperlink w:anchor="_Toc240003306" w:history="1">
+      <w:hyperlink w:anchor="_Toc240045521" w:history="1">
         <w:r>
           <w:rPr>
             <w:rStyle w:val="aff1"/>
@@ -4916,7 +4992,7 @@
             <w:noProof/>
             <w:webHidden/>
           </w:rPr>
-          <w:instrText xml:space="preserve"> PAGEREF _Toc240003306 \h </w:instrText>
+          <w:instrText xml:space="preserve"> PAGEREF _Toc240045521 \h </w:instrText>
         </w:r>
         <w:r>
           <w:rPr>
@@ -4965,7 +5041,7 @@
           <w14:ligatures w14:val="standardContextual"/>
         </w:rPr>
       </w:pPr>
-      <w:hyperlink w:anchor="_Toc240003307" w:history="1">
+      <w:hyperlink w:anchor="_Toc240045522" w:history="1">
         <w:r>
           <w:rPr>
             <w:rStyle w:val="aff1"/>
@@ -4992,7 +5068,7 @@
             <w:noProof/>
             <w:webHidden/>
           </w:rPr>
-          <w:instrText xml:space="preserve"> PAGEREF _Toc240003307 \h </w:instrText>
+          <w:instrText xml:space="preserve"> PAGEREF _Toc240045522 \h </w:instrText>
         </w:r>
         <w:r>
           <w:rPr>
@@ -5041,7 +5117,7 @@
           <w14:ligatures w14:val="standardContextual"/>
         </w:rPr>
       </w:pPr>
-      <w:hyperlink w:anchor="_Toc240003308" w:history="1">
+      <w:hyperlink w:anchor="_Toc240045523" w:history="1">
         <w:r>
           <w:rPr>
             <w:rStyle w:val="aff1"/>
@@ -5068,7 +5144,7 @@
             <w:noProof/>
             <w:webHidden/>
           </w:rPr>
-          <w:instrText xml:space="preserve"> PAGEREF _Toc240003308 \h </w:instrText>
+          <w:instrText xml:space="preserve"> PAGEREF _Toc240045523 \h </w:instrText>
         </w:r>
         <w:r>
           <w:rPr>
@@ -5117,7 +5193,7 @@
           <w14:ligatures w14:val="standardContextual"/>
         </w:rPr>
       </w:pPr>
-      <w:hyperlink w:anchor="_Toc240003309" w:history="1">
+      <w:hyperlink w:anchor="_Toc240045524" w:history="1">
         <w:r>
           <w:rPr>
             <w:rStyle w:val="aff1"/>
@@ -5144,7 +5220,7 @@
             <w:noProof/>
             <w:webHidden/>
           </w:rPr>
-          <w:instrText xml:space="preserve"> PAGEREF _Toc240003309 \h </w:instrText>
+          <w:instrText xml:space="preserve"> PAGEREF _Toc240045524 \h </w:instrText>
         </w:r>
         <w:r>
           <w:rPr>
@@ -5192,7 +5268,7 @@
           <w14:ligatures w14:val="standardContextual"/>
         </w:rPr>
       </w:pPr>
-      <w:hyperlink w:anchor="_Toc240003310" w:history="1">
+      <w:hyperlink w:anchor="_Toc240045525" w:history="1">
         <w:r>
           <w:rPr>
             <w:rStyle w:val="aff1"/>
@@ -5219,7 +5295,7 @@
             <w:noProof/>
             <w:webHidden/>
           </w:rPr>
-          <w:instrText xml:space="preserve"> PAGEREF _Toc240003310 \h </w:instrText>
+          <w:instrText xml:space="preserve"> PAGEREF _Toc240045525 \h </w:instrText>
         </w:r>
         <w:r>
           <w:rPr>
@@ -5267,7 +5343,7 @@
           <w14:ligatures w14:val="standardContextual"/>
         </w:rPr>
       </w:pPr>
-      <w:hyperlink w:anchor="_Toc240003311" w:history="1">
+      <w:hyperlink w:anchor="_Toc240045526" w:history="1">
         <w:r>
           <w:rPr>
             <w:rStyle w:val="aff1"/>
@@ -5294,7 +5370,7 @@
             <w:noProof/>
             <w:webHidden/>
           </w:rPr>
-          <w:instrText xml:space="preserve"> PAGEREF _Toc240003311 \h </w:instrText>
+          <w:instrText xml:space="preserve"> PAGEREF _Toc240045526 \h </w:instrText>
         </w:r>
         <w:r>
           <w:rPr>
@@ -5342,7 +5418,7 @@
           <w14:ligatures w14:val="standardContextual"/>
         </w:rPr>
       </w:pPr>
-      <w:hyperlink w:anchor="_Toc240003312" w:history="1">
+      <w:hyperlink w:anchor="_Toc240045527" w:history="1">
         <w:r>
           <w:rPr>
             <w:rStyle w:val="aff1"/>
@@ -5369,7 +5445,7 @@
             <w:noProof/>
             <w:webHidden/>
           </w:rPr>
-          <w:instrText xml:space="preserve"> PAGEREF _Toc240003312 \h </w:instrText>
+          <w:instrText xml:space="preserve"> PAGEREF _Toc240045527 \h </w:instrText>
         </w:r>
         <w:r>
           <w:rPr>
@@ -5419,7 +5495,7 @@
           <w:numId w:val="7"/>
         </w:numPr>
       </w:pPr>
-      <w:bookmarkStart w:id="0" w:name="_Toc240003249"/>
+      <w:bookmarkStart w:id="0" w:name="_Toc240045463"/>
       <w:r>
         <w:lastRenderedPageBreak/>
         <w:t>게임</w:t>
@@ -5452,7 +5528,7 @@
           <w:numId w:val="7"/>
         </w:numPr>
       </w:pPr>
-      <w:bookmarkStart w:id="1" w:name="_Toc240003250"/>
+      <w:bookmarkStart w:id="1" w:name="_Toc240045464"/>
       <w:r>
         <w:t>Executive Summary</w:t>
       </w:r>
@@ -5523,7 +5599,7 @@
           <w:numId w:val="7"/>
         </w:numPr>
       </w:pPr>
-      <w:bookmarkStart w:id="2" w:name="_Toc240003251"/>
+      <w:bookmarkStart w:id="2" w:name="_Toc240045465"/>
       <w:r>
         <w:t>Rev 16 Release Profile</w:t>
       </w:r>
@@ -5547,7 +5623,7 @@
           <w:numId w:val="7"/>
         </w:numPr>
       </w:pPr>
-      <w:bookmarkStart w:id="3" w:name="_Toc240003252"/>
+      <w:bookmarkStart w:id="3" w:name="_Toc240045466"/>
       <w:r>
         <w:t>제품</w:t>
       </w:r>
@@ -5837,7 +5913,7 @@
           <w:numId w:val="7"/>
         </w:numPr>
       </w:pPr>
-      <w:bookmarkStart w:id="4" w:name="_Toc240003253"/>
+      <w:bookmarkStart w:id="4" w:name="_Toc240045467"/>
       <w:r>
         <w:t>디자인</w:t>
       </w:r>
@@ -6207,7 +6283,7 @@
           <w:numId w:val="7"/>
         </w:numPr>
       </w:pPr>
-      <w:bookmarkStart w:id="5" w:name="_Toc240003254"/>
+      <w:bookmarkStart w:id="5" w:name="_Toc240045468"/>
       <w:r>
         <w:t>Target Experience</w:t>
       </w:r>
@@ -6281,7 +6357,7 @@
           <w:numId w:val="7"/>
         </w:numPr>
       </w:pPr>
-      <w:bookmarkStart w:id="6" w:name="_Toc240003255"/>
+      <w:bookmarkStart w:id="6" w:name="_Toc240045469"/>
       <w:r>
         <w:t>명시적</w:t>
       </w:r>
@@ -6553,7 +6629,7 @@
           <w:numId w:val="7"/>
         </w:numPr>
       </w:pPr>
-      <w:bookmarkStart w:id="7" w:name="_Toc240003256"/>
+      <w:bookmarkStart w:id="7" w:name="_Toc240045470"/>
       <w:r>
         <w:lastRenderedPageBreak/>
         <w:t>Contract Run</w:t>
@@ -6589,7 +6665,7 @@
           <w:numId w:val="7"/>
         </w:numPr>
       </w:pPr>
-      <w:bookmarkStart w:id="8" w:name="_Toc240003257"/>
+      <w:bookmarkStart w:id="8" w:name="_Toc240045471"/>
       <w:r>
         <w:t>Core Loop</w:t>
       </w:r>
@@ -7083,7 +7159,7 @@
           <w:numId w:val="7"/>
         </w:numPr>
       </w:pPr>
-      <w:bookmarkStart w:id="9" w:name="_Toc240003258"/>
+      <w:bookmarkStart w:id="9" w:name="_Toc240045472"/>
       <w:r>
         <w:t xml:space="preserve">Contract </w:t>
       </w:r>
@@ -7507,7 +7583,7 @@
           <w:numId w:val="7"/>
         </w:numPr>
       </w:pPr>
-      <w:bookmarkStart w:id="10" w:name="_Toc240003259"/>
+      <w:bookmarkStart w:id="10" w:name="_Toc240045473"/>
       <w:r>
         <w:lastRenderedPageBreak/>
         <w:t>성공</w:t>
@@ -7799,7 +7875,7 @@
           <w:numId w:val="7"/>
         </w:numPr>
       </w:pPr>
-      <w:bookmarkStart w:id="11" w:name="_Toc240003260"/>
+      <w:bookmarkStart w:id="11" w:name="_Toc240045474"/>
       <w:r>
         <w:t>Greed Decision</w:t>
       </w:r>
@@ -8168,7 +8244,7 @@
           <w:numId w:val="7"/>
         </w:numPr>
       </w:pPr>
-      <w:bookmarkStart w:id="12" w:name="_Toc240003261"/>
+      <w:bookmarkStart w:id="12" w:name="_Toc240045475"/>
       <w:r>
         <w:t>15~25</w:t>
       </w:r>
@@ -8538,7 +8614,7 @@
           <w:numId w:val="7"/>
         </w:numPr>
       </w:pPr>
-      <w:bookmarkStart w:id="13" w:name="_Toc240003262"/>
+      <w:bookmarkStart w:id="13" w:name="_Toc240045476"/>
       <w:r>
         <w:lastRenderedPageBreak/>
         <w:t>위조와</w:t>
@@ -8565,7 +8641,7 @@
           <w:numId w:val="7"/>
         </w:numPr>
       </w:pPr>
-      <w:bookmarkStart w:id="14" w:name="_Toc240003263"/>
+      <w:bookmarkStart w:id="14" w:name="_Toc240045477"/>
       <w:r>
         <w:t>Artifact</w:t>
       </w:r>
@@ -8855,7 +8931,7 @@
     </w:p>
     <w:p>
       <w:r>
-        <w:t>각 맵은 탈취 가능한 20점 외에 상호작용하지 않는 일반 전시물을 함께 배치한다. 일반 전시물은 얇은 액자와 작은 연작으로 공간을 구성하고, 탈취 가능한 작품은 두꺼운 프레임과 하단 보안 패널로 접근 전에 구별한다. 색상만으로 구분하지 않으며, 근거리 행동 안내는 탈취 대상에만 표시한다. 필수 작품은 기존 계약 단서와 발견 표시를 따른다.</w:t>
+        <w:t>각 맵은 탈취 가능한 20점 외에 상호작용하지 않는 일반 전시물을 함께 배치한다. 일반 전시물은 단독·연작·다단 군집으로 전시실을 구성하고 탈취 대상과 같거나 더 큰 작품도 포함한다. 탈취 가능한 작품은 두꺼운 프레임과 하단 보안 패널로 접근 전에 구별한다. 작품 크기, 중앙 위치 또는 양옆의 일반 작품 수가 정답을 드러내는 고정 패턴을 사용하지 않는다. 근거리 행동 안내는 탈취 대상에만 표시하며, 필수 작품은 기존 계약 단서와 발견 표시를 따른다.</w:t>
       </w:r>
     </w:p>
     <w:p>
@@ -8866,7 +8942,7 @@
           <w:numId w:val="7"/>
         </w:numPr>
       </w:pPr>
-      <w:bookmarkStart w:id="15" w:name="_Toc240003264"/>
+      <w:bookmarkStart w:id="15" w:name="_Toc240045478"/>
       <w:r>
         <w:t xml:space="preserve">Surface Forgery </w:t>
       </w:r>
@@ -8902,11 +8978,11 @@
         </w:numPr>
       </w:pPr>
       <w:r>
-        <w:t xml:space="preserve">World View가 완전히 가려진 Full-Screen 화면으로 전환된다. World Audio와 팀 음성은 유지하지만 Alert/Lockdown 상세 정보는 작업 화면에 중복 표시하지 않는다. Suspicious/Searching에서는 현재 작업을 유지한다. Alarmed/Lockdown 진입 시 서버가 작업 </w:t>
+        <w:t xml:space="preserve">World View가 완전히 가려진 Full-Screen 화면으로 전환된다. World Audio와 팀 음성은 유지하지만 Alert/Lockdown 상세 정보는 작업 화면에 중복 표시하지 않는다. </w:t>
       </w:r>
       <w:r>
         <w:lastRenderedPageBreak/>
-        <w:t>Session을 먼저 취소하고 화면을 닫아 이동·시점·탈출 판단을 즉시 복원하며, 위험 단계에서는 신규 작업 진입을 허용하지 않는다.</w:t>
+        <w:t>Suspicious/Searching에서는 현재 작업을 유지한다. Alarmed/Lockdown 진입 시 서버가 작업 Session을 먼저 취소하고 화면을 닫아 이동·시점·탈출 판단을 즉시 복원하며, 위험 단계에서는 신규 작업 진입을 허용하지 않는다.</w:t>
       </w:r>
     </w:p>
     <w:p>
@@ -9051,7 +9127,7 @@
           <w:numId w:val="7"/>
         </w:numPr>
       </w:pPr>
-      <w:bookmarkStart w:id="16" w:name="_Toc240003265"/>
+      <w:bookmarkStart w:id="16" w:name="_Toc240045479"/>
       <w:r>
         <w:t>Object Assembly — Deferred Expansion</w:t>
       </w:r>
@@ -9078,6 +9154,7 @@
         </w:numPr>
       </w:pPr>
       <w:r>
+        <w:lastRenderedPageBreak/>
         <w:t>v1.0에서는 Object Assembly를 Required Target 또는 Optional Exhibit Pool에 넣지 않고, 활성 Object Display Case·Assembly Widget·Result 열을 Player에게 노출하지 않는다.</w:t>
       </w:r>
     </w:p>
@@ -9090,7 +9167,6 @@
         </w:numPr>
       </w:pPr>
       <w:r>
-        <w:lastRenderedPageBreak/>
         <w:t>보존된 Assembly 경로는 Compile·Load·Cleanup과 Serialization 호환만 유지하며, 신규 Kit·Template·UI·Gameplay 확장은 진행하지 않는다.</w:t>
       </w:r>
     </w:p>
@@ -9119,7 +9195,7 @@
           <w:numId w:val="7"/>
         </w:numPr>
       </w:pPr>
-      <w:bookmarkStart w:id="17" w:name="_Toc240003266"/>
+      <w:bookmarkStart w:id="17" w:name="_Toc240045480"/>
       <w:r>
         <w:t>Quality</w:t>
       </w:r>
@@ -9408,7 +9484,7 @@
           <w:numId w:val="7"/>
         </w:numPr>
       </w:pPr>
-      <w:bookmarkStart w:id="18" w:name="_Toc240003267"/>
+      <w:bookmarkStart w:id="18" w:name="_Toc240045481"/>
       <w:r>
         <w:t>핵심</w:t>
       </w:r>
@@ -9910,7 +9986,7 @@
           <w:numId w:val="7"/>
         </w:numPr>
       </w:pPr>
-      <w:bookmarkStart w:id="19" w:name="_Toc240003268"/>
+      <w:bookmarkStart w:id="19" w:name="_Toc240045482"/>
       <w:r>
         <w:t xml:space="preserve">Owner-only Forgery </w:t>
       </w:r>
@@ -10157,7 +10233,7 @@
           <w:numId w:val="7"/>
         </w:numPr>
       </w:pPr>
-      <w:bookmarkStart w:id="20" w:name="_Toc240003269"/>
+      <w:bookmarkStart w:id="20" w:name="_Toc240045483"/>
       <w:r>
         <w:lastRenderedPageBreak/>
         <w:t>잠입</w:t>
@@ -10190,7 +10266,7 @@
           <w:numId w:val="7"/>
         </w:numPr>
       </w:pPr>
-      <w:bookmarkStart w:id="21" w:name="_Toc240003270"/>
+      <w:bookmarkStart w:id="21" w:name="_Toc240045484"/>
       <w:r>
         <w:t xml:space="preserve">First-Person </w:t>
       </w:r>
@@ -10255,7 +10331,7 @@
           <w:numId w:val="7"/>
         </w:numPr>
       </w:pPr>
-      <w:bookmarkStart w:id="22" w:name="_Toc240003271"/>
+      <w:bookmarkStart w:id="22" w:name="_Toc240045485"/>
       <w:r>
         <w:t>Walk, Sprint, Weight, Footstep</w:t>
       </w:r>
@@ -10598,7 +10674,7 @@
           <w:numId w:val="7"/>
         </w:numPr>
       </w:pPr>
-      <w:bookmarkStart w:id="23" w:name="_Toc240003272"/>
+      <w:bookmarkStart w:id="23" w:name="_Toc240045486"/>
       <w:r>
         <w:t>Patrol Guard</w:t>
       </w:r>
@@ -10949,7 +11025,7 @@
           <w:numId w:val="7"/>
         </w:numPr>
       </w:pPr>
-      <w:bookmarkStart w:id="24" w:name="_Toc240003273"/>
+      <w:bookmarkStart w:id="24" w:name="_Toc240045487"/>
       <w:r>
         <w:t>CCTV</w:t>
       </w:r>
@@ -11199,7 +11275,7 @@
           <w:numId w:val="7"/>
         </w:numPr>
       </w:pPr>
-      <w:bookmarkStart w:id="25" w:name="_Toc240003274"/>
+      <w:bookmarkStart w:id="25" w:name="_Toc240045488"/>
       <w:r>
         <w:lastRenderedPageBreak/>
         <w:t>Stun, Arrest, Recovery</w:t>
@@ -11274,7 +11350,7 @@
           <w:numId w:val="7"/>
         </w:numPr>
       </w:pPr>
-      <w:bookmarkStart w:id="26" w:name="_Toc240003275"/>
+      <w:bookmarkStart w:id="26" w:name="_Toc240045489"/>
       <w:r>
         <w:t>두</w:t>
       </w:r>
@@ -11750,7 +11826,7 @@
           <w:numId w:val="7"/>
         </w:numPr>
       </w:pPr>
-      <w:bookmarkStart w:id="27" w:name="_Toc240003276"/>
+      <w:bookmarkStart w:id="27" w:name="_Toc240045490"/>
       <w:r>
         <w:lastRenderedPageBreak/>
         <w:t>협동</w:t>
@@ -11777,7 +11853,7 @@
           <w:numId w:val="7"/>
         </w:numPr>
       </w:pPr>
-      <w:bookmarkStart w:id="28" w:name="_Toc240003277"/>
+      <w:bookmarkStart w:id="28" w:name="_Toc240045491"/>
       <w:r>
         <w:t>Role Switching</w:t>
       </w:r>
@@ -12185,7 +12261,7 @@
           <w:numId w:val="7"/>
         </w:numPr>
       </w:pPr>
-      <w:bookmarkStart w:id="29" w:name="_Toc240003278"/>
+      <w:bookmarkStart w:id="29" w:name="_Toc240045492"/>
       <w:r>
         <w:t>거리</w:t>
       </w:r>
@@ -12244,7 +12320,7 @@
           <w:numId w:val="7"/>
         </w:numPr>
       </w:pPr>
-      <w:bookmarkStart w:id="30" w:name="_Toc240003279"/>
+      <w:bookmarkStart w:id="30" w:name="_Toc240045493"/>
       <w:r>
         <w:t>Inventory, Loose Loot, Coin</w:t>
       </w:r>
@@ -12307,7 +12383,7 @@
           <w:numId w:val="7"/>
         </w:numPr>
       </w:pPr>
-      <w:bookmarkStart w:id="31" w:name="_Toc240003280"/>
+      <w:bookmarkStart w:id="31" w:name="_Toc240045494"/>
       <w:r>
         <w:t>Player Identity</w:t>
       </w:r>
@@ -12730,7 +12806,7 @@
           <w:numId w:val="7"/>
         </w:numPr>
       </w:pPr>
-      <w:bookmarkStart w:id="32" w:name="_Toc240003281"/>
+      <w:bookmarkStart w:id="32" w:name="_Toc240045495"/>
       <w:r>
         <w:t xml:space="preserve">Floor Plan Map </w:t>
       </w:r>
@@ -12942,7 +13018,7 @@
           <w:numId w:val="7"/>
         </w:numPr>
       </w:pPr>
-      <w:bookmarkStart w:id="33" w:name="_Toc240003282"/>
+      <w:bookmarkStart w:id="33" w:name="_Toc240045496"/>
       <w:r>
         <w:t>Shared Extraction</w:t>
       </w:r>
@@ -13022,7 +13098,7 @@
           <w:numId w:val="7"/>
         </w:numPr>
       </w:pPr>
-      <w:bookmarkStart w:id="34" w:name="_Toc240003283"/>
+      <w:bookmarkStart w:id="34" w:name="_Toc240045497"/>
       <w:r>
         <w:lastRenderedPageBreak/>
         <w:t xml:space="preserve">UI, </w:t>
@@ -13046,7 +13122,7 @@
           <w:numId w:val="7"/>
         </w:numPr>
       </w:pPr>
-      <w:bookmarkStart w:id="35" w:name="_Toc240003284"/>
+      <w:bookmarkStart w:id="35" w:name="_Toc240045498"/>
       <w:r>
         <w:t>HUD Information Architecture</w:t>
       </w:r>
@@ -13347,7 +13423,7 @@
           <w:numId w:val="7"/>
         </w:numPr>
       </w:pPr>
-      <w:bookmarkStart w:id="36" w:name="_Toc240003285"/>
+      <w:bookmarkStart w:id="36" w:name="_Toc240045499"/>
       <w:r>
         <w:t xml:space="preserve">Main HUD </w:t>
       </w:r>
@@ -13656,7 +13732,7 @@
           <w:numId w:val="7"/>
         </w:numPr>
       </w:pPr>
-      <w:bookmarkStart w:id="37" w:name="_Toc240003286"/>
+      <w:bookmarkStart w:id="37" w:name="_Toc240045500"/>
       <w:r>
         <w:lastRenderedPageBreak/>
         <w:t>최소</w:t>
@@ -13738,7 +13814,7 @@
           <w:numId w:val="7"/>
         </w:numPr>
       </w:pPr>
-      <w:bookmarkStart w:id="38" w:name="_Toc240003287"/>
+      <w:bookmarkStart w:id="38" w:name="_Toc240045501"/>
       <w:r>
         <w:t xml:space="preserve">Input Mode </w:t>
       </w:r>
@@ -14218,7 +14294,7 @@
           <w:numId w:val="7"/>
         </w:numPr>
       </w:pPr>
-      <w:bookmarkStart w:id="39" w:name="_Toc240003288"/>
+      <w:bookmarkStart w:id="39" w:name="_Toc240045502"/>
       <w:r>
         <w:lastRenderedPageBreak/>
         <w:t>Floor Plan</w:t>
@@ -14242,7 +14318,7 @@
           <w:numId w:val="7"/>
         </w:numPr>
       </w:pPr>
-      <w:bookmarkStart w:id="40" w:name="_Toc240003289"/>
+      <w:bookmarkStart w:id="40" w:name="_Toc240045503"/>
       <w:r>
         <w:t xml:space="preserve">Floor Plan Map </w:t>
       </w:r>
@@ -14557,7 +14633,7 @@
           <w:numId w:val="7"/>
         </w:numPr>
       </w:pPr>
-      <w:bookmarkStart w:id="41" w:name="_Toc240003290"/>
+      <w:bookmarkStart w:id="41" w:name="_Toc240045504"/>
       <w:r>
         <w:t xml:space="preserve">Team Result / Replica Recap </w:t>
       </w:r>
@@ -14935,7 +15011,7 @@
           <w:numId w:val="7"/>
         </w:numPr>
       </w:pPr>
-      <w:bookmarkStart w:id="42" w:name="_Toc240003291"/>
+      <w:bookmarkStart w:id="42" w:name="_Toc240045505"/>
       <w:r>
         <w:t>첫</w:t>
       </w:r>
@@ -15209,7 +15285,7 @@
           <w:numId w:val="7"/>
         </w:numPr>
       </w:pPr>
-      <w:bookmarkStart w:id="43" w:name="_Toc240003292"/>
+      <w:bookmarkStart w:id="43" w:name="_Toc240045506"/>
       <w:r>
         <w:lastRenderedPageBreak/>
         <w:t>접근성</w:t>
@@ -15282,7 +15358,7 @@
           <w:numId w:val="7"/>
         </w:numPr>
       </w:pPr>
-      <w:bookmarkStart w:id="44" w:name="_Toc240003293"/>
+      <w:bookmarkStart w:id="44" w:name="_Toc240045507"/>
       <w:r>
         <w:lastRenderedPageBreak/>
         <w:t>레벨</w:t>
@@ -15315,7 +15391,7 @@
           <w:numId w:val="7"/>
         </w:numPr>
       </w:pPr>
-      <w:bookmarkStart w:id="45" w:name="_Toc240003294"/>
+      <w:bookmarkStart w:id="45" w:name="_Toc240045508"/>
       <w:r>
         <w:t>세</w:t>
       </w:r>
@@ -15423,13 +15499,973 @@
     </w:p>
     <w:p>
       <w:pPr>
+        <w:pStyle w:val="31"/>
+      </w:pPr>
+      <w:bookmarkStart w:id="46" w:name="_Toc240045509"/>
+      <w:r>
+        <w:t>전시</w:t>
+      </w:r>
+      <w:r>
+        <w:t xml:space="preserve"> </w:t>
+      </w:r>
+      <w:r>
+        <w:t>배치의</w:t>
+      </w:r>
+      <w:r>
+        <w:t xml:space="preserve"> </w:t>
+      </w:r>
+      <w:r>
+        <w:t>다양성과</w:t>
+      </w:r>
+      <w:r>
+        <w:t xml:space="preserve"> </w:t>
+      </w:r>
+      <w:r>
+        <w:t>관람</w:t>
+      </w:r>
+      <w:r>
+        <w:t xml:space="preserve"> </w:t>
+      </w:r>
+      <w:r>
+        <w:t>리듬</w:t>
+      </w:r>
+      <w:bookmarkEnd w:id="46"/>
+    </w:p>
+    <w:p>
+      <w:r>
+        <w:t>Barnes Foundation</w:t>
+      </w:r>
+      <w:r>
+        <w:t>의</w:t>
+      </w:r>
+      <w:r>
+        <w:t xml:space="preserve"> </w:t>
+      </w:r>
+      <w:r>
+        <w:t>앙상블</w:t>
+      </w:r>
+      <w:r>
+        <w:t>, MoMA</w:t>
+      </w:r>
+      <w:r>
+        <w:t>의</w:t>
+      </w:r>
+      <w:r>
+        <w:t xml:space="preserve"> Warhol </w:t>
+      </w:r>
+      <w:r>
+        <w:t>연속</w:t>
+      </w:r>
+      <w:r>
+        <w:t>·</w:t>
+      </w:r>
+      <w:r>
+        <w:t>격자</w:t>
+      </w:r>
+      <w:r>
+        <w:t xml:space="preserve"> </w:t>
+      </w:r>
+      <w:r>
+        <w:t>전시와</w:t>
+      </w:r>
+      <w:r>
+        <w:t xml:space="preserve"> Rothko </w:t>
+      </w:r>
+      <w:r>
+        <w:t>전시</w:t>
+      </w:r>
+      <w:r>
+        <w:t>, Wallace Collection</w:t>
+      </w:r>
+      <w:r>
+        <w:t>의</w:t>
+      </w:r>
+      <w:r>
+        <w:t xml:space="preserve"> </w:t>
+      </w:r>
+      <w:r>
+        <w:t>다단</w:t>
+      </w:r>
+      <w:r>
+        <w:t xml:space="preserve"> </w:t>
+      </w:r>
+      <w:r>
+        <w:t>전시</w:t>
+      </w:r>
+      <w:r>
+        <w:t xml:space="preserve"> </w:t>
+      </w:r>
+      <w:r>
+        <w:t>사진을</w:t>
+      </w:r>
+      <w:r>
+        <w:t xml:space="preserve"> </w:t>
+      </w:r>
+      <w:r>
+        <w:t>참고한다</w:t>
+      </w:r>
+      <w:r>
+        <w:t xml:space="preserve">. </w:t>
+      </w:r>
+      <w:r>
+        <w:t>다음</w:t>
+      </w:r>
+      <w:r>
+        <w:t xml:space="preserve"> 12</w:t>
+      </w:r>
+      <w:r>
+        <w:t>종은</w:t>
+      </w:r>
+      <w:r>
+        <w:t xml:space="preserve"> </w:t>
+      </w:r>
+      <w:r>
+        <w:t>관찰한</w:t>
+      </w:r>
+      <w:r>
+        <w:t xml:space="preserve"> </w:t>
+      </w:r>
+      <w:r>
+        <w:t>구성을</w:t>
+      </w:r>
+      <w:r>
+        <w:t xml:space="preserve"> </w:t>
+      </w:r>
+      <w:r>
+        <w:t>게임</w:t>
+      </w:r>
+      <w:r>
+        <w:t xml:space="preserve"> </w:t>
+      </w:r>
+      <w:r>
+        <w:t>공간에</w:t>
+      </w:r>
+      <w:r>
+        <w:t xml:space="preserve"> </w:t>
+      </w:r>
+      <w:r>
+        <w:t>맞게</w:t>
+      </w:r>
+      <w:r>
+        <w:t xml:space="preserve"> </w:t>
+      </w:r>
+      <w:r>
+        <w:t>재구성한</w:t>
+      </w:r>
+      <w:r>
+        <w:t xml:space="preserve"> </w:t>
+      </w:r>
+      <w:r>
+        <w:t>배치</w:t>
+      </w:r>
+      <w:r>
+        <w:t xml:space="preserve"> </w:t>
+      </w:r>
+      <w:r>
+        <w:t>유형이며</w:t>
+      </w:r>
+      <w:r>
+        <w:t xml:space="preserve"> </w:t>
+      </w:r>
+      <w:r>
+        <w:t>미술관의</w:t>
+      </w:r>
+      <w:r>
+        <w:t xml:space="preserve"> </w:t>
+      </w:r>
+      <w:r>
+        <w:t>공식</w:t>
+      </w:r>
+      <w:r>
+        <w:t xml:space="preserve"> </w:t>
+      </w:r>
+      <w:r>
+        <w:t>분류나</w:t>
+      </w:r>
+      <w:r>
+        <w:t xml:space="preserve"> </w:t>
+      </w:r>
+      <w:r>
+        <w:t>전시를</w:t>
+      </w:r>
+      <w:r>
+        <w:t xml:space="preserve"> </w:t>
+      </w:r>
+      <w:r>
+        <w:t>그대로</w:t>
+      </w:r>
+      <w:r>
+        <w:t xml:space="preserve"> </w:t>
+      </w:r>
+      <w:r>
+        <w:t>복제한</w:t>
+      </w:r>
+      <w:r>
+        <w:t xml:space="preserve"> </w:t>
+      </w:r>
+      <w:r>
+        <w:t>것이</w:t>
+      </w:r>
+      <w:r>
+        <w:t xml:space="preserve"> </w:t>
+      </w:r>
+      <w:r>
+        <w:t>아니다</w:t>
+      </w:r>
+      <w:r>
+        <w:t>.</w:t>
+      </w:r>
+    </w:p>
+    <w:p>
+      <w:pPr>
+        <w:pStyle w:val="a0"/>
+      </w:pPr>
+      <w:r>
+        <w:t>단독</w:t>
+      </w:r>
+      <w:r>
+        <w:t xml:space="preserve"> </w:t>
+      </w:r>
+      <w:r>
+        <w:t>여백형</w:t>
+      </w:r>
+      <w:r>
+        <w:t xml:space="preserve"> · </w:t>
+      </w:r>
+      <w:r>
+        <w:t>동등한</w:t>
+      </w:r>
+      <w:r>
+        <w:t xml:space="preserve"> 2</w:t>
+      </w:r>
+      <w:r>
+        <w:t>점형</w:t>
+      </w:r>
+      <w:r>
+        <w:t xml:space="preserve"> · </w:t>
+      </w:r>
+      <w:r>
+        <w:t>동일</w:t>
+      </w:r>
+      <w:r>
+        <w:t xml:space="preserve"> </w:t>
+      </w:r>
+      <w:r>
+        <w:t>높이</w:t>
+      </w:r>
+      <w:r>
+        <w:t xml:space="preserve"> 3</w:t>
+      </w:r>
+      <w:r>
+        <w:t>점</w:t>
+      </w:r>
+      <w:r>
+        <w:t xml:space="preserve"> </w:t>
+      </w:r>
+      <w:r>
+        <w:t>연작</w:t>
+      </w:r>
+      <w:r>
+        <w:t xml:space="preserve"> · </w:t>
+      </w:r>
+      <w:r>
+        <w:t>긴</w:t>
+      </w:r>
+      <w:r>
+        <w:t xml:space="preserve"> 5</w:t>
+      </w:r>
+      <w:r>
+        <w:t>점</w:t>
+      </w:r>
+      <w:r>
+        <w:t xml:space="preserve"> </w:t>
+      </w:r>
+      <w:r>
+        <w:t>연속형</w:t>
+      </w:r>
+      <w:r>
+        <w:t xml:space="preserve">: </w:t>
+      </w:r>
+      <w:r>
+        <w:t>여백과</w:t>
+      </w:r>
+      <w:r>
+        <w:t xml:space="preserve"> </w:t>
+      </w:r>
+      <w:r>
+        <w:t>관람</w:t>
+      </w:r>
+      <w:r>
+        <w:t xml:space="preserve"> </w:t>
+      </w:r>
+      <w:r>
+        <w:t>순서</w:t>
+      </w:r>
+      <w:r>
+        <w:t xml:space="preserve">, </w:t>
+      </w:r>
+      <w:r>
+        <w:t>반복</w:t>
+      </w:r>
+      <w:r>
+        <w:t xml:space="preserve"> </w:t>
+      </w:r>
+      <w:r>
+        <w:t>작품의</w:t>
+      </w:r>
+      <w:r>
+        <w:t xml:space="preserve"> </w:t>
+      </w:r>
+      <w:r>
+        <w:t>비교에</w:t>
+      </w:r>
+      <w:r>
+        <w:t xml:space="preserve"> </w:t>
+      </w:r>
+      <w:r>
+        <w:t>차이를</w:t>
+      </w:r>
+      <w:r>
+        <w:t xml:space="preserve"> </w:t>
+      </w:r>
+      <w:r>
+        <w:t>둔다</w:t>
+      </w:r>
+      <w:r>
+        <w:t>.</w:t>
+      </w:r>
+    </w:p>
+    <w:p>
+      <w:pPr>
+        <w:pStyle w:val="a0"/>
+      </w:pPr>
+      <w:r>
+        <w:t>2</w:t>
+      </w:r>
+      <w:r>
+        <w:t>단</w:t>
+      </w:r>
+      <w:r>
+        <w:t xml:space="preserve"> 3</w:t>
+      </w:r>
+      <w:r>
+        <w:t>열</w:t>
+      </w:r>
+      <w:r>
+        <w:t xml:space="preserve"> </w:t>
+      </w:r>
+      <w:r>
+        <w:t>격자형</w:t>
+      </w:r>
+      <w:r>
+        <w:t xml:space="preserve"> · </w:t>
+      </w:r>
+      <w:r>
+        <w:t>세로</w:t>
+      </w:r>
+      <w:r>
+        <w:t xml:space="preserve"> 2</w:t>
+      </w:r>
+      <w:r>
+        <w:t>단형</w:t>
+      </w:r>
+      <w:r>
+        <w:t xml:space="preserve"> · </w:t>
+      </w:r>
+      <w:r>
+        <w:t>크기</w:t>
+      </w:r>
+      <w:r>
+        <w:t xml:space="preserve"> </w:t>
+      </w:r>
+      <w:r>
+        <w:t>혼합</w:t>
+      </w:r>
+      <w:r>
+        <w:t xml:space="preserve"> </w:t>
+      </w:r>
+      <w:r>
+        <w:t>살롱형</w:t>
+      </w:r>
+      <w:r>
+        <w:t xml:space="preserve"> · </w:t>
+      </w:r>
+      <w:r>
+        <w:t>큰</w:t>
+      </w:r>
+      <w:r>
+        <w:t xml:space="preserve"> </w:t>
+      </w:r>
+      <w:r>
+        <w:t>작품</w:t>
+      </w:r>
+      <w:r>
+        <w:t xml:space="preserve"> </w:t>
+      </w:r>
+      <w:r>
+        <w:t>옆</w:t>
+      </w:r>
+      <w:r>
+        <w:t xml:space="preserve"> </w:t>
+      </w:r>
+      <w:r>
+        <w:t>세로</w:t>
+      </w:r>
+      <w:r>
+        <w:t xml:space="preserve"> </w:t>
+      </w:r>
+      <w:r>
+        <w:t>쌍형</w:t>
+      </w:r>
+      <w:r>
+        <w:t xml:space="preserve">: </w:t>
+      </w:r>
+      <w:r>
+        <w:t>행</w:t>
+      </w:r>
+      <w:r>
+        <w:t>·</w:t>
+      </w:r>
+      <w:r>
+        <w:t>열</w:t>
+      </w:r>
+      <w:r>
+        <w:t>·</w:t>
+      </w:r>
+      <w:r>
+        <w:t>높이와</w:t>
+      </w:r>
+      <w:r>
+        <w:t xml:space="preserve"> </w:t>
+      </w:r>
+      <w:r>
+        <w:t>크기</w:t>
+      </w:r>
+      <w:r>
+        <w:t xml:space="preserve"> </w:t>
+      </w:r>
+      <w:r>
+        <w:t>관계가</w:t>
+      </w:r>
+      <w:r>
+        <w:t xml:space="preserve"> </w:t>
+      </w:r>
+      <w:r>
+        <w:t>다른</w:t>
+      </w:r>
+      <w:r>
+        <w:t xml:space="preserve"> </w:t>
+      </w:r>
+      <w:r>
+        <w:t>구성을</w:t>
+      </w:r>
+      <w:r>
+        <w:t xml:space="preserve"> </w:t>
+      </w:r>
+      <w:r>
+        <w:t>사용한다</w:t>
+      </w:r>
+      <w:r>
+        <w:t>.</w:t>
+      </w:r>
+    </w:p>
+    <w:p>
+      <w:pPr>
+        <w:pStyle w:val="a0"/>
+      </w:pPr>
+      <w:r>
+        <w:t>하단</w:t>
+      </w:r>
+      <w:r>
+        <w:t xml:space="preserve"> </w:t>
+      </w:r>
+      <w:r>
+        <w:t>기준선형</w:t>
+      </w:r>
+      <w:r>
+        <w:t xml:space="preserve"> · </w:t>
+      </w:r>
+      <w:r>
+        <w:t>비대칭</w:t>
+      </w:r>
+      <w:r>
+        <w:t xml:space="preserve"> </w:t>
+      </w:r>
+      <w:r>
+        <w:t>균형형</w:t>
+      </w:r>
+      <w:r>
+        <w:t xml:space="preserve"> · </w:t>
+      </w:r>
+      <w:r>
+        <w:t>여백으로</w:t>
+      </w:r>
+      <w:r>
+        <w:t xml:space="preserve"> </w:t>
+      </w:r>
+      <w:r>
+        <w:t>나눈</w:t>
+      </w:r>
+      <w:r>
+        <w:t xml:space="preserve"> </w:t>
+      </w:r>
+      <w:r>
+        <w:t>두</w:t>
+      </w:r>
+      <w:r>
+        <w:t xml:space="preserve"> </w:t>
+      </w:r>
+      <w:r>
+        <w:t>쌍형</w:t>
+      </w:r>
+      <w:r>
+        <w:t xml:space="preserve"> · </w:t>
+      </w:r>
+      <w:r>
+        <w:t>코너를</w:t>
+      </w:r>
+      <w:r>
+        <w:t xml:space="preserve"> </w:t>
+      </w:r>
+      <w:r>
+        <w:t>잇는</w:t>
+      </w:r>
+      <w:r>
+        <w:t xml:space="preserve"> 2</w:t>
+      </w:r>
+      <w:r>
+        <w:t>벽형</w:t>
+      </w:r>
+      <w:r>
+        <w:t xml:space="preserve">: </w:t>
+      </w:r>
+      <w:r>
+        <w:t>다른</w:t>
+      </w:r>
+      <w:r>
+        <w:t xml:space="preserve"> </w:t>
+      </w:r>
+      <w:r>
+        <w:t>크기의</w:t>
+      </w:r>
+      <w:r>
+        <w:t xml:space="preserve"> </w:t>
+      </w:r>
+      <w:r>
+        <w:t>작품을</w:t>
+      </w:r>
+      <w:r>
+        <w:t xml:space="preserve"> </w:t>
+      </w:r>
+      <w:r>
+        <w:t>정렬하거나</w:t>
+      </w:r>
+      <w:r>
+        <w:t xml:space="preserve"> </w:t>
+      </w:r>
+      <w:r>
+        <w:t>군집을</w:t>
+      </w:r>
+      <w:r>
+        <w:t xml:space="preserve"> </w:t>
+      </w:r>
+      <w:r>
+        <w:t>분리하고</w:t>
+      </w:r>
+      <w:r>
+        <w:t xml:space="preserve"> </w:t>
+      </w:r>
+      <w:r>
+        <w:t>관람</w:t>
+      </w:r>
+      <w:r>
+        <w:t xml:space="preserve"> </w:t>
+      </w:r>
+      <w:r>
+        <w:t>방향을</w:t>
+      </w:r>
+      <w:r>
+        <w:t xml:space="preserve"> </w:t>
+      </w:r>
+      <w:r>
+        <w:t>전환한다</w:t>
+      </w:r>
+      <w:r>
+        <w:t>.</w:t>
+      </w:r>
+    </w:p>
+    <w:p>
+      <w:r>
+        <w:lastRenderedPageBreak/>
+        <w:t>각</w:t>
+      </w:r>
+      <w:r>
+        <w:t xml:space="preserve"> </w:t>
+      </w:r>
+      <w:r>
+        <w:t>맵은</w:t>
+      </w:r>
+      <w:r>
+        <w:t xml:space="preserve"> </w:t>
+      </w:r>
+      <w:r>
+        <w:t>최소</w:t>
+      </w:r>
+      <w:r>
+        <w:t xml:space="preserve"> 10</w:t>
+      </w:r>
+      <w:r>
+        <w:t>종의</w:t>
+      </w:r>
+      <w:r>
+        <w:t xml:space="preserve"> </w:t>
+      </w:r>
+      <w:r>
+        <w:t>구별되는</w:t>
+      </w:r>
+      <w:r>
+        <w:t xml:space="preserve"> </w:t>
+      </w:r>
+      <w:r>
+        <w:t>배치를</w:t>
+      </w:r>
+      <w:r>
+        <w:t xml:space="preserve"> </w:t>
+      </w:r>
+      <w:r>
+        <w:t>실제</w:t>
+      </w:r>
+      <w:r>
+        <w:t xml:space="preserve"> </w:t>
+      </w:r>
+      <w:r>
+        <w:t>전시</w:t>
+      </w:r>
+      <w:r>
+        <w:t xml:space="preserve"> </w:t>
+      </w:r>
+      <w:r>
+        <w:t>벽에</w:t>
+      </w:r>
+      <w:r>
+        <w:t xml:space="preserve"> </w:t>
+      </w:r>
+      <w:r>
+        <w:t>사용한다</w:t>
+      </w:r>
+      <w:r>
+        <w:t xml:space="preserve">. </w:t>
+      </w:r>
+      <w:r>
+        <w:t>좌우</w:t>
+      </w:r>
+      <w:r>
+        <w:t xml:space="preserve"> </w:t>
+      </w:r>
+      <w:r>
+        <w:t>반전</w:t>
+      </w:r>
+      <w:r>
+        <w:t xml:space="preserve">, </w:t>
+      </w:r>
+      <w:r>
+        <w:t>그림</w:t>
+      </w:r>
+      <w:r>
+        <w:t xml:space="preserve"> </w:t>
+      </w:r>
+      <w:r>
+        <w:t>교체</w:t>
+      </w:r>
+      <w:r>
+        <w:t xml:space="preserve">, </w:t>
+      </w:r>
+      <w:r>
+        <w:t>간격의</w:t>
+      </w:r>
+      <w:r>
+        <w:t xml:space="preserve"> </w:t>
+      </w:r>
+      <w:r>
+        <w:t>미세</w:t>
+      </w:r>
+      <w:r>
+        <w:t xml:space="preserve"> </w:t>
+      </w:r>
+      <w:r>
+        <w:t>변경은</w:t>
+      </w:r>
+      <w:r>
+        <w:t xml:space="preserve"> </w:t>
+      </w:r>
+      <w:r>
+        <w:t>별도</w:t>
+      </w:r>
+      <w:r>
+        <w:t xml:space="preserve"> </w:t>
+      </w:r>
+      <w:r>
+        <w:t>유형으로</w:t>
+      </w:r>
+      <w:r>
+        <w:t xml:space="preserve"> </w:t>
+      </w:r>
+      <w:r>
+        <w:t>세지</w:t>
+      </w:r>
+      <w:r>
+        <w:t xml:space="preserve"> </w:t>
+      </w:r>
+      <w:r>
+        <w:t>않는다</w:t>
+      </w:r>
+      <w:r>
+        <w:t xml:space="preserve">. </w:t>
+      </w:r>
+      <w:r>
+        <w:t>일반</w:t>
+      </w:r>
+      <w:r>
+        <w:t xml:space="preserve"> </w:t>
+      </w:r>
+      <w:r>
+        <w:t>작품만</w:t>
+      </w:r>
+      <w:r>
+        <w:t xml:space="preserve"> </w:t>
+      </w:r>
+      <w:r>
+        <w:t>있는</w:t>
+      </w:r>
+      <w:r>
+        <w:t xml:space="preserve"> </w:t>
+      </w:r>
+      <w:r>
+        <w:t>독립</w:t>
+      </w:r>
+      <w:r>
+        <w:t xml:space="preserve"> </w:t>
+      </w:r>
+      <w:r>
+        <w:t>벽을</w:t>
+      </w:r>
+      <w:r>
+        <w:t xml:space="preserve"> </w:t>
+      </w:r>
+      <w:r>
+        <w:t>두고</w:t>
+      </w:r>
+      <w:r>
+        <w:t xml:space="preserve"> </w:t>
+      </w:r>
+      <w:r>
+        <w:t>도난</w:t>
+      </w:r>
+      <w:r>
+        <w:t xml:space="preserve"> </w:t>
+      </w:r>
+      <w:r>
+        <w:t>대상은</w:t>
+      </w:r>
+      <w:r>
+        <w:t xml:space="preserve"> </w:t>
+      </w:r>
+      <w:r>
+        <w:t>단독</w:t>
+      </w:r>
+      <w:r>
+        <w:t>·</w:t>
+      </w:r>
+      <w:r>
+        <w:t>군집의</w:t>
+      </w:r>
+      <w:r>
+        <w:t xml:space="preserve"> </w:t>
+      </w:r>
+      <w:r>
+        <w:t>가장자리</w:t>
+      </w:r>
+      <w:r>
+        <w:t>·</w:t>
+      </w:r>
+      <w:r>
+        <w:t>작은</w:t>
+      </w:r>
+      <w:r>
+        <w:t xml:space="preserve"> </w:t>
+      </w:r>
+      <w:r>
+        <w:t>작품</w:t>
+      </w:r>
+      <w:r>
+        <w:t xml:space="preserve"> </w:t>
+      </w:r>
+      <w:r>
+        <w:t>위치에도</w:t>
+      </w:r>
+      <w:r>
+        <w:t xml:space="preserve"> </w:t>
+      </w:r>
+      <w:r>
+        <w:t>배치한다</w:t>
+      </w:r>
+      <w:r>
+        <w:t>. M01</w:t>
+      </w:r>
+      <w:r>
+        <w:t>은</w:t>
+      </w:r>
+      <w:r>
+        <w:t xml:space="preserve"> </w:t>
+      </w:r>
+      <w:r>
+        <w:t>고전</w:t>
+      </w:r>
+      <w:r>
+        <w:t xml:space="preserve"> </w:t>
+      </w:r>
+      <w:r>
+        <w:t>회랑과</w:t>
+      </w:r>
+      <w:r>
+        <w:t xml:space="preserve"> </w:t>
+      </w:r>
+      <w:r>
+        <w:t>살롱</w:t>
+      </w:r>
+      <w:r>
+        <w:t>, M02</w:t>
+      </w:r>
+      <w:r>
+        <w:t>는</w:t>
+      </w:r>
+      <w:r>
+        <w:t xml:space="preserve"> </w:t>
+      </w:r>
+      <w:r>
+        <w:t>세로</w:t>
+      </w:r>
+      <w:r>
+        <w:t xml:space="preserve"> </w:t>
+      </w:r>
+      <w:r>
+        <w:t>연작과</w:t>
+      </w:r>
+      <w:r>
+        <w:t xml:space="preserve"> </w:t>
+      </w:r>
+      <w:r>
+        <w:t>여백</w:t>
+      </w:r>
+      <w:r>
+        <w:t>, M03</w:t>
+      </w:r>
+      <w:r>
+        <w:t>는</w:t>
+      </w:r>
+      <w:r>
+        <w:t xml:space="preserve"> </w:t>
+      </w:r>
+      <w:r>
+        <w:t>연속</w:t>
+      </w:r>
+      <w:r>
+        <w:t>·</w:t>
+      </w:r>
+      <w:r>
+        <w:t>격자와</w:t>
+      </w:r>
+      <w:r>
+        <w:t xml:space="preserve"> </w:t>
+      </w:r>
+      <w:r>
+        <w:t>독립</w:t>
+      </w:r>
+      <w:r>
+        <w:t xml:space="preserve"> </w:t>
+      </w:r>
+      <w:r>
+        <w:t>전시를</w:t>
+      </w:r>
+      <w:r>
+        <w:t xml:space="preserve"> </w:t>
+      </w:r>
+      <w:r>
+        <w:t>강조한다</w:t>
+      </w:r>
+      <w:r>
+        <w:t xml:space="preserve">. </w:t>
+      </w:r>
+      <w:r>
+        <w:t>벽</w:t>
+      </w:r>
+      <w:r>
+        <w:t xml:space="preserve"> </w:t>
+      </w:r>
+      <w:r>
+        <w:t>길이와</w:t>
+      </w:r>
+      <w:r>
+        <w:t xml:space="preserve"> </w:t>
+      </w:r>
+      <w:r>
+        <w:t>출입구에</w:t>
+      </w:r>
+      <w:r>
+        <w:t xml:space="preserve"> </w:t>
+      </w:r>
+      <w:r>
+        <w:t>맞춰</w:t>
+      </w:r>
+      <w:r>
+        <w:t xml:space="preserve"> </w:t>
+      </w:r>
+      <w:r>
+        <w:t>배치하며</w:t>
+      </w:r>
+      <w:r>
+        <w:t xml:space="preserve"> </w:t>
+      </w:r>
+      <w:r>
+        <w:t>무작위</w:t>
+      </w:r>
+      <w:r>
+        <w:t xml:space="preserve"> </w:t>
+      </w:r>
+      <w:r>
+        <w:t>산포로</w:t>
+      </w:r>
+      <w:r>
+        <w:t xml:space="preserve"> </w:t>
+      </w:r>
+      <w:r>
+        <w:t>다양성을</w:t>
+      </w:r>
+      <w:r>
+        <w:t xml:space="preserve"> </w:t>
+      </w:r>
+      <w:r>
+        <w:t>대신하지</w:t>
+      </w:r>
+      <w:r>
+        <w:t xml:space="preserve"> </w:t>
+      </w:r>
+      <w:r>
+        <w:t>않는다</w:t>
+      </w:r>
+      <w:r>
+        <w:t>.</w:t>
+      </w:r>
+    </w:p>
+    <w:p>
+      <w:pPr>
         <w:pStyle w:val="21"/>
         <w:numPr>
           <w:ilvl w:val="1"/>
           <w:numId w:val="7"/>
         </w:numPr>
       </w:pPr>
-      <w:bookmarkStart w:id="46" w:name="_Toc240003295"/>
+      <w:bookmarkStart w:id="47" w:name="_Toc240045510"/>
       <w:r>
         <w:t>맵</w:t>
       </w:r>
@@ -15439,7 +16475,7 @@
       <w:r>
         <w:t>포트폴리오</w:t>
       </w:r>
-      <w:bookmarkEnd w:id="46"/>
+      <w:bookmarkEnd w:id="47"/>
     </w:p>
     <w:tbl>
       <w:tblPr>
@@ -15875,9 +16911,8 @@
           <w:numId w:val="7"/>
         </w:numPr>
       </w:pPr>
-      <w:bookmarkStart w:id="47" w:name="_Toc240003296"/>
-      <w:r>
-        <w:lastRenderedPageBreak/>
+      <w:bookmarkStart w:id="48" w:name="_Toc240045511"/>
+      <w:r>
         <w:t xml:space="preserve">M01 — </w:t>
       </w:r>
       <w:r>
@@ -15889,7 +16924,7 @@
       <w:r>
         <w:t>고전미술관</w:t>
       </w:r>
-      <w:bookmarkEnd w:id="47"/>
+      <w:bookmarkEnd w:id="48"/>
     </w:p>
     <w:p>
       <w:r>
@@ -16189,7 +17224,7 @@
           <w:numId w:val="7"/>
         </w:numPr>
       </w:pPr>
-      <w:bookmarkStart w:id="48" w:name="_Toc240003297"/>
+      <w:bookmarkStart w:id="49" w:name="_Toc240045512"/>
       <w:r>
         <w:lastRenderedPageBreak/>
         <w:t xml:space="preserve">M02 — </w:t>
@@ -16203,7 +17238,7 @@
       <w:r>
         <w:t>동양미술관</w:t>
       </w:r>
-      <w:bookmarkEnd w:id="48"/>
+      <w:bookmarkEnd w:id="49"/>
     </w:p>
     <w:p>
       <w:r>
@@ -16503,7 +17538,7 @@
           <w:numId w:val="7"/>
         </w:numPr>
       </w:pPr>
-      <w:bookmarkStart w:id="49" w:name="_Toc240003298"/>
+      <w:bookmarkStart w:id="50" w:name="_Toc240045513"/>
       <w:r>
         <w:lastRenderedPageBreak/>
         <w:t xml:space="preserve">M03 — </w:t>
@@ -16517,7 +17552,7 @@
       <w:r>
         <w:t>현대미술관</w:t>
       </w:r>
-      <w:bookmarkEnd w:id="49"/>
+      <w:bookmarkEnd w:id="50"/>
     </w:p>
     <w:p>
       <w:r>
@@ -16817,7 +17852,7 @@
           <w:numId w:val="7"/>
         </w:numPr>
       </w:pPr>
-      <w:bookmarkStart w:id="50" w:name="_Toc240003299"/>
+      <w:bookmarkStart w:id="51" w:name="_Toc240045514"/>
       <w:r>
         <w:lastRenderedPageBreak/>
         <w:t xml:space="preserve">First-Person </w:t>
@@ -16831,7 +17866,7 @@
       <w:r>
         <w:t>가독성</w:t>
       </w:r>
-      <w:bookmarkEnd w:id="50"/>
+      <w:bookmarkEnd w:id="51"/>
     </w:p>
     <w:p>
       <w:pPr>
@@ -16901,7 +17936,7 @@
           <w:numId w:val="7"/>
         </w:numPr>
       </w:pPr>
-      <w:bookmarkStart w:id="51" w:name="_Toc240003300"/>
+      <w:bookmarkStart w:id="52" w:name="_Toc240045515"/>
       <w:r>
         <w:t>사운드</w:t>
       </w:r>
@@ -16911,7 +17946,7 @@
       <w:r>
         <w:t>디자인</w:t>
       </w:r>
-      <w:bookmarkEnd w:id="51"/>
+      <w:bookmarkEnd w:id="52"/>
     </w:p>
     <w:tbl>
       <w:tblPr>
@@ -17341,7 +18376,7 @@
           <w:numId w:val="7"/>
         </w:numPr>
       </w:pPr>
-      <w:bookmarkStart w:id="52" w:name="_Toc240003301"/>
+      <w:bookmarkStart w:id="53" w:name="_Toc240045516"/>
       <w:r>
         <w:lastRenderedPageBreak/>
         <w:t>세계관과</w:t>
@@ -17358,7 +18393,7 @@
       <w:r>
         <w:t>톤</w:t>
       </w:r>
-      <w:bookmarkEnd w:id="52"/>
+      <w:bookmarkEnd w:id="53"/>
     </w:p>
     <w:p>
       <w:r>
@@ -17588,7 +18623,7 @@
           <w:numId w:val="7"/>
         </w:numPr>
       </w:pPr>
-      <w:bookmarkStart w:id="53" w:name="_Toc240003302"/>
+      <w:bookmarkStart w:id="54" w:name="_Toc240045517"/>
       <w:r>
         <w:lastRenderedPageBreak/>
         <w:t>범위</w:t>
@@ -17605,7 +18640,7 @@
       <w:r>
         <w:t>플레이테스트</w:t>
       </w:r>
-      <w:bookmarkEnd w:id="53"/>
+      <w:bookmarkEnd w:id="54"/>
     </w:p>
     <w:p>
       <w:pPr>
@@ -17615,11 +18650,11 @@
           <w:numId w:val="7"/>
         </w:numPr>
       </w:pPr>
-      <w:bookmarkStart w:id="54" w:name="_Toc240003303"/>
+      <w:bookmarkStart w:id="55" w:name="_Toc240045518"/>
       <w:r>
         <w:t>v1.0 Required Scope</w:t>
       </w:r>
-      <w:bookmarkEnd w:id="54"/>
+      <w:bookmarkEnd w:id="55"/>
     </w:p>
     <w:tbl>
       <w:tblPr>
@@ -17983,11 +19018,11 @@
           <w:numId w:val="7"/>
         </w:numPr>
       </w:pPr>
-      <w:bookmarkStart w:id="55" w:name="_Toc240003304"/>
+      <w:bookmarkStart w:id="56" w:name="_Toc240045519"/>
       <w:r>
         <w:t>Deferred Expansion</w:t>
       </w:r>
-      <w:bookmarkEnd w:id="55"/>
+      <w:bookmarkEnd w:id="56"/>
     </w:p>
     <w:p>
       <w:r>
@@ -18007,7 +19042,7 @@
           <w:numId w:val="7"/>
         </w:numPr>
       </w:pPr>
-      <w:bookmarkStart w:id="56" w:name="_Toc240003305"/>
+      <w:bookmarkStart w:id="57" w:name="_Toc240045520"/>
       <w:r>
         <w:t>Stretch</w:t>
       </w:r>
@@ -18020,7 +19055,7 @@
       <w:r>
         <w:t>순서</w:t>
       </w:r>
-      <w:bookmarkEnd w:id="56"/>
+      <w:bookmarkEnd w:id="57"/>
     </w:p>
     <w:tbl>
       <w:tblPr>
@@ -18385,12 +19420,12 @@
           <w:numId w:val="7"/>
         </w:numPr>
       </w:pPr>
-      <w:bookmarkStart w:id="57" w:name="_Toc240003306"/>
+      <w:bookmarkStart w:id="58" w:name="_Toc240045521"/>
       <w:r>
         <w:lastRenderedPageBreak/>
         <w:t>Starting Balance Targets</w:t>
       </w:r>
-      <w:bookmarkEnd w:id="57"/>
+      <w:bookmarkEnd w:id="58"/>
     </w:p>
     <w:tbl>
       <w:tblPr>
@@ -18984,11 +20019,11 @@
           <w:numId w:val="7"/>
         </w:numPr>
       </w:pPr>
-      <w:bookmarkStart w:id="58" w:name="_Toc240003307"/>
+      <w:bookmarkStart w:id="59" w:name="_Toc240045522"/>
       <w:r>
         <w:t>Playtest Questions</w:t>
       </w:r>
-      <w:bookmarkEnd w:id="58"/>
+      <w:bookmarkEnd w:id="59"/>
     </w:p>
     <w:p>
       <w:pPr>
@@ -19070,12 +20105,12 @@
           <w:numId w:val="7"/>
         </w:numPr>
       </w:pPr>
-      <w:bookmarkStart w:id="59" w:name="_Toc240003308"/>
+      <w:bookmarkStart w:id="60" w:name="_Toc240045523"/>
       <w:r>
         <w:lastRenderedPageBreak/>
         <w:t>Release KPI</w:t>
       </w:r>
-      <w:bookmarkEnd w:id="59"/>
+      <w:bookmarkEnd w:id="60"/>
     </w:p>
     <w:tbl>
       <w:tblPr>
@@ -19402,11 +20437,11 @@
           <w:numId w:val="7"/>
         </w:numPr>
       </w:pPr>
-      <w:bookmarkStart w:id="60" w:name="_Toc240003309"/>
+      <w:bookmarkStart w:id="61" w:name="_Toc240045524"/>
       <w:r>
         <w:t>W6~W12 Roadmap</w:t>
       </w:r>
-      <w:bookmarkEnd w:id="60"/>
+      <w:bookmarkEnd w:id="61"/>
     </w:p>
     <w:tbl>
       <w:tblPr>
@@ -19768,11 +20803,11 @@
         <w:keepLines/>
         <w:pageBreakBefore w:val="0"/>
       </w:pPr>
-      <w:bookmarkStart w:id="61" w:name="_Toc240003310"/>
+      <w:bookmarkStart w:id="62" w:name="_Toc240045525"/>
       <w:r>
         <w:t>Appendix A — 용어</w:t>
       </w:r>
-      <w:bookmarkEnd w:id="61"/>
+      <w:bookmarkEnd w:id="62"/>
     </w:p>
     <w:tbl>
       <w:tblPr>
@@ -20159,14 +21194,14 @@
         <w:keepLines/>
         <w:pageBreakBefore w:val="0"/>
       </w:pPr>
-      <w:bookmarkStart w:id="62" w:name="_Toc240003311"/>
+      <w:bookmarkStart w:id="63" w:name="_Toc240045526"/>
       <w:r>
         <w:rPr>
           <w:sz w:val="32"/>
         </w:rPr>
         <w:t>Appendix B — Removed / Excluded / Deferred Expansion / Stretch</w:t>
       </w:r>
-      <w:bookmarkEnd w:id="62"/>
+      <w:bookmarkEnd w:id="63"/>
     </w:p>
     <w:tbl>
       <w:tblPr>
@@ -20386,7 +21421,7 @@
         <w:keepLines/>
         <w:pageBreakBefore w:val="0"/>
       </w:pPr>
-      <w:bookmarkStart w:id="63" w:name="_Toc240003312"/>
+      <w:bookmarkStart w:id="64" w:name="_Toc240045527"/>
       <w:r>
         <w:rPr>
           <w:sz w:val="32"/>
@@ -20394,7 +21429,7 @@
         <w:lastRenderedPageBreak/>
         <w:t>Appendix C — Player Experience Definition of Done</w:t>
       </w:r>
-      <w:bookmarkEnd w:id="63"/>
+      <w:bookmarkEnd w:id="64"/>
     </w:p>
     <w:p>
       <w:pPr>

</xml_diff>

<commit_message>
Refine museum layouts and apply catalogue UI
Rebuild M01-M03 room layouts and movement routes, retain review maps and align geometry-based floor plans and validation. Apply the approved catalogue textures, Korean fonts and four-unit UI layouts across active widget shells, with source art and font licenses.
</commit_message>
<xml_diff>
--- a/Museum_Heist_GDD.docx
+++ b/Museum_Heist_GDD.docx
@@ -111,7 +111,7 @@
             </w:r>
             <w:r>
               <w:br/>
-              <w:t>문서 정합성 검토 · 2026-09-11</w:t>
+              <w:t>문서 정합성 검토 · 2026-09-12</w:t>
             </w:r>
           </w:p>
         </w:tc>
@@ -564,7 +564,7 @@
       <w:r>
         <w:fldChar w:fldCharType="separate"/>
       </w:r>
-      <w:hyperlink w:anchor="_Toc240045463" w:history="1">
+      <w:hyperlink w:anchor="_Toc240136921" w:history="1">
         <w:r>
           <w:rPr>
             <w:rStyle w:val="aff1"/>
@@ -591,7 +591,7 @@
             <w:noProof/>
             <w:webHidden/>
           </w:rPr>
-          <w:instrText xml:space="preserve"> PAGEREF _Toc240045463 \h </w:instrText>
+          <w:instrText xml:space="preserve"> PAGEREF _Toc240136921 \h </w:instrText>
         </w:r>
         <w:r>
           <w:rPr>
@@ -640,7 +640,7 @@
           <w14:ligatures w14:val="standardContextual"/>
         </w:rPr>
       </w:pPr>
-      <w:hyperlink w:anchor="_Toc240045464" w:history="1">
+      <w:hyperlink w:anchor="_Toc240136922" w:history="1">
         <w:r>
           <w:rPr>
             <w:rStyle w:val="aff1"/>
@@ -667,7 +667,7 @@
             <w:noProof/>
             <w:webHidden/>
           </w:rPr>
-          <w:instrText xml:space="preserve"> PAGEREF _Toc240045464 \h </w:instrText>
+          <w:instrText xml:space="preserve"> PAGEREF _Toc240136922 \h </w:instrText>
         </w:r>
         <w:r>
           <w:rPr>
@@ -716,7 +716,7 @@
           <w14:ligatures w14:val="standardContextual"/>
         </w:rPr>
       </w:pPr>
-      <w:hyperlink w:anchor="_Toc240045465" w:history="1">
+      <w:hyperlink w:anchor="_Toc240136923" w:history="1">
         <w:r>
           <w:rPr>
             <w:rStyle w:val="aff1"/>
@@ -743,7 +743,7 @@
             <w:noProof/>
             <w:webHidden/>
           </w:rPr>
-          <w:instrText xml:space="preserve"> PAGEREF _Toc240045465 \h </w:instrText>
+          <w:instrText xml:space="preserve"> PAGEREF _Toc240136923 \h </w:instrText>
         </w:r>
         <w:r>
           <w:rPr>
@@ -792,7 +792,7 @@
           <w14:ligatures w14:val="standardContextual"/>
         </w:rPr>
       </w:pPr>
-      <w:hyperlink w:anchor="_Toc240045466" w:history="1">
+      <w:hyperlink w:anchor="_Toc240136924" w:history="1">
         <w:r>
           <w:rPr>
             <w:rStyle w:val="aff1"/>
@@ -819,7 +819,7 @@
             <w:noProof/>
             <w:webHidden/>
           </w:rPr>
-          <w:instrText xml:space="preserve"> PAGEREF _Toc240045466 \h </w:instrText>
+          <w:instrText xml:space="preserve"> PAGEREF _Toc240136924 \h </w:instrText>
         </w:r>
         <w:r>
           <w:rPr>
@@ -868,7 +868,7 @@
           <w14:ligatures w14:val="standardContextual"/>
         </w:rPr>
       </w:pPr>
-      <w:hyperlink w:anchor="_Toc240045467" w:history="1">
+      <w:hyperlink w:anchor="_Toc240136925" w:history="1">
         <w:r>
           <w:rPr>
             <w:rStyle w:val="aff1"/>
@@ -895,7 +895,7 @@
             <w:noProof/>
             <w:webHidden/>
           </w:rPr>
-          <w:instrText xml:space="preserve"> PAGEREF _Toc240045467 \h </w:instrText>
+          <w:instrText xml:space="preserve"> PAGEREF _Toc240136925 \h </w:instrText>
         </w:r>
         <w:r>
           <w:rPr>
@@ -944,7 +944,7 @@
           <w14:ligatures w14:val="standardContextual"/>
         </w:rPr>
       </w:pPr>
-      <w:hyperlink w:anchor="_Toc240045468" w:history="1">
+      <w:hyperlink w:anchor="_Toc240136926" w:history="1">
         <w:r>
           <w:rPr>
             <w:rStyle w:val="aff1"/>
@@ -971,7 +971,7 @@
             <w:noProof/>
             <w:webHidden/>
           </w:rPr>
-          <w:instrText xml:space="preserve"> PAGEREF _Toc240045468 \h </w:instrText>
+          <w:instrText xml:space="preserve"> PAGEREF _Toc240136926 \h </w:instrText>
         </w:r>
         <w:r>
           <w:rPr>
@@ -1020,7 +1020,7 @@
           <w14:ligatures w14:val="standardContextual"/>
         </w:rPr>
       </w:pPr>
-      <w:hyperlink w:anchor="_Toc240045469" w:history="1">
+      <w:hyperlink w:anchor="_Toc240136927" w:history="1">
         <w:r>
           <w:rPr>
             <w:rStyle w:val="aff1"/>
@@ -1047,7 +1047,7 @@
             <w:noProof/>
             <w:webHidden/>
           </w:rPr>
-          <w:instrText xml:space="preserve"> PAGEREF _Toc240045469 \h </w:instrText>
+          <w:instrText xml:space="preserve"> PAGEREF _Toc240136927 \h </w:instrText>
         </w:r>
         <w:r>
           <w:rPr>
@@ -1095,7 +1095,7 @@
           <w14:ligatures w14:val="standardContextual"/>
         </w:rPr>
       </w:pPr>
-      <w:hyperlink w:anchor="_Toc240045470" w:history="1">
+      <w:hyperlink w:anchor="_Toc240136928" w:history="1">
         <w:r>
           <w:rPr>
             <w:rStyle w:val="aff1"/>
@@ -1122,7 +1122,7 @@
             <w:noProof/>
             <w:webHidden/>
           </w:rPr>
-          <w:instrText xml:space="preserve"> PAGEREF _Toc240045470 \h </w:instrText>
+          <w:instrText xml:space="preserve"> PAGEREF _Toc240136928 \h </w:instrText>
         </w:r>
         <w:r>
           <w:rPr>
@@ -1171,7 +1171,7 @@
           <w14:ligatures w14:val="standardContextual"/>
         </w:rPr>
       </w:pPr>
-      <w:hyperlink w:anchor="_Toc240045471" w:history="1">
+      <w:hyperlink w:anchor="_Toc240136929" w:history="1">
         <w:r>
           <w:rPr>
             <w:rStyle w:val="aff1"/>
@@ -1198,7 +1198,7 @@
             <w:noProof/>
             <w:webHidden/>
           </w:rPr>
-          <w:instrText xml:space="preserve"> PAGEREF _Toc240045471 \h </w:instrText>
+          <w:instrText xml:space="preserve"> PAGEREF _Toc240136929 \h </w:instrText>
         </w:r>
         <w:r>
           <w:rPr>
@@ -1247,7 +1247,7 @@
           <w14:ligatures w14:val="standardContextual"/>
         </w:rPr>
       </w:pPr>
-      <w:hyperlink w:anchor="_Toc240045472" w:history="1">
+      <w:hyperlink w:anchor="_Toc240136930" w:history="1">
         <w:r>
           <w:rPr>
             <w:rStyle w:val="aff1"/>
@@ -1274,7 +1274,7 @@
             <w:noProof/>
             <w:webHidden/>
           </w:rPr>
-          <w:instrText xml:space="preserve"> PAGEREF _Toc240045472 \h </w:instrText>
+          <w:instrText xml:space="preserve"> PAGEREF _Toc240136930 \h </w:instrText>
         </w:r>
         <w:r>
           <w:rPr>
@@ -1323,7 +1323,7 @@
           <w14:ligatures w14:val="standardContextual"/>
         </w:rPr>
       </w:pPr>
-      <w:hyperlink w:anchor="_Toc240045473" w:history="1">
+      <w:hyperlink w:anchor="_Toc240136931" w:history="1">
         <w:r>
           <w:rPr>
             <w:rStyle w:val="aff1"/>
@@ -1350,7 +1350,7 @@
             <w:noProof/>
             <w:webHidden/>
           </w:rPr>
-          <w:instrText xml:space="preserve"> PAGEREF _Toc240045473 \h </w:instrText>
+          <w:instrText xml:space="preserve"> PAGEREF _Toc240136931 \h </w:instrText>
         </w:r>
         <w:r>
           <w:rPr>
@@ -1399,7 +1399,7 @@
           <w14:ligatures w14:val="standardContextual"/>
         </w:rPr>
       </w:pPr>
-      <w:hyperlink w:anchor="_Toc240045474" w:history="1">
+      <w:hyperlink w:anchor="_Toc240136932" w:history="1">
         <w:r>
           <w:rPr>
             <w:rStyle w:val="aff1"/>
@@ -1426,7 +1426,7 @@
             <w:noProof/>
             <w:webHidden/>
           </w:rPr>
-          <w:instrText xml:space="preserve"> PAGEREF _Toc240045474 \h </w:instrText>
+          <w:instrText xml:space="preserve"> PAGEREF _Toc240136932 \h </w:instrText>
         </w:r>
         <w:r>
           <w:rPr>
@@ -1475,7 +1475,7 @@
           <w14:ligatures w14:val="standardContextual"/>
         </w:rPr>
       </w:pPr>
-      <w:hyperlink w:anchor="_Toc240045475" w:history="1">
+      <w:hyperlink w:anchor="_Toc240136933" w:history="1">
         <w:r>
           <w:rPr>
             <w:rStyle w:val="aff1"/>
@@ -1502,7 +1502,7 @@
             <w:noProof/>
             <w:webHidden/>
           </w:rPr>
-          <w:instrText xml:space="preserve"> PAGEREF _Toc240045475 \h </w:instrText>
+          <w:instrText xml:space="preserve"> PAGEREF _Toc240136933 \h </w:instrText>
         </w:r>
         <w:r>
           <w:rPr>
@@ -1550,7 +1550,7 @@
           <w14:ligatures w14:val="standardContextual"/>
         </w:rPr>
       </w:pPr>
-      <w:hyperlink w:anchor="_Toc240045476" w:history="1">
+      <w:hyperlink w:anchor="_Toc240136934" w:history="1">
         <w:r>
           <w:rPr>
             <w:rStyle w:val="aff1"/>
@@ -1577,7 +1577,7 @@
             <w:noProof/>
             <w:webHidden/>
           </w:rPr>
-          <w:instrText xml:space="preserve"> PAGEREF _Toc240045476 \h </w:instrText>
+          <w:instrText xml:space="preserve"> PAGEREF _Toc240136934 \h </w:instrText>
         </w:r>
         <w:r>
           <w:rPr>
@@ -1626,7 +1626,7 @@
           <w14:ligatures w14:val="standardContextual"/>
         </w:rPr>
       </w:pPr>
-      <w:hyperlink w:anchor="_Toc240045477" w:history="1">
+      <w:hyperlink w:anchor="_Toc240136935" w:history="1">
         <w:r>
           <w:rPr>
             <w:rStyle w:val="aff1"/>
@@ -1653,7 +1653,7 @@
             <w:noProof/>
             <w:webHidden/>
           </w:rPr>
-          <w:instrText xml:space="preserve"> PAGEREF _Toc240045477 \h </w:instrText>
+          <w:instrText xml:space="preserve"> PAGEREF _Toc240136935 \h </w:instrText>
         </w:r>
         <w:r>
           <w:rPr>
@@ -1702,7 +1702,7 @@
           <w14:ligatures w14:val="standardContextual"/>
         </w:rPr>
       </w:pPr>
-      <w:hyperlink w:anchor="_Toc240045478" w:history="1">
+      <w:hyperlink w:anchor="_Toc240136936" w:history="1">
         <w:r>
           <w:rPr>
             <w:rStyle w:val="aff1"/>
@@ -1729,7 +1729,7 @@
             <w:noProof/>
             <w:webHidden/>
           </w:rPr>
-          <w:instrText xml:space="preserve"> PAGEREF _Toc240045478 \h </w:instrText>
+          <w:instrText xml:space="preserve"> PAGEREF _Toc240136936 \h </w:instrText>
         </w:r>
         <w:r>
           <w:rPr>
@@ -1778,7 +1778,7 @@
           <w14:ligatures w14:val="standardContextual"/>
         </w:rPr>
       </w:pPr>
-      <w:hyperlink w:anchor="_Toc240045479" w:history="1">
+      <w:hyperlink w:anchor="_Toc240136937" w:history="1">
         <w:r>
           <w:rPr>
             <w:rStyle w:val="aff1"/>
@@ -1805,7 +1805,7 @@
             <w:noProof/>
             <w:webHidden/>
           </w:rPr>
-          <w:instrText xml:space="preserve"> PAGEREF _Toc240045479 \h </w:instrText>
+          <w:instrText xml:space="preserve"> PAGEREF _Toc240136937 \h </w:instrText>
         </w:r>
         <w:r>
           <w:rPr>
@@ -1854,7 +1854,7 @@
           <w14:ligatures w14:val="standardContextual"/>
         </w:rPr>
       </w:pPr>
-      <w:hyperlink w:anchor="_Toc240045480" w:history="1">
+      <w:hyperlink w:anchor="_Toc240136938" w:history="1">
         <w:r>
           <w:rPr>
             <w:rStyle w:val="aff1"/>
@@ -1881,7 +1881,7 @@
             <w:noProof/>
             <w:webHidden/>
           </w:rPr>
-          <w:instrText xml:space="preserve"> PAGEREF _Toc240045480 \h </w:instrText>
+          <w:instrText xml:space="preserve"> PAGEREF _Toc240136938 \h </w:instrText>
         </w:r>
         <w:r>
           <w:rPr>
@@ -1930,7 +1930,7 @@
           <w14:ligatures w14:val="standardContextual"/>
         </w:rPr>
       </w:pPr>
-      <w:hyperlink w:anchor="_Toc240045481" w:history="1">
+      <w:hyperlink w:anchor="_Toc240136939" w:history="1">
         <w:r>
           <w:rPr>
             <w:rStyle w:val="aff1"/>
@@ -1957,7 +1957,7 @@
             <w:noProof/>
             <w:webHidden/>
           </w:rPr>
-          <w:instrText xml:space="preserve"> PAGEREF _Toc240045481 \h </w:instrText>
+          <w:instrText xml:space="preserve"> PAGEREF _Toc240136939 \h </w:instrText>
         </w:r>
         <w:r>
           <w:rPr>
@@ -2006,7 +2006,7 @@
           <w14:ligatures w14:val="standardContextual"/>
         </w:rPr>
       </w:pPr>
-      <w:hyperlink w:anchor="_Toc240045482" w:history="1">
+      <w:hyperlink w:anchor="_Toc240136940" w:history="1">
         <w:r>
           <w:rPr>
             <w:rStyle w:val="aff1"/>
@@ -2033,7 +2033,7 @@
             <w:noProof/>
             <w:webHidden/>
           </w:rPr>
-          <w:instrText xml:space="preserve"> PAGEREF _Toc240045482 \h </w:instrText>
+          <w:instrText xml:space="preserve"> PAGEREF _Toc240136940 \h </w:instrText>
         </w:r>
         <w:r>
           <w:rPr>
@@ -2081,7 +2081,7 @@
           <w14:ligatures w14:val="standardContextual"/>
         </w:rPr>
       </w:pPr>
-      <w:hyperlink w:anchor="_Toc240045483" w:history="1">
+      <w:hyperlink w:anchor="_Toc240136941" w:history="1">
         <w:r>
           <w:rPr>
             <w:rStyle w:val="aff1"/>
@@ -2108,7 +2108,7 @@
             <w:noProof/>
             <w:webHidden/>
           </w:rPr>
-          <w:instrText xml:space="preserve"> PAGEREF _Toc240045483 \h </w:instrText>
+          <w:instrText xml:space="preserve"> PAGEREF _Toc240136941 \h </w:instrText>
         </w:r>
         <w:r>
           <w:rPr>
@@ -2157,7 +2157,7 @@
           <w14:ligatures w14:val="standardContextual"/>
         </w:rPr>
       </w:pPr>
-      <w:hyperlink w:anchor="_Toc240045484" w:history="1">
+      <w:hyperlink w:anchor="_Toc240136942" w:history="1">
         <w:r>
           <w:rPr>
             <w:rStyle w:val="aff1"/>
@@ -2184,7 +2184,7 @@
             <w:noProof/>
             <w:webHidden/>
           </w:rPr>
-          <w:instrText xml:space="preserve"> PAGEREF _Toc240045484 \h </w:instrText>
+          <w:instrText xml:space="preserve"> PAGEREF _Toc240136942 \h </w:instrText>
         </w:r>
         <w:r>
           <w:rPr>
@@ -2233,7 +2233,7 @@
           <w14:ligatures w14:val="standardContextual"/>
         </w:rPr>
       </w:pPr>
-      <w:hyperlink w:anchor="_Toc240045485" w:history="1">
+      <w:hyperlink w:anchor="_Toc240136943" w:history="1">
         <w:r>
           <w:rPr>
             <w:rStyle w:val="aff1"/>
@@ -2260,7 +2260,7 @@
             <w:noProof/>
             <w:webHidden/>
           </w:rPr>
-          <w:instrText xml:space="preserve"> PAGEREF _Toc240045485 \h </w:instrText>
+          <w:instrText xml:space="preserve"> PAGEREF _Toc240136943 \h </w:instrText>
         </w:r>
         <w:r>
           <w:rPr>
@@ -2309,7 +2309,7 @@
           <w14:ligatures w14:val="standardContextual"/>
         </w:rPr>
       </w:pPr>
-      <w:hyperlink w:anchor="_Toc240045486" w:history="1">
+      <w:hyperlink w:anchor="_Toc240136944" w:history="1">
         <w:r>
           <w:rPr>
             <w:rStyle w:val="aff1"/>
@@ -2336,7 +2336,7 @@
             <w:noProof/>
             <w:webHidden/>
           </w:rPr>
-          <w:instrText xml:space="preserve"> PAGEREF _Toc240045486 \h </w:instrText>
+          <w:instrText xml:space="preserve"> PAGEREF _Toc240136944 \h </w:instrText>
         </w:r>
         <w:r>
           <w:rPr>
@@ -2385,7 +2385,7 @@
           <w14:ligatures w14:val="standardContextual"/>
         </w:rPr>
       </w:pPr>
-      <w:hyperlink w:anchor="_Toc240045487" w:history="1">
+      <w:hyperlink w:anchor="_Toc240136945" w:history="1">
         <w:r>
           <w:rPr>
             <w:rStyle w:val="aff1"/>
@@ -2412,7 +2412,7 @@
             <w:noProof/>
             <w:webHidden/>
           </w:rPr>
-          <w:instrText xml:space="preserve"> PAGEREF _Toc240045487 \h </w:instrText>
+          <w:instrText xml:space="preserve"> PAGEREF _Toc240136945 \h </w:instrText>
         </w:r>
         <w:r>
           <w:rPr>
@@ -2461,7 +2461,7 @@
           <w14:ligatures w14:val="standardContextual"/>
         </w:rPr>
       </w:pPr>
-      <w:hyperlink w:anchor="_Toc240045488" w:history="1">
+      <w:hyperlink w:anchor="_Toc240136946" w:history="1">
         <w:r>
           <w:rPr>
             <w:rStyle w:val="aff1"/>
@@ -2488,7 +2488,7 @@
             <w:noProof/>
             <w:webHidden/>
           </w:rPr>
-          <w:instrText xml:space="preserve"> PAGEREF _Toc240045488 \h </w:instrText>
+          <w:instrText xml:space="preserve"> PAGEREF _Toc240136946 \h </w:instrText>
         </w:r>
         <w:r>
           <w:rPr>
@@ -2537,7 +2537,7 @@
           <w14:ligatures w14:val="standardContextual"/>
         </w:rPr>
       </w:pPr>
-      <w:hyperlink w:anchor="_Toc240045489" w:history="1">
+      <w:hyperlink w:anchor="_Toc240136947" w:history="1">
         <w:r>
           <w:rPr>
             <w:rStyle w:val="aff1"/>
@@ -2564,7 +2564,7 @@
             <w:noProof/>
             <w:webHidden/>
           </w:rPr>
-          <w:instrText xml:space="preserve"> PAGEREF _Toc240045489 \h </w:instrText>
+          <w:instrText xml:space="preserve"> PAGEREF _Toc240136947 \h </w:instrText>
         </w:r>
         <w:r>
           <w:rPr>
@@ -2612,7 +2612,7 @@
           <w14:ligatures w14:val="standardContextual"/>
         </w:rPr>
       </w:pPr>
-      <w:hyperlink w:anchor="_Toc240045490" w:history="1">
+      <w:hyperlink w:anchor="_Toc240136948" w:history="1">
         <w:r>
           <w:rPr>
             <w:rStyle w:val="aff1"/>
@@ -2639,7 +2639,7 @@
             <w:noProof/>
             <w:webHidden/>
           </w:rPr>
-          <w:instrText xml:space="preserve"> PAGEREF _Toc240045490 \h </w:instrText>
+          <w:instrText xml:space="preserve"> PAGEREF _Toc240136948 \h </w:instrText>
         </w:r>
         <w:r>
           <w:rPr>
@@ -2688,7 +2688,7 @@
           <w14:ligatures w14:val="standardContextual"/>
         </w:rPr>
       </w:pPr>
-      <w:hyperlink w:anchor="_Toc240045491" w:history="1">
+      <w:hyperlink w:anchor="_Toc240136949" w:history="1">
         <w:r>
           <w:rPr>
             <w:rStyle w:val="aff1"/>
@@ -2715,7 +2715,7 @@
             <w:noProof/>
             <w:webHidden/>
           </w:rPr>
-          <w:instrText xml:space="preserve"> PAGEREF _Toc240045491 \h </w:instrText>
+          <w:instrText xml:space="preserve"> PAGEREF _Toc240136949 \h </w:instrText>
         </w:r>
         <w:r>
           <w:rPr>
@@ -2764,7 +2764,7 @@
           <w14:ligatures w14:val="standardContextual"/>
         </w:rPr>
       </w:pPr>
-      <w:hyperlink w:anchor="_Toc240045492" w:history="1">
+      <w:hyperlink w:anchor="_Toc240136950" w:history="1">
         <w:r>
           <w:rPr>
             <w:rStyle w:val="aff1"/>
@@ -2791,7 +2791,7 @@
             <w:noProof/>
             <w:webHidden/>
           </w:rPr>
-          <w:instrText xml:space="preserve"> PAGEREF _Toc240045492 \h </w:instrText>
+          <w:instrText xml:space="preserve"> PAGEREF _Toc240136950 \h </w:instrText>
         </w:r>
         <w:r>
           <w:rPr>
@@ -2840,7 +2840,7 @@
           <w14:ligatures w14:val="standardContextual"/>
         </w:rPr>
       </w:pPr>
-      <w:hyperlink w:anchor="_Toc240045493" w:history="1">
+      <w:hyperlink w:anchor="_Toc240136951" w:history="1">
         <w:r>
           <w:rPr>
             <w:rStyle w:val="aff1"/>
@@ -2867,7 +2867,7 @@
             <w:noProof/>
             <w:webHidden/>
           </w:rPr>
-          <w:instrText xml:space="preserve"> PAGEREF _Toc240045493 \h </w:instrText>
+          <w:instrText xml:space="preserve"> PAGEREF _Toc240136951 \h </w:instrText>
         </w:r>
         <w:r>
           <w:rPr>
@@ -2916,7 +2916,7 @@
           <w14:ligatures w14:val="standardContextual"/>
         </w:rPr>
       </w:pPr>
-      <w:hyperlink w:anchor="_Toc240045494" w:history="1">
+      <w:hyperlink w:anchor="_Toc240136952" w:history="1">
         <w:r>
           <w:rPr>
             <w:rStyle w:val="aff1"/>
@@ -2943,7 +2943,7 @@
             <w:noProof/>
             <w:webHidden/>
           </w:rPr>
-          <w:instrText xml:space="preserve"> PAGEREF _Toc240045494 \h </w:instrText>
+          <w:instrText xml:space="preserve"> PAGEREF _Toc240136952 \h </w:instrText>
         </w:r>
         <w:r>
           <w:rPr>
@@ -2992,7 +2992,7 @@
           <w14:ligatures w14:val="standardContextual"/>
         </w:rPr>
       </w:pPr>
-      <w:hyperlink w:anchor="_Toc240045495" w:history="1">
+      <w:hyperlink w:anchor="_Toc240136953" w:history="1">
         <w:r>
           <w:rPr>
             <w:rStyle w:val="aff1"/>
@@ -3019,7 +3019,7 @@
             <w:noProof/>
             <w:webHidden/>
           </w:rPr>
-          <w:instrText xml:space="preserve"> PAGEREF _Toc240045495 \h </w:instrText>
+          <w:instrText xml:space="preserve"> PAGEREF _Toc240136953 \h </w:instrText>
         </w:r>
         <w:r>
           <w:rPr>
@@ -3068,7 +3068,7 @@
           <w14:ligatures w14:val="standardContextual"/>
         </w:rPr>
       </w:pPr>
-      <w:hyperlink w:anchor="_Toc240045496" w:history="1">
+      <w:hyperlink w:anchor="_Toc240136954" w:history="1">
         <w:r>
           <w:rPr>
             <w:rStyle w:val="aff1"/>
@@ -3095,7 +3095,7 @@
             <w:noProof/>
             <w:webHidden/>
           </w:rPr>
-          <w:instrText xml:space="preserve"> PAGEREF _Toc240045496 \h </w:instrText>
+          <w:instrText xml:space="preserve"> PAGEREF _Toc240136954 \h </w:instrText>
         </w:r>
         <w:r>
           <w:rPr>
@@ -3143,7 +3143,7 @@
           <w14:ligatures w14:val="standardContextual"/>
         </w:rPr>
       </w:pPr>
-      <w:hyperlink w:anchor="_Toc240045497" w:history="1">
+      <w:hyperlink w:anchor="_Toc240136955" w:history="1">
         <w:r>
           <w:rPr>
             <w:rStyle w:val="aff1"/>
@@ -3170,7 +3170,7 @@
             <w:noProof/>
             <w:webHidden/>
           </w:rPr>
-          <w:instrText xml:space="preserve"> PAGEREF _Toc240045497 \h </w:instrText>
+          <w:instrText xml:space="preserve"> PAGEREF _Toc240136955 \h </w:instrText>
         </w:r>
         <w:r>
           <w:rPr>
@@ -3219,7 +3219,7 @@
           <w14:ligatures w14:val="standardContextual"/>
         </w:rPr>
       </w:pPr>
-      <w:hyperlink w:anchor="_Toc240045498" w:history="1">
+      <w:hyperlink w:anchor="_Toc240136956" w:history="1">
         <w:r>
           <w:rPr>
             <w:rStyle w:val="aff1"/>
@@ -3246,7 +3246,7 @@
             <w:noProof/>
             <w:webHidden/>
           </w:rPr>
-          <w:instrText xml:space="preserve"> PAGEREF _Toc240045498 \h </w:instrText>
+          <w:instrText xml:space="preserve"> PAGEREF _Toc240136956 \h </w:instrText>
         </w:r>
         <w:r>
           <w:rPr>
@@ -3295,7 +3295,7 @@
           <w14:ligatures w14:val="standardContextual"/>
         </w:rPr>
       </w:pPr>
-      <w:hyperlink w:anchor="_Toc240045499" w:history="1">
+      <w:hyperlink w:anchor="_Toc240136957" w:history="1">
         <w:r>
           <w:rPr>
             <w:rStyle w:val="aff1"/>
@@ -3322,7 +3322,7 @@
             <w:noProof/>
             <w:webHidden/>
           </w:rPr>
-          <w:instrText xml:space="preserve"> PAGEREF _Toc240045499 \h </w:instrText>
+          <w:instrText xml:space="preserve"> PAGEREF _Toc240136957 \h </w:instrText>
         </w:r>
         <w:r>
           <w:rPr>
@@ -3371,7 +3371,7 @@
           <w14:ligatures w14:val="standardContextual"/>
         </w:rPr>
       </w:pPr>
-      <w:hyperlink w:anchor="_Toc240045500" w:history="1">
+      <w:hyperlink w:anchor="_Toc240136958" w:history="1">
         <w:r>
           <w:rPr>
             <w:rStyle w:val="aff1"/>
@@ -3398,7 +3398,7 @@
             <w:noProof/>
             <w:webHidden/>
           </w:rPr>
-          <w:instrText xml:space="preserve"> PAGEREF _Toc240045500 \h </w:instrText>
+          <w:instrText xml:space="preserve"> PAGEREF _Toc240136958 \h </w:instrText>
         </w:r>
         <w:r>
           <w:rPr>
@@ -3447,7 +3447,7 @@
           <w14:ligatures w14:val="standardContextual"/>
         </w:rPr>
       </w:pPr>
-      <w:hyperlink w:anchor="_Toc240045501" w:history="1">
+      <w:hyperlink w:anchor="_Toc240136959" w:history="1">
         <w:r>
           <w:rPr>
             <w:rStyle w:val="aff1"/>
@@ -3474,7 +3474,7 @@
             <w:noProof/>
             <w:webHidden/>
           </w:rPr>
-          <w:instrText xml:space="preserve"> PAGEREF _Toc240045501 \h </w:instrText>
+          <w:instrText xml:space="preserve"> PAGEREF _Toc240136959 \h </w:instrText>
         </w:r>
         <w:r>
           <w:rPr>
@@ -3523,7 +3523,7 @@
           <w14:ligatures w14:val="standardContextual"/>
         </w:rPr>
       </w:pPr>
-      <w:hyperlink w:anchor="_Toc240045502" w:history="1">
+      <w:hyperlink w:anchor="_Toc240136960" w:history="1">
         <w:r>
           <w:rPr>
             <w:rStyle w:val="aff1"/>
@@ -3550,7 +3550,7 @@
             <w:noProof/>
             <w:webHidden/>
           </w:rPr>
-          <w:instrText xml:space="preserve"> PAGEREF _Toc240045502 \h </w:instrText>
+          <w:instrText xml:space="preserve"> PAGEREF _Toc240136960 \h </w:instrText>
         </w:r>
         <w:r>
           <w:rPr>
@@ -3599,7 +3599,7 @@
           <w14:ligatures w14:val="standardContextual"/>
         </w:rPr>
       </w:pPr>
-      <w:hyperlink w:anchor="_Toc240045503" w:history="1">
+      <w:hyperlink w:anchor="_Toc240136961" w:history="1">
         <w:r>
           <w:rPr>
             <w:rStyle w:val="aff1"/>
@@ -3626,7 +3626,7 @@
             <w:noProof/>
             <w:webHidden/>
           </w:rPr>
-          <w:instrText xml:space="preserve"> PAGEREF _Toc240045503 \h </w:instrText>
+          <w:instrText xml:space="preserve"> PAGEREF _Toc240136961 \h </w:instrText>
         </w:r>
         <w:r>
           <w:rPr>
@@ -3675,7 +3675,7 @@
           <w14:ligatures w14:val="standardContextual"/>
         </w:rPr>
       </w:pPr>
-      <w:hyperlink w:anchor="_Toc240045504" w:history="1">
+      <w:hyperlink w:anchor="_Toc240136962" w:history="1">
         <w:r>
           <w:rPr>
             <w:rStyle w:val="aff1"/>
@@ -3702,7 +3702,7 @@
             <w:noProof/>
             <w:webHidden/>
           </w:rPr>
-          <w:instrText xml:space="preserve"> PAGEREF _Toc240045504 \h </w:instrText>
+          <w:instrText xml:space="preserve"> PAGEREF _Toc240136962 \h </w:instrText>
         </w:r>
         <w:r>
           <w:rPr>
@@ -3751,7 +3751,7 @@
           <w14:ligatures w14:val="standardContextual"/>
         </w:rPr>
       </w:pPr>
-      <w:hyperlink w:anchor="_Toc240045505" w:history="1">
+      <w:hyperlink w:anchor="_Toc240136963" w:history="1">
         <w:r>
           <w:rPr>
             <w:rStyle w:val="aff1"/>
@@ -3778,7 +3778,7 @@
             <w:noProof/>
             <w:webHidden/>
           </w:rPr>
-          <w:instrText xml:space="preserve"> PAGEREF _Toc240045505 \h </w:instrText>
+          <w:instrText xml:space="preserve"> PAGEREF _Toc240136963 \h </w:instrText>
         </w:r>
         <w:r>
           <w:rPr>
@@ -3827,7 +3827,7 @@
           <w14:ligatures w14:val="standardContextual"/>
         </w:rPr>
       </w:pPr>
-      <w:hyperlink w:anchor="_Toc240045506" w:history="1">
+      <w:hyperlink w:anchor="_Toc240136964" w:history="1">
         <w:r>
           <w:rPr>
             <w:rStyle w:val="aff1"/>
@@ -3854,7 +3854,7 @@
             <w:noProof/>
             <w:webHidden/>
           </w:rPr>
-          <w:instrText xml:space="preserve"> PAGEREF _Toc240045506 \h </w:instrText>
+          <w:instrText xml:space="preserve"> PAGEREF _Toc240136964 \h </w:instrText>
         </w:r>
         <w:r>
           <w:rPr>
@@ -3902,7 +3902,7 @@
           <w14:ligatures w14:val="standardContextual"/>
         </w:rPr>
       </w:pPr>
-      <w:hyperlink w:anchor="_Toc240045507" w:history="1">
+      <w:hyperlink w:anchor="_Toc240136965" w:history="1">
         <w:r>
           <w:rPr>
             <w:rStyle w:val="aff1"/>
@@ -3929,7 +3929,7 @@
             <w:noProof/>
             <w:webHidden/>
           </w:rPr>
-          <w:instrText xml:space="preserve"> PAGEREF _Toc240045507 \h </w:instrText>
+          <w:instrText xml:space="preserve"> PAGEREF _Toc240136965 \h </w:instrText>
         </w:r>
         <w:r>
           <w:rPr>
@@ -3978,7 +3978,7 @@
           <w14:ligatures w14:val="standardContextual"/>
         </w:rPr>
       </w:pPr>
-      <w:hyperlink w:anchor="_Toc240045508" w:history="1">
+      <w:hyperlink w:anchor="_Toc240136966" w:history="1">
         <w:r>
           <w:rPr>
             <w:rStyle w:val="aff1"/>
@@ -4005,7 +4005,7 @@
             <w:noProof/>
             <w:webHidden/>
           </w:rPr>
-          <w:instrText xml:space="preserve"> PAGEREF _Toc240045508 \h </w:instrText>
+          <w:instrText xml:space="preserve"> PAGEREF _Toc240136966 \h </w:instrText>
         </w:r>
         <w:r>
           <w:rPr>
@@ -4054,7 +4054,7 @@
           <w14:ligatures w14:val="standardContextual"/>
         </w:rPr>
       </w:pPr>
-      <w:hyperlink w:anchor="_Toc240045509" w:history="1">
+      <w:hyperlink w:anchor="_Toc240136967" w:history="1">
         <w:r>
           <w:rPr>
             <w:rStyle w:val="aff1"/>
@@ -4081,7 +4081,7 @@
             <w:noProof/>
             <w:webHidden/>
           </w:rPr>
-          <w:instrText xml:space="preserve"> PAGEREF _Toc240045509 \h </w:instrText>
+          <w:instrText xml:space="preserve"> PAGEREF _Toc240136967 \h </w:instrText>
         </w:r>
         <w:r>
           <w:rPr>
@@ -4130,7 +4130,7 @@
           <w14:ligatures w14:val="standardContextual"/>
         </w:rPr>
       </w:pPr>
-      <w:hyperlink w:anchor="_Toc240045510" w:history="1">
+      <w:hyperlink w:anchor="_Toc240136968" w:history="1">
         <w:r>
           <w:rPr>
             <w:rStyle w:val="aff1"/>
@@ -4157,7 +4157,7 @@
             <w:noProof/>
             <w:webHidden/>
           </w:rPr>
-          <w:instrText xml:space="preserve"> PAGEREF _Toc240045510 \h </w:instrText>
+          <w:instrText xml:space="preserve"> PAGEREF _Toc240136968 \h </w:instrText>
         </w:r>
         <w:r>
           <w:rPr>
@@ -4206,7 +4206,7 @@
           <w14:ligatures w14:val="standardContextual"/>
         </w:rPr>
       </w:pPr>
-      <w:hyperlink w:anchor="_Toc240045511" w:history="1">
+      <w:hyperlink w:anchor="_Toc240136969" w:history="1">
         <w:r>
           <w:rPr>
             <w:rStyle w:val="aff1"/>
@@ -4233,7 +4233,7 @@
             <w:noProof/>
             <w:webHidden/>
           </w:rPr>
-          <w:instrText xml:space="preserve"> PAGEREF _Toc240045511 \h </w:instrText>
+          <w:instrText xml:space="preserve"> PAGEREF _Toc240136969 \h </w:instrText>
         </w:r>
         <w:r>
           <w:rPr>
@@ -4282,7 +4282,7 @@
           <w14:ligatures w14:val="standardContextual"/>
         </w:rPr>
       </w:pPr>
-      <w:hyperlink w:anchor="_Toc240045512" w:history="1">
+      <w:hyperlink w:anchor="_Toc240136970" w:history="1">
         <w:r>
           <w:rPr>
             <w:rStyle w:val="aff1"/>
@@ -4309,7 +4309,7 @@
             <w:noProof/>
             <w:webHidden/>
           </w:rPr>
-          <w:instrText xml:space="preserve"> PAGEREF _Toc240045512 \h </w:instrText>
+          <w:instrText xml:space="preserve"> PAGEREF _Toc240136970 \h </w:instrText>
         </w:r>
         <w:r>
           <w:rPr>
@@ -4329,7 +4329,7 @@
             <w:noProof/>
             <w:webHidden/>
           </w:rPr>
-          <w:t>25</w:t>
+          <w:t>26</w:t>
         </w:r>
         <w:r>
           <w:rPr>
@@ -4358,7 +4358,7 @@
           <w14:ligatures w14:val="standardContextual"/>
         </w:rPr>
       </w:pPr>
-      <w:hyperlink w:anchor="_Toc240045513" w:history="1">
+      <w:hyperlink w:anchor="_Toc240136971" w:history="1">
         <w:r>
           <w:rPr>
             <w:rStyle w:val="aff1"/>
@@ -4385,7 +4385,7 @@
             <w:noProof/>
             <w:webHidden/>
           </w:rPr>
-          <w:instrText xml:space="preserve"> PAGEREF _Toc240045513 \h </w:instrText>
+          <w:instrText xml:space="preserve"> PAGEREF _Toc240136971 \h </w:instrText>
         </w:r>
         <w:r>
           <w:rPr>
@@ -4405,7 +4405,7 @@
             <w:noProof/>
             <w:webHidden/>
           </w:rPr>
-          <w:t>26</w:t>
+          <w:t>27</w:t>
         </w:r>
         <w:r>
           <w:rPr>
@@ -4434,7 +4434,7 @@
           <w14:ligatures w14:val="standardContextual"/>
         </w:rPr>
       </w:pPr>
-      <w:hyperlink w:anchor="_Toc240045514" w:history="1">
+      <w:hyperlink w:anchor="_Toc240136972" w:history="1">
         <w:r>
           <w:rPr>
             <w:rStyle w:val="aff1"/>
@@ -4461,7 +4461,7 @@
             <w:noProof/>
             <w:webHidden/>
           </w:rPr>
-          <w:instrText xml:space="preserve"> PAGEREF _Toc240045514 \h </w:instrText>
+          <w:instrText xml:space="preserve"> PAGEREF _Toc240136972 \h </w:instrText>
         </w:r>
         <w:r>
           <w:rPr>
@@ -4481,7 +4481,7 @@
             <w:noProof/>
             <w:webHidden/>
           </w:rPr>
-          <w:t>27</w:t>
+          <w:t>28</w:t>
         </w:r>
         <w:r>
           <w:rPr>
@@ -4510,7 +4510,7 @@
           <w14:ligatures w14:val="standardContextual"/>
         </w:rPr>
       </w:pPr>
-      <w:hyperlink w:anchor="_Toc240045515" w:history="1">
+      <w:hyperlink w:anchor="_Toc240136973" w:history="1">
         <w:r>
           <w:rPr>
             <w:rStyle w:val="aff1"/>
@@ -4537,7 +4537,7 @@
             <w:noProof/>
             <w:webHidden/>
           </w:rPr>
-          <w:instrText xml:space="preserve"> PAGEREF _Toc240045515 \h </w:instrText>
+          <w:instrText xml:space="preserve"> PAGEREF _Toc240136973 \h </w:instrText>
         </w:r>
         <w:r>
           <w:rPr>
@@ -4557,7 +4557,7 @@
             <w:noProof/>
             <w:webHidden/>
           </w:rPr>
-          <w:t>27</w:t>
+          <w:t>28</w:t>
         </w:r>
         <w:r>
           <w:rPr>
@@ -4586,7 +4586,7 @@
           <w14:ligatures w14:val="standardContextual"/>
         </w:rPr>
       </w:pPr>
-      <w:hyperlink w:anchor="_Toc240045516" w:history="1">
+      <w:hyperlink w:anchor="_Toc240136974" w:history="1">
         <w:r>
           <w:rPr>
             <w:rStyle w:val="aff1"/>
@@ -4613,7 +4613,7 @@
             <w:noProof/>
             <w:webHidden/>
           </w:rPr>
-          <w:instrText xml:space="preserve"> PAGEREF _Toc240045516 \h </w:instrText>
+          <w:instrText xml:space="preserve"> PAGEREF _Toc240136974 \h </w:instrText>
         </w:r>
         <w:r>
           <w:rPr>
@@ -4633,7 +4633,7 @@
             <w:noProof/>
             <w:webHidden/>
           </w:rPr>
-          <w:t>28</w:t>
+          <w:t>29</w:t>
         </w:r>
         <w:r>
           <w:rPr>
@@ -4661,7 +4661,7 @@
           <w14:ligatures w14:val="standardContextual"/>
         </w:rPr>
       </w:pPr>
-      <w:hyperlink w:anchor="_Toc240045517" w:history="1">
+      <w:hyperlink w:anchor="_Toc240136975" w:history="1">
         <w:r>
           <w:rPr>
             <w:rStyle w:val="aff1"/>
@@ -4688,7 +4688,7 @@
             <w:noProof/>
             <w:webHidden/>
           </w:rPr>
-          <w:instrText xml:space="preserve"> PAGEREF _Toc240045517 \h </w:instrText>
+          <w:instrText xml:space="preserve"> PAGEREF _Toc240136975 \h </w:instrText>
         </w:r>
         <w:r>
           <w:rPr>
@@ -4708,7 +4708,7 @@
             <w:noProof/>
             <w:webHidden/>
           </w:rPr>
-          <w:t>29</w:t>
+          <w:t>30</w:t>
         </w:r>
         <w:r>
           <w:rPr>
@@ -4737,7 +4737,7 @@
           <w14:ligatures w14:val="standardContextual"/>
         </w:rPr>
       </w:pPr>
-      <w:hyperlink w:anchor="_Toc240045518" w:history="1">
+      <w:hyperlink w:anchor="_Toc240136976" w:history="1">
         <w:r>
           <w:rPr>
             <w:rStyle w:val="aff1"/>
@@ -4764,7 +4764,7 @@
             <w:noProof/>
             <w:webHidden/>
           </w:rPr>
-          <w:instrText xml:space="preserve"> PAGEREF _Toc240045518 \h </w:instrText>
+          <w:instrText xml:space="preserve"> PAGEREF _Toc240136976 \h </w:instrText>
         </w:r>
         <w:r>
           <w:rPr>
@@ -4784,7 +4784,7 @@
             <w:noProof/>
             <w:webHidden/>
           </w:rPr>
-          <w:t>29</w:t>
+          <w:t>30</w:t>
         </w:r>
         <w:r>
           <w:rPr>
@@ -4813,7 +4813,7 @@
           <w14:ligatures w14:val="standardContextual"/>
         </w:rPr>
       </w:pPr>
-      <w:hyperlink w:anchor="_Toc240045519" w:history="1">
+      <w:hyperlink w:anchor="_Toc240136977" w:history="1">
         <w:r>
           <w:rPr>
             <w:rStyle w:val="aff1"/>
@@ -4840,7 +4840,7 @@
             <w:noProof/>
             <w:webHidden/>
           </w:rPr>
-          <w:instrText xml:space="preserve"> PAGEREF _Toc240045519 \h </w:instrText>
+          <w:instrText xml:space="preserve"> PAGEREF _Toc240136977 \h </w:instrText>
         </w:r>
         <w:r>
           <w:rPr>
@@ -4860,7 +4860,7 @@
             <w:noProof/>
             <w:webHidden/>
           </w:rPr>
-          <w:t>29</w:t>
+          <w:t>30</w:t>
         </w:r>
         <w:r>
           <w:rPr>
@@ -4889,7 +4889,7 @@
           <w14:ligatures w14:val="standardContextual"/>
         </w:rPr>
       </w:pPr>
-      <w:hyperlink w:anchor="_Toc240045520" w:history="1">
+      <w:hyperlink w:anchor="_Toc240136978" w:history="1">
         <w:r>
           <w:rPr>
             <w:rStyle w:val="aff1"/>
@@ -4916,7 +4916,7 @@
             <w:noProof/>
             <w:webHidden/>
           </w:rPr>
-          <w:instrText xml:space="preserve"> PAGEREF _Toc240045520 \h </w:instrText>
+          <w:instrText xml:space="preserve"> PAGEREF _Toc240136978 \h </w:instrText>
         </w:r>
         <w:r>
           <w:rPr>
@@ -4936,7 +4936,7 @@
             <w:noProof/>
             <w:webHidden/>
           </w:rPr>
-          <w:t>29</w:t>
+          <w:t>30</w:t>
         </w:r>
         <w:r>
           <w:rPr>
@@ -4965,7 +4965,7 @@
           <w14:ligatures w14:val="standardContextual"/>
         </w:rPr>
       </w:pPr>
-      <w:hyperlink w:anchor="_Toc240045521" w:history="1">
+      <w:hyperlink w:anchor="_Toc240136979" w:history="1">
         <w:r>
           <w:rPr>
             <w:rStyle w:val="aff1"/>
@@ -4992,7 +4992,7 @@
             <w:noProof/>
             <w:webHidden/>
           </w:rPr>
-          <w:instrText xml:space="preserve"> PAGEREF _Toc240045521 \h </w:instrText>
+          <w:instrText xml:space="preserve"> PAGEREF _Toc240136979 \h </w:instrText>
         </w:r>
         <w:r>
           <w:rPr>
@@ -5012,7 +5012,7 @@
             <w:noProof/>
             <w:webHidden/>
           </w:rPr>
-          <w:t>30</w:t>
+          <w:t>31</w:t>
         </w:r>
         <w:r>
           <w:rPr>
@@ -5041,7 +5041,7 @@
           <w14:ligatures w14:val="standardContextual"/>
         </w:rPr>
       </w:pPr>
-      <w:hyperlink w:anchor="_Toc240045522" w:history="1">
+      <w:hyperlink w:anchor="_Toc240136980" w:history="1">
         <w:r>
           <w:rPr>
             <w:rStyle w:val="aff1"/>
@@ -5068,7 +5068,7 @@
             <w:noProof/>
             <w:webHidden/>
           </w:rPr>
-          <w:instrText xml:space="preserve"> PAGEREF _Toc240045522 \h </w:instrText>
+          <w:instrText xml:space="preserve"> PAGEREF _Toc240136980 \h </w:instrText>
         </w:r>
         <w:r>
           <w:rPr>
@@ -5088,7 +5088,7 @@
             <w:noProof/>
             <w:webHidden/>
           </w:rPr>
-          <w:t>30</w:t>
+          <w:t>31</w:t>
         </w:r>
         <w:r>
           <w:rPr>
@@ -5117,7 +5117,7 @@
           <w14:ligatures w14:val="standardContextual"/>
         </w:rPr>
       </w:pPr>
-      <w:hyperlink w:anchor="_Toc240045523" w:history="1">
+      <w:hyperlink w:anchor="_Toc240136981" w:history="1">
         <w:r>
           <w:rPr>
             <w:rStyle w:val="aff1"/>
@@ -5144,7 +5144,7 @@
             <w:noProof/>
             <w:webHidden/>
           </w:rPr>
-          <w:instrText xml:space="preserve"> PAGEREF _Toc240045523 \h </w:instrText>
+          <w:instrText xml:space="preserve"> PAGEREF _Toc240136981 \h </w:instrText>
         </w:r>
         <w:r>
           <w:rPr>
@@ -5164,7 +5164,7 @@
             <w:noProof/>
             <w:webHidden/>
           </w:rPr>
-          <w:t>31</w:t>
+          <w:t>32</w:t>
         </w:r>
         <w:r>
           <w:rPr>
@@ -5193,7 +5193,7 @@
           <w14:ligatures w14:val="standardContextual"/>
         </w:rPr>
       </w:pPr>
-      <w:hyperlink w:anchor="_Toc240045524" w:history="1">
+      <w:hyperlink w:anchor="_Toc240136982" w:history="1">
         <w:r>
           <w:rPr>
             <w:rStyle w:val="aff1"/>
@@ -5220,7 +5220,7 @@
             <w:noProof/>
             <w:webHidden/>
           </w:rPr>
-          <w:instrText xml:space="preserve"> PAGEREF _Toc240045524 \h </w:instrText>
+          <w:instrText xml:space="preserve"> PAGEREF _Toc240136982 \h </w:instrText>
         </w:r>
         <w:r>
           <w:rPr>
@@ -5240,7 +5240,7 @@
             <w:noProof/>
             <w:webHidden/>
           </w:rPr>
-          <w:t>31</w:t>
+          <w:t>32</w:t>
         </w:r>
         <w:r>
           <w:rPr>
@@ -5268,7 +5268,7 @@
           <w14:ligatures w14:val="standardContextual"/>
         </w:rPr>
       </w:pPr>
-      <w:hyperlink w:anchor="_Toc240045525" w:history="1">
+      <w:hyperlink w:anchor="_Toc240136983" w:history="1">
         <w:r>
           <w:rPr>
             <w:rStyle w:val="aff1"/>
@@ -5295,7 +5295,7 @@
             <w:noProof/>
             <w:webHidden/>
           </w:rPr>
-          <w:instrText xml:space="preserve"> PAGEREF _Toc240045525 \h </w:instrText>
+          <w:instrText xml:space="preserve"> PAGEREF _Toc240136983 \h </w:instrText>
         </w:r>
         <w:r>
           <w:rPr>
@@ -5315,7 +5315,7 @@
             <w:noProof/>
             <w:webHidden/>
           </w:rPr>
-          <w:t>32</w:t>
+          <w:t>33</w:t>
         </w:r>
         <w:r>
           <w:rPr>
@@ -5343,7 +5343,7 @@
           <w14:ligatures w14:val="standardContextual"/>
         </w:rPr>
       </w:pPr>
-      <w:hyperlink w:anchor="_Toc240045526" w:history="1">
+      <w:hyperlink w:anchor="_Toc240136984" w:history="1">
         <w:r>
           <w:rPr>
             <w:rStyle w:val="aff1"/>
@@ -5370,7 +5370,7 @@
             <w:noProof/>
             <w:webHidden/>
           </w:rPr>
-          <w:instrText xml:space="preserve"> PAGEREF _Toc240045526 \h </w:instrText>
+          <w:instrText xml:space="preserve"> PAGEREF _Toc240136984 \h </w:instrText>
         </w:r>
         <w:r>
           <w:rPr>
@@ -5390,7 +5390,7 @@
             <w:noProof/>
             <w:webHidden/>
           </w:rPr>
-          <w:t>32</w:t>
+          <w:t>33</w:t>
         </w:r>
         <w:r>
           <w:rPr>
@@ -5418,7 +5418,7 @@
           <w14:ligatures w14:val="standardContextual"/>
         </w:rPr>
       </w:pPr>
-      <w:hyperlink w:anchor="_Toc240045527" w:history="1">
+      <w:hyperlink w:anchor="_Toc240136985" w:history="1">
         <w:r>
           <w:rPr>
             <w:rStyle w:val="aff1"/>
@@ -5445,7 +5445,7 @@
             <w:noProof/>
             <w:webHidden/>
           </w:rPr>
-          <w:instrText xml:space="preserve"> PAGEREF _Toc240045527 \h </w:instrText>
+          <w:instrText xml:space="preserve"> PAGEREF _Toc240136985 \h </w:instrText>
         </w:r>
         <w:r>
           <w:rPr>
@@ -5465,7 +5465,7 @@
             <w:noProof/>
             <w:webHidden/>
           </w:rPr>
-          <w:t>33</w:t>
+          <w:t>34</w:t>
         </w:r>
         <w:r>
           <w:rPr>
@@ -5495,7 +5495,7 @@
           <w:numId w:val="7"/>
         </w:numPr>
       </w:pPr>
-      <w:bookmarkStart w:id="0" w:name="_Toc240045463"/>
+      <w:bookmarkStart w:id="0" w:name="_Toc240136921"/>
       <w:r>
         <w:lastRenderedPageBreak/>
         <w:t>게임</w:t>
@@ -5528,7 +5528,7 @@
           <w:numId w:val="7"/>
         </w:numPr>
       </w:pPr>
-      <w:bookmarkStart w:id="1" w:name="_Toc240045464"/>
+      <w:bookmarkStart w:id="1" w:name="_Toc240136922"/>
       <w:r>
         <w:t>Executive Summary</w:t>
       </w:r>
@@ -5599,7 +5599,7 @@
           <w:numId w:val="7"/>
         </w:numPr>
       </w:pPr>
-      <w:bookmarkStart w:id="2" w:name="_Toc240045465"/>
+      <w:bookmarkStart w:id="2" w:name="_Toc240136923"/>
       <w:r>
         <w:t>Rev 16 Release Profile</w:t>
       </w:r>
@@ -5623,7 +5623,7 @@
           <w:numId w:val="7"/>
         </w:numPr>
       </w:pPr>
-      <w:bookmarkStart w:id="3" w:name="_Toc240045466"/>
+      <w:bookmarkStart w:id="3" w:name="_Toc240136924"/>
       <w:r>
         <w:t>제품</w:t>
       </w:r>
@@ -5913,7 +5913,7 @@
           <w:numId w:val="7"/>
         </w:numPr>
       </w:pPr>
-      <w:bookmarkStart w:id="4" w:name="_Toc240045467"/>
+      <w:bookmarkStart w:id="4" w:name="_Toc240136925"/>
       <w:r>
         <w:t>디자인</w:t>
       </w:r>
@@ -6283,7 +6283,7 @@
           <w:numId w:val="7"/>
         </w:numPr>
       </w:pPr>
-      <w:bookmarkStart w:id="5" w:name="_Toc240045468"/>
+      <w:bookmarkStart w:id="5" w:name="_Toc240136926"/>
       <w:r>
         <w:t>Target Experience</w:t>
       </w:r>
@@ -6357,7 +6357,7 @@
           <w:numId w:val="7"/>
         </w:numPr>
       </w:pPr>
-      <w:bookmarkStart w:id="6" w:name="_Toc240045469"/>
+      <w:bookmarkStart w:id="6" w:name="_Toc240136927"/>
       <w:r>
         <w:t>명시적</w:t>
       </w:r>
@@ -6629,7 +6629,7 @@
           <w:numId w:val="7"/>
         </w:numPr>
       </w:pPr>
-      <w:bookmarkStart w:id="7" w:name="_Toc240045470"/>
+      <w:bookmarkStart w:id="7" w:name="_Toc240136928"/>
       <w:r>
         <w:lastRenderedPageBreak/>
         <w:t>Contract Run</w:t>
@@ -6665,7 +6665,7 @@
           <w:numId w:val="7"/>
         </w:numPr>
       </w:pPr>
-      <w:bookmarkStart w:id="8" w:name="_Toc240045471"/>
+      <w:bookmarkStart w:id="8" w:name="_Toc240136929"/>
       <w:r>
         <w:t>Core Loop</w:t>
       </w:r>
@@ -7159,7 +7159,7 @@
           <w:numId w:val="7"/>
         </w:numPr>
       </w:pPr>
-      <w:bookmarkStart w:id="9" w:name="_Toc240045472"/>
+      <w:bookmarkStart w:id="9" w:name="_Toc240136930"/>
       <w:r>
         <w:t xml:space="preserve">Contract </w:t>
       </w:r>
@@ -7583,7 +7583,7 @@
           <w:numId w:val="7"/>
         </w:numPr>
       </w:pPr>
-      <w:bookmarkStart w:id="10" w:name="_Toc240045473"/>
+      <w:bookmarkStart w:id="10" w:name="_Toc240136931"/>
       <w:r>
         <w:lastRenderedPageBreak/>
         <w:t>성공</w:t>
@@ -7875,7 +7875,7 @@
           <w:numId w:val="7"/>
         </w:numPr>
       </w:pPr>
-      <w:bookmarkStart w:id="11" w:name="_Toc240045474"/>
+      <w:bookmarkStart w:id="11" w:name="_Toc240136932"/>
       <w:r>
         <w:t>Greed Decision</w:t>
       </w:r>
@@ -8244,7 +8244,7 @@
           <w:numId w:val="7"/>
         </w:numPr>
       </w:pPr>
-      <w:bookmarkStart w:id="12" w:name="_Toc240045475"/>
+      <w:bookmarkStart w:id="12" w:name="_Toc240136933"/>
       <w:r>
         <w:t>15~25</w:t>
       </w:r>
@@ -8614,7 +8614,7 @@
           <w:numId w:val="7"/>
         </w:numPr>
       </w:pPr>
-      <w:bookmarkStart w:id="13" w:name="_Toc240045476"/>
+      <w:bookmarkStart w:id="13" w:name="_Toc240136934"/>
       <w:r>
         <w:lastRenderedPageBreak/>
         <w:t>위조와</w:t>
@@ -8641,7 +8641,7 @@
           <w:numId w:val="7"/>
         </w:numPr>
       </w:pPr>
-      <w:bookmarkStart w:id="14" w:name="_Toc240045477"/>
+      <w:bookmarkStart w:id="14" w:name="_Toc240136935"/>
       <w:r>
         <w:t>Artifact</w:t>
       </w:r>
@@ -8942,7 +8942,7 @@
           <w:numId w:val="7"/>
         </w:numPr>
       </w:pPr>
-      <w:bookmarkStart w:id="15" w:name="_Toc240045478"/>
+      <w:bookmarkStart w:id="15" w:name="_Toc240136936"/>
       <w:r>
         <w:t xml:space="preserve">Surface Forgery </w:t>
       </w:r>
@@ -9127,7 +9127,7 @@
           <w:numId w:val="7"/>
         </w:numPr>
       </w:pPr>
-      <w:bookmarkStart w:id="16" w:name="_Toc240045479"/>
+      <w:bookmarkStart w:id="16" w:name="_Toc240136937"/>
       <w:r>
         <w:t>Object Assembly — Deferred Expansion</w:t>
       </w:r>
@@ -9195,7 +9195,7 @@
           <w:numId w:val="7"/>
         </w:numPr>
       </w:pPr>
-      <w:bookmarkStart w:id="17" w:name="_Toc240045480"/>
+      <w:bookmarkStart w:id="17" w:name="_Toc240136938"/>
       <w:r>
         <w:t>Quality</w:t>
       </w:r>
@@ -9484,7 +9484,7 @@
           <w:numId w:val="7"/>
         </w:numPr>
       </w:pPr>
-      <w:bookmarkStart w:id="18" w:name="_Toc240045481"/>
+      <w:bookmarkStart w:id="18" w:name="_Toc240136939"/>
       <w:r>
         <w:t>핵심</w:t>
       </w:r>
@@ -9986,7 +9986,7 @@
           <w:numId w:val="7"/>
         </w:numPr>
       </w:pPr>
-      <w:bookmarkStart w:id="19" w:name="_Toc240045482"/>
+      <w:bookmarkStart w:id="19" w:name="_Toc240136940"/>
       <w:r>
         <w:t xml:space="preserve">Owner-only Forgery </w:t>
       </w:r>
@@ -10233,7 +10233,7 @@
           <w:numId w:val="7"/>
         </w:numPr>
       </w:pPr>
-      <w:bookmarkStart w:id="20" w:name="_Toc240045483"/>
+      <w:bookmarkStart w:id="20" w:name="_Toc240136941"/>
       <w:r>
         <w:lastRenderedPageBreak/>
         <w:t>잠입</w:t>
@@ -10266,7 +10266,7 @@
           <w:numId w:val="7"/>
         </w:numPr>
       </w:pPr>
-      <w:bookmarkStart w:id="21" w:name="_Toc240045484"/>
+      <w:bookmarkStart w:id="21" w:name="_Toc240136942"/>
       <w:r>
         <w:t xml:space="preserve">First-Person </w:t>
       </w:r>
@@ -10331,7 +10331,7 @@
           <w:numId w:val="7"/>
         </w:numPr>
       </w:pPr>
-      <w:bookmarkStart w:id="22" w:name="_Toc240045485"/>
+      <w:bookmarkStart w:id="22" w:name="_Toc240136943"/>
       <w:r>
         <w:t>Walk, Sprint, Weight, Footstep</w:t>
       </w:r>
@@ -10674,7 +10674,7 @@
           <w:numId w:val="7"/>
         </w:numPr>
       </w:pPr>
-      <w:bookmarkStart w:id="23" w:name="_Toc240045486"/>
+      <w:bookmarkStart w:id="23" w:name="_Toc240136944"/>
       <w:r>
         <w:t>Patrol Guard</w:t>
       </w:r>
@@ -11025,7 +11025,7 @@
           <w:numId w:val="7"/>
         </w:numPr>
       </w:pPr>
-      <w:bookmarkStart w:id="24" w:name="_Toc240045487"/>
+      <w:bookmarkStart w:id="24" w:name="_Toc240136945"/>
       <w:r>
         <w:t>CCTV</w:t>
       </w:r>
@@ -11275,7 +11275,7 @@
           <w:numId w:val="7"/>
         </w:numPr>
       </w:pPr>
-      <w:bookmarkStart w:id="25" w:name="_Toc240045488"/>
+      <w:bookmarkStart w:id="25" w:name="_Toc240136946"/>
       <w:r>
         <w:lastRenderedPageBreak/>
         <w:t>Stun, Arrest, Recovery</w:t>
@@ -11350,7 +11350,7 @@
           <w:numId w:val="7"/>
         </w:numPr>
       </w:pPr>
-      <w:bookmarkStart w:id="26" w:name="_Toc240045489"/>
+      <w:bookmarkStart w:id="26" w:name="_Toc240136947"/>
       <w:r>
         <w:t>두</w:t>
       </w:r>
@@ -11826,7 +11826,7 @@
           <w:numId w:val="7"/>
         </w:numPr>
       </w:pPr>
-      <w:bookmarkStart w:id="27" w:name="_Toc240045490"/>
+      <w:bookmarkStart w:id="27" w:name="_Toc240136948"/>
       <w:r>
         <w:lastRenderedPageBreak/>
         <w:t>협동</w:t>
@@ -11853,7 +11853,7 @@
           <w:numId w:val="7"/>
         </w:numPr>
       </w:pPr>
-      <w:bookmarkStart w:id="28" w:name="_Toc240045491"/>
+      <w:bookmarkStart w:id="28" w:name="_Toc240136949"/>
       <w:r>
         <w:t>Role Switching</w:t>
       </w:r>
@@ -12261,7 +12261,7 @@
           <w:numId w:val="7"/>
         </w:numPr>
       </w:pPr>
-      <w:bookmarkStart w:id="29" w:name="_Toc240045492"/>
+      <w:bookmarkStart w:id="29" w:name="_Toc240136950"/>
       <w:r>
         <w:t>거리</w:t>
       </w:r>
@@ -12320,7 +12320,7 @@
           <w:numId w:val="7"/>
         </w:numPr>
       </w:pPr>
-      <w:bookmarkStart w:id="30" w:name="_Toc240045493"/>
+      <w:bookmarkStart w:id="30" w:name="_Toc240136951"/>
       <w:r>
         <w:t>Inventory, Loose Loot, Coin</w:t>
       </w:r>
@@ -12383,7 +12383,7 @@
           <w:numId w:val="7"/>
         </w:numPr>
       </w:pPr>
-      <w:bookmarkStart w:id="31" w:name="_Toc240045494"/>
+      <w:bookmarkStart w:id="31" w:name="_Toc240136952"/>
       <w:r>
         <w:t>Player Identity</w:t>
       </w:r>
@@ -12806,7 +12806,7 @@
           <w:numId w:val="7"/>
         </w:numPr>
       </w:pPr>
-      <w:bookmarkStart w:id="32" w:name="_Toc240045495"/>
+      <w:bookmarkStart w:id="32" w:name="_Toc240136953"/>
       <w:r>
         <w:t xml:space="preserve">Floor Plan Map </w:t>
       </w:r>
@@ -13018,7 +13018,7 @@
           <w:numId w:val="7"/>
         </w:numPr>
       </w:pPr>
-      <w:bookmarkStart w:id="33" w:name="_Toc240045496"/>
+      <w:bookmarkStart w:id="33" w:name="_Toc240136954"/>
       <w:r>
         <w:t>Shared Extraction</w:t>
       </w:r>
@@ -13098,7 +13098,7 @@
           <w:numId w:val="7"/>
         </w:numPr>
       </w:pPr>
-      <w:bookmarkStart w:id="34" w:name="_Toc240045497"/>
+      <w:bookmarkStart w:id="34" w:name="_Toc240136955"/>
       <w:r>
         <w:lastRenderedPageBreak/>
         <w:t xml:space="preserve">UI, </w:t>
@@ -13113,6 +13113,12 @@
         <w:t>접근성</w:t>
       </w:r>
       <w:bookmarkEnd w:id="34"/>
+    </w:p>
+    <w:p>
+      <w:pPr/>
+      <w:r>
+        <w:t>메뉴와 작업 화면은 전시 도록을 펼쳐 보는 분위기로 통일한다. 먹색 바탕, 아이보리 종이 탭과 절제된 금색 테두리를 사용하고, 주요 행동은 밝은 종이 버튼으로 강조한다. 제목은 명조 계열, 본문과 수치는 고딕 계열로 구분한다. HUD는 월드 시야를 가리는 장식을 줄이고 미션·경계도·팀 상태의 판독성을 우선한다. 로비의 맵 선택은 각 박물관의 실제 장면을 보여준다.</w:t>
+      </w:r>
     </w:p>
     <w:p>
       <w:pPr>
@@ -13122,7 +13128,7 @@
           <w:numId w:val="7"/>
         </w:numPr>
       </w:pPr>
-      <w:bookmarkStart w:id="35" w:name="_Toc240045498"/>
+      <w:bookmarkStart w:id="35" w:name="_Toc240136956"/>
       <w:r>
         <w:t>HUD Information Architecture</w:t>
       </w:r>
@@ -13423,7 +13429,7 @@
           <w:numId w:val="7"/>
         </w:numPr>
       </w:pPr>
-      <w:bookmarkStart w:id="36" w:name="_Toc240045499"/>
+      <w:bookmarkStart w:id="36" w:name="_Toc240136957"/>
       <w:r>
         <w:t xml:space="preserve">Main HUD </w:t>
       </w:r>
@@ -13732,7 +13738,7 @@
           <w:numId w:val="7"/>
         </w:numPr>
       </w:pPr>
-      <w:bookmarkStart w:id="37" w:name="_Toc240045500"/>
+      <w:bookmarkStart w:id="37" w:name="_Toc240136958"/>
       <w:r>
         <w:lastRenderedPageBreak/>
         <w:t>최소</w:t>
@@ -13814,7 +13820,7 @@
           <w:numId w:val="7"/>
         </w:numPr>
       </w:pPr>
-      <w:bookmarkStart w:id="38" w:name="_Toc240045501"/>
+      <w:bookmarkStart w:id="38" w:name="_Toc240136959"/>
       <w:r>
         <w:t xml:space="preserve">Input Mode </w:t>
       </w:r>
@@ -14294,7 +14300,7 @@
           <w:numId w:val="7"/>
         </w:numPr>
       </w:pPr>
-      <w:bookmarkStart w:id="39" w:name="_Toc240045502"/>
+      <w:bookmarkStart w:id="39" w:name="_Toc240136960"/>
       <w:r>
         <w:lastRenderedPageBreak/>
         <w:t>Floor Plan</w:t>
@@ -14318,7 +14324,7 @@
           <w:numId w:val="7"/>
         </w:numPr>
       </w:pPr>
-      <w:bookmarkStart w:id="40" w:name="_Toc240045503"/>
+      <w:bookmarkStart w:id="40" w:name="_Toc240136961"/>
       <w:r>
         <w:t xml:space="preserve">Floor Plan Map </w:t>
       </w:r>
@@ -14633,7 +14639,7 @@
           <w:numId w:val="7"/>
         </w:numPr>
       </w:pPr>
-      <w:bookmarkStart w:id="41" w:name="_Toc240045504"/>
+      <w:bookmarkStart w:id="41" w:name="_Toc240136962"/>
       <w:r>
         <w:t xml:space="preserve">Team Result / Replica Recap </w:t>
       </w:r>
@@ -15011,7 +15017,7 @@
           <w:numId w:val="7"/>
         </w:numPr>
       </w:pPr>
-      <w:bookmarkStart w:id="42" w:name="_Toc240045505"/>
+      <w:bookmarkStart w:id="42" w:name="_Toc240136963"/>
       <w:r>
         <w:t>첫</w:t>
       </w:r>
@@ -15285,7 +15291,7 @@
           <w:numId w:val="7"/>
         </w:numPr>
       </w:pPr>
-      <w:bookmarkStart w:id="43" w:name="_Toc240045506"/>
+      <w:bookmarkStart w:id="43" w:name="_Toc240136964"/>
       <w:r>
         <w:lastRenderedPageBreak/>
         <w:t>접근성</w:t>
@@ -15358,7 +15364,7 @@
           <w:numId w:val="7"/>
         </w:numPr>
       </w:pPr>
-      <w:bookmarkStart w:id="44" w:name="_Toc240045507"/>
+      <w:bookmarkStart w:id="44" w:name="_Toc240136965"/>
       <w:r>
         <w:lastRenderedPageBreak/>
         <w:t>레벨</w:t>
@@ -15391,7 +15397,7 @@
           <w:numId w:val="7"/>
         </w:numPr>
       </w:pPr>
-      <w:bookmarkStart w:id="45" w:name="_Toc240045508"/>
+      <w:bookmarkStart w:id="45" w:name="_Toc240136966"/>
       <w:r>
         <w:t>세</w:t>
       </w:r>
@@ -15486,7 +15492,7 @@
         <w:pStyle w:val="a0"/>
       </w:pPr>
       <w:r>
-        <w:t>전시실은 작품이 붙는 벽과 관람 공간을 함께 설계한다. 액자는 실제 벽면 또는 바닥에 지지된 독립 전시벽에 설치하고, 정면이 접근 가능한 관람 공간을 향하게 한다. 일반 연결부는 3~5m 폭을 초기 블록아웃 기준으로 삼으며, 눈높이 차폐·경비 관찰 자리·횡단 구간·귀환 길을 이어 배치한다. 최종 폭과 플레이 시간은 멀티플레이로 검증한다.</w:t>
+        <w:t>전시실은 작품 벽과 관람 공간을 함께 설계한다. 승인 평면도 기준 외벽 0.40m, 내벽 0.24m, 연결 문 3~4m, 후면 관리 회랑 4m를 사용한다. 작품 앞 작업 공간은 2.2m를 확보하며 활성 작품은 벽에서 1.6m 떨어진 접근점으로 진입할 수 있어야 한다. 맵별 활성 작품 20점, 일반 작품 M01 51점·M02 53점·M03 61점과 12종 전시 패턴을 배치한다. 통과 폭과 15~25분 플레이 시간은 실제 멀티플레이로 검증한다.</w:t>
       </w:r>
     </w:p>
     <w:p>
@@ -15494,14 +15500,14 @@
         <w:pStyle w:val="a0"/>
       </w:pPr>
       <w:r>
-        <w:t>M01은 중앙 Rotunda의 개방감을 유지하고 북·남 회랑을 여러 전시실로 나눈다. M02는 중정을 대표 개방 공간으로 남기고 벽에 연결된 병풍과 엇갈린 입구로 시야를 굴절시킨다. M03는 세 레인을 유지하면서 중앙의 긴 전망을 불투명 전시벽으로 구간화하고, 측면 복원 구역에 은폐 공간을 제공한다. Laser 고가 작품에는 경보 문턱과 독립적인 이탈 경로를 함께 둔다.</w:t>
+        <w:t>M01은 중앙 Rotunda의 개방감을 유지하고 북·남 회랑을 여러 전시실로 나눈다. M02는 중정을 대표 개방 공간으로 남기고 벽에 연결된 병풍과 엇갈린 입구로 시야를 굴절시킨다. M03는 세 레인을 유지하면서 중앙의 긴 전망을 불투명 전시벽으로 구간화하고, 측면 복원 구역에 은폐 공간을 제공한다. Laser 고가 작품에는 경보 문턱과 독립적인 이탈 경로를 함께 둔다. 필수 작품은 서측에서 계약을 끝내는 동선을 방지하도록 동측 일반 전시실에 둔다. 일곱 Laser는 모두 FourStar 고가 작품에 연결하고, 버튼은 문을 통과하는 경비와 몸이 부딪히지 않는 벽면 차폐 공간에 둔다. 홀드는 동료의 진입과 복귀에 필요한 동안 선택하며 위조 작업 전체의 의무 대기로 만들지 않는다.</w:t>
       </w:r>
     </w:p>
     <w:p>
       <w:pPr>
         <w:pStyle w:val="31"/>
       </w:pPr>
-      <w:bookmarkStart w:id="46" w:name="_Toc240045509"/>
+      <w:bookmarkStart w:id="46" w:name="_Toc240136967"/>
       <w:r>
         <w:t>전시</w:t>
       </w:r>
@@ -15533,187 +15539,7 @@
     </w:p>
     <w:p>
       <w:r>
-        <w:t>Barnes Foundation</w:t>
-      </w:r>
-      <w:r>
-        <w:t>의</w:t>
-      </w:r>
-      <w:r>
-        <w:t xml:space="preserve"> </w:t>
-      </w:r>
-      <w:r>
-        <w:t>앙상블</w:t>
-      </w:r>
-      <w:r>
-        <w:t>, MoMA</w:t>
-      </w:r>
-      <w:r>
-        <w:t>의</w:t>
-      </w:r>
-      <w:r>
-        <w:t xml:space="preserve"> Warhol </w:t>
-      </w:r>
-      <w:r>
-        <w:t>연속</w:t>
-      </w:r>
-      <w:r>
-        <w:t>·</w:t>
-      </w:r>
-      <w:r>
-        <w:t>격자</w:t>
-      </w:r>
-      <w:r>
-        <w:t xml:space="preserve"> </w:t>
-      </w:r>
-      <w:r>
-        <w:t>전시와</w:t>
-      </w:r>
-      <w:r>
-        <w:t xml:space="preserve"> Rothko </w:t>
-      </w:r>
-      <w:r>
-        <w:t>전시</w:t>
-      </w:r>
-      <w:r>
-        <w:t>, Wallace Collection</w:t>
-      </w:r>
-      <w:r>
-        <w:t>의</w:t>
-      </w:r>
-      <w:r>
-        <w:t xml:space="preserve"> </w:t>
-      </w:r>
-      <w:r>
-        <w:t>다단</w:t>
-      </w:r>
-      <w:r>
-        <w:t xml:space="preserve"> </w:t>
-      </w:r>
-      <w:r>
-        <w:t>전시</w:t>
-      </w:r>
-      <w:r>
-        <w:t xml:space="preserve"> </w:t>
-      </w:r>
-      <w:r>
-        <w:t>사진을</w:t>
-      </w:r>
-      <w:r>
-        <w:t xml:space="preserve"> </w:t>
-      </w:r>
-      <w:r>
-        <w:t>참고한다</w:t>
-      </w:r>
-      <w:r>
-        <w:t xml:space="preserve">. </w:t>
-      </w:r>
-      <w:r>
-        <w:t>다음</w:t>
-      </w:r>
-      <w:r>
-        <w:t xml:space="preserve"> 12</w:t>
-      </w:r>
-      <w:r>
-        <w:t>종은</w:t>
-      </w:r>
-      <w:r>
-        <w:t xml:space="preserve"> </w:t>
-      </w:r>
-      <w:r>
-        <w:t>관찰한</w:t>
-      </w:r>
-      <w:r>
-        <w:t xml:space="preserve"> </w:t>
-      </w:r>
-      <w:r>
-        <w:t>구성을</w:t>
-      </w:r>
-      <w:r>
-        <w:t xml:space="preserve"> </w:t>
-      </w:r>
-      <w:r>
-        <w:t>게임</w:t>
-      </w:r>
-      <w:r>
-        <w:t xml:space="preserve"> </w:t>
-      </w:r>
-      <w:r>
-        <w:t>공간에</w:t>
-      </w:r>
-      <w:r>
-        <w:t xml:space="preserve"> </w:t>
-      </w:r>
-      <w:r>
-        <w:t>맞게</w:t>
-      </w:r>
-      <w:r>
-        <w:t xml:space="preserve"> </w:t>
-      </w:r>
-      <w:r>
-        <w:t>재구성한</w:t>
-      </w:r>
-      <w:r>
-        <w:t xml:space="preserve"> </w:t>
-      </w:r>
-      <w:r>
-        <w:t>배치</w:t>
-      </w:r>
-      <w:r>
-        <w:t xml:space="preserve"> </w:t>
-      </w:r>
-      <w:r>
-        <w:t>유형이며</w:t>
-      </w:r>
-      <w:r>
-        <w:t xml:space="preserve"> </w:t>
-      </w:r>
-      <w:r>
-        <w:t>미술관의</w:t>
-      </w:r>
-      <w:r>
-        <w:t xml:space="preserve"> </w:t>
-      </w:r>
-      <w:r>
-        <w:t>공식</w:t>
-      </w:r>
-      <w:r>
-        <w:t xml:space="preserve"> </w:t>
-      </w:r>
-      <w:r>
-        <w:t>분류나</w:t>
-      </w:r>
-      <w:r>
-        <w:t xml:space="preserve"> </w:t>
-      </w:r>
-      <w:r>
-        <w:t>전시를</w:t>
-      </w:r>
-      <w:r>
-        <w:t xml:space="preserve"> </w:t>
-      </w:r>
-      <w:r>
-        <w:t>그대로</w:t>
-      </w:r>
-      <w:r>
-        <w:t xml:space="preserve"> </w:t>
-      </w:r>
-      <w:r>
-        <w:t>복제한</w:t>
-      </w:r>
-      <w:r>
-        <w:t xml:space="preserve"> </w:t>
-      </w:r>
-      <w:r>
-        <w:t>것이</w:t>
-      </w:r>
-      <w:r>
-        <w:t xml:space="preserve"> </w:t>
-      </w:r>
-      <w:r>
-        <w:t>아니다</w:t>
-      </w:r>
-      <w:r>
-        <w:t>.</w:t>
+        <w:t>Barnes Foundation의 앙상블, MoMA의 Warhol 연속·격자 전시와 Rothko 전시, Wallace Collection의 다단 전시 사진을 참고한다. 다음 12종은 관찰한 구성을 게임 공간에 맞게 재구성한 배치 유형이며 미술관의 공식 분류나 전시를 그대로 복제한 것이 아니다.</w:t>
       </w:r>
     </w:p>
     <w:p>
@@ -15721,118 +15547,7 @@
         <w:pStyle w:val="a0"/>
       </w:pPr>
       <w:r>
-        <w:t>단독</w:t>
-      </w:r>
-      <w:r>
-        <w:t xml:space="preserve"> </w:t>
-      </w:r>
-      <w:r>
-        <w:t>여백형</w:t>
-      </w:r>
-      <w:r>
-        <w:t xml:space="preserve"> · </w:t>
-      </w:r>
-      <w:r>
-        <w:t>동등한</w:t>
-      </w:r>
-      <w:r>
-        <w:t xml:space="preserve"> 2</w:t>
-      </w:r>
-      <w:r>
-        <w:t>점형</w:t>
-      </w:r>
-      <w:r>
-        <w:t xml:space="preserve"> · </w:t>
-      </w:r>
-      <w:r>
-        <w:t>동일</w:t>
-      </w:r>
-      <w:r>
-        <w:t xml:space="preserve"> </w:t>
-      </w:r>
-      <w:r>
-        <w:t>높이</w:t>
-      </w:r>
-      <w:r>
-        <w:t xml:space="preserve"> 3</w:t>
-      </w:r>
-      <w:r>
-        <w:t>점</w:t>
-      </w:r>
-      <w:r>
-        <w:t xml:space="preserve"> </w:t>
-      </w:r>
-      <w:r>
-        <w:t>연작</w:t>
-      </w:r>
-      <w:r>
-        <w:t xml:space="preserve"> · </w:t>
-      </w:r>
-      <w:r>
-        <w:t>긴</w:t>
-      </w:r>
-      <w:r>
-        <w:t xml:space="preserve"> 5</w:t>
-      </w:r>
-      <w:r>
-        <w:t>점</w:t>
-      </w:r>
-      <w:r>
-        <w:t xml:space="preserve"> </w:t>
-      </w:r>
-      <w:r>
-        <w:t>연속형</w:t>
-      </w:r>
-      <w:r>
-        <w:t xml:space="preserve">: </w:t>
-      </w:r>
-      <w:r>
-        <w:t>여백과</w:t>
-      </w:r>
-      <w:r>
-        <w:t xml:space="preserve"> </w:t>
-      </w:r>
-      <w:r>
-        <w:t>관람</w:t>
-      </w:r>
-      <w:r>
-        <w:t xml:space="preserve"> </w:t>
-      </w:r>
-      <w:r>
-        <w:t>순서</w:t>
-      </w:r>
-      <w:r>
-        <w:t xml:space="preserve">, </w:t>
-      </w:r>
-      <w:r>
-        <w:t>반복</w:t>
-      </w:r>
-      <w:r>
-        <w:t xml:space="preserve"> </w:t>
-      </w:r>
-      <w:r>
-        <w:t>작품의</w:t>
-      </w:r>
-      <w:r>
-        <w:t xml:space="preserve"> </w:t>
-      </w:r>
-      <w:r>
-        <w:t>비교에</w:t>
-      </w:r>
-      <w:r>
-        <w:t xml:space="preserve"> </w:t>
-      </w:r>
-      <w:r>
-        <w:t>차이를</w:t>
-      </w:r>
-      <w:r>
-        <w:t xml:space="preserve"> </w:t>
-      </w:r>
-      <w:r>
-        <w:t>둔다</w:t>
-      </w:r>
-      <w:r>
-        <w:t>.</w:t>
+        <w:t>단독 여백형 · 동등한 2점형 · 동일 높이 3점 연작 · 긴 5점 연속형: 여백과 관람 순서, 반복 작품의 비교에 차이를 둔다.</w:t>
       </w:r>
     </w:p>
     <w:p>
@@ -15840,133 +15555,8 @@
         <w:pStyle w:val="a0"/>
       </w:pPr>
       <w:r>
-        <w:t>2</w:t>
-      </w:r>
-      <w:r>
-        <w:t>단</w:t>
-      </w:r>
-      <w:r>
-        <w:t xml:space="preserve"> 3</w:t>
-      </w:r>
-      <w:r>
-        <w:t>열</w:t>
-      </w:r>
-      <w:r>
-        <w:t xml:space="preserve"> </w:t>
-      </w:r>
-      <w:r>
-        <w:t>격자형</w:t>
-      </w:r>
-      <w:r>
-        <w:t xml:space="preserve"> · </w:t>
-      </w:r>
-      <w:r>
-        <w:t>세로</w:t>
-      </w:r>
-      <w:r>
-        <w:t xml:space="preserve"> 2</w:t>
-      </w:r>
-      <w:r>
-        <w:t>단형</w:t>
-      </w:r>
-      <w:r>
-        <w:t xml:space="preserve"> · </w:t>
-      </w:r>
-      <w:r>
-        <w:t>크기</w:t>
-      </w:r>
-      <w:r>
-        <w:t xml:space="preserve"> </w:t>
-      </w:r>
-      <w:r>
-        <w:t>혼합</w:t>
-      </w:r>
-      <w:r>
-        <w:t xml:space="preserve"> </w:t>
-      </w:r>
-      <w:r>
-        <w:t>살롱형</w:t>
-      </w:r>
-      <w:r>
-        <w:t xml:space="preserve"> · </w:t>
-      </w:r>
-      <w:r>
-        <w:t>큰</w:t>
-      </w:r>
-      <w:r>
-        <w:t xml:space="preserve"> </w:t>
-      </w:r>
-      <w:r>
-        <w:t>작품</w:t>
-      </w:r>
-      <w:r>
-        <w:t xml:space="preserve"> </w:t>
-      </w:r>
-      <w:r>
-        <w:t>옆</w:t>
-      </w:r>
-      <w:r>
-        <w:t xml:space="preserve"> </w:t>
-      </w:r>
-      <w:r>
-        <w:t>세로</w:t>
-      </w:r>
-      <w:r>
-        <w:t xml:space="preserve"> </w:t>
-      </w:r>
-      <w:r>
-        <w:t>쌍형</w:t>
-      </w:r>
-      <w:r>
-        <w:t xml:space="preserve">: </w:t>
-      </w:r>
-      <w:r>
-        <w:t>행</w:t>
-      </w:r>
-      <w:r>
-        <w:t>·</w:t>
-      </w:r>
-      <w:r>
-        <w:t>열</w:t>
-      </w:r>
-      <w:r>
-        <w:t>·</w:t>
-      </w:r>
-      <w:r>
-        <w:t>높이와</w:t>
-      </w:r>
-      <w:r>
-        <w:t xml:space="preserve"> </w:t>
-      </w:r>
-      <w:r>
-        <w:t>크기</w:t>
-      </w:r>
-      <w:r>
-        <w:t xml:space="preserve"> </w:t>
-      </w:r>
-      <w:r>
-        <w:t>관계가</w:t>
-      </w:r>
-      <w:r>
-        <w:t xml:space="preserve"> </w:t>
-      </w:r>
-      <w:r>
-        <w:t>다른</w:t>
-      </w:r>
-      <w:r>
-        <w:t xml:space="preserve"> </w:t>
-      </w:r>
-      <w:r>
-        <w:t>구성을</w:t>
-      </w:r>
-      <w:r>
-        <w:t xml:space="preserve"> </w:t>
-      </w:r>
-      <w:r>
-        <w:t>사용한다</w:t>
-      </w:r>
-      <w:r>
-        <w:t>.</w:t>
+        <w:lastRenderedPageBreak/>
+        <w:t>2단 3열 격자형 · 세로 2단형 · 크기 혼합 살롱형 · 큰 작품 옆 세로 쌍형: 행·열·높이와 크기 관계가 다른 구성을 사용한다.</w:t>
       </w:r>
     </w:p>
     <w:p>
@@ -15974,487 +15564,12 @@
         <w:pStyle w:val="a0"/>
       </w:pPr>
       <w:r>
-        <w:t>하단</w:t>
-      </w:r>
-      <w:r>
-        <w:t xml:space="preserve"> </w:t>
-      </w:r>
-      <w:r>
-        <w:t>기준선형</w:t>
-      </w:r>
-      <w:r>
-        <w:t xml:space="preserve"> · </w:t>
-      </w:r>
-      <w:r>
-        <w:t>비대칭</w:t>
-      </w:r>
-      <w:r>
-        <w:t xml:space="preserve"> </w:t>
-      </w:r>
-      <w:r>
-        <w:t>균형형</w:t>
-      </w:r>
-      <w:r>
-        <w:t xml:space="preserve"> · </w:t>
-      </w:r>
-      <w:r>
-        <w:t>여백으로</w:t>
-      </w:r>
-      <w:r>
-        <w:t xml:space="preserve"> </w:t>
-      </w:r>
-      <w:r>
-        <w:t>나눈</w:t>
-      </w:r>
-      <w:r>
-        <w:t xml:space="preserve"> </w:t>
-      </w:r>
-      <w:r>
-        <w:t>두</w:t>
-      </w:r>
-      <w:r>
-        <w:t xml:space="preserve"> </w:t>
-      </w:r>
-      <w:r>
-        <w:t>쌍형</w:t>
-      </w:r>
-      <w:r>
-        <w:t xml:space="preserve"> · </w:t>
-      </w:r>
-      <w:r>
-        <w:t>코너를</w:t>
-      </w:r>
-      <w:r>
-        <w:t xml:space="preserve"> </w:t>
-      </w:r>
-      <w:r>
-        <w:t>잇는</w:t>
-      </w:r>
-      <w:r>
-        <w:t xml:space="preserve"> 2</w:t>
-      </w:r>
-      <w:r>
-        <w:t>벽형</w:t>
-      </w:r>
-      <w:r>
-        <w:t xml:space="preserve">: </w:t>
-      </w:r>
-      <w:r>
-        <w:t>다른</w:t>
-      </w:r>
-      <w:r>
-        <w:t xml:space="preserve"> </w:t>
-      </w:r>
-      <w:r>
-        <w:t>크기의</w:t>
-      </w:r>
-      <w:r>
-        <w:t xml:space="preserve"> </w:t>
-      </w:r>
-      <w:r>
-        <w:t>작품을</w:t>
-      </w:r>
-      <w:r>
-        <w:t xml:space="preserve"> </w:t>
-      </w:r>
-      <w:r>
-        <w:t>정렬하거나</w:t>
-      </w:r>
-      <w:r>
-        <w:t xml:space="preserve"> </w:t>
-      </w:r>
-      <w:r>
-        <w:t>군집을</w:t>
-      </w:r>
-      <w:r>
-        <w:t xml:space="preserve"> </w:t>
-      </w:r>
-      <w:r>
-        <w:t>분리하고</w:t>
-      </w:r>
-      <w:r>
-        <w:t xml:space="preserve"> </w:t>
-      </w:r>
-      <w:r>
-        <w:t>관람</w:t>
-      </w:r>
-      <w:r>
-        <w:t xml:space="preserve"> </w:t>
-      </w:r>
-      <w:r>
-        <w:t>방향을</w:t>
-      </w:r>
-      <w:r>
-        <w:t xml:space="preserve"> </w:t>
-      </w:r>
-      <w:r>
-        <w:t>전환한다</w:t>
-      </w:r>
-      <w:r>
-        <w:t>.</w:t>
+        <w:t>하단 기준선형 · 비대칭 균형형 · 여백으로 나눈 두 쌍형 · 코너를 잇는 2벽형: 다른 크기의 작품을 정렬하거나 군집을 분리하고 관람 방향을 전환한다.</w:t>
       </w:r>
     </w:p>
     <w:p>
       <w:r>
-        <w:lastRenderedPageBreak/>
-        <w:t>각</w:t>
-      </w:r>
-      <w:r>
-        <w:t xml:space="preserve"> </w:t>
-      </w:r>
-      <w:r>
-        <w:t>맵은</w:t>
-      </w:r>
-      <w:r>
-        <w:t xml:space="preserve"> </w:t>
-      </w:r>
-      <w:r>
-        <w:t>최소</w:t>
-      </w:r>
-      <w:r>
-        <w:t xml:space="preserve"> 10</w:t>
-      </w:r>
-      <w:r>
-        <w:t>종의</w:t>
-      </w:r>
-      <w:r>
-        <w:t xml:space="preserve"> </w:t>
-      </w:r>
-      <w:r>
-        <w:t>구별되는</w:t>
-      </w:r>
-      <w:r>
-        <w:t xml:space="preserve"> </w:t>
-      </w:r>
-      <w:r>
-        <w:t>배치를</w:t>
-      </w:r>
-      <w:r>
-        <w:t xml:space="preserve"> </w:t>
-      </w:r>
-      <w:r>
-        <w:t>실제</w:t>
-      </w:r>
-      <w:r>
-        <w:t xml:space="preserve"> </w:t>
-      </w:r>
-      <w:r>
-        <w:t>전시</w:t>
-      </w:r>
-      <w:r>
-        <w:t xml:space="preserve"> </w:t>
-      </w:r>
-      <w:r>
-        <w:t>벽에</w:t>
-      </w:r>
-      <w:r>
-        <w:t xml:space="preserve"> </w:t>
-      </w:r>
-      <w:r>
-        <w:t>사용한다</w:t>
-      </w:r>
-      <w:r>
-        <w:t xml:space="preserve">. </w:t>
-      </w:r>
-      <w:r>
-        <w:t>좌우</w:t>
-      </w:r>
-      <w:r>
-        <w:t xml:space="preserve"> </w:t>
-      </w:r>
-      <w:r>
-        <w:t>반전</w:t>
-      </w:r>
-      <w:r>
-        <w:t xml:space="preserve">, </w:t>
-      </w:r>
-      <w:r>
-        <w:t>그림</w:t>
-      </w:r>
-      <w:r>
-        <w:t xml:space="preserve"> </w:t>
-      </w:r>
-      <w:r>
-        <w:t>교체</w:t>
-      </w:r>
-      <w:r>
-        <w:t xml:space="preserve">, </w:t>
-      </w:r>
-      <w:r>
-        <w:t>간격의</w:t>
-      </w:r>
-      <w:r>
-        <w:t xml:space="preserve"> </w:t>
-      </w:r>
-      <w:r>
-        <w:t>미세</w:t>
-      </w:r>
-      <w:r>
-        <w:t xml:space="preserve"> </w:t>
-      </w:r>
-      <w:r>
-        <w:t>변경은</w:t>
-      </w:r>
-      <w:r>
-        <w:t xml:space="preserve"> </w:t>
-      </w:r>
-      <w:r>
-        <w:t>별도</w:t>
-      </w:r>
-      <w:r>
-        <w:t xml:space="preserve"> </w:t>
-      </w:r>
-      <w:r>
-        <w:t>유형으로</w:t>
-      </w:r>
-      <w:r>
-        <w:t xml:space="preserve"> </w:t>
-      </w:r>
-      <w:r>
-        <w:t>세지</w:t>
-      </w:r>
-      <w:r>
-        <w:t xml:space="preserve"> </w:t>
-      </w:r>
-      <w:r>
-        <w:t>않는다</w:t>
-      </w:r>
-      <w:r>
-        <w:t xml:space="preserve">. </w:t>
-      </w:r>
-      <w:r>
-        <w:t>일반</w:t>
-      </w:r>
-      <w:r>
-        <w:t xml:space="preserve"> </w:t>
-      </w:r>
-      <w:r>
-        <w:t>작품만</w:t>
-      </w:r>
-      <w:r>
-        <w:t xml:space="preserve"> </w:t>
-      </w:r>
-      <w:r>
-        <w:t>있는</w:t>
-      </w:r>
-      <w:r>
-        <w:t xml:space="preserve"> </w:t>
-      </w:r>
-      <w:r>
-        <w:t>독립</w:t>
-      </w:r>
-      <w:r>
-        <w:t xml:space="preserve"> </w:t>
-      </w:r>
-      <w:r>
-        <w:t>벽을</w:t>
-      </w:r>
-      <w:r>
-        <w:t xml:space="preserve"> </w:t>
-      </w:r>
-      <w:r>
-        <w:t>두고</w:t>
-      </w:r>
-      <w:r>
-        <w:t xml:space="preserve"> </w:t>
-      </w:r>
-      <w:r>
-        <w:t>도난</w:t>
-      </w:r>
-      <w:r>
-        <w:t xml:space="preserve"> </w:t>
-      </w:r>
-      <w:r>
-        <w:t>대상은</w:t>
-      </w:r>
-      <w:r>
-        <w:t xml:space="preserve"> </w:t>
-      </w:r>
-      <w:r>
-        <w:t>단독</w:t>
-      </w:r>
-      <w:r>
-        <w:t>·</w:t>
-      </w:r>
-      <w:r>
-        <w:t>군집의</w:t>
-      </w:r>
-      <w:r>
-        <w:t xml:space="preserve"> </w:t>
-      </w:r>
-      <w:r>
-        <w:t>가장자리</w:t>
-      </w:r>
-      <w:r>
-        <w:t>·</w:t>
-      </w:r>
-      <w:r>
-        <w:t>작은</w:t>
-      </w:r>
-      <w:r>
-        <w:t xml:space="preserve"> </w:t>
-      </w:r>
-      <w:r>
-        <w:t>작품</w:t>
-      </w:r>
-      <w:r>
-        <w:t xml:space="preserve"> </w:t>
-      </w:r>
-      <w:r>
-        <w:t>위치에도</w:t>
-      </w:r>
-      <w:r>
-        <w:t xml:space="preserve"> </w:t>
-      </w:r>
-      <w:r>
-        <w:t>배치한다</w:t>
-      </w:r>
-      <w:r>
-        <w:t>. M01</w:t>
-      </w:r>
-      <w:r>
-        <w:t>은</w:t>
-      </w:r>
-      <w:r>
-        <w:t xml:space="preserve"> </w:t>
-      </w:r>
-      <w:r>
-        <w:t>고전</w:t>
-      </w:r>
-      <w:r>
-        <w:t xml:space="preserve"> </w:t>
-      </w:r>
-      <w:r>
-        <w:t>회랑과</w:t>
-      </w:r>
-      <w:r>
-        <w:t xml:space="preserve"> </w:t>
-      </w:r>
-      <w:r>
-        <w:t>살롱</w:t>
-      </w:r>
-      <w:r>
-        <w:t>, M02</w:t>
-      </w:r>
-      <w:r>
-        <w:t>는</w:t>
-      </w:r>
-      <w:r>
-        <w:t xml:space="preserve"> </w:t>
-      </w:r>
-      <w:r>
-        <w:t>세로</w:t>
-      </w:r>
-      <w:r>
-        <w:t xml:space="preserve"> </w:t>
-      </w:r>
-      <w:r>
-        <w:t>연작과</w:t>
-      </w:r>
-      <w:r>
-        <w:t xml:space="preserve"> </w:t>
-      </w:r>
-      <w:r>
-        <w:t>여백</w:t>
-      </w:r>
-      <w:r>
-        <w:t>, M03</w:t>
-      </w:r>
-      <w:r>
-        <w:t>는</w:t>
-      </w:r>
-      <w:r>
-        <w:t xml:space="preserve"> </w:t>
-      </w:r>
-      <w:r>
-        <w:t>연속</w:t>
-      </w:r>
-      <w:r>
-        <w:t>·</w:t>
-      </w:r>
-      <w:r>
-        <w:t>격자와</w:t>
-      </w:r>
-      <w:r>
-        <w:t xml:space="preserve"> </w:t>
-      </w:r>
-      <w:r>
-        <w:t>독립</w:t>
-      </w:r>
-      <w:r>
-        <w:t xml:space="preserve"> </w:t>
-      </w:r>
-      <w:r>
-        <w:t>전시를</w:t>
-      </w:r>
-      <w:r>
-        <w:t xml:space="preserve"> </w:t>
-      </w:r>
-      <w:r>
-        <w:t>강조한다</w:t>
-      </w:r>
-      <w:r>
-        <w:t xml:space="preserve">. </w:t>
-      </w:r>
-      <w:r>
-        <w:t>벽</w:t>
-      </w:r>
-      <w:r>
-        <w:t xml:space="preserve"> </w:t>
-      </w:r>
-      <w:r>
-        <w:t>길이와</w:t>
-      </w:r>
-      <w:r>
-        <w:t xml:space="preserve"> </w:t>
-      </w:r>
-      <w:r>
-        <w:t>출입구에</w:t>
-      </w:r>
-      <w:r>
-        <w:t xml:space="preserve"> </w:t>
-      </w:r>
-      <w:r>
-        <w:t>맞춰</w:t>
-      </w:r>
-      <w:r>
-        <w:t xml:space="preserve"> </w:t>
-      </w:r>
-      <w:r>
-        <w:t>배치하며</w:t>
-      </w:r>
-      <w:r>
-        <w:t xml:space="preserve"> </w:t>
-      </w:r>
-      <w:r>
-        <w:t>무작위</w:t>
-      </w:r>
-      <w:r>
-        <w:t xml:space="preserve"> </w:t>
-      </w:r>
-      <w:r>
-        <w:t>산포로</w:t>
-      </w:r>
-      <w:r>
-        <w:t xml:space="preserve"> </w:t>
-      </w:r>
-      <w:r>
-        <w:t>다양성을</w:t>
-      </w:r>
-      <w:r>
-        <w:t xml:space="preserve"> </w:t>
-      </w:r>
-      <w:r>
-        <w:t>대신하지</w:t>
-      </w:r>
-      <w:r>
-        <w:t xml:space="preserve"> </w:t>
-      </w:r>
-      <w:r>
-        <w:t>않는다</w:t>
-      </w:r>
-      <w:r>
-        <w:t>.</w:t>
+        <w:t>각 맵은 최소 10종의 구별되는 배치를 실제 전시 벽에 사용한다. 좌우 반전, 그림 교체, 간격의 미세 변경은 별도 유형으로 세지 않는다. 일반 작품만 있는 독립 벽을 두고 도난 대상은 단독·군집의 가장자리·작은 작품 위치에도 배치한다. M01은 고전 회랑과 살롱, M02는 세로 연작과 여백, M03는 연속·격자와 독립 전시를 강조한다. 벽 길이와 출입구에 맞춰 배치하며 무작위 산포로 다양성을 대신하지 않는다.</w:t>
       </w:r>
     </w:p>
     <w:p>
@@ -16465,7 +15580,7 @@
           <w:numId w:val="7"/>
         </w:numPr>
       </w:pPr>
-      <w:bookmarkStart w:id="47" w:name="_Toc240045510"/>
+      <w:bookmarkStart w:id="47" w:name="_Toc240136968"/>
       <w:r>
         <w:t>맵</w:t>
       </w:r>
@@ -16752,11 +15867,8 @@
             <w:vAlign w:val="center"/>
           </w:tcPr>
           <w:p>
-            <w:pPr>
-              <w:pStyle w:val="TableText"/>
-            </w:pPr>
-            <w:r>
-              <w:t>비대칭 Serpentine·Occlusion·지름길</w:t>
+            <w:r>
+              <w:t>중정 순환 회랑·굴절 진입·CCTV 지름길</w:t>
             </w:r>
           </w:p>
         </w:tc>
@@ -16837,11 +15949,8 @@
             <w:vAlign w:val="center"/>
           </w:tcPr>
           <w:p>
-            <w:pPr>
-              <w:pStyle w:val="TableText"/>
-            </w:pPr>
-            <w:r>
-              <w:t>Braided 3-Lane·긴 시야·엇갈린 교차</w:t>
+            <w:r>
+              <w:t>3개 레인·엇갈린 문·불투명 구획</w:t>
             </w:r>
           </w:p>
         </w:tc>
@@ -16911,7 +16020,7 @@
           <w:numId w:val="7"/>
         </w:numPr>
       </w:pPr>
-      <w:bookmarkStart w:id="48" w:name="_Toc240045511"/>
+      <w:bookmarkStart w:id="48" w:name="_Toc240136969"/>
       <w:r>
         <w:t xml:space="preserve">M01 — </w:t>
       </w:r>
@@ -16928,7 +16037,7 @@
     </w:p>
     <w:p>
       <w:r>
-        <w:t>웅장함과 목표 공간이 비교적 일찍 읽히는 공개형 Figure-8 맵이다. Vent 전실에서 금장 Portal을 지나 중앙 Rotunda가 바로 방향 기준점이 되고, 북·남 두 순환 회랑이 중앙을 공유한다. Required Target을 획득한 뒤에는 진입 때와 다른 루프로 서측 Vent에 귀환하게 하여 재집결과 Greed Decision을 학습시킨다.</w:t>
+        <w:t>84×64m의 고전미술관이다. 24×20m 중앙 홀을 방향 기준점으로 두고, 북측 5개와 남측 5개 전시실을 두 순환 루프로 연결한다. 서측 진입 전실과 동측 증거실·구금실을 분리하고 북·남 끝 4m 관리 회랑으로 우회한다. 18개 구역과 30개 문을 사용하며 동측 두 선택 전시실에 Laser 지름길과 일반 우회로를 둔다. 필수 작품은 북동 N4 전시실의 동쪽 벽에 두고, 고가 작품은 N5와 S5에 배치한다. 벽 높이는 4.4m이고 대리석 바닥·금장 문틀·정돈된 벽면 전시로 고전미술관의 질서를 만든다.</w:t>
       </w:r>
     </w:p>
     <w:tbl>
@@ -17145,7 +16254,6 @@
       <w:tr>
         <w:trPr>
           <w:cantSplit/>
-          <w:trHeight w:val="3061"/>
           <w:jc w:val="center"/>
         </w:trPr>
         <w:tc>
@@ -17166,42 +16274,44 @@
             </w:pPr>
             <w:r>
               <w:rPr>
-                <w:b/>
-                <w:color w:val="C55A11"/>
-                <w:sz w:val="18"/>
+                <w:noProof/>
               </w:rPr>
-              <w:t>IMAGE REFERENCE SLOT</w:t>
-            </w:r>
-            <w:r>
-              <w:rPr>
-                <w:b/>
-                <w:color w:val="C55A11"/>
-                <w:sz w:val="18"/>
-              </w:rPr>
-              <w:br/>
-            </w:r>
-            <w:r>
-              <w:rPr>
-                <w:b/>
-                <w:color w:val="17365D"/>
-                <w:sz w:val="26"/>
-              </w:rPr>
-              <w:t>M01 Key Art / Floor Mood</w:t>
-            </w:r>
-            <w:r>
-              <w:rPr>
-                <w:b/>
-                <w:color w:val="17365D"/>
-                <w:sz w:val="26"/>
-              </w:rPr>
-              <w:br/>
-            </w:r>
-            <w:r>
-              <w:rPr>
-                <w:color w:val="66717C"/>
-                <w:sz w:val="19"/>
-              </w:rPr>
-              <w:t>중앙 Rotunda, 금장 프레임, 달빛과 따뜻한 실내등의 대비</w:t>
+              <w:lastRenderedPageBreak/>
+              <w:drawing>
+                <wp:inline distT="0" distB="0" distL="0" distR="0" wp14:anchorId="4E0D75E9" wp14:editId="757157FD">
+                  <wp:extent cx="5120640" cy="3200400"/>
+                  <wp:effectExtent l="0" t="0" r="0" b="0"/>
+                  <wp:docPr id="1" name="Picture 1"/>
+                  <wp:cNvGraphicFramePr>
+                    <a:graphicFrameLocks xmlns:a="http://schemas.openxmlformats.org/drawingml/2006/main" noChangeAspect="1"/>
+                  </wp:cNvGraphicFramePr>
+                  <a:graphic xmlns:a="http://schemas.openxmlformats.org/drawingml/2006/main">
+                    <a:graphicData uri="http://schemas.openxmlformats.org/drawingml/2006/picture">
+                      <pic:pic xmlns:pic="http://schemas.openxmlformats.org/drawingml/2006/picture">
+                        <pic:nvPicPr>
+                          <pic:cNvPr id="0" name="T_FloorPlan_M01.png"/>
+                          <pic:cNvPicPr/>
+                        </pic:nvPicPr>
+                        <pic:blipFill>
+                          <a:blip r:embed="rId8"/>
+                          <a:stretch>
+                            <a:fillRect/>
+                          </a:stretch>
+                        </pic:blipFill>
+                        <pic:spPr>
+                          <a:xfrm>
+                            <a:off x="0" y="0"/>
+                            <a:ext cx="5120640" cy="3200400"/>
+                          </a:xfrm>
+                          <a:prstGeom prst="rect">
+                            <a:avLst/>
+                          </a:prstGeom>
+                        </pic:spPr>
+                      </pic:pic>
+                    </a:graphicData>
+                  </a:graphic>
+                </wp:inline>
+              </w:drawing>
             </w:r>
           </w:p>
         </w:tc>
@@ -17212,7 +16322,7 @@
         <w:pStyle w:val="CaptionCustom"/>
       </w:pPr>
       <w:r>
-        <w:t>그림 1. M01 컨셉 아트·라이팅 레퍼런스 교체 슬롯</w:t>
+        <w:t>그림 1. M01 저장된 맵의 벽·문 구성과 게임 내 지도</w:t>
       </w:r>
     </w:p>
     <w:p>
@@ -17224,7 +16334,7 @@
           <w:numId w:val="7"/>
         </w:numPr>
       </w:pPr>
-      <w:bookmarkStart w:id="49" w:name="_Toc240045512"/>
+      <w:bookmarkStart w:id="49" w:name="_Toc240136970"/>
       <w:r>
         <w:lastRenderedPageBreak/>
         <w:t xml:space="preserve">M02 — </w:t>
@@ -17242,7 +16352,7 @@
     </w:p>
     <w:p>
       <w:r>
-        <w:t>시야보다 소리가 먼저 위협을 알리는 지연 공개형 Serpentine 맵이다. Vent 뒤 병풍 틈과 두 번의 굴절을 지나야 비대칭 Moon Garden이 드러나며, 긴 S자 안전 동선과 CCTV가 감시하는 세 지름길 사이에서 시간과 위험을 교환한다. Target과 고가 작품은 마지막 Blind Corner까지 완전히 보이지 않는다.</w:t>
+        <w:t>72×64m의 중정형 동양미술관이다. 20×20m 정원과 폭 4m 순환 회랑을 중심으로 21개 구역을 29개 문으로 연결한다. 남서측 전실의 두 꺾임 뒤 정원이 드러나며, 벽에 붙은 입구 병풍과 버튼 대기용 차폐벽, 정원 안의 수면·식재·정자를 정돈해 배치한다. 비스듬한 독립 가림막과 회랑에 흩어진 바위·관목은 배치하지 않는다. 세 CCTV 지름길은 긴 우회 동선과 위험을 교환하고 북동·남동 선택실에 Laser를 둔다. 필수 작품은 동측 E2 전시실의 동쪽 벽에 둔다. 북동 고가실과 E2 사이의 바로 옆 출입문을 닫고, 북쪽 관리 회랑을 일반 우회·이탈로로 유지한다. 북동 버튼은 전시실 북동 모서리, 남동 버튼은 진입문의 동쪽 벽감에 두어 통과 순찰선과 분리한다. 벽 높이는 4.4m이며 목재·동장 프레임·낮은 정원 식재로 관람 공간의 질서를 유지한다. 남동 고가실과 증거실 사이의 중복 지름길도 닫고 서쪽 S3 전시실을 통한 일반 출입·이탈을 유지한다. 차폐벽 아래의 버튼은 국소 조명으로 식별성을 유지한다.</w:t>
       </w:r>
     </w:p>
     <w:tbl>
@@ -17399,11 +16509,8 @@
             <w:vAlign w:val="center"/>
           </w:tcPr>
           <w:p>
-            <w:pPr>
-              <w:pStyle w:val="TableText"/>
-            </w:pPr>
-            <w:r>
-              <w:t>병풍 Dogleg, 비대칭 Moon Garden, S자 Gallery, 감시 지름길</w:t>
+            <w:r>
+              <w:t>20×20m 중정, 4m 순환 회랑, 굴절 진입, 북·남 관리 회랑</w:t>
             </w:r>
           </w:p>
         </w:tc>
@@ -17459,7 +16566,6 @@
       <w:tr>
         <w:trPr>
           <w:cantSplit/>
-          <w:trHeight w:val="3061"/>
           <w:jc w:val="center"/>
         </w:trPr>
         <w:tc>
@@ -17480,42 +16586,43 @@
             </w:pPr>
             <w:r>
               <w:rPr>
-                <w:b/>
-                <w:color w:val="C55A11"/>
-                <w:sz w:val="18"/>
+                <w:noProof/>
               </w:rPr>
-              <w:t>IMAGE REFERENCE SLOT</w:t>
-            </w:r>
-            <w:r>
-              <w:rPr>
-                <w:b/>
-                <w:color w:val="C55A11"/>
-                <w:sz w:val="18"/>
-              </w:rPr>
-              <w:br/>
-            </w:r>
-            <w:r>
-              <w:rPr>
-                <w:b/>
-                <w:color w:val="17365D"/>
-                <w:sz w:val="26"/>
-              </w:rPr>
-              <w:t>M02 Key Art / Floor Mood</w:t>
-            </w:r>
-            <w:r>
-              <w:rPr>
-                <w:b/>
-                <w:color w:val="17365D"/>
-                <w:sz w:val="26"/>
-              </w:rPr>
-              <w:br/>
-            </w:r>
-            <w:r>
-              <w:rPr>
-                <w:color w:val="66717C"/>
-                <w:sz w:val="19"/>
-              </w:rPr>
-              <w:t>비 내리는 중정, 병풍 사이의 좁은 시야, 젖은 목재 반사</w:t>
+              <w:drawing>
+                <wp:inline distT="0" distB="0" distL="0" distR="0" wp14:anchorId="184977C7" wp14:editId="5584D24D">
+                  <wp:extent cx="5120640" cy="3200400"/>
+                  <wp:effectExtent l="0" t="0" r="0" b="0"/>
+                  <wp:docPr id="2" name="Picture 2"/>
+                  <wp:cNvGraphicFramePr>
+                    <a:graphicFrameLocks xmlns:a="http://schemas.openxmlformats.org/drawingml/2006/main" noChangeAspect="1"/>
+                  </wp:cNvGraphicFramePr>
+                  <a:graphic xmlns:a="http://schemas.openxmlformats.org/drawingml/2006/main">
+                    <a:graphicData uri="http://schemas.openxmlformats.org/drawingml/2006/picture">
+                      <pic:pic xmlns:pic="http://schemas.openxmlformats.org/drawingml/2006/picture">
+                        <pic:nvPicPr>
+                          <pic:cNvPr id="0" name="T_FloorPlan_M02.png"/>
+                          <pic:cNvPicPr/>
+                        </pic:nvPicPr>
+                        <pic:blipFill>
+                          <a:blip r:embed="rId9"/>
+                          <a:stretch>
+                            <a:fillRect/>
+                          </a:stretch>
+                        </pic:blipFill>
+                        <pic:spPr>
+                          <a:xfrm>
+                            <a:off x="0" y="0"/>
+                            <a:ext cx="5120640" cy="3200400"/>
+                          </a:xfrm>
+                          <a:prstGeom prst="rect">
+                            <a:avLst/>
+                          </a:prstGeom>
+                        </pic:spPr>
+                      </pic:pic>
+                    </a:graphicData>
+                  </a:graphic>
+                </wp:inline>
+              </w:drawing>
             </w:r>
           </w:p>
         </w:tc>
@@ -17526,7 +16633,7 @@
         <w:pStyle w:val="CaptionCustom"/>
       </w:pPr>
       <w:r>
-        <w:t>그림 2. M02 컨셉 아트·라이팅 레퍼런스 교체 슬롯</w:t>
+        <w:t>그림 2. M02 저장된 맵의 벽·문 구성과 게임 내 지도</w:t>
       </w:r>
     </w:p>
     <w:p>
@@ -17538,7 +16645,7 @@
           <w:numId w:val="7"/>
         </w:numPr>
       </w:pPr>
-      <w:bookmarkStart w:id="50" w:name="_Toc240045513"/>
+      <w:bookmarkStart w:id="50" w:name="_Toc240136971"/>
       <w:r>
         <w:lastRenderedPageBreak/>
         <w:t xml:space="preserve">M03 — </w:t>
@@ -17556,7 +16663,7 @@
     </w:p>
     <w:p>
       <w:r>
-        <w:t>중앙 시야를 전시벽으로 끊고 세 레인의 경로 선택을 유지하는 Braided 3-Lane 맵이다. 첫 10초 안에 북측 Glass, 중앙 Spine, 남측 Restoration 중 하나를 고르고 엇갈린 Crosslink에서만 레인을 전환한다. 동측 Target 획득 후 다른 레인으로 귀환하며, 고가 작품은 남→북 Service Airlock 협동 접근으로 분리한다.</w:t>
+        <w:t>96×56m의 현대미술관이다. 북측 전시 레인, 불투명 벽으로 구획한 중앙 레인, 남측 복원·서비스 레인을 19개 구역과 33개 문으로 연결한다. 중앙 문의 위치를 남북으로 번갈아 배치하여 긴 직선 시야를 끊고 각 교차로에서 우회·횡단·귀환을 선택하게 한다. 북동·중앙 동측·남측 고가 선택실에 Laser를 두되 독립적인 일반 이탈 문을 제공한다. 벽 높이는 5m이며 고측 유리 채광과 금속 구조, 백색 콘크리트 벽면으로 현대미술관을 표현한다. 필수 작품은 Laser가 없는 북동 N4 전시실의 북쪽 벽에 둔다. 세 버튼은 각각 N4 남동·C3 남동·S2 남동 모서리의 차폐 공간에 두고, 일직선 통과 순찰선에서 벗어나 진입 준비와 역할 교대를 할 수 있게 한다. 남측 버튼과 겹치던 전리품 받침대는 동쪽 서비스실로 옮겨 차폐 공간의 바닥을 비운다.</w:t>
       </w:r>
     </w:p>
     <w:tbl>
@@ -17713,11 +16820,8 @@
             <w:vAlign w:val="center"/>
           </w:tcPr>
           <w:p>
-            <w:pPr>
-              <w:pStyle w:val="TableText"/>
-            </w:pPr>
-            <w:r>
-              <w:t>North Glass Lane, Central Spine, South Restoration Lane, Service Airlock</w:t>
+            <w:r>
+              <w:t>북측 전시실, 중앙 구획 전시실, 남측 복원·서비스실, 엇갈린 연결 문</w:t>
             </w:r>
           </w:p>
         </w:tc>
@@ -17727,11 +16831,8 @@
             <w:vAlign w:val="center"/>
           </w:tcPr>
           <w:p>
-            <w:pPr>
-              <w:pStyle w:val="TableText"/>
-            </w:pPr>
-            <w:r>
-              <w:t>긴 시야·낮은 엄폐·엇갈린 Crosslink·레인별 교대 노출</w:t>
+            <w:r>
+              <w:t>불투명 전시벽·문 앞 횡단·레인별 교대 노출</w:t>
             </w:r>
           </w:p>
         </w:tc>
@@ -17741,11 +16842,8 @@
             <w:vAlign w:val="center"/>
           </w:tcPr>
           <w:p>
-            <w:pPr>
-              <w:pStyle w:val="TableText"/>
-            </w:pPr>
-            <w:r>
-              <w:t>‘숨을 곳이 없는데 도망칠 곳은 있다’</w:t>
+            <w:r>
+              <w:t>경로를 읽고 안전한 횡단 시점을 선택하는 긴장</w:t>
             </w:r>
           </w:p>
         </w:tc>
@@ -17773,7 +16871,6 @@
       <w:tr>
         <w:trPr>
           <w:cantSplit/>
-          <w:trHeight w:val="3061"/>
           <w:jc w:val="center"/>
         </w:trPr>
         <w:tc>
@@ -17794,42 +16891,43 @@
             </w:pPr>
             <w:r>
               <w:rPr>
-                <w:b/>
-                <w:color w:val="C55A11"/>
-                <w:sz w:val="18"/>
+                <w:noProof/>
               </w:rPr>
-              <w:t>IMAGE REFERENCE SLOT</w:t>
-            </w:r>
-            <w:r>
-              <w:rPr>
-                <w:b/>
-                <w:color w:val="C55A11"/>
-                <w:sz w:val="18"/>
-              </w:rPr>
-              <w:br/>
-            </w:r>
-            <w:r>
-              <w:rPr>
-                <w:b/>
-                <w:color w:val="17365D"/>
-                <w:sz w:val="26"/>
-              </w:rPr>
-              <w:t>M03 Key Art / Floor Mood</w:t>
-            </w:r>
-            <w:r>
-              <w:rPr>
-                <w:b/>
-                <w:color w:val="17365D"/>
-                <w:sz w:val="26"/>
-              </w:rPr>
-              <w:br/>
-            </w:r>
-            <w:r>
-              <w:rPr>
-                <w:color w:val="66717C"/>
-                <w:sz w:val="19"/>
-              </w:rPr>
-              <w:t>유리 레인과 불투명 전시벽, 교차로를 비추는 비상등</w:t>
+              <w:drawing>
+                <wp:inline distT="0" distB="0" distL="0" distR="0" wp14:anchorId="6384B8F9" wp14:editId="75B922F6">
+                  <wp:extent cx="5120640" cy="3200400"/>
+                  <wp:effectExtent l="0" t="0" r="0" b="0"/>
+                  <wp:docPr id="3" name="Picture 3"/>
+                  <wp:cNvGraphicFramePr>
+                    <a:graphicFrameLocks xmlns:a="http://schemas.openxmlformats.org/drawingml/2006/main" noChangeAspect="1"/>
+                  </wp:cNvGraphicFramePr>
+                  <a:graphic xmlns:a="http://schemas.openxmlformats.org/drawingml/2006/main">
+                    <a:graphicData uri="http://schemas.openxmlformats.org/drawingml/2006/picture">
+                      <pic:pic xmlns:pic="http://schemas.openxmlformats.org/drawingml/2006/picture">
+                        <pic:nvPicPr>
+                          <pic:cNvPr id="0" name="T_FloorPlan_M03.png"/>
+                          <pic:cNvPicPr/>
+                        </pic:nvPicPr>
+                        <pic:blipFill>
+                          <a:blip r:embed="rId10"/>
+                          <a:stretch>
+                            <a:fillRect/>
+                          </a:stretch>
+                        </pic:blipFill>
+                        <pic:spPr>
+                          <a:xfrm>
+                            <a:off x="0" y="0"/>
+                            <a:ext cx="5120640" cy="3200400"/>
+                          </a:xfrm>
+                          <a:prstGeom prst="rect">
+                            <a:avLst/>
+                          </a:prstGeom>
+                        </pic:spPr>
+                      </pic:pic>
+                    </a:graphicData>
+                  </a:graphic>
+                </wp:inline>
+              </w:drawing>
             </w:r>
           </w:p>
         </w:tc>
@@ -17840,7 +16938,7 @@
         <w:pStyle w:val="CaptionCustom"/>
       </w:pPr>
       <w:r>
-        <w:t>그림 3. M03 컨셉 아트·라이팅 레퍼런스 교체 슬롯</w:t>
+        <w:t>그림 3. M03 저장된 맵의 벽·문 구성과 게임 내 지도</w:t>
       </w:r>
     </w:p>
     <w:p>
@@ -17852,7 +16950,7 @@
           <w:numId w:val="7"/>
         </w:numPr>
       </w:pPr>
-      <w:bookmarkStart w:id="51" w:name="_Toc240045514"/>
+      <w:bookmarkStart w:id="51" w:name="_Toc240136972"/>
       <w:r>
         <w:lastRenderedPageBreak/>
         <w:t xml:space="preserve">First-Person </w:t>
@@ -17936,7 +17034,7 @@
           <w:numId w:val="7"/>
         </w:numPr>
       </w:pPr>
-      <w:bookmarkStart w:id="52" w:name="_Toc240045515"/>
+      <w:bookmarkStart w:id="52" w:name="_Toc240136973"/>
       <w:r>
         <w:t>사운드</w:t>
       </w:r>
@@ -18376,7 +17474,7 @@
           <w:numId w:val="7"/>
         </w:numPr>
       </w:pPr>
-      <w:bookmarkStart w:id="53" w:name="_Toc240045516"/>
+      <w:bookmarkStart w:id="53" w:name="_Toc240136974"/>
       <w:r>
         <w:lastRenderedPageBreak/>
         <w:t>세계관과</w:t>
@@ -18623,7 +17721,7 @@
           <w:numId w:val="7"/>
         </w:numPr>
       </w:pPr>
-      <w:bookmarkStart w:id="54" w:name="_Toc240045517"/>
+      <w:bookmarkStart w:id="54" w:name="_Toc240136975"/>
       <w:r>
         <w:lastRenderedPageBreak/>
         <w:t>범위</w:t>
@@ -18650,7 +17748,7 @@
           <w:numId w:val="7"/>
         </w:numPr>
       </w:pPr>
-      <w:bookmarkStart w:id="55" w:name="_Toc240045518"/>
+      <w:bookmarkStart w:id="55" w:name="_Toc240136976"/>
       <w:r>
         <w:t>v1.0 Required Scope</w:t>
       </w:r>
@@ -19018,7 +18116,7 @@
           <w:numId w:val="7"/>
         </w:numPr>
       </w:pPr>
-      <w:bookmarkStart w:id="56" w:name="_Toc240045519"/>
+      <w:bookmarkStart w:id="56" w:name="_Toc240136977"/>
       <w:r>
         <w:t>Deferred Expansion</w:t>
       </w:r>
@@ -19042,7 +18140,7 @@
           <w:numId w:val="7"/>
         </w:numPr>
       </w:pPr>
-      <w:bookmarkStart w:id="57" w:name="_Toc240045520"/>
+      <w:bookmarkStart w:id="57" w:name="_Toc240136978"/>
       <w:r>
         <w:t>Stretch</w:t>
       </w:r>
@@ -19420,7 +18518,7 @@
           <w:numId w:val="7"/>
         </w:numPr>
       </w:pPr>
-      <w:bookmarkStart w:id="58" w:name="_Toc240045521"/>
+      <w:bookmarkStart w:id="58" w:name="_Toc240136979"/>
       <w:r>
         <w:lastRenderedPageBreak/>
         <w:t>Starting Balance Targets</w:t>
@@ -20019,7 +19117,7 @@
           <w:numId w:val="7"/>
         </w:numPr>
       </w:pPr>
-      <w:bookmarkStart w:id="59" w:name="_Toc240045522"/>
+      <w:bookmarkStart w:id="59" w:name="_Toc240136980"/>
       <w:r>
         <w:t>Playtest Questions</w:t>
       </w:r>
@@ -20105,7 +19203,7 @@
           <w:numId w:val="7"/>
         </w:numPr>
       </w:pPr>
-      <w:bookmarkStart w:id="60" w:name="_Toc240045523"/>
+      <w:bookmarkStart w:id="60" w:name="_Toc240136981"/>
       <w:r>
         <w:lastRenderedPageBreak/>
         <w:t>Release KPI</w:t>
@@ -20437,7 +19535,7 @@
           <w:numId w:val="7"/>
         </w:numPr>
       </w:pPr>
-      <w:bookmarkStart w:id="61" w:name="_Toc240045524"/>
+      <w:bookmarkStart w:id="61" w:name="_Toc240136982"/>
       <w:r>
         <w:t>W6~W12 Roadmap</w:t>
       </w:r>
@@ -20803,7 +19901,7 @@
         <w:keepLines/>
         <w:pageBreakBefore w:val="0"/>
       </w:pPr>
-      <w:bookmarkStart w:id="62" w:name="_Toc240045525"/>
+      <w:bookmarkStart w:id="62" w:name="_Toc240136983"/>
       <w:r>
         <w:t>Appendix A — 용어</w:t>
       </w:r>
@@ -21194,7 +20292,7 @@
         <w:keepLines/>
         <w:pageBreakBefore w:val="0"/>
       </w:pPr>
-      <w:bookmarkStart w:id="63" w:name="_Toc240045526"/>
+      <w:bookmarkStart w:id="63" w:name="_Toc240136984"/>
       <w:r>
         <w:rPr>
           <w:sz w:val="32"/>
@@ -21421,7 +20519,7 @@
         <w:keepLines/>
         <w:pageBreakBefore w:val="0"/>
       </w:pPr>
-      <w:bookmarkStart w:id="64" w:name="_Toc240045527"/>
+      <w:bookmarkStart w:id="64" w:name="_Toc240136985"/>
       <w:r>
         <w:rPr>
           <w:sz w:val="32"/>
@@ -21504,8 +20602,8 @@
       </w:r>
     </w:p>
     <w:sectPr>
-      <w:headerReference w:type="default" r:id="rId8"/>
-      <w:footerReference w:type="default" r:id="rId9"/>
+      <w:headerReference w:type="default" r:id="rId11"/>
+      <w:footerReference w:type="default" r:id="rId12"/>
       <w:pgSz w:w="11906" w:h="16838"/>
       <w:pgMar w:top="1020" w:right="1020" w:bottom="907" w:left="1020" w:header="454" w:footer="397" w:gutter="0"/>
       <w:cols w:space="720"/>

</xml_diff>